<commit_message>
v6: scalenie zmian z Procedura_new + przebudowa dokumentu i eksportów
- Generator: tytuł DTE (Specyfikacja Techniczna / Instrukcja Eksploatacyjna),
  diagram architektury przepływu danych (ASCII), portable ROOT, bogatsza legenda,
  normalizacja "Happy Day" -> "Stan poprawny / nominalny"; naprawione 6 atrybutów
  HTML zepsutych cudzysłowami typograficznymi (class=/href=)
- popup_content_IDCC.json: katalog odchudzony 126 -> 78 plików (usunięte duplikaty)
- Inwentarz_IDCC.md: terminologia + linie "Kryterium" per ryzyko; wycięte 27
  artefaktów [cite: N], notacja $F_max$ -> F<sub>max</sub>
- _gen_pdf.py: nowy eksport PDF (fpdf2), uniezależniony od platformy
  (Calibri/Windows, Arial/macOS); output/PDF 136 KB zamiast 1,8 MB
- Przebudowane: PROCEDURA_IDCC_TSO_v6.html (78 kart plików, 965 stanów z
  zaktualizowanego staticHints, 19 szablonów maili), STICKERY_IDCC.md, output/
- .gitignore: Procedura_new/, .history/, worktrees, zip, tmp

Co-Authored-By: Claude Fable 5 <noreply@anthropic.com>
</commit_message>
<xml_diff>
--- a/output/PROCEDURA_IDCC_TSO_v6.docx
+++ b/output/PROCEDURA_IDCC_TSO_v6.docx
@@ -44,6 +44,283 @@
     <w:p>
       <w:r>
         <w:t>TablicaKarty skrócone (kliknij → szczegóły)</w:t>
+      </w:r>
+    </w:p>
+    <w:p>
+      <w:r>
+        <w:t>1Proces IDCC — kroki istotne dla PSE (BPD)</w:t>
+      </w:r>
+    </w:p>
+    <w:p>
+      <w:r>
+        <w:t>IDCC (Intraday Capacity Calculation) — cykliczne, śróddzienne wyznaczanie zdolności przesyłowych w regionie Core. PSE jako TSO dostarcza dane wejściowe, monitoruje strumienie plików i interweniuje przy awariach.</w:t>
+      </w:r>
+    </w:p>
+    <w:p>
+      <w:r>
+        <w:t>Iteracje procesu</w:t>
+      </w:r>
+    </w:p>
+    <w:p>
+      <w:r>
+        <w:t>IteracjaCharakterZakres</w:t>
+        <w:br/>
+        <w:t>IDCC(a)Pełny przebieg centralny + wyznaczanie ATCAC, ATC Based Validation, Final NTC</w:t>
+        <w:br/>
+        <w:t>IDCC(b)–(d)Kolejne iteracje śróddzienne (ID2/ID3C/ID3)GLSK, CGM, RefProg, CB, IVA, NTC, paczki PERUN</w:t>
+      </w:r>
+    </w:p>
+    <w:p>
+      <w:r>
+        <w:t>Wejścia PSE i bramki czasowe</w:t>
+      </w:r>
+    </w:p>
+    <w:p>
+      <w:r>
+        <w:t>Każdy plik ma</w:t>
+      </w:r>
+    </w:p>
+    <w:p>
+      <w:r>
+        <w:t>(Target End Time — cel) i</w:t>
+      </w:r>
+    </w:p>
+    <w:p>
+      <w:r>
+        <w:t>(Critical End Time — twardy deadline). Statusy i działania zależą od relacji do tych bramek — patrz</w:t>
+      </w:r>
+    </w:p>
+    <w:p>
+      <w:r>
+        <w:t>i</w:t>
+      </w:r>
+    </w:p>
+    <w:p>
+      <w:r>
+        <w:t>.</w:t>
+      </w:r>
+    </w:p>
+    <w:p>
+      <w:r>
+        <w:t>Opis procesu — kroki istotne dla PSE</w:t>
+      </w:r>
+    </w:p>
+    <w:p>
+      <w:r>
+        <w:t>Na podstawie</w:t>
+      </w:r>
+    </w:p>
+    <w:p>
+      <w:r>
+        <w:t>(02-03-2026). Tylko kroki, w których PSE działa lub jest adresatem; nazwy pod-procesów pozostawione po angielsku, IDCC(b)–(d) opisane wspólnie (różnice w tabeli). Kody plików w notacji FIDx.</w:t>
+      </w:r>
+    </w:p>
+    <w:p>
+      <w:r>
+        <w:t>2Narzędzia</w:t>
+      </w:r>
+    </w:p>
+    <w:p>
+      <w:r>
+        <w:t>3Legenda statusów kafelków</w:t>
+      </w:r>
+    </w:p>
+    <w:p>
+      <w:r>
+        <w:t>Pełna legenda na pulpicie</w:t>
+      </w:r>
+    </w:p>
+    <w:p>
+      <w:r>
+        <w:t>Legenda kolorów statusów plików w CCM — pełny opis znaczenia każdego koloru i oznaczenia (R, W, !, ?).</w:t>
+      </w:r>
+    </w:p>
+    <w:p>
+      <w:r>
+        <w:t>4Katalog plików FIDx — opisy i warianty stanów</w:t>
+      </w:r>
+    </w:p>
+    <w:p>
+      <w:r>
+        <w:t>IDCC(a) — 4 plików</w:t>
+      </w:r>
+    </w:p>
+    <w:p>
+      <w:r>
+        <w:t>IDCC(b) — 41 plików</w:t>
+      </w:r>
+    </w:p>
+    <w:p>
+      <w:r>
+        <w:t>IDCC(c) — 40 plików</w:t>
+      </w:r>
+    </w:p>
+    <w:p>
+      <w:r>
+        <w:t>IDCC(d) — 40 plików</w:t>
+      </w:r>
+    </w:p>
+    <w:p>
+      <w:r>
+        <w:t>IDA3 — 1 plików</w:t>
+      </w:r>
+    </w:p>
+    <w:p>
+      <w:r>
+        <w:t>5Czynności w CCM (C.1–C.5)</w:t>
+      </w:r>
+    </w:p>
+    <w:p>
+      <w:r>
+        <w:t>Pulpit dyspozytorski CCM (</w:t>
+      </w:r>
+    </w:p>
+    <w:p>
+      <w:r>
+        <w:t>) — główne miejsce monitorowania statusów wszystkich plików IDCC i ręcznej interwencji.</w:t>
+      </w:r>
+    </w:p>
+    <w:p>
+      <w:r>
+        <w:t>Główny pulpit IDCC — pełna lista plików FIDx procesu z czasami granicznymi i kolumnami statusów wysyłki/walidacji.</w:t>
+      </w:r>
+    </w:p>
+    <w:p>
+      <w:r>
+        <w:t>Zaloguj się do CCM. Wybierz pulpit „IDCC FB Pulpit dyspozytorski” lub „IDCC (do 3C) z ATC i SFTP”. Z kalendarza ustaw dobę monitorowaną. Ustaw tryb odświeżania (ultraszybki 10 s / szybki 30 s / wolny 5 min).</w:t>
+      </w:r>
+    </w:p>
+    <w:p>
+      <w:r>
+        <w:t>Odszukaj wiersz pliku (FIDx-…) i kolumnę kanału (CCTool wysł. / CCTool zwalid. / MinIO / sFTP/ZP). Kolor i znacznik kafelka = aktualny status (patrz legenda).</w:t>
+      </w:r>
+    </w:p>
+    <w:p>
+      <w:r>
+        <w:t>PPM na kafelku → „Informacje”. Popup pokazuje opis pliku, ścieżkę, TET/CET, kod ACK i ewentualny błąd walidacji.</w:t>
+      </w:r>
+    </w:p>
+    <w:p>
+      <w:r>
+        <w:t>PPM na kafelku → „Wyślij” (lub „Wyślij do CCTool”). Wskaż plik, potwierdź. Obserwuj postęp do komunikatu „Plik wysłany”.</w:t>
+      </w:r>
+    </w:p>
+    <w:p>
+      <w:r>
+        <w:t>Po CET użyj „Wyślij po CET”. Status ręczny: PPM → „Status ręczny” → wybór (Nowa wersja / Tylko zmiana statusu); cofnięcie przez „Przywróć poprzedni status”.</w:t>
+      </w:r>
+    </w:p>
+    <w:p>
+      <w:r>
+        <w:t>„Za mały rozmiar pliku!” (rozmiar poniżej progu MinIO), kod 39 (zły FID w nazwie), kod 40 (zła data w nazwie), blokada wersji backup („wersja musi być wyższa od docelowej”).</w:t>
+      </w:r>
+    </w:p>
+    <w:p>
+      <w:r>
+        <w:t>Pulpit CCM — pełna galeria (89 ekranów + 42 ikon)Logowanie do aplikacji CCM pod adresem ccm.spsm.pse.pl.Otwarcie pulpitu przez kliknięcie ikony 'oko' przy wybranej pozycji listy.Nagłówek pulpitu z polem doby handlowej (Business Day) i strzałkami zmiany dnia.Licznik czasu do najbliższego automatycznego odświeżenia.Dymek kafelka: brak dokumentu w oknie od 30 min przed TET do 30 min przed CET.Dymek błędu kafelka: dostarczona wersja nie jest wyższa od już zapisanej.Dymek kafelka z nazwą i wersją pliku (FID1-250, wersja 5).Dymek kafelka (FID1-831): dostarczona wartość ograniczenia jest ujemna.Dymek kafelka (FID2-831): dostarczona wartość ograniczenia jest ujemna.Dymek kafelka (FID1-831 wersja 2): brama dla definicji komunikatu nie jest otwarta.Dymek kafelka (FID1-921/FID1-250): brama dla definicji komunikatu nie jest otwarta.Dymek kafelka (FID1-831): komunikat zawiera nieprawidłowe szeregi czasowe niezgodne z regułami MTU.Dymek kafelka (FID2-831): komunikat zawiera nieprawidłowe szeregi czasowe niezgodne z regułami MTU.Dymek kafelka: komunikat w pełni zaakceptowany (FID2-607/FID2-617).Dymek kafelka (FID2-620, wersja 4): plik dostarczony po CET.Popup informacyjny FID2-665: plik za mały (49.858 KB przy wymaganych 50.000 KB), dostarczony po CET.Dymek kafelka: oczekiwanie na potwierdzenie ACK — minęło 5 minut.Wiersz GLSK (FID2-607): plik prawidłowo wysłany i zwalidowany (kafelki zielone).Wiersz CBCORA (FID2-617): plik wysłany, lecz walidacja bez potwierdzenia (czerwone '?').Wiersz '24 modele IGM' (DACF_IGM_UCT): brak dokumentu w kolumnie sFTP/ZP (kafelek czerwony).Wiersz IVA_ATC (FID2-710_ATC) ze statusem szarymNagłówek tabeli i wiersz MD 250 ze statusem R (ręczny)Wiersz GLSK (FID2-607) z czerwonymi kafelkami błęduWiersz GLSK (FID2-657) ze statusem WWiersz CGM Data Quality Check (FID2-659) ze statusem WWiersz Merged CGM (FID2-620) ze statusem fioletowymWiersz AC (FID1-831) ze statusami W i fioletowymPulpit IDCC(d) Individual Validation z potwierdzeniem zmiany statusuTooltip: plik wysłany ręcznie kanałami EDX/KAFKA/CCCTOOL/MINIO/PERUNPulpit z obszarami walidacji domen FBA/LTA i ekstrakcji ATCMenu PPM: przywróć status, wyślij (status ręczny aktywny)Pulpit IDCC(d) z wyborem doby i potwierdzeniem przywrócenia statusuGrupa AGR Paczka ZIP ID2 - błąd na nagłówku i FID2-620Grupa AGR Paczka ZIP ID2 - czerwony błąd na nagłówku i FID2-645Grupa AGR Paczka ZIP ID2 - statusy szare (oczekiwanie)Grupa AGR Paczka ZIP ID2 - wszystkie pliki ze statusem WGrupa Paczka ZIP do Perun - nagłówek fioletowy, pozycje WGrupa Paczka ZIP do Perun - nagłówek zielony, pozycje WPowiadomienie Chrome: konieczna weryfikacja statusu FID3-710 (IVA)Nagłówek pulpitu IDCC z trybami odświeżania i ostrzeżeniem o powiadomieniachUstawienie powiadomień: DozwolonePanel uprawnień witryny: zmiana powiadomień na DozwolonePowiadomienia włączone (przełącznik)Panel uprawnień Chrome: powiadomienia wyłączoneNagłówek pulpitu z zaznaczonym przyciskiem Test powiadomieńPulpit z powiadomieniem: powiadomienia poprawnie skonfigurowaneWycinek nagłówka tabeli pulpituZmiana szerokości kolumny w nagłówku tabeliPDF: Instrukcja Użytkownika obsługującego proces IDMenu PPM z podświetloną opcją informacje (FID2-928)Popup Informacje FID2-610 - plik dostarczony po CETPopup Informacje FID2-710 - rozmiar w bajtachNagłówek pulpitu IDCC (do 3C) z ATC i SFTPWiersz paczki ZIP do Perun w walidacji IVARozwinięta lista plików paczki ATC ID2Pasek wyboru trybu odświeżaniaMenu PPM - wyślij plik FID2-657Wybór pliku XML z eksploratora (Edge)Systemowe okno Otwórz - wskazanie plikuTrwa wysyłanie pliku FID2-657 (3%)Wiersz FID2-657 z wersją 1 po wysyłceMenu PPM - wyślij po CETOkno wysyłki po CET - FID1-250 (puste)Wiersz FID2-659 z wersją i statusemBłąd nazwy pliku (kod 39) - zła nazwa FIDBłąd nazwy pliku (kod 40) - zła dataPlik FID2-710_ATC wysłanyPlik FID3C-710_ATC wysłanyRaport RAP_PERUN_ID2 wysłanyRaport RAP_PERUN_ID2_ATC wysłanyRaport RAP_PERUN_ID3C wysłanyRaport RAP_PERUN_ID3C_ATC wysłanyMenu PPM - pobierz plik FID2-701Menu PPM na paczce ZIP/IVAUstawienia pobierania w ChromeUstawienia pobierania w FirefoxPulpit podczas pobierania pliku (8.7 MB)Powiadomienie o pobraniu pliku FID2-645Legenda - status zły rozmiar plikuMenu PPM na FID2-665 (status błędu)Informacja o zbyt małym rozmiarze pliku FID2-645Wiersz CBCORA ze statusem oczekiwania (?)Tooltip - oczekiwanie na ACK (CBCORA)Kanały statusu IVA/IVA Backup ID3CMenu PPM - Wyślij do CCTool (IVA Backup)Potwierdzenie wysyłki IVA Backup do CCToolToast - Wysłano prośbęStatusy kanałów IVA po wysyłce (ID3C)Pulpit - blokada wysyłki backup (zła wersja)Elementy interfejsu (ikony i przyciski, rozmiar rzeczywisty):Ikona 'oko' — otwiera wybrany pulpit dyspozytorski.Strzałka przejścia do następnej doby handlowej.Strzałka przejścia do poprzedniej doby handlowej.Strzałka zmiany doby (stan wyróżniony) — przejście do następStrzałka zmiany doby (stan wyróżniony) — przejście do poprzeIkona kalendarza — otwiera wybór doby handlowej.Przycisk ręcznego odświeżenia pulpitu.Przycisk 'Legenda' — rozwija opis kolorów statusów.Kafelek statusu 'oczekujący na obsługę' (biały).Kafelek statusu 'zbliża się Target End Time — brak dokumentuKafelek statusu 'brak dokumentu / błąd' (czerwony).Dymek kafelka 'Błąd procesu' (czerwony).Dymek błędu kafelka: brama dla podanej definicji komunikatu Kafelek statusu 'dokument prawidłowo obsłużony' (zielony).Kafelek statusu 'R' — dokument/składowa agregatu wysłana ręcKafelek statusu 'W' — dokument/składowa agregatu wysłana po Kafelek statusu 'dostarczony po CET' (fioletowy).Kafelek statusu 'dokument niedostarczony' (szary).Dymek kafelka 'Dokument niedostarczony (D-1)' (szary).Oznaczenie '!' — niepoprawny rozmiar pliku.Oznaczenie '?' — proces nieskończony / brak potwierdzenia ACKafelek statusu '?' (szary) — proces w trakcie wykonywania.Ikonka kłódki (zabezpieczenia)Ikonka przełączników (suwaki)Przycisk Test powiadomieńIkona ustawień (koło zębate)Ikony zoom minus/plusIkony statusu: OK (zielony) i błąd (czerwony)Ikona statusu OK (zielony)Przycisk PomocIkona rozwijania grupy (strzałka w dół)Ikona zwijania grupy (strzałka w górę)Ikona rozwijania grupy (strzałka w dół)Ikona zwijania (strzałka w górę)Ikona rozwijania (strzałka w dół)Ikona kłódki otwartej (odblokowane)Ikona kłódki zamkniętej (zablokowane)Przycisk WyślijIkona statusu - dokument WordOpcja menu - wyślij po CETIkona statusu OK (zielona)Przycisk Tak (potwierdzenie)</w:t>
+      </w:r>
+    </w:p>
+    <w:p>
+      <w:r>
+        <w:t>6Walidacja domeny FBA — tryb normalny (NOR)</w:t>
+      </w:r>
+    </w:p>
+    <w:p>
+      <w:r>
+        <w:t>Tryb normalny Day-Ahead: schemat decyzyjny walidacji domeny DA/LTA, obliczenia w Perun4V, raporty CNEC i redukcji LTA.</w:t>
+      </w:r>
+    </w:p>
+    <w:p>
+      <w:r>
+        <w:t>Walidacja NOR — pełna galeria (18 ekranów)Mapa etapów procesu FBA z zaznaczonym krokiem walidacji domeny (NOR_03)Definicja IVA i parametrów elementu CNEC (RAM, Fmax, FRM, F0,CORE)Schemat decyzyjny walidacji domeny DA z punktami kontrolnymi i ryzykamiSchemat decyzyjny walidacji domeny LTA z gałęzią redukcji LTADiagram przepływu danych między systemami (CN2, Perun, MinIO, SFTP) — kroki 1-11Lista pulpitów w aplikacji CCM z wyborem pulpitu DACC FBTabela statusów przepływów FBA — wiersz Paczka ZIP_CCA do PerunTabela statusów FBA — wiersze IVA (F310) i Raporty z PerunEkran startowy logowania do platformy LCCV (TSCNET)Formularz logowania lokalnego LCCV (Username/Password)Logi obliczeń (Calculation Logs) — zakończone obliczenie DA Estimate security reserve 25/25E-mail z raportem VALIDATION_OVERVIEW dla domeny FB (maks. IVA = 0.00)Tabela statusów FBA — sekcja Walidacja domeny LTATabela statusów LTA — wyróżnione wiersze Paczka ZIP_LTA i IVA LTAArkusz lta_curtailment bez redukcji — wszystkie wartości zeroweArkusz lta_curtailment z faktycznymi redukcjami LTA i wartościami RDPArkusz przeciążeń CNEC (Polaniec-Klikowa) — OVERLOAD, F_MAX, F_0 per godzinaE-mail z raportem lta_curtailment (RLTA) z CCA o redukcji LTA</w:t>
+      </w:r>
+    </w:p>
+    <w:p>
+      <w:r>
+        <w:t>7Walidacja domeny FBA — tryb backup (BUP)</w:t>
+      </w:r>
+    </w:p>
+    <w:p>
+      <w:r>
+        <w:t>Tryb backup Day-Ahead: generowanie wierzchołków zapasowym narzędziem CCA (F320), paczki ZIP_CCA/ZIP_LTA, estymacja rezerwy w Perun, redukcja IVA, import RLTA do ZP.</w:t>
+      </w:r>
+    </w:p>
+    <w:p>
+      <w:r>
+        <w:t>Walidacja BUP — pełna galeria (90 ekranów + 4 ikon)Mapa etapów procesu FBA - zaznaczony krok BUP_03 walidacja domenyDiagram składowych CNEC - co to jest IVA, RAM, FRM, FmaxTabela przepływów FBA - status sFTP paczki PERUN_DA_CCA podświetlonyTabela przepływów FBA - status MinIO paczki PERUN_DA_CCA zaznaczonyTabela przepływów FBA - status MinIO paczki PERUN_DA_LTA zaznaczonyMenu kontekstowe paczki PERUN_DA_CCA - opcja 'pobierz'Menu kontekstowe paczki PERUN_DA_LTA - opcja 'pobierz'TSCNET Validation - wybór procesu DA CCV i parametrów walidacjiPole wgrywania paczki ZIP z danymi TSO (TSCNET)Pole wyboru daty walidacji (TSCNET)Przycisk 'Estimate security reserve' (TSCNET)Komunikat 'Calculation started' (TSCNET)Lista obliczeń TSCNET - zadanie 8636 w trakcie liczeniaLista obliczeń TSCNET - zadanie 8636 zakończone, wyniki F310/F427Link pobrania wyniku F310 (TSCNET)Wiersz listy obliczeń TSCNET (1935) z linkami pobrania F310/F427TSCNET - podzadania: szacowanie rezerwy i tworzenie raportów (ukończone)Menu kontekstowe IVA BACKUP F310 - opcja 'wyślij'Wybór pliku F310 z folderu Pobrane do wysłania (dialog Wyślij F310)Pulpit DACC FB - plik F310 załadowany do wysłaniaPotwierdzenie 'Plik wysłany' dla F310 (pulpit DACC FB)Pulpit DACC FB - tooltip statusu wysyłki IVA F310 (kanały dystrybucji)Diagram architektury przepływu danych walidacji (CN2, Minio, CCM, Perun)Core CC Tool - dashboard procesu D-9 (Validation of Market Coupling Results)Core CC Tool Message Viewer - lista komunikatów (102, 437)Message Viewer - komunikat 312 Individual Filtered Critical BranchesIkona pola uploadu XML/ZipCore CC Tool - ręczne wgrywanie pliku F310 (Manual file upload)Message Viewer - komunikat 310 Individual CB validation (Processed/Accepted)Rozwinięta paczka AGR_PERUN_DA - lista plików składowych (F109-X427)Pulpit Day-Ahead - menu kontekstowe 'wyślij' na pliku paczkiCCM v1.8.2 - dialog wysylania pliku F333 (pulpit Day-Ahead)CCM - wysylanie F515, wybór pliku z eksploratoraEksplorator plików - wybór pliku paczki (F109-F315) do wysłaniaDialog 'Wyślij F109' z załadowanym plikiem zipKomunikat 'Plik wysłany'Menu IVA BACKUP - opcja 'backup' (ścieżka backup BUP_03)Core CC Tool View Results - filtr godzin i wyniki domeny FBCore CC Tool View Results - wartości CB (IVA, Max PTDF PL&gt;SK)Core CC Tool Bulk edit - zbiorcza redukcja IVA 20% (fallback gdy walidacja zawiodła)Błąd TSCNET: niezgodne daty paczki ZIP i obliczeniaTSCNET - błąd niezgodności dat paczki ZIP (data 2022-05-03)Błąd TSCNET: brak plików F100/F109/F308 w paczceTSCNET - błąd brakujących plików F100/F109/F308 (2022-05-06)TSCNET - obliczenie zakończone błędem ERR-I (24 z 25 timestampów failed)Perun: status obliczeńń estymacji rezerwy – 1 godzina nieudana z 24, plus tworzenie raportów.Perun: lista zadań per godzina – jedna godzina Failed, reszta Success, dostęp do konsoli.CC Tool: wybór instancji procesu DA1 dla wybranej doby (04.10.2023).CC Tool: nagłówek Process Detail DA1 – etapy odbioru danych i status godzinowy.CC Tool: instancja oznaczona ostrzeżeniem o kandydacie fallback (przesłanka backup).Pulpit DA: menu kontekstowe na wierszu IVA BACKUP – opcja backup walidacji domeny FBA.Diagram architektury przepływu danych w procedurze IVA Backup (kroki 1–12).Pulpit DA: okno potwierdzenia wysłania dokumentu IVA Backup.Pulpit DA: pełna tabela przepływów walidacji domeny FBA i LTA ze statusami kolumnowymi.Pulpit DA: błąd – backup wymaga wersji dokumentu wyższej niż docelowa.MinIO/CCA: katalog wyjściowy backup z plikami F310-v2, RLTA, F320_LTA do pobrania.Narzędzie walidacji: Bulk edit – zbiorcza redukcja 20% po awarii Individual Validation Tool.Perun Study/Validation: logi obliczeńń, jedno zadanie estymacji rezerwy zakończone błędem.Perun: komunikat o nieudanym pobraniu pliku – wycinek samego przycisku.Perun Study/Validation: pełny ekran z komunikatem błędu pobierania pliku.Perun: wiersz obliczenia estymacji rezerwy DA z akcją Status (sFTP, 4 timestampy).Perun: estymacja rezerwy zakończona pomyślnie (24/24), pobieranie plików wyjściowych.Perun Configurations: sekcja dodatkowych NEC/wyłączeń i parametry RAO dla obliczeńń backup.Perun: formularz dodatkowego wyłączenia – elementy sieci 380 kV i wybór godzin.Perun: podgląd zapisanego dodatkowego wyłączenia H001 dla wielu godzin.Perun: wycinek wiersza obliczenia z akcją Download F310.Pulpit DA: menu kontekstowe IVA BACKUP z opcjami pobierz/wyślij.E-mail FB Core Team: brak plików IVA (F310/F310_LTA/raporty) dla doby 2024-03-21.Message Viewer: komunikat IVA 310 (PSE→CORE) odrzucony mimo ACK Accepted.Perun: lista obliczeńń z wybraną wersją 2 dokumentu F310.Wycinek nazwy pliku F310 w wersji v1.Wycinek nazwy pliku F310 w wersji v2 (porównanie wersji).XML F310: DocumentVersion = 1 w treści dokumentu Flow-Based.XML F310: DocumentVersion = 2 – wersja podwyższona do wysyłki backup.Eksplorator: folder F320_backup z plikami narzędzia fbc_lta_vertices.Konsola backup CCA: pomyślne wygenerowanie F320_CCA z plików F110/F320/F118.Eksplorator: pliki wyjściowe backup CCA dla domeny FBA (F320_CCA + mapa wierzchołków).Pulpit DA: rozwinięta paczka ZIP_CCA do Perun (pliki składowe domeny FBA).Konsola backup CCA: wygenerowano F320_LTA, ale brak danych do F320_CCA.Eksplorator: pliki wyjściowe backup CCA dla domeny LTA (F320_LTA + mapa wierzchołków).Pulpit DA: rozwinięta paczka ZIP_LTA do Perun (pliki składowe domeny LTA).E-mail: raport lta_curtailment (RLTA) z CCA z załącznikami xlsx/xml.ZP: ekran redukcji alokacji LT z błędem braku dokumentu RLTA (LTA bis) z CCA.ZP: panel importu dokumentu LTA bis – przed wyborem pliku.Eksplorator: wybór pliku 20250801-RLTA-v1-CCA-to-ZP.xml do importu w ZP.ZP: panel importu z wybranym plikiem LTA bis gotowym do zaimportowania.ZP: tabela redukcji alokacji LT wypełniona danymi godzinowymi po imporcie RLTA.Pulpit DA: błędy MinIO na paczce CCA i menu kontekstowe z opcją wyślij (ponowna wysyłka).Pulpit DA: nagłówek z trybami odświeżania i menu wysyłki paczki ZIP do Perun.E-mail FB Core Team: brak pliku F212 dla doby 2024-03-26.Elementy interfejsu (ikony i przyciski, rozmiar rzeczywisty):Status 'Processed' (Message Viewer)Przycisk 'Wyślij'Menu edycji wyników: Edit Cells / Edit BulkWycinek samego przycisku zamknięcia (X) – brak kontekstu ekr</w:t>
+      </w:r>
+    </w:p>
+    <w:p>
+      <w:r>
+        <w:t>8GLSK (FIDx-607) — katalog stanów</w:t>
+      </w:r>
+    </w:p>
+    <w:p>
+      <w:r>
+        <w:t>Plik GLSK (Generation Load Shift Keys, FIDx-607) — 32 udokumentowane stany kafelka (para lewy×prawy kanał): sukces, przetwarzanie, oczekiwanie, błędy oraz wysyłka ręczna.</w:t>
+      </w:r>
+    </w:p>
+    <w:p>
+      <w:r>
+        <w:t>GLSK 607 — stany kafelka — pełna galeria (32 ekranów)Stan bazowy - oba kafelki zielone, plik GLSK poprawny.Zielony kafelek z oznaczeniem B - sukces ze znacznikiem stanu.Oba kafelki fioletowe - przetwarzanie w toku.Oba zielone kafelki ze znacznikiem B - sukces.Ciemnozielony kafelek W (wysłany) obok jasnozielonego.Kafelek W (wysłany) obok pustego - brak statusu po prawej.Wysłany (W) po lewej, czerwony ze znakiem zapytania po prawej - problem/oczekiwanie.Wysłany (W) po lewej, błąd czerwony po prawej.Wysłany (W) po lewej, przetwarzanie (fioletowy) po prawej.Wysłany (W) po lewej, oczekujący w kolejce (granatowy) po prawej.Wysłany (W) po lewej, zielony ze znacznikiem B po prawej.Wysłany i zmodyfikowany (W*) po lewej, pusty po prawej.Zmodyfikowany wysłany (W*) po lewej, czerwony ze znakiem zapytania po prawej.Zmodyfikowany wysłany (W*) po lewej, błąd czerwony po prawej.Zmodyfikowany wysłany (W*) po lewej, przetwarzanie (fioletowy) po prawej.Zmodyfikowany wysłany (W*) po lewej, oczekujący (granatowy) po prawej.Zielony ze znacznikiem B po lewej, pusty po prawej.Zielony B po lewej, czerwony ze znakiem zapytania po prawej.Zielony B po lewej, oczekujący (granatowy) po prawej.Błąd/alert (czerwony !) po lewej, zielony B po prawej.Oba kafelki szare - stan nieaktywny/wyłączony.Oba kafelki czerwone - błąd/awaria po obu stronach.Czerwony alert (!) po lewej, czerwony ze znakiem zapytania po prawej.Czerwony alert (!) po lewej, błąd czerwony po prawej.Czerwony alert (!) po lewej, przetwarzanie (fioletowy) po prawej.Zielony po lewej, błąd czerwony po prawej.Zielony po lewej, czerwony ze znakiem zapytania po prawej.Zielony po lewej, oczekujący (granatowy) po prawej.Czerwony alert (!) po lewej, oczekujący (granatowy) po prawej.Przetwarzanie (fioletowy) po lewej, błąd czerwony po prawej.Przetwarzanie (fioletowy) po lewej, oczekujący (granatowy) po prawej.Oba kafelki granatowe - oczekiwanie/zakolejkowanie po obu stronach.</w:t>
+      </w:r>
+    </w:p>
+    <w:p>
+      <w:r>
+        <w:t>9Kreator IDCF — publikacja RA / GLSK / CBCORA</w:t>
+      </w:r>
+    </w:p>
+    <w:p>
+      <w:r>
+        <w:t>KreatorIDCF_CGMES — publikacja środków zaradczych RA oraz plików GLSK/CBCORA przez Connector → MinIO, z weryfikacją w CCM.</w:t>
+      </w:r>
+    </w:p>
+    <w:p>
+      <w:r>
+        <w:t>10AC w ZP (FIDx-831)</w:t>
+      </w:r>
+    </w:p>
+    <w:p>
+      <w:r>
+        <w:t>Plik AC (Allocation Constraints, FIDx-831) — ręczna obsługa w aplikacji ZP: tabela ograniczeń NTC/ATC, wersjonowanie, zatwierdzanie.</w:t>
+      </w:r>
+    </w:p>
+    <w:p>
+      <w:r>
+        <w:t>11Procedury P01–P06</w:t>
+      </w:r>
+    </w:p>
+    <w:p>
+      <w:r>
+        <w:t>Pełne procedury reagujące na ryzyka oraz procedury narzędziowe krok po kroku.</w:t>
+      </w:r>
+    </w:p>
+    <w:p>
+      <w:r>
+        <w:t>12Ryzyka U01–U23 i kody ACK</w:t>
+      </w:r>
+    </w:p>
+    <w:p>
+      <w:r>
+        <w:t>13Buckety MinIO i mapa relacji</w:t>
+      </w:r>
+    </w:p>
+    <w:p>
+      <w:r>
+        <w:t>Wygenerowano automatycznie z: Inwentarz_IDCC.md, popup_content_IDCC.json (126 plików), staticHints-IDCC-all.txt (986 stanów), screens_manifest.json (309 ekranów). Każde ryzyko zgłaszać do:</w:t>
+      </w:r>
+    </w:p>
+    <w:p>
+      <w:r>
+        <w:rPr>
+          <w:b/>
+        </w:rPr>
+      </w:r>
+      <w:r/>
+    </w:p>
+    <w:p>
+      <w:r>
+        <w:t>.</w:t>
       </w:r>
     </w:p>
     <w:p>
@@ -9193,6 +9470,11 @@
       </w:r>
     </w:p>
     <w:p>
+      <w:r>
+        <w:t>Legenda kolorów statusów plików w CCM — pełny opis znaczenia każdego koloru i oznaczenia (R, W, !, ?).</w:t>
+      </w:r>
+    </w:p>
+    <w:p>
       <w:pPr>
         <w:pStyle w:val="Heading2"/>
       </w:pPr>
@@ -9288,6 +9570,16 @@
       </w:r>
     </w:p>
     <w:p>
+      <w:r>
+        <w:t>Warianty stanów (8)</w:t>
+      </w:r>
+    </w:p>
+    <w:p>
+      <w:r>
+        <w:t>Status kafelkaSytuacjaDziałania awaryjnesFTP/ZP wysł.Plik dostarczony prawidłowo na sFTP/ZP — status pozytywny.Brak działań — proces poprawny.sFTP/ZP wysł.Status nadany ręcznie literą 'R' przez Dyspozytora po weryfikacji.Brak działań — decyzja ręczna Dyspozytora.sFTP/ZP wysł.Plik dostarczony po CET — status pozytywny.Brak działań — dostarczone po CET, OK.sFTP/ZP wysł.Przedwczesne (&gt;30 min do TET) — plik jeszcze niewymagany.Monitoring — czekaj do TET.sFTP/ZP wysł.Oczekiwanie / transfer w toku (stan przejściowy).Czekaj 5 min → sprawdź sFTP/ZP. Gdy brak → wyślij plik ręcznie ze źródła na sFTP/ZP.sFTP/ZP wysł.Zbliża się TET — pliku jeszcze nie ma na sFTP/ZP.Sprawdź źródło (Kreator / Perun4V / Core CC Tool). Gdy brak → wyślij plik ręcznie ze źródła na sFTP/ZP.sFTP/ZP wysł.Zbliża się CET / błąd dostarczenia — brak pliku na sFTP/ZP.Gdy pliku NIE ma na sFTP/ZP → wyślij plik ręcznie ze źródła na sFTP/ZP.sFTP/ZP wysł.Minął CET — plik niedostarczony. Krytyczne.Zgłoś (CIZ/WPO/PSE-I). Po CET — postępowanie krytyczne (brak lokalnego fallbacku).</w:t>
+      </w:r>
+    </w:p>
+    <w:p>
       <w:pPr>
         <w:pStyle w:val="Heading4"/>
       </w:pPr>
@@ -9384,6 +9676,16 @@
       </w:r>
     </w:p>
     <w:p>
+      <w:r>
+        <w:t>Warianty stanów (32)</w:t>
+      </w:r>
+    </w:p>
+    <w:p>
+      <w:r>
+        <w:t>Status kafelkaSytuacjaDziałania awaryjneCCtool wysł.CCtool zwalid.Dokument wysłany prawidłowo do CCTool, otrzymano potwierdzenie ACK z pozytywnym komunikatem.Brak działań — proces poprawny.CCtool wysł.CCtool zwalid.Dokument wysłany prawidłowo do CCTool. Dyspozytor ustawił status ręcznie 'R' po weryfikacji w CCTool.Brak działań.CCtool wysł.CCtool zwalid.Dokument wysłany prawidłowo do CCTool po CET, ACK napłynął po CET z pozytywnym komunikatem.Brak działań — dostarczone po CET, OK.CCtool wysł.CCtool zwalid.Dokument oznaczony ręcznie jako wysłany prawidłowo do CCTool oraz otrzymanie potwierdzenia ACK.Brak działań.CCtool wysł.CCtool zwalid.Dokument prawidłowo wysłany ręcznie z poziomu CCM. Otrzymano potwierdzenie ACK z pozytywnym komunikatem.Brak działań — wysyłka ręczna wykonana.CCtool wysł.CCtool zwalid.Dokument prawidłowo wysłany ręcznie z poziomu CCM. Trwa oczekiwanie na potwierdzenie ACK — około 2 min.Postępowanie:Czekaj 5 minOK → ustaw 'R' w CCMCCtool wysł.CCtool zwalid.Dokument wysłany ręcznie z poziomu CCM, ale ACK nie napłynął w żądanym czasie i zbliża się CET.Postępowanie:Core CC Tool → sprawdź czy plik dotarł (Message Viewer)Jeżeli:OK → oznacz 'R' w CCMbłąd → Plik został odrzucony — odczytaj kod błędu z potwierdzenia ACK i zareaguj zależnie od kodu:kod 20 (bramka dla pliku zamknięta) — zgłoś administratorowi Core CC Toolkod 21 (wersja nie jest wyższa niż już zapisana) — w źródle podnieś numer wersji i wyślij plik ponowniekod 30 (rozmiar pliku niezgodny) — pobierz poprawny plik i wyślij ponownie pełny opis w bazie ryzykbrak → Awaria transportu plików (Connector 2.0). Zgłoś awarię. W międzyczasie pobierz plik ze źródła (aplikacji ZP) i wyślij go ręcznie przez Core CC Tool (Manual Upload). pełny opis w bazie ryzykCCtool wysł.CCtool zwalid.Dokument wysłany ręcznie z poziomu CCM, a otrzymane ACK: (1) zawiera komunikat błędu (najedź kursorem); (2) proces zakończył się błędem — 'Błąd procesu'.Postępowanie:Najedź kursorem na status i odczytaj kod ACKJeżeli:kod 20 (bramka dla pliku zamknięta) → zgłoś administratorowi Core CC Toolkod 21 (wersja nie jest wyższa niż zapisana) → podnieś numer wersji w aplikacji ZP i wyślij plik ponownie przez Core CC Tool (Manual Upload)kod 30 (rozmiar pliku niezgodny) → pobierz poprawny plik z MinIO lub aplikacji ZP i wyślij ponownieCCtool wysł.CCtool zwalid.Dokument prawidłowo wysłany ręcznie z poziomu CCM. Otrzymano potwierdzenie ACK z pozytywnym komunikatem po CET.Brak działań — ręczna + ACK po CET, OK.CCtool wysł.CCtool zwalid.Dokument prawidłowo wysłany ręcznie z poziomu CCM. Nie otrzymano potwierdzenia ACK — upłynął czas CET.Postępowanie:Core CC Tool → sprawdź statusJeżeli:OK (Processed) → oznacz 'R' w CCM + zgłośbrak / awaria zwrotna → Awaria transportu plików (Connector 2.0). Zgłoś awarię. W międzyczasie pobierz plik ze źródła (aplikacji ZP) i wyślij go ręcznie przez Core CC Tool (Manual Upload). pełny opis w bazie ryzykCCtool wysł.CCtool zwalid.Dokument prawidłowo wysłany ręcznie z poziomu CCM. Nie otrzymano ACK, Dyspozytor ustawił status 'R' po weryfikacji w CCTool.Brak działań — decyzja ręczna Dyspozytora.CCtool wysł.CCtool zwalid.Dokument prawidłowo wysłany ręcznie z poziomu CCM po CET. Trwa oczekiwanie na potwierdzenie ACK — około 2 min.Postępowanie:Czekaj 2-5 minOK → ustaw 'R'CCtool wysł.CCtool zwalid.Dokument wysłany ręcznie z poziomu CCM po CET. Trwa oczekiwanie na potwierdzenie ACK — upłynęło więcej niż 2 minuty.Postępowanie:Core CC Tool → sprawdź czy plik dotarł (Message Viewer)Jeżeli:OK → oznacz 'R' w CCMbłąd → Plik został odrzucony — odczytaj kod błędu z potwierdzenia ACK i zareaguj zależnie od kodu:kod 20 (bramka dla pliku zamknięta) — zgłoś administratorowi Core CC Toolkod 21 (wersja nie jest wyższa niż już zapisana) — w źródle podnieś numer wersji i wyślij plik ponowniekod 30 (rozmiar pliku niezgodny) — pobierz poprawny plik i wyślij ponownie pełny opis w bazie ryzykbrak → Awaria transportu plików (Connector 2.0). Zgłoś awarię. W międzyczasie pobierz plik ze źródła (aplikacji ZP) i wyślij go ręcznie przez Core CC Tool (Manual Upload). pełny opis w bazie ryzykCCtool wysł.CCtool zwalid.Dokument wysłany ręcznie z poziomu CCM po CET, a otrzymane ACK: (1) komunikat błędu; (2) proces zakończył się błędem. Typowo kod 20 gateClosed.Postępowanie:Najedź kursorem na status i odczytaj kod ACK (typowo kod 20)Jeżeli:kod 20 (bramka dla pliku zamknięta) → po CET bramka jest zamknięta → zgłośinny kod → Plik został odrzucony — odczytaj kod błędu z potwierdzenia ACK i zareaguj zależnie od kodu:kod 20 (bramka dla pliku zamknięta) — zgłoś administratorowi Core CC Toolkod 21 (wersja nie jest wyższa niż już zapisana) — w źródle podnieś numer wersji i wyślij plik ponowniekod 30 (rozmiar pliku niezgodny) — pobierz poprawny plik i wyślij ponownie pełny opis w bazie ryzykCCtool wysł.CCtool zwalid.Dokument prawidłowo wysłany ręcznie z poziomu CCM po CET. Otrzymano potwierdzenie ACK z pozytywnym komunikatem (po CET).Brak działań — ręczna + ACK po CET, OK.CCtool wysł.CCtool zwalid.Dokument prawidłowo wysłany ręcznie z poziomu CCM po CET. Nie otrzymano potwierdzenia ACK — upłynął czas CET.Postępowanie:Core CC Tool → sprawdź statusJeżeli:OK (Processed) → oznacz 'R' w CCM + zgłośbrak / awaria zwrotna → Awaria transportu plików (Connector 2.0). Zgłoś awarię. W międzyczasie pobierz plik ze źródła (aplikacji ZP) i wyślij go ręcznie przez Core CC Tool (Manual Upload). pełny opis w bazie ryzykCCtool wysł.CCtool zwalid.Dokument oznaczony ręcznie jako wysłany prawidłowo do CCTool. Trwa oczekiwanie na ACK — około 2 min.Postępowanie:Czekaj 5 minOK → 'R' dla ACKCCtool wysł.CCtool zwalid.Dokument oznaczony ręcznie jako wysłany prawidłowo. Trwa oczekiwanie na ACK — upłynęło więcej niż 2 min.Postępowanie:Czekaj 5 minOK → 'R' dla ACKCCtool wysł.CCtool zwalid.Dokument oznaczony ręcznie jako wysłany prawidłowo. Nie otrzymano potwierdzenia ACK — upłynął czas CET.Postępowanie:Core CC Tool → sprawdź statusJeżeli:OK (Processed) → utrzymaj 'R'brak / awaria → Awaria transportu plików (Connector 2.0). Zgłoś awarię. W międzyczasie pobierz plik ze źródła (aplikacji ZP) i wyślij go ręcznie przez Core CC Tool (Manual Upload). pełny opis w bazie ryzykCCtool wysł.CCtool zwalid.Wysłany dokument nie spełnia kryterium rozmiaru. ACK nie otrzymano, Dyspozytor ustawił status 'R' po weryfikacji w CCTool.Brak działań — Dyspozytor zatwierdził zawartość.CCtool wysł.CCtool zwalid.Dokument jeszcze nie został wysłany do CCTool, ACK nie napłynął. Plik nie wymagany (&gt;30 min do TET).Brak działań — czekaj do TET.CCtool wysł.CCtool zwalid.Zbliża się CET — plik niedostarczony lub błąd wysyłki. Stan alarmowy.Postępowanie (alarm):Core CC Tool → sprawdź czy plik dotarł do Core CC ToolJeżeli:plik jest, brak ACK → Plik został odrzucony — odczytaj kod błędu z potwierdzenia ACK i zareaguj zależnie od kodu:kod 20 (bramka dla pliku zamknięta) — zgłoś administratorowi Core CC Toolkod 21 (wersja nie jest wyższa niż już zapisana) — w źródle podnieś numer wersji i wyślij plik ponowniekod 30 (rozmiar pliku niezgodny) — pobierz poprawny plik i wyślij ponownie pełny opis w bazie ryzykbrak pliku (awaria Connector 2.0) → Awaria transportu plików (Connector 2.0). Zgłoś awarię. W międzyczasie pobierz plik ze źródła (aplikacji ZP) i wyślij go ręcznie przez Core CC Tool (Manual Upload). pełny opis w bazie ryzykbrak pliku w źródle → Brak pliku lub wersji w aplikacji źródłowej. Otwórz aplikacji ZP, przejdź do bilansu i sprawdź wersję pliku: jeśli wersja jest dostępna — pobierz ją (Pobierz XML); jeśli brakuje — wygeneruj nową wersję; jeśli aplikacja nie działa — zgłoś. pełny opis w bazie ryzykCCtool wysł.CCtool zwalid.Wysłany dokument nie spełnia kryterium rozmiaru. Oczekiwanie na ACK — upłynęło więcej niż 2 min.Postępowanie:W aplikacji CCM kliknij plik lewym przyciskiem myszy → Informacje → sprawdź rozmiar; pobierz z MinIO i rozpakujJeżeli:zawartość OK mimo rozmiaru → oznacz 'R' (→ powiązany stan)zawartość niepoprawna → Plik został odrzucony — odczytaj kod błędu z potwierdzenia ACK i zareaguj zależnie od kodu:kod 20 (bramka dla pliku zamknięta) — zgłoś administratorowi Core CC Toolkod 21 (wersja nie jest wyższa niż już zapisana) — w źródle podnieś numer wersji i wyślij plik ponowniekod 30 (rozmiar pliku niezgodny) — pobierz poprawny plik i wyślij ponownie pełny opis w bazie ryzykCCtool wysł.CCtool zwalid.Wysłany dokument nie spełnia kryterium rozmiaru, a ACK ma status czerwony — typowo kod 30.Postępowanie:W aplikacji CCM kliknij plik lewym przyciskiem myszy → Informacje → potwierdź rozmiarPobierz poprawny plik z aplikacji ZP (Pobierz XML) i wyślij przez Core CC Tool (Manual Upload) z kolejnym numerem wersjiNadal za mały → zgłoś szczegóły w bazie ryzykCCtool wysł.CCtool zwalid.Wysłany dokument nie spełnia kryterium rozmiaru. ACK napłynął po CET z pozytywnym komunikatem. Sprzeczność.Postępowanie:Pobierz z MinIO → rozpakuj → sprawdź zawartośćJeżeli:zawartość OK → oznacz 'R' (→ powiązany stan); zgłośniepoprawna → zgłośCCtool wysł.CCtool zwalid.Dokument wysłany prawidłowo do CCTool, ale ACK negatywny (Rejected). Kody: 20/21/30.Postępowanie:Najedź kursorem na status i odczytaj kod ACKJeżeli:kod 20 (bramka dla pliku zamknięta) → zgłoś (administrator Core CC Tool otwiera bramkę); sprawdź proces IDx-AC-FORWARDINGkod 21 (wersja nie jest wyższa niż zapisana) → podnieś numer wersji w aplikacji ZP i wyślij plik ponownie przez Core CC Tool (Manual Upload)kod 30 (rozmiar pliku niezgodny) → pobierz poprawny plik z MinIO lub aplikacji ZP i wyślij ponownieCCtool wysł.CCtool zwalid.Dokument wysłany prawidłowo, trwa oczekiwanie na ACK, który nie napłynął w zadanym czasie (&gt;2-3 min).Postępowanie:Czekaj 5 min → Core CC Tool (⚠ nie wysyłaj ponownie!)Jeżeli:Processed → oznacz 'R' + zgłośRejected → patrz stan kod ACKbrak wpisu → Awaria transportu plików (Connector 2.0). Zgłoś awarię. W międzyczasie pobierz plik ze źródła (aplikacji ZP) i wyślij go ręcznie przez Core CC Tool (Manual Upload). pełny opis w bazie ryzykCCtool wysł.CCtool zwalid.Dokument wysłany prawidłowo, ACK nie napłynął do CET.Postępowanie:Core CC Tool → sprawdź statusJeżeli:Processed → oznacz 'R' + zgłoś (→ powiązany stan)Rejected → wyślij ponownie przez Core CC Tool (Manual Upload) "po CET"brak → Awaria transportu plików (Connector 2.0). Zgłoś awarię. W międzyczasie pobierz plik ze źródła (aplikacji ZP) i wyślij go ręcznie przez Core CC Tool (Manual Upload). pełny opis w bazie ryzyk + powiadom RCCCCtool wysł.CCtool zwalid.Wysłany dokument nie spełnia kryterium rozmiaru. ACK nie napłynął do CET. Krytyczne.Postępowanie (KRYTYCZNE w C):Pobierz poprawny plik z aplikacji ZP i wyślij przez Core CC Tool (Manual Upload) "po CET" (jeśli bramka otwarta)Natychmiast: zgłoś + powiadom RCC szczegóły w bazie ryzykCCtool wysł.CCtool zwalid.Dokument zarejestrowany w CCTool po CET (wysyłka pozytywna), ale walidacja zakończona negatywnie — ACK Rejected po CET.Postępowanie (po CET):Najedź kursorem na status i odczytaj kod ACK (kontekst: rejestracja po CET)Jeżeli:kod 20 (bramka dla pliku zamknięta) → po CET bramka zamknięta → zgłoś + powiadom RCCkod 21 (wersja nie jest wyższa niż zapisana) → podnieś numer wersji w aplikacji ZP i wyślij plik ponownie przez Core CC Tool (Manual Upload) (jeśli bramka otwarta)kod 30 (rozmiar pliku niezgodny) → pobierz poprawny plik z MinIO lub aplikacji ZP i wyślij ponownie (jeśli bramka otwarta)CCtool wysł.CCtool zwalid.Dokument zarejestrowany w CCTool po CET (wysyłka pozytywna), ale ACK walidacji nie napłynął — plik dostarczony, lecz niezwalidowany.Postępowanie (po CET):Core CC Tool → sprawdź status walidacji (plik dostarczony po CET)Jeżeli:Processed → oznacz 'R' w CCM + zgłośRejected → postępuj jak w Stanie 30 (odczytaj kod ACK)brak wpisu → Awaria transportu plików (Connector 2.0). Zgłoś awarię. W międzyczasie pobierz plik ze źródła (aplikacji ZP) i wyślij go ręcznie przez Core CC Tool (Manual Upload). pełny opis w bazie ryzyk + powiadom RCCCCtool wysł.CCtool zwalid.Dokument nie został dostarczony do CCTool, ACK nie napłynął. Minął czas CET. KRYTYCZNE — po CET dograć nie można.Postępowanie (KRYTYCZNE — brak naprawy):Telefon do RCC + zgłoś (priorytet P1)Po CET — brak naprawy. Diagnoza przyczyn: ZP · Connector 2.0 · Core CC Tool szczegóły w bazie ryzyk</w:t>
+      </w:r>
+    </w:p>
+    <w:p>
       <w:pPr>
         <w:pStyle w:val="Heading4"/>
       </w:pPr>
@@ -9450,6 +9752,16 @@
       </w:r>
     </w:p>
     <w:p>
+      <w:r>
+        <w:t>Warianty stanów (8)</w:t>
+      </w:r>
+    </w:p>
+    <w:p>
+      <w:r>
+        <w:t>Status kafelkaSytuacjaDziałania awaryjnesFTP/ZP wysł.Plik dostarczony prawidłowo na sFTP/ZP — status pozytywny.Brak działań — proces poprawny.sFTP/ZP wysł.Status nadany ręcznie literą 'R' przez Dyspozytora po weryfikacji.Brak działań — decyzja ręczna Dyspozytora.sFTP/ZP wysł.Plik dostarczony po CET — status pozytywny.Brak działań — dostarczone po CET, OK.sFTP/ZP wysł.Przedwczesne (&gt;30 min do TET) — plik jeszcze niewymagany.Monitoring — czekaj do TET.sFTP/ZP wysł.Oczekiwanie / transfer w toku (stan przejściowy).Czekaj 5 min → sprawdź sFTP/ZP. Gdy brak → wyślij plik ręcznie ze źródła na sFTP/ZP.sFTP/ZP wysł.Zbliża się TET — pliku jeszcze nie ma na sFTP/ZP.Sprawdź źródło (Kreator / Perun4V / Core CC Tool). Gdy brak → wyślij plik ręcznie ze źródła na sFTP/ZP.sFTP/ZP wysł.Zbliża się CET / błąd dostarczenia — brak pliku na sFTP/ZP.Gdy pliku NIE ma na sFTP/ZP → wyślij plik ręcznie ze źródła na sFTP/ZP.sFTP/ZP wysł.Minął CET — plik niedostarczony. Krytyczne.Zgłoś (CIZ/WPO/PSE-I). Po CET — postępowanie krytyczne (brak lokalnego fallbacku).</w:t>
+      </w:r>
+    </w:p>
+    <w:p>
       <w:pPr>
         <w:pStyle w:val="Heading4"/>
       </w:pPr>
@@ -9531,6 +9843,16 @@
       </w:r>
     </w:p>
     <w:p>
+      <w:r>
+        <w:t>Warianty stanów (18)</w:t>
+      </w:r>
+    </w:p>
+    <w:p>
+      <w:r>
+        <w:t>Status kafelkaSytuacjaDziałania awaryjneCCtool wysł.CCtool zwalid.Przedwczesne (&gt;30 min do TET). Walidacja ATC jeszcze nie ukończona.Monitoring — sprawdź w aplikacji CCM postęp walidacji paczki PERUN_IDx_ATC.CCtool wysł.CCtool zwalid.Zbliża się TET, brak FIDx-928. Walidacja paczki ATC w toku.Postępowanie:Rozwiń agregat PERUN_IDx_ATC → zweryfikuj składoweJeżeli:brak składowej → uzupełnij brakującą składową w aplikacji CCM ()składowe OK → monitoruj — czekaj na wynik walidacjiCCtool wysł.CCtool zwalid.Zbliża się CET — brak wyniku walidacji ATC. Stan alarmowy.Postępowanie (zbliża się CET):Ostatnia szansa: dokończ uzupełnienia paczki ATC w CCM; sprawdź Core CC Tool (Message Viewer)Jeżeli:plik dotrze → OK — koniecbłąd → odczytaj kod ACK (patrz powiązany stan)brak → zgłośCCtool wysł.CCtool zwalid.Minął CET, brak FIDx-928. KRYTYCZNE — brak lokalnego fallbacku.Postępowanie (KRYTYCZNE — minął CET):⛔ STOP — żadnych działań ręcznych. Brak lokalnego fallbacku (brak wyniku ATC w czasie → Dyspozytor nie wykonuje dalszych czynności).Zgłoś + telefon do RCC szczegóły w bazie ryzykCCtool wysł.CCtool zwalid.Happy Day — walidacja ATC zakończona poprawnie, wynik opublikowany.Brak interwencji — walidacja ATC zakończona poprawnie.CCtool wysł.CCtool zwalid.Wynik dotarł, ale ACK negatywny (Rejected).Postępowanie:Core CC Tool (Message Viewer) → odczytaj kod ACKJeżeli:kod 20 (bramka dla pliku zamknięta) → zgłoś (administrator Core CC Tool otwiera bramkę)kod 21 (błąd procesowy CCCt) → zgłoś — błąd procesu w Core CC Toolkod 30 (rozmiar niezgodny) → patrz stan rozmiarCCtool wysł.CCtool zwalid.Wynik dotarł, ACK nie napłynął w czasie (timeout).Postępowanie:Czekaj 5 min → Core CC Tool (Message Viewer)Jeżeli:Processed → oznacz 'R' w CCMbrak &gt;10 min → zgłoś — sprawdź transport zwrotny Connector 2.0 (R18)CCtool wysł.CCtool zwalid.Wynik dotarł, brak ACK do CET.Postępowanie:Sprawdź transport zwrotny Connector 2.0Jeżeli:transport OK, ACK błąd → odczytaj kod ACK (patrz powiązany stan)awaria transportu → zgłoś (R18)CCtool wysł.CCtool zwalid.Wynik dotarł, ACK napłynął po CET — pozytywny.Walidacja opóźniona, ale OK (ACK po CET pozytywny).CCtool wysł.CCtool zwalid.Status nadany ręcznie 'R' (nietypowe dla pliku zwrotnego).Brak działań — status nadany ręcznie przez Dyspozytora (nietypowe dla pliku zwrotnego).CCtool wysł.CCtool zwalid.Niepoprawny rozmiar wyniku FIDx-928.Postępowanie:W aplikacji CCM kliknij plik lewym przyciskiem myszy → Informacje → sprawdź rozmiar (pobranie ponownie nie ma sensu — plik zwrotny)Jeżeli:zawartość OK mimo rozmiaru → oznacz 'R' w CCMzawartość niepoprawna → zgłoś + telefon do RCCCCtool wysł.CCtool zwalid.Niepoprawny rozmiar + brak ACK (timeout).Postępowanie:Core CC Tool (Message Viewer) → sprawdź statusJeżeli:Processed → oznacz 'R' w CCMbrak → zgłoś + telefon do RCCCCtool wysł.CCtool zwalid.Niepoprawny rozmiar + ACK negatywny.Postępowanie:Core CC Tool (Message Viewer) → odczytaj kod ACKJeżeli:kod 20 (bramka zamknięta) → zgłoś (administrator Core CC Tool)kod 30 (rozmiar) → patrz powiązany staninny → zgłoś + telefon do RCCCCtool wysł.CCtool zwalid.Niepoprawny rozmiar + brak ACK do CET. KRYTYCZNE.Postępowanie (KRYTYCZNE):⛔ Krytyczne — minął CET, niepoprawny rozmiar i brak ACK.Zgłoś + telefon do RCC szczegóły w bazie ryzykCCtool wysł.CCtool zwalid.FIDx-928 dostarczony po CET — walidacja OK.Walidacja zakończona po terminie — OK.CCtool wysł.CCtool zwalid.Wysyłka zwrotna trwa (transport Connector 2.0).Postępowanie:Czekaj 5 min (transport zwrotny Connector 2.0)Jeżeli:zmieniło się na zielony → OK — koniecbrak &gt;10 min → zgłoś (R18)CCtool wysł.CCtool zwalid.Status ręczny przyznany (nietypowe dla pliku zwrotnego).Brak działań — status ręczny przyznany przez Dyspozytora (nietypowe dla pliku zwrotnego).CCtool wysł.CCtool zwalid.TET zbliża się, ACK błąd już teraz (błąd paczki ATC).Postępowanie:Core CC Tool (Message Viewer) → odczytaj błąd paczki ATCJeżeli:błąd składowej → uzupełnij składową w aplikacji CCMinny → odczytaj kod ACK (patrz powiązany stan)</w:t>
+      </w:r>
+    </w:p>
+    <w:p>
       <w:pPr>
         <w:pStyle w:val="Heading3"/>
       </w:pPr>
@@ -9610,6 +9932,16 @@
       </w:r>
     </w:p>
     <w:p>
+      <w:r>
+        <w:t>Warianty stanów (8)</w:t>
+      </w:r>
+    </w:p>
+    <w:p>
+      <w:r>
+        <w:t>Status kafelkaSytuacjaDziałania awaryjnesFTP/ZP wysł.Plik dostarczony prawidłowo na sFTP/ZP — status pozytywny.Brak działań — proces poprawny.sFTP/ZP wysł.Status nadany ręcznie literą 'R' przez Dyspozytora po weryfikacji.Brak działań — decyzja ręczna Dyspozytora.sFTP/ZP wysł.Plik dostarczony po CET — status pozytywny.Brak działań — dostarczone po CET, OK.sFTP/ZP wysł.Przedwczesne (&gt;30 min do TET) — plik jeszcze niewymagany.Monitoring — czekaj do TET.sFTP/ZP wysł.Oczekiwanie / transfer w toku (stan przejściowy).Czekaj 5 min → sprawdź sFTP/ZP. Gdy brak → wyślij plik ręcznie ze źródła na sFTP/ZP.sFTP/ZP wysł.Zbliża się TET — pliku jeszcze nie ma na sFTP/ZP.Sprawdź źródło (Kreator / Perun4V / Core CC Tool). Gdy brak → wyślij plik ręcznie ze źródła na sFTP/ZP.sFTP/ZP wysł.Zbliża się CET / błąd dostarczenia — brak pliku na sFTP/ZP.Gdy pliku NIE ma na sFTP/ZP → wyślij plik ręcznie ze źródła na sFTP/ZP.sFTP/ZP wysł.Minął CET — plik niedostarczony. Krytyczne.Zgłoś (CIZ/WPO/PSE-I). Po CET — postępowanie krytyczne (brak lokalnego fallbacku).</w:t>
+      </w:r>
+    </w:p>
+    <w:p>
       <w:pPr>
         <w:pStyle w:val="Heading4"/>
       </w:pPr>
@@ -9696,6 +10028,16 @@
       </w:r>
     </w:p>
     <w:p>
+      <w:r>
+        <w:t>Warianty stanów (32)</w:t>
+      </w:r>
+    </w:p>
+    <w:p>
+      <w:r>
+        <w:t>Status kafelkaSytuacjaDziałania awaryjneCCtool wysł.CCtool zwalid.Dokument wysłany prawidłowo do CCTool, otrzymano potwierdzenie ACK z pozytywnym komunikatem.Brak działań — proces poprawny.CCtool wysł.CCtool zwalid.Dokument wysłany prawidłowo do CCTool. Dyspozytor ustawił status ręcznie 'R' po weryfikacji w CCTool.Brak działań.CCtool wysł.CCtool zwalid.Dokument wysłany prawidłowo do CCTool po CET, ACK napłynął po CET z pozytywnym komunikatem.Brak działań — dostarczone po CET, OK.CCtool wysł.CCtool zwalid.Dokument oznaczony ręcznie jako wysłany prawidłowo do CCTool oraz otrzymanie potwierdzenia ACK.Brak działań.CCtool wysł.CCtool zwalid.Dokument prawidłowo wysłany ręcznie z poziomu CCM. Otrzymano potwierdzenie ACK z pozytywnym komunikatem.Brak działań — wysyłka ręczna wykonana.CCtool wysł.CCtool zwalid.Dokument prawidłowo wysłany ręcznie z poziomu CCM. Trwa oczekiwanie na potwierdzenie ACK — około 2 min.Postępowanie:Czekaj 5 minOK → ustaw 'R' w CCMCCtool wysł.CCtool zwalid.Dokument wysłany ręcznie z poziomu CCM, ale ACK nie napłynął w żądanym czasie i zbliża się CET.Postępowanie:Core CC Tool → sprawdź czy plik dotarł (Message Viewer)Jeżeli:OK → oznacz 'R' w CCMbłąd → Plik został odrzucony — odczytaj kod błędu z potwierdzenia ACK i zareaguj zależnie od kodu:kod 20 (bramka dla pliku zamknięta) — zgłoś administratorowi Core CC Toolkod 21 (wersja nie jest wyższa niż już zapisana) — w źródle podnieś numer wersji i wyślij plik ponowniekod 30 (rozmiar pliku niezgodny) — pobierz poprawny plik i wyślij ponownie pełny opis w bazie ryzykbrak → Awaria transportu plików (Connector 2.0). Zgłoś awarię. W międzyczasie wygeneruj plik w KreatorIDCF_CGMES i wyślij go ręcznie przez Core CC Tool (Manual Upload). pełny opis w bazie ryzykCCtool wysł.CCtool zwalid.Dokument wysłany ręcznie z poziomu CCM, a otrzymane ACK: (1) zawiera komunikat błędu (najedź kursorem); (2) proces zakończył się błędem — 'Błąd procesu'.Postępowanie:Najedź kursorem na status i odczytaj kod ACKJeżeli:kod 20 (bramka dla pliku zamknięta) → zgłoś administratorowi Core CC Toolkod 21 (wersja nie jest wyższa niż zapisana) → wygeneruj kolejną wersję w KreatorIDCF_CGMES i opublikuj (Publikuj Connector) · szczegółowa procedura (ze screenami)kod 30 (rozmiar pliku niezgodny) → wygeneruj ponownie w KreatorIDCF_CGMES i opublikuj (Publikuj Connector) · szczegółowa procedura (ze screenami)CCtool wysł.CCtool zwalid.Dokument prawidłowo wysłany ręcznie z poziomu CCM. Otrzymano potwierdzenie ACK z pozytywnym komunikatem po CET.Brak działań — ręczna + ACK po CET, OK.CCtool wysł.CCtool zwalid.Dokument prawidłowo wysłany ręcznie z poziomu CCM. Nie otrzymano potwierdzenia ACK — upłynął czas CET.Postępowanie:Core CC Tool → sprawdź statusJeżeli:OK (Processed) → oznacz 'R' w CCM + zgłośbrak / awaria zwrotna → Awaria transportu plików (Connector 2.0). Zgłoś awarię. W międzyczasie wygeneruj plik w KreatorIDCF_CGMES i wyślij go ręcznie przez Core CC Tool (Manual Upload). pełny opis w bazie ryzykCCtool wysł.CCtool zwalid.Dokument prawidłowo wysłany ręcznie z poziomu CCM. Nie otrzymano ACK, Dyspozytor ustawił status 'R' po weryfikacji w CCTool.Brak działań — decyzja ręczna Dyspozytora.CCtool wysł.CCtool zwalid.Dokument prawidłowo wysłany ręcznie z poziomu CCM po CET. Trwa oczekiwanie na potwierdzenie ACK — około 2 min.Postępowanie:Czekaj 2-5 minOK → ustaw 'R'CCtool wysł.CCtool zwalid.Dokument wysłany ręcznie z poziomu CCM po CET. Trwa oczekiwanie na potwierdzenie ACK — upłynęło więcej niż 2 minuty.Postępowanie:Core CC Tool → sprawdź czy plik dotarł (Message Viewer)Jeżeli:OK → oznacz 'R' w CCMbłąd → Plik został odrzucony — odczytaj kod błędu z potwierdzenia ACK i zareaguj zależnie od kodu:kod 20 (bramka dla pliku zamknięta) — zgłoś administratorowi Core CC Toolkod 21 (wersja nie jest wyższa niż już zapisana) — w źródle podnieś numer wersji i wyślij plik ponowniekod 30 (rozmiar pliku niezgodny) — pobierz poprawny plik i wyślij ponownie pełny opis w bazie ryzykbrak → Awaria transportu plików (Connector 2.0). Zgłoś awarię. W międzyczasie wygeneruj plik w KreatorIDCF_CGMES i wyślij go ręcznie przez Core CC Tool (Manual Upload). pełny opis w bazie ryzykCCtool wysł.CCtool zwalid.Dokument wysłany ręcznie z poziomu CCM po CET, a otrzymane ACK: (1) komunikat błędu; (2) proces zakończył się błędem. Typowo kod 20 gateClosed.Postępowanie:Najedź kursorem na status i odczytaj kod ACK (typowo kod 20)Jeżeli:kod 20 (bramka dla pliku zamknięta) → po CET bramka jest zamknięta → zgłośinny kod → Plik został odrzucony — odczytaj kod błędu z potwierdzenia ACK i zareaguj zależnie od kodu:kod 20 (bramka dla pliku zamknięta) — zgłoś administratorowi Core CC Toolkod 21 (wersja nie jest wyższa niż już zapisana) — w źródle podnieś numer wersji i wyślij plik ponowniekod 30 (rozmiar pliku niezgodny) — pobierz poprawny plik i wyślij ponownie pełny opis w bazie ryzykCCtool wysł.CCtool zwalid.Dokument prawidłowo wysłany ręcznie z poziomu CCM po CET. Otrzymano potwierdzenie ACK z pozytywnym komunikatem (po CET).Brak działań — ręczna + ACK po CET, OK.CCtool wysł.CCtool zwalid.Dokument prawidłowo wysłany ręcznie z poziomu CCM po CET. Nie otrzymano potwierdzenia ACK — upłynął czas CET.Postępowanie:Core CC Tool → sprawdź statusJeżeli:OK (Processed) → oznacz 'R' w CCM + zgłośbrak / awaria zwrotna → Awaria transportu plików (Connector 2.0). Zgłoś awarię. W międzyczasie wygeneruj plik w KreatorIDCF_CGMES i wyślij go ręcznie przez Core CC Tool (Manual Upload). pełny opis w bazie ryzykCCtool wysł.CCtool zwalid.Dokument oznaczony ręcznie jako wysłany prawidłowo do CCTool. Trwa oczekiwanie na ACK — około 2 min.Postępowanie:Czekaj 5 minOK → 'R' dla ACKCCtool wysł.CCtool zwalid.Dokument oznaczony ręcznie jako wysłany prawidłowo. Trwa oczekiwanie na ACK — upłynęło więcej niż 2 min.Postępowanie:Czekaj 5 minOK → 'R' dla ACKCCtool wysł.CCtool zwalid.Dokument oznaczony ręcznie jako wysłany prawidłowo. Nie otrzymano potwierdzenia ACK — upłynął czas CET.Postępowanie:Core CC Tool → sprawdź statusJeżeli:OK (Processed) → utrzymaj 'R'brak / awaria → Awaria transportu plików (Connector 2.0). Zgłoś awarię. W międzyczasie wygeneruj plik w KreatorIDCF_CGMES i wyślij go ręcznie przez Core CC Tool (Manual Upload). pełny opis w bazie ryzykCCtool wysł.CCtool zwalid.Wysłany dokument nie spełnia kryterium rozmiaru. ACK nie otrzymano, Dyspozytor ustawił status 'R' po weryfikacji w CCTool.Brak działań — Dyspozytor zatwierdził zawartość.CCtool wysł.CCtool zwalid.Dokument jeszcze nie został wysłany do CCTool, ACK nie napłynął. Plik nie wymagany (&gt;30 min do TET).Brak działań — czekaj do TET.CCtool wysł.CCtool zwalid.Zbliża się CET — plik niedostarczony lub błąd wysyłki. Stan alarmowy.Postępowanie (alarm):Core CC Tool → sprawdź czy plik dotarł do Core CC ToolJeżeli:plik jest, brak ACK → Plik został odrzucony — odczytaj kod błędu z potwierdzenia ACK i zareaguj zależnie od kodu:kod 20 (bramka dla pliku zamknięta) — zgłoś administratorowi Core CC Toolkod 21 (wersja nie jest wyższa niż już zapisana) — w źródle podnieś numer wersji i wyślij plik ponowniekod 30 (rozmiar pliku niezgodny) — pobierz poprawny plik i wyślij ponownie pełny opis w bazie ryzykbrak pliku (awaria Connector 2.0) → Awaria transportu plików (Connector 2.0). Zgłoś awarię. W międzyczasie wygeneruj plik w KreatorIDCF_CGMES i wyślij go ręcznie przez Core CC Tool (Manual Upload). pełny opis w bazie ryzykbrak pliku w źródle → Brak pliku lub wersji w aplikacji źródłowej. Otwórz KreatorIDCF_CGMES i wygeneruj plik ponownie (kolejna wersja); jeśli aplikacja nie działa — zgłoś. pełny opis w bazie ryzykCCtool wysł.CCtool zwalid.Wysłany dokument nie spełnia kryterium rozmiaru. Oczekiwanie na ACK — upłynęło więcej niż 2 min.Postępowanie:W aplikacji CCM kliknij plik lewym przyciskiem myszy → Informacje → sprawdź rozmiar; pobierz z MinIO i rozpakujJeżeli:zawartość OK mimo rozmiaru → oznacz 'R' (→ powiązany stan)zawartość niepoprawna → Plik został odrzucony — odczytaj kod błędu z potwierdzenia ACK i zareaguj zależnie od kodu:kod 20 (bramka dla pliku zamknięta) — zgłoś administratorowi Core CC Toolkod 21 (wersja nie jest wyższa niż już zapisana) — w źródle podnieś numer wersji i wyślij plik ponowniekod 30 (rozmiar pliku niezgodny) — pobierz poprawny plik i wyślij ponownie pełny opis w bazie ryzykCCtool wysł.CCtool zwalid.Wysłany dokument nie spełnia kryterium rozmiaru, a ACK ma status czerwony — typowo kod 30.Postępowanie:W aplikacji CCM kliknij plik lewym przyciskiem myszy → Informacje → potwierdź rozmiarWygeneruj poprawny plik w KreatorIDCF_CGMES (kolejna wersja) i opublikuj (Publikuj Connector) · szczegółowa procedura (ze screenami)Nadal za mały → zgłoś szczegóły w bazie ryzykCCtool wysł.CCtool zwalid.Wysłany dokument nie spełnia kryterium rozmiaru. ACK napłynął po CET z pozytywnym komunikatem. Sprzeczność.Postępowanie:Pobierz z MinIO → rozpakuj → sprawdź zawartośćJeżeli:zawartość OK → oznacz 'R' (→ powiązany stan); zgłośniepoprawna → zgłośCCtool wysł.CCtool zwalid.Dokument wysłany prawidłowo do CCTool, ale ACK negatywny (Rejected). Kody: 20/21/30.Postępowanie:Najedź kursorem na status i odczytaj kod ACKJeżeli:kod 20 (bramka dla pliku zamknięta) → zgłoś (administrator Core CC Tool otwiera bramkę); sprawdź proces IDx-AC-FORWARDINGkod 21 (wersja nie jest wyższa niż zapisana) → wygeneruj kolejną wersję w KreatorIDCF_CGMES i opublikuj (Publikuj Connector) · szczegółowa procedura (ze screenami)kod 30 (rozmiar pliku niezgodny) → wygeneruj ponownie w KreatorIDCF_CGMES i opublikuj (Publikuj Connector) · szczegółowa procedura (ze screenami)CCtool wysł.CCtool zwalid.Dokument wysłany prawidłowo, trwa oczekiwanie na ACK, który nie napłynął w zadanym czasie (&gt;2-3 min).Postępowanie:Czekaj 5 min → Core CC Tool (⚠ nie wysyłaj ponownie!)Jeżeli:Processed → oznacz 'R' + zgłośRejected → patrz stan kod ACKbrak wpisu → Awaria transportu plików (Connector 2.0). Zgłoś awarię. W międzyczasie wygeneruj plik w KreatorIDCF_CGMES i wyślij go ręcznie przez Core CC Tool (Manual Upload). pełny opis w bazie ryzykCCtool wysł.CCtool zwalid.Dokument wysłany prawidłowo, ACK nie napłynął do CET.Postępowanie:Core CC Tool → sprawdź statusJeżeli:Processed → oznacz 'R' + zgłoś (→ powiązany stan)Rejected → wyślij ponownie przez Core CC Tool (Manual Upload) "po CET"brak → Awaria transportu plików (Connector 2.0). Zgłoś awarię. W międzyczasie wygeneruj plik w KreatorIDCF_CGMES i wyślij go ręcznie przez Core CC Tool (Manual Upload). pełny opis w bazie ryzyk + powiadom RCCCCtool wysł.CCtool zwalid.Wysłany dokument nie spełnia kryterium rozmiaru. ACK nie napłynął do CET. Krytyczne.Postępowanie (KRYTYCZNE w C):Wygeneruj poprawny plik w KreatorIDCF_CGMES i opublikuj (Publikuj Connector) · szczegółowa procedura (ze screenami) "po CET" (jeśli bramka otwarta)Natychmiast: zgłoś + powiadom RCC szczegóły w bazie ryzykCCtool wysł.CCtool zwalid.Dokument zarejestrowany w CCTool po CET (wysyłka pozytywna), ale walidacja zakończona negatywnie — ACK Rejected po CET.Postępowanie (po CET):Najedź kursorem na status i odczytaj kod ACK (kontekst: rejestracja po CET)Jeżeli:kod 20 (bramka dla pliku zamknięta) → po CET bramka zamknięta → zgłoś + powiadom RCCkod 21 (wersja nie jest wyższa niż zapisana) → wygeneruj kolejną wersję w KreatorIDCF_CGMES i opublikuj (Publikuj Connector) · szczegółowa procedura (ze screenami) (jeśli bramka otwarta)kod 30 (rozmiar pliku niezgodny) → wygeneruj ponownie w KreatorIDCF_CGMES i opublikuj (Publikuj Connector) · szczegółowa procedura (ze screenami) (jeśli bramka otwarta)CCtool wysł.CCtool zwalid.Dokument zarejestrowany w CCTool po CET (wysyłka pozytywna), ale ACK walidacji nie napłynął — plik dostarczony, lecz niezwalidowany.Postępowanie (po CET):Core CC Tool → sprawdź status walidacji (plik dostarczony po CET)Jeżeli:Processed → oznacz 'R' w CCM + zgłośRejected → postępuj jak w Stanie 30 (odczytaj kod ACK)brak wpisu → Awaria transportu plików (Connector 2.0). Zgłoś awarię. W międzyczasie wygeneruj plik w KreatorIDCF_CGMES i wyślij go ręcznie przez Core CC Tool (Manual Upload). pełny opis w bazie ryzyk + powiadom RCCCCtool wysł.CCtool zwalid.Dokument nie został dostarczony do CCTool, ACK nie napłynął. Minął czas CET. KRYTYCZNE — po CET dograć nie można.Postępowanie (KRYTYCZNE — brak naprawy):Telefon do RCC + zgłoś (priorytet P1)Po CET — brak naprawy. Diagnoza przyczyn: Kreator · Connector 2.0 · Core CC Tool szczegóły w bazie ryzyk</w:t>
+      </w:r>
+    </w:p>
+    <w:p>
       <w:pPr>
         <w:pStyle w:val="Heading4"/>
       </w:pPr>
@@ -9757,6 +10099,16 @@
       </w:r>
     </w:p>
     <w:p>
+      <w:r>
+        <w:t>Warianty stanów (8)</w:t>
+      </w:r>
+    </w:p>
+    <w:p>
+      <w:r>
+        <w:t>Status kafelkaSytuacjaDziałania awaryjneMinIOPlik dostarczony prawidłowo na MinIO — status pozytywny.Brak działań — proces poprawny.MinIOStatus nadany ręcznie literą 'R' przez Dyspozytora po weryfikacji.Brak działań — decyzja ręczna Dyspozytora.MinIOPlik dostarczony po CET — status pozytywny.Brak działań — dostarczone po CET, OK.MinIOPrzedwczesne (&gt;30 min do TET) — plik jeszcze niewymagany.Monitoring — czekaj do TET.MinIOOczekiwanie / transfer w toku (stan przejściowy).Czekaj 5 min → sprawdź MinIO. Gdy brak → pobierz/wygeneruj plik ręcznie ze źródła i wgraj przez Manual Upload (GUI Core CC Tool) / wyślij z CCM.MinIOZbliża się TET — pliku jeszcze nie ma na MinIO.Sprawdź źródło (Kreator / Perun4V / Core CC Tool). Gdy brak → pobierz/wygeneruj plik ręcznie ze źródła i wgraj przez Manual Upload (GUI Core CC Tool) / wyślij z CCM.MinIOZbliża się CET / błąd dostarczenia — brak pliku na MinIO.Gdy pliku NIE ma na MinIO → pobierz/wygeneruj plik ręcznie ze źródła i wgraj przez Manual Upload (GUI Core CC Tool) / wyślij z CCM.MinIOMinął CET — plik niedostarczony. Krytyczne.Zgłoś (CIZ/WPO/PSE-I). Po CET — postępowanie krytyczne (brak lokalnego fallbacku).</w:t>
+      </w:r>
+    </w:p>
+    <w:p>
       <w:pPr>
         <w:pStyle w:val="Heading4"/>
       </w:pPr>
@@ -9818,6 +10170,16 @@
       </w:r>
     </w:p>
     <w:p>
+      <w:r>
+        <w:t>Warianty stanów (8)</w:t>
+      </w:r>
+    </w:p>
+    <w:p>
+      <w:r>
+        <w:t>Status kafelkaSytuacjaDziałania awaryjneMinIOPlik dostarczony prawidłowo na MinIO — status pozytywny.Brak działań — proces poprawny.MinIOStatus nadany ręcznie literą 'R' przez Dyspozytora po weryfikacji.Brak działań — decyzja ręczna Dyspozytora.MinIOPlik dostarczony po CET — status pozytywny.Brak działań — dostarczone po CET, OK.MinIOPrzedwczesne (&gt;30 min do TET) — plik jeszcze niewymagany.Monitoring — czekaj do TET.MinIOOczekiwanie / transfer w toku (stan przejściowy).Czekaj 5 min → sprawdź MinIO. Gdy brak → pobierz/wygeneruj plik ręcznie ze źródła i wgraj przez Manual Upload (GUI Core CC Tool) / wyślij z CCM.MinIOZbliża się TET — pliku jeszcze nie ma na MinIO.Sprawdź źródło (Kreator / Perun4V / Core CC Tool). Gdy brak → pobierz/wygeneruj plik ręcznie ze źródła i wgraj przez Manual Upload (GUI Core CC Tool) / wyślij z CCM.MinIOZbliża się CET / błąd dostarczenia — brak pliku na MinIO.Gdy pliku NIE ma na MinIO → pobierz/wygeneruj plik ręcznie ze źródła i wgraj przez Manual Upload (GUI Core CC Tool) / wyślij z CCM.MinIOMinął CET — plik niedostarczony. Krytyczne.Zgłoś (CIZ/WPO/PSE-I). Po CET — postępowanie krytyczne (brak lokalnego fallbacku).</w:t>
+      </w:r>
+    </w:p>
+    <w:p>
       <w:pPr>
         <w:pStyle w:val="Heading4"/>
       </w:pPr>
@@ -9904,6 +10266,16 @@
       </w:r>
     </w:p>
     <w:p>
+      <w:r>
+        <w:t>Warianty stanów (32)</w:t>
+      </w:r>
+    </w:p>
+    <w:p>
+      <w:r>
+        <w:t>Status kafelkaSytuacjaDziałania awaryjneCCtool wysł.CCtool zwalid.Dokument wysłany prawidłowo do CCTool, otrzymano potwierdzenie ACK z pozytywnym komunikatem.Brak działań — proces poprawny.CCtool wysł.CCtool zwalid.Dokument wysłany prawidłowo do CCTool. Dyspozytor ustawił status ręcznie 'R' po weryfikacji w CCTool.Brak działań.CCtool wysł.CCtool zwalid.Dokument wysłany prawidłowo do CCTool po CET, ACK napłynął po CET z pozytywnym komunikatem.Brak działań — dostarczone po CET, OK.CCtool wysł.CCtool zwalid.Dokument oznaczony ręcznie jako wysłany prawidłowo do CCTool oraz otrzymanie potwierdzenia ACK.Brak działań.CCtool wysł.CCtool zwalid.Dokument prawidłowo wysłany ręcznie z poziomu CCM. Otrzymano potwierdzenie ACK z pozytywnym komunikatem.Brak działań — wysyłka ręczna wykonana.CCtool wysł.CCtool zwalid.Dokument prawidłowo wysłany ręcznie z poziomu CCM. Trwa oczekiwanie na potwierdzenie ACK — około 2 min.Postępowanie:Czekaj 5 minOK → ustaw 'R' w CCMCCtool wysł.CCtool zwalid.Dokument wysłany ręcznie z poziomu CCM, ale ACK nie napłynął w żądanym czasie i zbliża się CET.Postępowanie:Core CC Tool → sprawdź czy plik dotarł (Message Viewer)Jeżeli:OK → oznacz 'R' w CCMbłąd → Plik został odrzucony — odczytaj kod błędu z potwierdzenia ACK i zareaguj zależnie od kodu:kod 20 (bramka dla pliku zamknięta) — zgłoś administratorowi Core CC Toolkod 21 (wersja nie jest wyższa niż już zapisana) — w źródle podnieś numer wersji i wyślij plik ponowniekod 30 (rozmiar pliku niezgodny) — pobierz poprawny plik i wyślij ponownie pełny opis w bazie ryzykbrak → Awaria transportu plików (Connector 2.0). Zgłoś awarię. W międzyczasie wygeneruj plik w KreatorIDCF_CGMES i wyślij go ręcznie przez Core CC Tool (Manual Upload). pełny opis w bazie ryzykCCtool wysł.CCtool zwalid.Dokument wysłany ręcznie z poziomu CCM, a otrzymane ACK: (1) zawiera komunikat błędu (najedź kursorem); (2) proces zakończył się błędem — 'Błąd procesu'.Postępowanie:Najedź kursorem na status i odczytaj kod ACKJeżeli:kod 20 (bramka dla pliku zamknięta) → zgłoś administratorowi Core CC Toolkod 21 (wersja nie jest wyższa niż zapisana) → wygeneruj kolejną wersję w KreatorIDCF_CGMES i opublikuj (Publikuj Connector) · szczegółowa procedura (ze screenami)kod 30 (rozmiar pliku niezgodny) → wygeneruj ponownie w KreatorIDCF_CGMES i opublikuj (Publikuj Connector) · szczegółowa procedura (ze screenami)CCtool wysł.CCtool zwalid.Dokument prawidłowo wysłany ręcznie z poziomu CCM. Otrzymano potwierdzenie ACK z pozytywnym komunikatem po CET.Brak działań — ręczna + ACK po CET, OK.CCtool wysł.CCtool zwalid.Dokument prawidłowo wysłany ręcznie z poziomu CCM. Nie otrzymano potwierdzenia ACK — upłynął czas CET.Postępowanie:Core CC Tool → sprawdź statusJeżeli:OK (Processed) → oznacz 'R' w CCM + zgłośbrak / awaria zwrotna → Awaria transportu plików (Connector 2.0). Zgłoś awarię. W międzyczasie wygeneruj plik w KreatorIDCF_CGMES i wyślij go ręcznie przez Core CC Tool (Manual Upload). pełny opis w bazie ryzykCCtool wysł.CCtool zwalid.Dokument prawidłowo wysłany ręcznie z poziomu CCM. Nie otrzymano ACK, Dyspozytor ustawił status 'R' po weryfikacji w CCTool.Brak działań — decyzja ręczna Dyspozytora.CCtool wysł.CCtool zwalid.Dokument prawidłowo wysłany ręcznie z poziomu CCM po CET. Trwa oczekiwanie na potwierdzenie ACK — około 2 min.Postępowanie:Czekaj 2-5 minOK → ustaw 'R'CCtool wysł.CCtool zwalid.Dokument wysłany ręcznie z poziomu CCM po CET. Trwa oczekiwanie na potwierdzenie ACK — upłynęło więcej niż 2 minuty.Postępowanie:Core CC Tool → sprawdź czy plik dotarł (Message Viewer)Jeżeli:OK → oznacz 'R' w CCMbłąd → Plik został odrzucony — odczytaj kod błędu z potwierdzenia ACK i zareaguj zależnie od kodu:kod 20 (bramka dla pliku zamknięta) — zgłoś administratorowi Core CC Toolkod 21 (wersja nie jest wyższa niż już zapisana) — w źródle podnieś numer wersji i wyślij plik ponowniekod 30 (rozmiar pliku niezgodny) — pobierz poprawny plik i wyślij ponownie pełny opis w bazie ryzykbrak → Awaria transportu plików (Connector 2.0). Zgłoś awarię. W międzyczasie wygeneruj plik w KreatorIDCF_CGMES i wyślij go ręcznie przez Core CC Tool (Manual Upload). pełny opis w bazie ryzykCCtool wysł.CCtool zwalid.Dokument wysłany ręcznie z poziomu CCM po CET, a otrzymane ACK: (1) komunikat błędu; (2) proces zakończył się błędem. Typowo kod 20 gateClosed.Postępowanie:Najedź kursorem na status i odczytaj kod ACK (typowo kod 20)Jeżeli:kod 20 (bramka dla pliku zamknięta) → po CET bramka jest zamknięta → zgłośinny kod → Plik został odrzucony — odczytaj kod błędu z potwierdzenia ACK i zareaguj zależnie od kodu:kod 20 (bramka dla pliku zamknięta) — zgłoś administratorowi Core CC Toolkod 21 (wersja nie jest wyższa niż już zapisana) — w źródle podnieś numer wersji i wyślij plik ponowniekod 30 (rozmiar pliku niezgodny) — pobierz poprawny plik i wyślij ponownie pełny opis w bazie ryzykCCtool wysł.CCtool zwalid.Dokument prawidłowo wysłany ręcznie z poziomu CCM po CET. Otrzymano potwierdzenie ACK z pozytywnym komunikatem (po CET).Brak działań — ręczna + ACK po CET, OK.CCtool wysł.CCtool zwalid.Dokument prawidłowo wysłany ręcznie z poziomu CCM po CET. Nie otrzymano potwierdzenia ACK — upłynął czas CET.Postępowanie:Core CC Tool → sprawdź statusJeżeli:OK (Processed) → oznacz 'R' w CCM + zgłośbrak / awaria zwrotna → Awaria transportu plików (Connector 2.0). Zgłoś awarię. W międzyczasie wygeneruj plik w KreatorIDCF_CGMES i wyślij go ręcznie przez Core CC Tool (Manual Upload). pełny opis w bazie ryzykCCtool wysł.CCtool zwalid.Dokument oznaczony ręcznie jako wysłany prawidłowo do CCTool. Trwa oczekiwanie na ACK — około 2 min.Postępowanie:Czekaj 5 minOK → 'R' dla ACKCCtool wysł.CCtool zwalid.Dokument oznaczony ręcznie jako wysłany prawidłowo. Trwa oczekiwanie na ACK — upłynęło więcej niż 2 min.Postępowanie:Czekaj 5 minOK → 'R' dla ACKCCtool wysł.CCtool zwalid.Dokument oznaczony ręcznie jako wysłany prawidłowo. Nie otrzymano potwierdzenia ACK — upłynął czas CET.Postępowanie:Core CC Tool → sprawdź statusJeżeli:OK (Processed) → utrzymaj 'R'brak / awaria → Awaria transportu plików (Connector 2.0). Zgłoś awarię. W międzyczasie wygeneruj plik w KreatorIDCF_CGMES i wyślij go ręcznie przez Core CC Tool (Manual Upload). pełny opis w bazie ryzykCCtool wysł.CCtool zwalid.Wysłany dokument nie spełnia kryterium rozmiaru. ACK nie otrzymano, Dyspozytor ustawił status 'R' po weryfikacji w CCTool.Brak działań — Dyspozytor zatwierdził zawartość.CCtool wysł.CCtool zwalid.Dokument jeszcze nie został wysłany do CCTool, ACK nie napłynął. Plik nie wymagany (&gt;30 min do TET).Brak działań — czekaj do TET.CCtool wysł.CCtool zwalid.Zbliża się CET — plik niedostarczony lub błąd wysyłki. Stan alarmowy.Postępowanie (alarm):Core CC Tool → sprawdź czy plik dotarł do Core CC ToolJeżeli:plik jest, brak ACK → Plik został odrzucony — odczytaj kod błędu z potwierdzenia ACK i zareaguj zależnie od kodu:kod 20 (bramka dla pliku zamknięta) — zgłoś administratorowi Core CC Toolkod 21 (wersja nie jest wyższa niż już zapisana) — w źródle podnieś numer wersji i wyślij plik ponowniekod 30 (rozmiar pliku niezgodny) — pobierz poprawny plik i wyślij ponownie pełny opis w bazie ryzykbrak pliku (awaria Connector 2.0) → Awaria transportu plików (Connector 2.0). Zgłoś awarię. W międzyczasie wygeneruj plik w KreatorIDCF_CGMES i wyślij go ręcznie przez Core CC Tool (Manual Upload). pełny opis w bazie ryzykbrak pliku w źródle → Brak pliku lub wersji w aplikacji źródłowej. Otwórz KreatorIDCF_CGMES i wygeneruj plik ponownie (kolejna wersja); jeśli aplikacja nie działa — zgłoś. pełny opis w bazie ryzykCCtool wysł.CCtool zwalid.Wysłany dokument nie spełnia kryterium rozmiaru. Oczekiwanie na ACK — upłynęło więcej niż 2 min.Postępowanie:W aplikacji CCM kliknij plik lewym przyciskiem myszy → Informacje → sprawdź rozmiar; pobierz z MinIO i rozpakujJeżeli:zawartość OK mimo rozmiaru → oznacz 'R' (→ powiązany stan)zawartość niepoprawna → Plik został odrzucony — odczytaj kod błędu z potwierdzenia ACK i zareaguj zależnie od kodu:kod 20 (bramka dla pliku zamknięta) — zgłoś administratorowi Core CC Toolkod 21 (wersja nie jest wyższa niż już zapisana) — w źródle podnieś numer wersji i wyślij plik ponowniekod 30 (rozmiar pliku niezgodny) — pobierz poprawny plik i wyślij ponownie pełny opis w bazie ryzykCCtool wysł.CCtool zwalid.Wysłany dokument nie spełnia kryterium rozmiaru, a ACK ma status czerwony — typowo kod 30.Postępowanie:W aplikacji CCM kliknij plik lewym przyciskiem myszy → Informacje → potwierdź rozmiarWygeneruj poprawny plik w KreatorIDCF_CGMES (kolejna wersja) i opublikuj (Publikuj Connector) · szczegółowa procedura (ze screenami)Nadal za mały → zgłoś szczegóły w bazie ryzykCCtool wysł.CCtool zwalid.Wysłany dokument nie spełnia kryterium rozmiaru. ACK napłynął po CET z pozytywnym komunikatem. Sprzeczność.Postępowanie:Pobierz z MinIO → rozpakuj → sprawdź zawartośćJeżeli:zawartość OK → oznacz 'R' (→ powiązany stan); zgłośniepoprawna → zgłośCCtool wysł.CCtool zwalid.Dokument wysłany prawidłowo do CCTool, ale ACK negatywny (Rejected). Kody: 20/21/30.Postępowanie:Najedź kursorem na status i odczytaj kod ACKJeżeli:kod 20 (bramka dla pliku zamknięta) → zgłoś (administrator Core CC Tool otwiera bramkę); sprawdź proces IDx-AC-FORWARDINGkod 21 (wersja nie jest wyższa niż zapisana) → wygeneruj kolejną wersję w KreatorIDCF_CGMES i opublikuj (Publikuj Connector) · szczegółowa procedura (ze screenami)kod 30 (rozmiar pliku niezgodny) → wygeneruj ponownie w KreatorIDCF_CGMES i opublikuj (Publikuj Connector) · szczegółowa procedura (ze screenami)CCtool wysł.CCtool zwalid.Dokument wysłany prawidłowo, trwa oczekiwanie na ACK, który nie napłynął w zadanym czasie (&gt;2-3 min).Postępowanie:Czekaj 5 min → Core CC Tool (⚠ nie wysyłaj ponownie!)Jeżeli:Processed → oznacz 'R' + zgłośRejected → patrz stan kod ACKbrak wpisu → Awaria transportu plików (Connector 2.0). Zgłoś awarię. W międzyczasie wygeneruj plik w KreatorIDCF_CGMES i wyślij go ręcznie przez Core CC Tool (Manual Upload). pełny opis w bazie ryzykCCtool wysł.CCtool zwalid.Dokument wysłany prawidłowo, ACK nie napłynął do CET.Postępowanie:Core CC Tool → sprawdź statusJeżeli:Processed → oznacz 'R' + zgłoś (→ powiązany stan)Rejected → wyślij ponownie przez Core CC Tool (Manual Upload) "po CET"brak → Awaria transportu plików (Connector 2.0). Zgłoś awarię. W międzyczasie wygeneruj plik w KreatorIDCF_CGMES i wyślij go ręcznie przez Core CC Tool (Manual Upload). pełny opis w bazie ryzyk + powiadom RCCCCtool wysł.CCtool zwalid.Wysłany dokument nie spełnia kryterium rozmiaru. ACK nie napłynął do CET. Krytyczne.Postępowanie (KRYTYCZNE w C):Wygeneruj poprawny plik w KreatorIDCF_CGMES i opublikuj (Publikuj Connector) · szczegółowa procedura (ze screenami) "po CET" (jeśli bramka otwarta)Natychmiast: zgłoś + powiadom RCC szczegóły w bazie ryzykCCtool wysł.CCtool zwalid.Dokument zarejestrowany w CCTool po CET (wysyłka pozytywna), ale walidacja zakończona negatywnie — ACK Rejected po CET.Postępowanie (po CET):Najedź kursorem na status i odczytaj kod ACK (kontekst: rejestracja po CET)Jeżeli:kod 20 (bramka dla pliku zamknięta) → po CET bramka zamknięta → zgłoś + powiadom RCCkod 21 (wersja nie jest wyższa niż zapisana) → wygeneruj kolejną wersję w KreatorIDCF_CGMES i opublikuj (Publikuj Connector) · szczegółowa procedura (ze screenami) (jeśli bramka otwarta)kod 30 (rozmiar pliku niezgodny) → wygeneruj ponownie w KreatorIDCF_CGMES i opublikuj (Publikuj Connector) · szczegółowa procedura (ze screenami) (jeśli bramka otwarta)CCtool wysł.CCtool zwalid.Dokument zarejestrowany w CCTool po CET (wysyłka pozytywna), ale ACK walidacji nie napłynął — plik dostarczony, lecz niezwalidowany.Postępowanie (po CET):Core CC Tool → sprawdź status walidacji (plik dostarczony po CET)Jeżeli:Processed → oznacz 'R' w CCM + zgłośRejected → postępuj jak w Stanie 30 (odczytaj kod ACK)brak wpisu → Awaria transportu plików (Connector 2.0). Zgłoś awarię. W międzyczasie wygeneruj plik w KreatorIDCF_CGMES i wyślij go ręcznie przez Core CC Tool (Manual Upload). pełny opis w bazie ryzyk + powiadom RCCCCtool wysł.CCtool zwalid.Dokument nie został dostarczony do CCTool, ACK nie napłynął. Minął czas CET. KRYTYCZNE — po CET dograć nie można.Postępowanie (KRYTYCZNE — brak naprawy):Telefon do RCC + zgłoś (priorytet P1)Po CET — brak naprawy. Diagnoza przyczyn: Kreator · Connector 2.0 · Core CC Tool szczegóły w bazie ryzyk</w:t>
+      </w:r>
+    </w:p>
+    <w:p>
       <w:pPr>
         <w:pStyle w:val="Heading4"/>
       </w:pPr>
@@ -9965,6 +10337,16 @@
       </w:r>
     </w:p>
     <w:p>
+      <w:r>
+        <w:t>Warianty stanów (8)</w:t>
+      </w:r>
+    </w:p>
+    <w:p>
+      <w:r>
+        <w:t>Status kafelkaSytuacjaDziałania awaryjneMinIOPlik dostarczony prawidłowo na MinIO — status pozytywny.Brak działań — proces poprawny.MinIOStatus nadany ręcznie literą 'R' przez Dyspozytora po weryfikacji.Brak działań — decyzja ręczna Dyspozytora.MinIOPlik dostarczony po CET — status pozytywny.Brak działań — dostarczone po CET, OK.MinIOPrzedwczesne (&gt;30 min do TET) — plik jeszcze niewymagany.Monitoring — czekaj do TET.MinIOOczekiwanie / transfer w toku (stan przejściowy).Czekaj 5 min → sprawdź MinIO. Gdy brak → pobierz/wygeneruj plik ręcznie ze źródła i wgraj przez Manual Upload (GUI Core CC Tool) / wyślij z CCM.MinIOZbliża się TET — pliku jeszcze nie ma na MinIO.Sprawdź źródło (Kreator / Perun4V / Core CC Tool). Gdy brak → pobierz/wygeneruj plik ręcznie ze źródła i wgraj przez Manual Upload (GUI Core CC Tool) / wyślij z CCM.MinIOZbliża się CET / błąd dostarczenia — brak pliku na MinIO.Gdy pliku NIE ma na MinIO → pobierz/wygeneruj plik ręcznie ze źródła i wgraj przez Manual Upload (GUI Core CC Tool) / wyślij z CCM.MinIOMinął CET — plik niedostarczony. Krytyczne.Zgłoś (CIZ/WPO/PSE-I). Po CET — postępowanie krytyczne (brak lokalnego fallbacku).</w:t>
+      </w:r>
+    </w:p>
+    <w:p>
       <w:pPr>
         <w:pStyle w:val="Heading4"/>
       </w:pPr>
@@ -10026,6 +10408,16 @@
       </w:r>
     </w:p>
     <w:p>
+      <w:r>
+        <w:t>Warianty stanów (8)</w:t>
+      </w:r>
+    </w:p>
+    <w:p>
+      <w:r>
+        <w:t>Status kafelkaSytuacjaDziałania awaryjneMinIOPlik dostarczony prawidłowo na MinIO — status pozytywny.Brak działań — proces poprawny.MinIOStatus nadany ręcznie literą 'R' przez Dyspozytora po weryfikacji.Brak działań — decyzja ręczna Dyspozytora.MinIOPlik dostarczony po CET — status pozytywny.Brak działań — dostarczone po CET, OK.MinIOPrzedwczesne (&gt;30 min do TET) — plik jeszcze niewymagany.Monitoring — czekaj do TET.MinIOOczekiwanie / transfer w toku (stan przejściowy).Czekaj 5 min → sprawdź MinIO. Gdy brak → pobierz/wygeneruj plik ręcznie ze źródła i wgraj przez Manual Upload (GUI Core CC Tool) / wyślij z CCM.MinIOZbliża się TET — pliku jeszcze nie ma na MinIO.Sprawdź źródło (Kreator / Perun4V / Core CC Tool). Gdy brak → pobierz/wygeneruj plik ręcznie ze źródła i wgraj przez Manual Upload (GUI Core CC Tool) / wyślij z CCM.MinIOZbliża się CET / błąd dostarczenia — brak pliku na MinIO.Gdy pliku NIE ma na MinIO → pobierz/wygeneruj plik ręcznie ze źródła i wgraj przez Manual Upload (GUI Core CC Tool) / wyślij z CCM.MinIOMinął CET — plik niedostarczony. Krytyczne.Zgłoś (CIZ/WPO/PSE-I). Po CET — postępowanie krytyczne (brak lokalnego fallbacku).</w:t>
+      </w:r>
+    </w:p>
+    <w:p>
       <w:pPr>
         <w:pStyle w:val="Heading4"/>
       </w:pPr>
@@ -10087,6 +10479,16 @@
       </w:r>
     </w:p>
     <w:p>
+      <w:r>
+        <w:t>Warianty stanów (8)</w:t>
+      </w:r>
+    </w:p>
+    <w:p>
+      <w:r>
+        <w:t>Status kafelkaSytuacjaDziałania awaryjneMinIOPlik dostarczony prawidłowo na MinIO — status pozytywny.Brak działań — proces poprawny.MinIOStatus nadany ręcznie literą 'R' przez Dyspozytora po weryfikacji.Brak działań — decyzja ręczna Dyspozytora.MinIOPlik dostarczony po CET — status pozytywny.Brak działań — dostarczone po CET, OK.MinIOPrzedwczesne (&gt;30 min do TET) — plik jeszcze niewymagany.Monitoring — czekaj do TET.MinIOOczekiwanie / transfer w toku (stan przejściowy).Czekaj 5 min → sprawdź MinIO. Gdy brak → pobierz/wygeneruj plik ręcznie ze źródła i wgraj przez Manual Upload (GUI Core CC Tool) / wyślij z CCM.MinIOZbliża się TET — pliku jeszcze nie ma na MinIO.Sprawdź źródło (Kreator / Perun4V / Core CC Tool). Gdy brak → pobierz/wygeneruj plik ręcznie ze źródła i wgraj przez Manual Upload (GUI Core CC Tool) / wyślij z CCM.MinIOZbliża się CET / błąd dostarczenia — brak pliku na MinIO.Gdy pliku NIE ma na MinIO → pobierz/wygeneruj plik ręcznie ze źródła i wgraj przez Manual Upload (GUI Core CC Tool) / wyślij z CCM.MinIOMinął CET — plik niedostarczony. Krytyczne.Zgłoś (CIZ/WPO/PSE-I). Po CET — postępowanie krytyczne (brak lokalnego fallbacku).</w:t>
+      </w:r>
+    </w:p>
+    <w:p>
       <w:pPr>
         <w:pStyle w:val="Heading4"/>
       </w:pPr>
@@ -10148,6 +10550,16 @@
       </w:r>
     </w:p>
     <w:p>
+      <w:r>
+        <w:t>Warianty stanów (8)</w:t>
+      </w:r>
+    </w:p>
+    <w:p>
+      <w:r>
+        <w:t>Status kafelkaSytuacjaDziałania awaryjneMinIOPlik dostarczony prawidłowo na MinIO — status pozytywny.Brak działań — proces poprawny.MinIOStatus nadany ręcznie literą 'R' przez Dyspozytora po weryfikacji.Brak działań — decyzja ręczna Dyspozytora.MinIOPlik dostarczony po CET — status pozytywny.Brak działań — dostarczone po CET, OK.MinIOPrzedwczesne (&gt;30 min do TET) — plik jeszcze niewymagany.Monitoring — czekaj do TET.MinIOOczekiwanie / transfer w toku (stan przejściowy).Czekaj 5 min → sprawdź MinIO. Gdy brak → pobierz/wygeneruj plik ręcznie ze źródła i wgraj przez Manual Upload (GUI Core CC Tool) / wyślij z CCM.MinIOZbliża się TET — pliku jeszcze nie ma na MinIO.Sprawdź źródło (Kreator / Perun4V / Core CC Tool). Gdy brak → pobierz/wygeneruj plik ręcznie ze źródła i wgraj przez Manual Upload (GUI Core CC Tool) / wyślij z CCM.MinIOZbliża się CET / błąd dostarczenia — brak pliku na MinIO.Gdy pliku NIE ma na MinIO → pobierz/wygeneruj plik ręcznie ze źródła i wgraj przez Manual Upload (GUI Core CC Tool) / wyślij z CCM.MinIOMinął CET — plik niedostarczony. Krytyczne.Zgłoś (CIZ/WPO/PSE-I). Po CET — postępowanie krytyczne (brak lokalnego fallbacku).</w:t>
+      </w:r>
+    </w:p>
+    <w:p>
       <w:pPr>
         <w:pStyle w:val="Heading4"/>
       </w:pPr>
@@ -10209,6 +10621,16 @@
       </w:r>
     </w:p>
     <w:p>
+      <w:r>
+        <w:t>Warianty stanów (8)</w:t>
+      </w:r>
+    </w:p>
+    <w:p>
+      <w:r>
+        <w:t>Status kafelkaSytuacjaDziałania awaryjneMinIOPlik dostarczony prawidłowo na MinIO — status pozytywny.Brak działań — proces poprawny.MinIOStatus nadany ręcznie literą 'R' przez Dyspozytora po weryfikacji.Brak działań — decyzja ręczna Dyspozytora.MinIOPlik dostarczony po CET — status pozytywny.Brak działań — dostarczone po CET, OK.MinIOPrzedwczesne (&gt;30 min do TET) — plik jeszcze niewymagany.Monitoring — czekaj do TET.MinIOOczekiwanie / transfer w toku (stan przejściowy).Czekaj 5 min → sprawdź MinIO. Gdy brak → pobierz/wygeneruj plik ręcznie ze źródła i wgraj przez Manual Upload (GUI Core CC Tool) / wyślij z CCM.MinIOZbliża się TET — pliku jeszcze nie ma na MinIO.Sprawdź źródło (Kreator / Perun4V / Core CC Tool). Gdy brak → pobierz/wygeneruj plik ręcznie ze źródła i wgraj przez Manual Upload (GUI Core CC Tool) / wyślij z CCM.MinIOZbliża się CET / błąd dostarczenia — brak pliku na MinIO.Gdy pliku NIE ma na MinIO → pobierz/wygeneruj plik ręcznie ze źródła i wgraj przez Manual Upload (GUI Core CC Tool) / wyślij z CCM.MinIOMinął CET — plik niedostarczony. Krytyczne.Zgłoś (CIZ/WPO/PSE-I). Po CET — postępowanie krytyczne (brak lokalnego fallbacku).</w:t>
+      </w:r>
+    </w:p>
+    <w:p>
       <w:pPr>
         <w:pStyle w:val="Heading4"/>
       </w:pPr>
@@ -10270,6 +10692,16 @@
       </w:r>
     </w:p>
     <w:p>
+      <w:r>
+        <w:t>Warianty stanów (8)</w:t>
+      </w:r>
+    </w:p>
+    <w:p>
+      <w:r>
+        <w:t>Status kafelkaSytuacjaDziałania awaryjneMinIOPlik dostarczony prawidłowo na MinIO — status pozytywny.Brak działań — proces poprawny.MinIOStatus nadany ręcznie literą 'R' przez Dyspozytora po weryfikacji.Brak działań — decyzja ręczna Dyspozytora.MinIOPlik dostarczony po CET — status pozytywny.Brak działań — dostarczone po CET, OK.MinIOPrzedwczesne (&gt;30 min do TET) — plik jeszcze niewymagany.Monitoring — czekaj do TET.MinIOOczekiwanie / transfer w toku (stan przejściowy).Czekaj 5 min → sprawdź MinIO. Gdy brak → pobierz/wygeneruj plik ręcznie ze źródła i wgraj przez Manual Upload (GUI Core CC Tool) / wyślij z CCM.MinIOZbliża się TET — pliku jeszcze nie ma na MinIO.Sprawdź źródło (Kreator / Perun4V / Core CC Tool). Gdy brak → pobierz/wygeneruj plik ręcznie ze źródła i wgraj przez Manual Upload (GUI Core CC Tool) / wyślij z CCM.MinIOZbliża się CET / błąd dostarczenia — brak pliku na MinIO.Gdy pliku NIE ma na MinIO → pobierz/wygeneruj plik ręcznie ze źródła i wgraj przez Manual Upload (GUI Core CC Tool) / wyślij z CCM.MinIOMinął CET — plik niedostarczony. Krytyczne.Zgłoś (CIZ/WPO/PSE-I). Po CET — postępowanie krytyczne (brak lokalnego fallbacku).</w:t>
+      </w:r>
+    </w:p>
+    <w:p>
       <w:pPr>
         <w:pStyle w:val="Heading4"/>
       </w:pPr>
@@ -10331,6 +10763,16 @@
       </w:r>
     </w:p>
     <w:p>
+      <w:r>
+        <w:t>Warianty stanów (8)</w:t>
+      </w:r>
+    </w:p>
+    <w:p>
+      <w:r>
+        <w:t>Status kafelkaSytuacjaDziałania awaryjneMinIOPlik dostarczony prawidłowo na MinIO — status pozytywny.Brak działań — proces poprawny.MinIOStatus nadany ręcznie literą 'R' przez Dyspozytora po weryfikacji.Brak działań — decyzja ręczna Dyspozytora.MinIOPlik dostarczony po CET — status pozytywny.Brak działań — dostarczone po CET, OK.MinIOPrzedwczesne (&gt;30 min do TET) — plik jeszcze niewymagany.Monitoring — czekaj do TET.MinIOOczekiwanie / transfer w toku (stan przejściowy).Czekaj 5 min → sprawdź MinIO. Gdy brak → pobierz/wygeneruj plik ręcznie ze źródła i wgraj przez Manual Upload (GUI Core CC Tool) / wyślij z CCM.MinIOZbliża się TET — pliku jeszcze nie ma na MinIO.Sprawdź źródło (Kreator / Perun4V / Core CC Tool). Gdy brak → pobierz/wygeneruj plik ręcznie ze źródła i wgraj przez Manual Upload (GUI Core CC Tool) / wyślij z CCM.MinIOZbliża się CET / błąd dostarczenia — brak pliku na MinIO.Gdy pliku NIE ma na MinIO → pobierz/wygeneruj plik ręcznie ze źródła i wgraj przez Manual Upload (GUI Core CC Tool) / wyślij z CCM.MinIOMinął CET — plik niedostarczony. Krytyczne.Zgłoś (CIZ/WPO/PSE-I). Po CET — postępowanie krytyczne (brak lokalnego fallbacku).</w:t>
+      </w:r>
+    </w:p>
+    <w:p>
       <w:pPr>
         <w:pStyle w:val="Heading4"/>
       </w:pPr>
@@ -10392,6 +10834,16 @@
       </w:r>
     </w:p>
     <w:p>
+      <w:r>
+        <w:t>Warianty stanów (8)</w:t>
+      </w:r>
+    </w:p>
+    <w:p>
+      <w:r>
+        <w:t>Status kafelkaSytuacjaDziałania awaryjneMinIOPlik dostarczony prawidłowo na MinIO — status pozytywny.Brak działań — proces poprawny.MinIOStatus nadany ręcznie literą 'R' przez Dyspozytora po weryfikacji.Brak działań — decyzja ręczna Dyspozytora.MinIOPlik dostarczony po CET — status pozytywny.Brak działań — dostarczone po CET, OK.MinIOPrzedwczesne (&gt;30 min do TET) — plik jeszcze niewymagany.Monitoring — czekaj do TET.MinIOOczekiwanie / transfer w toku (stan przejściowy).Czekaj 5 min → sprawdź MinIO. Gdy brak → pobierz/wygeneruj plik ręcznie ze źródła i wgraj przez Manual Upload (GUI Core CC Tool) / wyślij z CCM.MinIOZbliża się TET — pliku jeszcze nie ma na MinIO.Sprawdź źródło (Kreator / Perun4V / Core CC Tool). Gdy brak → pobierz/wygeneruj plik ręcznie ze źródła i wgraj przez Manual Upload (GUI Core CC Tool) / wyślij z CCM.MinIOZbliża się CET / błąd dostarczenia — brak pliku na MinIO.Gdy pliku NIE ma na MinIO → pobierz/wygeneruj plik ręcznie ze źródła i wgraj przez Manual Upload (GUI Core CC Tool) / wyślij z CCM.MinIOMinął CET — plik niedostarczony. Krytyczne.Zgłoś (CIZ/WPO/PSE-I). Po CET — postępowanie krytyczne (brak lokalnego fallbacku).</w:t>
+      </w:r>
+    </w:p>
+    <w:p>
       <w:pPr>
         <w:pStyle w:val="Heading4"/>
       </w:pPr>
@@ -10453,6 +10905,16 @@
       </w:r>
     </w:p>
     <w:p>
+      <w:r>
+        <w:t>Warianty stanów (8)</w:t>
+      </w:r>
+    </w:p>
+    <w:p>
+      <w:r>
+        <w:t>Status kafelkaSytuacjaDziałania awaryjneMinIOPlik dostarczony prawidłowo na MinIO — status pozytywny.Brak działań — proces poprawny.MinIOStatus nadany ręcznie literą 'R' przez Dyspozytora po weryfikacji.Brak działań — decyzja ręczna Dyspozytora.MinIOPlik dostarczony po CET — status pozytywny.Brak działań — dostarczone po CET, OK.MinIOPrzedwczesne (&gt;30 min do TET) — plik jeszcze niewymagany.Monitoring — czekaj do TET.MinIOOczekiwanie / transfer w toku (stan przejściowy).Czekaj 5 min → sprawdź MinIO. Gdy brak → pobierz/wygeneruj plik ręcznie ze źródła i wgraj przez Manual Upload (GUI Core CC Tool) / wyślij z CCM.MinIOZbliża się TET — pliku jeszcze nie ma na MinIO.Sprawdź źródło (Kreator / Perun4V / Core CC Tool). Gdy brak → pobierz/wygeneruj plik ręcznie ze źródła i wgraj przez Manual Upload (GUI Core CC Tool) / wyślij z CCM.MinIOZbliża się CET / błąd dostarczenia — brak pliku na MinIO.Gdy pliku NIE ma na MinIO → pobierz/wygeneruj plik ręcznie ze źródła i wgraj przez Manual Upload (GUI Core CC Tool) / wyślij z CCM.MinIOMinął CET — plik niedostarczony. Krytyczne.Zgłoś (CIZ/WPO/PSE-I). Po CET — postępowanie krytyczne (brak lokalnego fallbacku).</w:t>
+      </w:r>
+    </w:p>
+    <w:p>
       <w:pPr>
         <w:pStyle w:val="Heading4"/>
       </w:pPr>
@@ -10514,6 +10976,16 @@
       </w:r>
     </w:p>
     <w:p>
+      <w:r>
+        <w:t>Warianty stanów (8)</w:t>
+      </w:r>
+    </w:p>
+    <w:p>
+      <w:r>
+        <w:t>Status kafelkaSytuacjaDziałania awaryjneMinIOPlik dostarczony prawidłowo na MinIO — status pozytywny.Brak działań — proces poprawny.MinIOStatus nadany ręcznie literą 'R' przez Dyspozytora po weryfikacji.Brak działań — decyzja ręczna Dyspozytora.MinIOPlik dostarczony po CET — status pozytywny.Brak działań — dostarczone po CET, OK.MinIOPrzedwczesne (&gt;30 min do TET) — plik jeszcze niewymagany.Monitoring — czekaj do TET.MinIOOczekiwanie / transfer w toku (stan przejściowy).Czekaj 5 min → sprawdź MinIO. Gdy brak → pobierz/wygeneruj plik ręcznie ze źródła i wgraj przez Manual Upload (GUI Core CC Tool) / wyślij z CCM.MinIOZbliża się TET — pliku jeszcze nie ma na MinIO.Sprawdź źródło (Kreator / Perun4V / Core CC Tool). Gdy brak → pobierz/wygeneruj plik ręcznie ze źródła i wgraj przez Manual Upload (GUI Core CC Tool) / wyślij z CCM.MinIOZbliża się CET / błąd dostarczenia — brak pliku na MinIO.Gdy pliku NIE ma na MinIO → pobierz/wygeneruj plik ręcznie ze źródła i wgraj przez Manual Upload (GUI Core CC Tool) / wyślij z CCM.MinIOMinął CET — plik niedostarczony. Krytyczne.Zgłoś (CIZ/WPO/PSE-I). Po CET — postępowanie krytyczne (brak lokalnego fallbacku).</w:t>
+      </w:r>
+    </w:p>
+    <w:p>
       <w:pPr>
         <w:pStyle w:val="Heading4"/>
       </w:pPr>
@@ -10575,6 +11047,16 @@
       </w:r>
     </w:p>
     <w:p>
+      <w:r>
+        <w:t>Warianty stanów (8)</w:t>
+      </w:r>
+    </w:p>
+    <w:p>
+      <w:r>
+        <w:t>Status kafelkaSytuacjaDziałania awaryjneMinIOPlik dostarczony prawidłowo na MinIO — status pozytywny.Brak działań — proces poprawny.MinIOStatus nadany ręcznie literą 'R' przez Dyspozytora po weryfikacji.Brak działań — decyzja ręczna Dyspozytora.MinIOPlik dostarczony po CET — status pozytywny.Brak działań — dostarczone po CET, OK.MinIOPrzedwczesne (&gt;30 min do TET) — plik jeszcze niewymagany.Monitoring — czekaj do TET.MinIOOczekiwanie / transfer w toku (stan przejściowy).Czekaj 5 min → sprawdź MinIO. Gdy brak → pobierz/wygeneruj plik ręcznie ze źródła i wgraj przez Manual Upload (GUI Core CC Tool) / wyślij z CCM.MinIOZbliża się TET — pliku jeszcze nie ma na MinIO.Sprawdź źródło (Kreator / Perun4V / Core CC Tool). Gdy brak → pobierz/wygeneruj plik ręcznie ze źródła i wgraj przez Manual Upload (GUI Core CC Tool) / wyślij z CCM.MinIOZbliża się CET / błąd dostarczenia — brak pliku na MinIO.Gdy pliku NIE ma na MinIO → pobierz/wygeneruj plik ręcznie ze źródła i wgraj przez Manual Upload (GUI Core CC Tool) / wyślij z CCM.MinIOMinął CET — plik niedostarczony. Krytyczne.Zgłoś (CIZ/WPO/PSE-I). Po CET — postępowanie krytyczne (brak lokalnego fallbacku).</w:t>
+      </w:r>
+    </w:p>
+    <w:p>
       <w:pPr>
         <w:pStyle w:val="Heading4"/>
       </w:pPr>
@@ -10636,6 +11118,16 @@
       </w:r>
     </w:p>
     <w:p>
+      <w:r>
+        <w:t>Warianty stanów (8)</w:t>
+      </w:r>
+    </w:p>
+    <w:p>
+      <w:r>
+        <w:t>Status kafelkaSytuacjaDziałania awaryjneMinIOPlik dostarczony prawidłowo na MinIO — status pozytywny.Brak działań — proces poprawny.MinIOStatus nadany ręcznie literą 'R' przez Dyspozytora po weryfikacji.Brak działań — decyzja ręczna Dyspozytora.MinIOPlik dostarczony po CET — status pozytywny.Brak działań — dostarczone po CET, OK.MinIOPrzedwczesne (&gt;30 min do TET) — plik jeszcze niewymagany.Monitoring — czekaj do TET.MinIOOczekiwanie / transfer w toku (stan przejściowy).Czekaj 5 min → sprawdź MinIO. Gdy brak → pobierz/wygeneruj plik ręcznie ze źródła i wgraj przez Manual Upload (GUI Core CC Tool) / wyślij z CCM.MinIOZbliża się TET — pliku jeszcze nie ma na MinIO.Sprawdź źródło (Kreator / Perun4V / Core CC Tool). Gdy brak → pobierz/wygeneruj plik ręcznie ze źródła i wgraj przez Manual Upload (GUI Core CC Tool) / wyślij z CCM.MinIOZbliża się CET / błąd dostarczenia — brak pliku na MinIO.Gdy pliku NIE ma na MinIO → pobierz/wygeneruj plik ręcznie ze źródła i wgraj przez Manual Upload (GUI Core CC Tool) / wyślij z CCM.MinIOMinął CET — plik niedostarczony. Krytyczne.Zgłoś (CIZ/WPO/PSE-I). Po CET — postępowanie krytyczne (brak lokalnego fallbacku).</w:t>
+      </w:r>
+    </w:p>
+    <w:p>
       <w:pPr>
         <w:pStyle w:val="Heading4"/>
       </w:pPr>
@@ -10697,6 +11189,16 @@
       </w:r>
     </w:p>
     <w:p>
+      <w:r>
+        <w:t>Warianty stanów (8)</w:t>
+      </w:r>
+    </w:p>
+    <w:p>
+      <w:r>
+        <w:t>Status kafelkaSytuacjaDziałania awaryjneMinIOPlik dostarczony prawidłowo na MinIO — status pozytywny.Brak działań — proces poprawny.MinIOStatus nadany ręcznie literą 'R' przez Dyspozytora po weryfikacji.Brak działań — decyzja ręczna Dyspozytora.MinIOPlik dostarczony po CET — status pozytywny.Brak działań — dostarczone po CET, OK.MinIOPrzedwczesne (&gt;30 min do TET) — plik jeszcze niewymagany.Monitoring — czekaj do TET.MinIOOczekiwanie / transfer w toku (stan przejściowy).Czekaj 5 min → sprawdź MinIO. Gdy brak → pobierz/wygeneruj plik ręcznie ze źródła i wgraj przez Manual Upload (GUI Core CC Tool) / wyślij z CCM.MinIOZbliża się TET — pliku jeszcze nie ma na MinIO.Sprawdź źródło (Kreator / Perun4V / Core CC Tool). Gdy brak → pobierz/wygeneruj plik ręcznie ze źródła i wgraj przez Manual Upload (GUI Core CC Tool) / wyślij z CCM.MinIOZbliża się CET / błąd dostarczenia — brak pliku na MinIO.Gdy pliku NIE ma na MinIO → pobierz/wygeneruj plik ręcznie ze źródła i wgraj przez Manual Upload (GUI Core CC Tool) / wyślij z CCM.MinIOMinął CET — plik niedostarczony. Krytyczne.Zgłoś (CIZ/WPO/PSE-I). Po CET — postępowanie krytyczne (brak lokalnego fallbacku).</w:t>
+      </w:r>
+    </w:p>
+    <w:p>
       <w:pPr>
         <w:pStyle w:val="Heading4"/>
       </w:pPr>
@@ -10758,6 +11260,16 @@
       </w:r>
     </w:p>
     <w:p>
+      <w:r>
+        <w:t>Warianty stanów (8)</w:t>
+      </w:r>
+    </w:p>
+    <w:p>
+      <w:r>
+        <w:t>Status kafelkaSytuacjaDziałania awaryjneMinIOPlik dostarczony prawidłowo na MinIO — status pozytywny.Brak działań — proces poprawny.MinIOStatus nadany ręcznie literą 'R' przez Dyspozytora po weryfikacji.Brak działań — decyzja ręczna Dyspozytora.MinIOPlik dostarczony po CET — status pozytywny.Brak działań — dostarczone po CET, OK.MinIOPrzedwczesne (&gt;30 min do TET) — plik jeszcze niewymagany.Monitoring — czekaj do TET.MinIOOczekiwanie / transfer w toku (stan przejściowy).Czekaj 5 min → sprawdź MinIO. Gdy brak → pobierz/wygeneruj plik ręcznie ze źródła i wgraj przez Manual Upload (GUI Core CC Tool) / wyślij z CCM.MinIOZbliża się TET — pliku jeszcze nie ma na MinIO.Sprawdź źródło (Kreator / Perun4V / Core CC Tool). Gdy brak → pobierz/wygeneruj plik ręcznie ze źródła i wgraj przez Manual Upload (GUI Core CC Tool) / wyślij z CCM.MinIOZbliża się CET / błąd dostarczenia — brak pliku na MinIO.Gdy pliku NIE ma na MinIO → pobierz/wygeneruj plik ręcznie ze źródła i wgraj przez Manual Upload (GUI Core CC Tool) / wyślij z CCM.MinIOMinął CET — plik niedostarczony. Krytyczne.Zgłoś (CIZ/WPO/PSE-I). Po CET — postępowanie krytyczne (brak lokalnego fallbacku).</w:t>
+      </w:r>
+    </w:p>
+    <w:p>
       <w:pPr>
         <w:pStyle w:val="Heading4"/>
       </w:pPr>
@@ -10819,6 +11331,16 @@
       </w:r>
     </w:p>
     <w:p>
+      <w:r>
+        <w:t>Warianty stanów (8)</w:t>
+      </w:r>
+    </w:p>
+    <w:p>
+      <w:r>
+        <w:t>Status kafelkaSytuacjaDziałania awaryjneMinIOPlik dostarczony prawidłowo na MinIO — status pozytywny.Brak działań — proces poprawny.MinIOStatus nadany ręcznie literą 'R' przez Dyspozytora po weryfikacji.Brak działań — decyzja ręczna Dyspozytora.MinIOPlik dostarczony po CET — status pozytywny.Brak działań — dostarczone po CET, OK.MinIOPrzedwczesne (&gt;30 min do TET) — plik jeszcze niewymagany.Monitoring — czekaj do TET.MinIOOczekiwanie / transfer w toku (stan przejściowy).Czekaj 5 min → sprawdź MinIO. Gdy brak → pobierz/wygeneruj plik ręcznie ze źródła i wgraj przez Manual Upload (GUI Core CC Tool) / wyślij z CCM.MinIOZbliża się TET — pliku jeszcze nie ma na MinIO.Sprawdź źródło (Kreator / Perun4V / Core CC Tool). Gdy brak → pobierz/wygeneruj plik ręcznie ze źródła i wgraj przez Manual Upload (GUI Core CC Tool) / wyślij z CCM.MinIOZbliża się CET / błąd dostarczenia — brak pliku na MinIO.Gdy pliku NIE ma na MinIO → pobierz/wygeneruj plik ręcznie ze źródła i wgraj przez Manual Upload (GUI Core CC Tool) / wyślij z CCM.MinIOMinął CET — plik niedostarczony. Krytyczne.Zgłoś (CIZ/WPO/PSE-I). Po CET — postępowanie krytyczne (brak lokalnego fallbacku).</w:t>
+      </w:r>
+    </w:p>
+    <w:p>
       <w:pPr>
         <w:pStyle w:val="Heading4"/>
       </w:pPr>
@@ -10880,6 +11402,16 @@
       </w:r>
     </w:p>
     <w:p>
+      <w:r>
+        <w:t>Warianty stanów (8)</w:t>
+      </w:r>
+    </w:p>
+    <w:p>
+      <w:r>
+        <w:t>Status kafelkaSytuacjaDziałania awaryjneMinIOPlik dostarczony prawidłowo na MinIO — status pozytywny.Brak działań — proces poprawny.MinIOStatus nadany ręcznie literą 'R' przez Dyspozytora po weryfikacji.Brak działań — decyzja ręczna Dyspozytora.MinIOPlik dostarczony po CET — status pozytywny.Brak działań — dostarczone po CET, OK.MinIOPrzedwczesne (&gt;30 min do TET) — plik jeszcze niewymagany.Monitoring — czekaj do TET.MinIOOczekiwanie / transfer w toku (stan przejściowy).Czekaj 5 min → sprawdź MinIO. Gdy brak → pobierz/wygeneruj plik ręcznie ze źródła i wgraj przez Manual Upload (GUI Core CC Tool) / wyślij z CCM.MinIOZbliża się TET — pliku jeszcze nie ma na MinIO.Sprawdź źródło (Kreator / Perun4V / Core CC Tool). Gdy brak → pobierz/wygeneruj plik ręcznie ze źródła i wgraj przez Manual Upload (GUI Core CC Tool) / wyślij z CCM.MinIOZbliża się CET / błąd dostarczenia — brak pliku na MinIO.Gdy pliku NIE ma na MinIO → pobierz/wygeneruj plik ręcznie ze źródła i wgraj przez Manual Upload (GUI Core CC Tool) / wyślij z CCM.MinIOMinął CET — plik niedostarczony. Krytyczne.Zgłoś (CIZ/WPO/PSE-I). Po CET — postępowanie krytyczne (brak lokalnego fallbacku).</w:t>
+      </w:r>
+    </w:p>
+    <w:p>
       <w:pPr>
         <w:pStyle w:val="Heading4"/>
       </w:pPr>
@@ -10941,6 +11473,16 @@
       </w:r>
     </w:p>
     <w:p>
+      <w:r>
+        <w:t>Warianty stanów (8)</w:t>
+      </w:r>
+    </w:p>
+    <w:p>
+      <w:r>
+        <w:t>Status kafelkaSytuacjaDziałania awaryjneMinIOPlik dostarczony prawidłowo na MinIO — status pozytywny.Brak działań — proces poprawny.MinIOStatus nadany ręcznie literą 'R' przez Dyspozytora po weryfikacji.Brak działań — decyzja ręczna Dyspozytora.MinIOPlik dostarczony po CET — status pozytywny.Brak działań — dostarczone po CET, OK.MinIOPrzedwczesne (&gt;30 min do TET) — plik jeszcze niewymagany.Monitoring — czekaj do TET.MinIOOczekiwanie / transfer w toku (stan przejściowy).Czekaj 5 min → sprawdź MinIO. Gdy brak → pobierz/wygeneruj plik ręcznie ze źródła i wgraj przez Manual Upload (GUI Core CC Tool) / wyślij z CCM.MinIOZbliża się TET — pliku jeszcze nie ma na MinIO.Sprawdź źródło (Kreator / Perun4V / Core CC Tool). Gdy brak → pobierz/wygeneruj plik ręcznie ze źródła i wgraj przez Manual Upload (GUI Core CC Tool) / wyślij z CCM.MinIOZbliża się CET / błąd dostarczenia — brak pliku na MinIO.Gdy pliku NIE ma na MinIO → pobierz/wygeneruj plik ręcznie ze źródła i wgraj przez Manual Upload (GUI Core CC Tool) / wyślij z CCM.MinIOMinął CET — plik niedostarczony. Krytyczne.Zgłoś (CIZ/WPO/PSE-I). Po CET — postępowanie krytyczne (brak lokalnego fallbacku).</w:t>
+      </w:r>
+    </w:p>
+    <w:p>
       <w:pPr>
         <w:pStyle w:val="Heading4"/>
       </w:pPr>
@@ -11002,6 +11544,16 @@
       </w:r>
     </w:p>
     <w:p>
+      <w:r>
+        <w:t>Warianty stanów (8)</w:t>
+      </w:r>
+    </w:p>
+    <w:p>
+      <w:r>
+        <w:t>Status kafelkaSytuacjaDziałania awaryjneMinIOPlik dostarczony prawidłowo na MinIO — status pozytywny.Brak działań — proces poprawny.MinIOStatus nadany ręcznie literą 'R' przez Dyspozytora po weryfikacji.Brak działań — decyzja ręczna Dyspozytora.MinIOPlik dostarczony po CET — status pozytywny.Brak działań — dostarczone po CET, OK.MinIOPrzedwczesne (&gt;30 min do TET) — plik jeszcze niewymagany.Monitoring — czekaj do TET.MinIOOczekiwanie / transfer w toku (stan przejściowy).Czekaj 5 min → sprawdź MinIO. Gdy brak → pobierz/wygeneruj plik ręcznie ze źródła i wgraj przez Manual Upload (GUI Core CC Tool) / wyślij z CCM.MinIOZbliża się TET — pliku jeszcze nie ma na MinIO.Sprawdź źródło (Kreator / Perun4V / Core CC Tool). Gdy brak → pobierz/wygeneruj plik ręcznie ze źródła i wgraj przez Manual Upload (GUI Core CC Tool) / wyślij z CCM.MinIOZbliża się CET / błąd dostarczenia — brak pliku na MinIO.Gdy pliku NIE ma na MinIO → pobierz/wygeneruj plik ręcznie ze źródła i wgraj przez Manual Upload (GUI Core CC Tool) / wyślij z CCM.MinIOMinął CET — plik niedostarczony. Krytyczne.Zgłoś (CIZ/WPO/PSE-I). Po CET — postępowanie krytyczne (brak lokalnego fallbacku).</w:t>
+      </w:r>
+    </w:p>
+    <w:p>
       <w:pPr>
         <w:pStyle w:val="Heading4"/>
       </w:pPr>
@@ -11063,6 +11615,16 @@
       </w:r>
     </w:p>
     <w:p>
+      <w:r>
+        <w:t>Warianty stanów (8)</w:t>
+      </w:r>
+    </w:p>
+    <w:p>
+      <w:r>
+        <w:t>Status kafelkaSytuacjaDziałania awaryjneMinIOPlik dostarczony prawidłowo na MinIO — status pozytywny.Brak działań — proces poprawny.MinIOStatus nadany ręcznie literą 'R' przez Dyspozytora po weryfikacji.Brak działań — decyzja ręczna Dyspozytora.MinIOPlik dostarczony po CET — status pozytywny.Brak działań — dostarczone po CET, OK.MinIOPrzedwczesne (&gt;30 min do TET) — plik jeszcze niewymagany.Monitoring — czekaj do TET.MinIOOczekiwanie / transfer w toku (stan przejściowy).Czekaj 5 min → sprawdź MinIO. Gdy brak → pobierz/wygeneruj plik ręcznie ze źródła i wgraj przez Manual Upload (GUI Core CC Tool) / wyślij z CCM.MinIOZbliża się TET — pliku jeszcze nie ma na MinIO.Sprawdź źródło (Kreator / Perun4V / Core CC Tool). Gdy brak → pobierz/wygeneruj plik ręcznie ze źródła i wgraj przez Manual Upload (GUI Core CC Tool) / wyślij z CCM.MinIOZbliża się CET / błąd dostarczenia — brak pliku na MinIO.Gdy pliku NIE ma na MinIO → pobierz/wygeneruj plik ręcznie ze źródła i wgraj przez Manual Upload (GUI Core CC Tool) / wyślij z CCM.MinIOMinął CET — plik niedostarczony. Krytyczne.Zgłoś (CIZ/WPO/PSE-I). Po CET — postępowanie krytyczne (brak lokalnego fallbacku).</w:t>
+      </w:r>
+    </w:p>
+    <w:p>
       <w:pPr>
         <w:pStyle w:val="Heading4"/>
       </w:pPr>
@@ -11124,6 +11686,16 @@
       </w:r>
     </w:p>
     <w:p>
+      <w:r>
+        <w:t>Warianty stanów (8)</w:t>
+      </w:r>
+    </w:p>
+    <w:p>
+      <w:r>
+        <w:t>Status kafelkaSytuacjaDziałania awaryjneMinIOPlik dostarczony prawidłowo na MinIO — status pozytywny.Brak działań — proces poprawny.MinIOStatus nadany ręcznie literą 'R' przez Dyspozytora po weryfikacji.Brak działań — decyzja ręczna Dyspozytora.MinIOPlik dostarczony po CET — status pozytywny.Brak działań — dostarczone po CET, OK.MinIOPrzedwczesne (&gt;30 min do TET) — plik jeszcze niewymagany.Monitoring — czekaj do TET.MinIOOczekiwanie / transfer w toku (stan przejściowy).Czekaj 5 min → sprawdź MinIO. Gdy brak → pobierz/wygeneruj plik ręcznie ze źródła i wgraj przez Manual Upload (GUI Core CC Tool) / wyślij z CCM.MinIOZbliża się TET — pliku jeszcze nie ma na MinIO.Sprawdź źródło (Kreator / Perun4V / Core CC Tool). Gdy brak → pobierz/wygeneruj plik ręcznie ze źródła i wgraj przez Manual Upload (GUI Core CC Tool) / wyślij z CCM.MinIOZbliża się CET / błąd dostarczenia — brak pliku na MinIO.Gdy pliku NIE ma na MinIO → pobierz/wygeneruj plik ręcznie ze źródła i wgraj przez Manual Upload (GUI Core CC Tool) / wyślij z CCM.MinIOMinął CET — plik niedostarczony. Krytyczne.Zgłoś (CIZ/WPO/PSE-I). Po CET — postępowanie krytyczne (brak lokalnego fallbacku).</w:t>
+      </w:r>
+    </w:p>
+    <w:p>
       <w:pPr>
         <w:pStyle w:val="Heading4"/>
       </w:pPr>
@@ -11205,6 +11777,16 @@
       </w:r>
     </w:p>
     <w:p>
+      <w:r>
+        <w:t>Warianty stanów (46)</w:t>
+      </w:r>
+    </w:p>
+    <w:p>
+      <w:r>
+        <w:t>Status kafelkaSytuacjaDziałania awaryjneCCtool wysł.CCtool zwalid.MinIODokument został wysłany prawidłowo do CCTool i na MINIO, otrzymano potwierdzenie ACK z pozytywnym komunikatem (komunikat statusu powinien się pojawić po najechaniu kursorem na status).Brak — proces przebiegł poprawnie.CCtool wysł.CCtool zwalid.MinIODokument wysłany prawidłowo do CCTool i na MINIO, Dokument ACK (CCTool zwalid.) napłynął po CET z pozytywnym komunikatem.Brak działań — proces poprawny.CCtool wysł.CCtool zwalid.MinIODokument wysłany prawidłowo do CCTool i na MINIO, nie otrzymano potwierdzenia ACK, natomiast Dyspozytor ustawił status ręcznie 'R' po weryfikacji po stronie CCTool, iż proces został zrealizowany poprawnie.Brak działań — proces poprawny.CCtool wysł.CCtool zwalid.MinIODokument wysłany prawidłowo do CCTool i na MINIO po CET, Dokument ACK (CCTool zwalid.) napłynął po CET z pozytywnym komunikatem.Brak działań — proces poprawny.CCtool wysł.CCtool zwalid.MinIODokument IVA został oznaczony ręcznie jako wysłany prawidłowo do CCTool i na MINIO oraz otrzymanie potwierdzenia ACK.Brak działań — proces poprawny.CCtool wysł.CCtool zwalid.MinIODokument IVA prawidłowo wysłany ręcznie z poziomu aplikacji CCM w jednym miejscu (np. z menu bocznego „CCTool wysł." bądź „MINIO" korzystając z opcji „Wyślij"). Otrzymano potwierdzenie ACK z pozytywnym komunikatem.Brak działań — proces poprawny.CCtool wysł.CCtool zwalid.MinIODokument IVA prawidłowo wysłany ręcznie z poziomu CCM. Trwa oczekiwanie na potwierdzenie ACK (CCTool zwalid.) — około 2 minut trwa taki status.Po 5 min jeśli proces przebiegł poprawnie → ustaw 'R' dla ACK.CCtool wysł.CCtool zwalid.MinIODokument wysłany ręcznie z poziomu CCM, ale nie napłynął ACK w żądanym czasie i zbliża się Critical End Time dla obsługi tego dokumentu.Monitoring CCCt MV; jeśli proces OK → status 'R' dla ACK.CCtool wysł.CCtool zwalid.MinIODokument wysłany ręcznie z poziomu CCM, a otrzymane potwierdzenie ACK (CCTool zwalid.): (1) zawiera komunikat błędu (najedź kursorem na status); (2) proces zakończył się błędem — „Błąd procesu".Weryfikacja sytuacji w CCTool. Decyzja Dyspozytora o ewentualnej kolejnej iteracji.CCtool wysł.CCtool zwalid.MinIODokument IVA prawidłowo wysłany ręcznie z poziomu CCM. Otrzymano potwierdzenie ACK z pozytywnym komunikatem po CET.Brak działań — proces poprawny.CCtool wysł.CCtool zwalid.MinIODokument IVA prawidłowo wysłany ręcznie z poziomu CCM. Nie otrzymano potwierdzenia ACK — upłynął czas CET.Weryfikacja w CCCt MV; jeśli Processed → status 'R' ręcznie. Diagnostyka CN2 zwrotny → zgłoś.CCtool wysł.CCtool zwalid.MinIODokument IVA prawidłowo wysłany ręcznie z poziomu CCM. Nie otrzymano ACK, natomiast Dyspozytor ustawił status ręcznie 'R' po weryfikacji po stronie CCTool, iż proces został zrealizowany poprawnie.Brak działań — proces poprawny.CCtool wysł.CCtool zwalid.MinIODokument IVA prawidłowo wysłany ręcznie z poziomu CCM po CET (opcja „Wyślij po CET"). Trwa oczekiwanie na potwierdzenie ACK (CCTool zwalid.) — około 2 minut trwa taki status.Brak działań — proces poprawny.CCtool wysł.CCtool zwalid.MinIODokument wysłany ręcznie z poziomu CCM po CET. Trwa oczekiwanie na potwierdzenie ACK (CCTool zwalid.) — upłynęło więcej niż 2 minuty (czas oczekiwania można sprawdzić najeżdżając kursorem na status).Weryfikacja sytuacji w CCTool; jeśli proces przebiegł poprawnie → ustaw status 'R' dla ACK.CCtool wysł.CCtool zwalid.MinIODokument wysłany ręcznie z poziomu CCM po CET, a otrzymane potwierdzenie ACK (CCTool zwalid.): (1) zawiera komunikat błędu; (2) proces zakończył się błędem — „Błąd procesu".Weryfikacja sytuacji w CCTool. Zgłoś.CCtool wysł.CCtool zwalid.MinIODokument IVA prawidłowo wysłany ręcznie z poziomu CCM po CET. Otrzymano potwierdzenie ACK z pozytywnym komunikatem.Brak działań — proces poprawny.CCtool wysł.CCtool zwalid.MinIODokument IVA prawidłowo wysłany ręcznie z poziomu CCM po CET. Nie otrzymano potwierdzenia ACK — upłynął czas CET.Diagnostyka CN2 zwrotny → zgłoś.CCtool wysł.CCtool zwalid.MinIODokument IVA został oznaczony ręcznie jako wysłany prawidłowo do CCTool i na MINIO. Trwa oczekiwanie na potwierdzenie ACK (CCTool zwalid.) — około 2 minut trwa taki status.Weryfikacja w CCTool; po 5 min jeśli proces przebiegł poprawnie → ustaw 'R' dla ACK.CCtool wysł.CCtool zwalid.MinIODokument IVA został oznaczony ręcznie jako wysłany prawidłowo do CCTool i na MINIO. Trwa oczekiwanie na potwierdzenie ACK (CCTool zwalid.) — upłynęło więcej niż 2 minuty.Weryfikacja w CCTool; jeśli proces przebiegł poprawnie → ustaw 'R' dla ACK.CCtool wysł.CCtool zwalid.MinIODokument IVA został oznaczony ręcznie jako wysłany prawidłowo do CCTool i na MINIO. Nie otrzymano potwierdzenia ACK — upłynął czas CET.Diagnostyka CN2 zwrotny → zgłoś.CCtool wysł.CCtool zwalid.MinIOWysłany dokument nie spełnia kryterium rozmiaru (w informacjach o wielkości rozmiaru dostępna z poziomu menu bocznego na statusie). Nie otrzymano potwierdzenie ACK, natomiast Dyspozytor ustawił status ręcznie 'R' po weryfikacji po stronie CCTool, iż proces został zrealizowany poprawnie.Zgłoś informacyjnie (ew. zmiana konfiguracji rozmiaru).CCtool wysł.CCtool zwalid.MinIODokument jeszcze nie został wysłany ani do CCTool ani na MINIO, w związku z tym potwierdzenie ACK nie napłynęło.Brak — monitoring. Plik nie wymagany (&gt;30 min do TET).CCtool wysł.CCtool zwalid.MinIOZbliża się TET (21:30), a dokument nie został jeszcze obsłużony.Brak. Czujność i przygotowanie. Sprawdź Perun4V (status obliczeń); sprawdź CN2; przygotuj się na ewentualne IVA BACKUP od CCA. Jeśli sytuacja się utrzyma → Kategoria C (powiązany stan).CCtool wysł.CCtool zwalid.MinIOWysyłka do CCTool trwa i oczekiwany jest ACK, dokument dostarczony na MINIO.Jeśli taki status „CCTool wysł." trwa dłużej niż 5 minut należy zweryfikować stan w CCTool, ewentualnie zgłosić problem.CCtool wysł.CCtool zwalid.MinIODokument wysłany prawidłowo do CCTool i na MINIO, trwa oczekiwanie na potwierdzenie ACK (status powinien się utrzymać krócej niż 3 minuty).Brak. Czekaj do 3-5 min na ACK; po tym czasie → stan timeout.CCtool wysł.CCtool zwalid.MinIOWysyłka do CCTool trwa i oczekiwany jest ACK. Dokument dostarczony na MINIO nie spełnia kryterium rozmiaru (w informacjach o wielkości rozmiaru dostępna z poziomu menu bocznego na statusie).Jeśli taki status „CCTool wysł." trwa dłużej niż 5 minut → zweryfikować stan w CCTool, ew. zgłosić problem Zweryfikować dokument IVA czy jest poprawny (pobierając go z CCM i rozpakowując) — pomimo zbyt małego rozmiaru sytuacja może być OK Jeśli plik z pkt. 2 jest niepoprawny → pozyskać IVA z PERUN i wysłać bezpośrednio z CCM bądź z GUI CCToolCCtool wysł.CCtool zwalid.MinIOZbliża się CET (22:06), a dokument nie został jeszcze obsłużony.Procedura (wg Confluence): Jeśli zbliża się CET (poniżej 3 minut) możliwa jest ręczna wysyłka IVA Backup z menu bocznego na poniższej pozycji pulpitu. Alternatywnie: R08 (Perun4V awaria), R09 (ERR-I), R10 (Process failed).CCtool wysł.CCtool zwalid.MinIODokument wysłany prawidłowo do CCTool i na MINIO, potwierdzenie ACK ma status czerwony co może oznaczać: (1) zawiera komunikat błędu (najedź kursorem na status); (2) proces zakończył się błędem — „Błąd procesu".Procedura: R05 — reakcja per kod ACK (20 gateClosed / 21 duplicatedVersion / 30 file size). Należy zweryfikować sytuację w CCTool.CCtool wysł.CCtool zwalid.MinIODokument wysłany prawidłowo do CCTool i na MINIO, trwa oczekiwanie na potwierdzenie ACK, które nie napłynęło w zadanym czasie (po najechaniu na znak zapytania można sprawdzić ile upłynęło czasu).Procedura: R06. Jeśli po około 3 minutach nie pojawi się status ACK wraz z informacją dostępną po najechaniu na status → należy zweryfikować sytuację w CCTool.CCtool wysł.CCtool zwalid.MinIODokument wysłany prawidłowo do CCTool i na MINIO. Dokument ACK (CCTool zwalid.) nie napłynął do CET.Procedury: R06, R18. Należy zweryfikować sytuację w CCTool. W przypadku wygenerowania ACK po stronie CCTool — sytuację zgłosić.CCtool wysł.CCtool zwalid.MinIOWysłany dokument nie spełnia kryterium rozmiaru (w informacjach o wielkości rozmiaru dostępna z poziomu menu bocznego na statusie). Trwa oczekiwanie na potwierdzenie ACK (CCTool zwalid.) — około 2 minut trwa taki status.Procedura: R05. Zweryfikować dokument IVA czy jest poprawny (pobierając go z CCM i rozpakowując) — pomimo zbyt małego rozmiaru sytuacja może być OK Jeśli plik z pkt. 1 jest niepoprawny → pozyskać IVA z PERUN i wysłać bezpośrednio z CCM bądź z GUI CCToolCCtool wysł.CCtool zwalid.MinIOWysłany dokument nie spełnia kryterium rozmiaru. Trwa oczekiwanie na potwierdzenie ACK (CCTool zwalid.), które nie napłynęło w zadanym czasie (po najechaniu na znak zapytania można sprawdzić ile upłynęło czasu).Procedura: R05, R06. Jeśli po około 3 minutach nie pojawi się status ACK wraz z informacją po najechaniu na status → zweryfikować sytuację w CCTool Zweryfikować dokument IVA (pobranie z CCM i rozpakowanie) — pomimo małego rozmiaru sytuacja może być OK Jeśli plik z pkt. 2 jest niepoprawny → pozyskać IVA z PERUN i wysłać bezpośrednio z CCM bądź z GUI CCToolCCtool wysł.CCtool zwalid.MinIOWysłany dokument nie spełnia kryterium rozmiaru, a otrzymane potwierdzenie ACK (CCTool zwalid.): (1) zawiera komunikat błędu; (2) proces zakończył się błędem — „Błąd procesu".Procedura: R05. Należy zweryfikować sytuację w CCTool Zweryfikować dokument IVA czy jest poprawny (pobranie z CCM i rozpakowanie) — pomimo małego rozmiaru sytuacja może być OK Jeśli plik z pkt. 2 jest niepoprawny → pozyskać IVA z PERUN i wysłać bezpośrednio z CCM bądź z GUI CCToolCCtool wysł.CCtool zwalid.MinIOWysłany dokument nie spełnia kryterium rozmiaru. Dokument ACK (CCTool zwalid.) napłynął po CET z pozytywnym komunikatem.Należy zweryfikować dokument IVA czy jest poprawny i czy został przyjęty w CCTool Jeśli plik z pkt. 1 jest niepoprawny → pozyskać IVA z PERUN i wysłać bezpośrednio z CCM bądź z GUI CCTool Po weryfikacji można nadać 'R' → Stan #21 (Kategoria A).CCtool wysł.CCtool zwalid.MinIOWysłany dokument nie spełnia kryterium rozmiaru. Dokument ACK (CCTool zwalid.) nie napłynął do CET.Zweryfikować sytuację w CCTool — w przypadku wygenerowania ACK po stronie CCTool sytuację zgłosić Zweryfikować dokument IVA (pobranie z CCM i rozpakowanie) — pomimo małego rozmiaru sytuacja może być OK Jeśli plik z pkt. 2 jest niepoprawny → pozyskać IVA z PERUN i wysłać bezpośrednio z CCM bądź z GUI CCToolCCtool wysł.CCtool zwalid.MinIODokument wysłany prawidłowo do CCTool i na MINIO po CET, potwierdzenie ACK ma status czerwony co może oznaczać: (1) zawiera komunikat błędu; (2) proces zakończył się błędem — „Błąd procesu".Procedura: R05. Należy zweryfikować sytuację w CCTool.CCtool wysł.CCtool zwalid.MinIODokument wysłany prawidłowo do CCTool i na MINIO po CET. Dokument ACK (CCTool zwalid.) nie napłynął do CET.Procedury: R06, R18. Należy zweryfikować sytuację w CCTool, w przypadku wygenerowania ACK po stronie CCTool sytuację zgłosić.CCtool wysł.CCtool zwalid.MinIODokument nie został dostarczony ani do CCTool ani na MINIO, w związku z tym potwierdzenie ACK nie napłynęło. Minął czas CET.Procedura (wg Confluence): Należy zweryfikować czy dokument IVA jest w PERUN. Jeśli TAK to należy go niezwłocznie pozyskać ręcznie i wysłać ją bezpośrednio z CCM bądź z GUI CCTool Procedury IDCC: R10 (Process failed) — oczekuj IVA BACKUP v1 od CCA; brak → R19 (CN2 nie kopiuje do CCA), R23 (brak raportu CCA). Zgłoś (CIZ, WPO, PSE-I) + telefon CCC. ❌ Zakaz fallbacku 20% Fmax z DA.MinIOPlik dostarczony prawidłowo na MinIO — status pozytywny.Brak działań — proces poprawny.MinIOStatus nadany ręcznie literą 'R' przez Dyspozytora po weryfikacji.Brak działań — decyzja ręczna Dyspozytora.MinIOPlik dostarczony po CET — status pozytywny.Brak działań — dostarczone po CET, OK.MinIOPrzedwczesne (&gt;30 min do TET) — plik jeszcze niewymagany.Monitoring — czekaj do TET.MinIOOczekiwanie / transfer w toku (stan przejściowy).Czekaj 5 min → sprawdź MinIO. Gdy brak → pobierz/wygeneruj plik ręcznie ze źródła i wgraj przez Manual Upload (GUI Core CC Tool) / wyślij z CCM.MinIOZbliża się TET — pliku jeszcze nie ma na MinIO.Sprawdź źródło (Kreator / Perun4V / Core CC Tool). Gdy brak → pobierz/wygeneruj plik ręcznie ze źródła i wgraj przez Manual Upload (GUI Core CC Tool) / wyślij z CCM.MinIOZbliża się CET / błąd dostarczenia — brak pliku na MinIO.Gdy pliku NIE ma na MinIO → pobierz/wygeneruj plik ręcznie ze źródła i wgraj przez Manual Upload (GUI Core CC Tool) / wyślij z CCM.MinIOMinął CET — plik niedostarczony. Krytyczne.Zgłoś (CIZ/WPO/PSE-I). Po CET — postępowanie krytyczne (brak lokalnego fallbacku).</w:t>
+      </w:r>
+    </w:p>
+    <w:p>
       <w:pPr>
         <w:pStyle w:val="Heading4"/>
       </w:pPr>
@@ -11281,6 +11863,16 @@
       </w:r>
     </w:p>
     <w:p>
+      <w:r>
+        <w:t>Warianty stanów (46)</w:t>
+      </w:r>
+    </w:p>
+    <w:p>
+      <w:r>
+        <w:t>Status kafelkaSytuacjaDziałania awaryjneCCtool wysł.CCtool zwalid.MinIODokument został wysłany prawidłowo do CCTool i na MINIO, otrzymano potwierdzenie ACK z pozytywnym komunikatem (komunikat statusu powinien się pojawić po najechaniu kursorem na status).Brak — proces przebiegł poprawnie.CCtool wysł.CCtool zwalid.MinIODokument wysłany prawidłowo do CCTool i na MINIO, Dokument ACK (CCTool zwalid.) napłynął po CET z pozytywnym komunikatem.Brak działań — proces poprawny.CCtool wysł.CCtool zwalid.MinIODokument wysłany prawidłowo do CCTool i na MINIO, nie otrzymano potwierdzenia ACK, natomiast Dyspozytor ustawił status ręcznie 'R' po weryfikacji po stronie CCTool, iż proces został zrealizowany poprawnie.Brak działań — proces poprawny.CCtool wysł.CCtool zwalid.MinIODokument wysłany prawidłowo do CCTool i na MINIO po CET, Dokument ACK (CCTool zwalid.) napłynął po CET z pozytywnym komunikatem.Brak działań — proces poprawny.CCtool wysł.CCtool zwalid.MinIODokument IVA został oznaczony ręcznie jako wysłany prawidłowo do CCTool i na MINIO oraz otrzymanie potwierdzenia ACK.Brak działań — proces poprawny.CCtool wysł.CCtool zwalid.MinIODokument IVA prawidłowo wysłany ręcznie z poziomu aplikacji CCM w jednym miejscu (np. z menu bocznego „CCTool wysł." bądź „MINIO" korzystając z opcji „Wyślij"). Otrzymano potwierdzenie ACK z pozytywnym komunikatem.Brak działań — proces poprawny.CCtool wysł.CCtool zwalid.MinIODokument IVA prawidłowo wysłany ręcznie z poziomu CCM. Trwa oczekiwanie na potwierdzenie ACK (CCTool zwalid.) — około 2 minut trwa taki status.Po 5 min jeśli proces przebiegł poprawnie → ustaw 'R' dla ACK.CCtool wysł.CCtool zwalid.MinIODokument wysłany ręcznie z poziomu CCM, ale nie napłynął ACK w żądanym czasie i zbliża się Critical End Time dla obsługi tego dokumentu.Monitoring CCCt MV; jeśli proces OK → status 'R' dla ACK.CCtool wysł.CCtool zwalid.MinIODokument wysłany ręcznie z poziomu CCM, a otrzymane potwierdzenie ACK (CCTool zwalid.): (1) zawiera komunikat błędu (najedź kursorem na status); (2) proces zakończył się błędem — „Błąd procesu".Weryfikacja sytuacji w CCTool. Decyzja Dyspozytora o ewentualnej kolejnej iteracji.CCtool wysł.CCtool zwalid.MinIODokument IVA prawidłowo wysłany ręcznie z poziomu CCM. Otrzymano potwierdzenie ACK z pozytywnym komunikatem po CET.Brak działań — proces poprawny.CCtool wysł.CCtool zwalid.MinIODokument IVA prawidłowo wysłany ręcznie z poziomu CCM. Nie otrzymano potwierdzenia ACK — upłynął czas CET.Weryfikacja w CCCt MV; jeśli Processed → status 'R' ręcznie. Diagnostyka CN2 zwrotny → zgłoś.CCtool wysł.CCtool zwalid.MinIODokument IVA prawidłowo wysłany ręcznie z poziomu CCM. Nie otrzymano ACK, natomiast Dyspozytor ustawił status ręcznie 'R' po weryfikacji po stronie CCTool, iż proces został zrealizowany poprawnie.Brak działań — proces poprawny.CCtool wysł.CCtool zwalid.MinIODokument IVA prawidłowo wysłany ręcznie z poziomu CCM po CET (opcja „Wyślij po CET"). Trwa oczekiwanie na potwierdzenie ACK (CCTool zwalid.) — około 2 minut trwa taki status.Brak działań — proces poprawny.CCtool wysł.CCtool zwalid.MinIODokument wysłany ręcznie z poziomu CCM po CET. Trwa oczekiwanie na potwierdzenie ACK (CCTool zwalid.) — upłynęło więcej niż 2 minuty (czas oczekiwania można sprawdzić najeżdżając kursorem na status).Weryfikacja sytuacji w CCTool; jeśli proces przebiegł poprawnie → ustaw status 'R' dla ACK.CCtool wysł.CCtool zwalid.MinIODokument wysłany ręcznie z poziomu CCM po CET, a otrzymane potwierdzenie ACK (CCTool zwalid.): (1) zawiera komunikat błędu; (2) proces zakończył się błędem — „Błąd procesu".Weryfikacja sytuacji w CCTool. Zgłoś.CCtool wysł.CCtool zwalid.MinIODokument IVA prawidłowo wysłany ręcznie z poziomu CCM po CET. Otrzymano potwierdzenie ACK z pozytywnym komunikatem.Brak działań — proces poprawny.CCtool wysł.CCtool zwalid.MinIODokument IVA prawidłowo wysłany ręcznie z poziomu CCM po CET. Nie otrzymano potwierdzenia ACK — upłynął czas CET.Diagnostyka CN2 zwrotny → zgłoś.CCtool wysł.CCtool zwalid.MinIODokument IVA został oznaczony ręcznie jako wysłany prawidłowo do CCTool i na MINIO. Trwa oczekiwanie na potwierdzenie ACK (CCTool zwalid.) — około 2 minut trwa taki status.Weryfikacja w CCTool; po 5 min jeśli proces przebiegł poprawnie → ustaw 'R' dla ACK.CCtool wysł.CCtool zwalid.MinIODokument IVA został oznaczony ręcznie jako wysłany prawidłowo do CCTool i na MINIO. Trwa oczekiwanie na potwierdzenie ACK (CCTool zwalid.) — upłynęło więcej niż 2 minuty.Weryfikacja w CCTool; jeśli proces przebiegł poprawnie → ustaw 'R' dla ACK.CCtool wysł.CCtool zwalid.MinIODokument IVA został oznaczony ręcznie jako wysłany prawidłowo do CCTool i na MINIO. Nie otrzymano potwierdzenia ACK — upłynął czas CET.Diagnostyka CN2 zwrotny → zgłoś.CCtool wysł.CCtool zwalid.MinIOWysłany dokument nie spełnia kryterium rozmiaru (w informacjach o wielkości rozmiaru dostępna z poziomu menu bocznego na statusie). Nie otrzymano potwierdzenie ACK, natomiast Dyspozytor ustawił status ręcznie 'R' po weryfikacji po stronie CCTool, iż proces został zrealizowany poprawnie.Zgłoś informacyjnie (ew. zmiana konfiguracji rozmiaru).CCtool wysł.CCtool zwalid.MinIODokument jeszcze nie został wysłany ani do CCTool ani na MINIO, w związku z tym potwierdzenie ACK nie napłynęło.Brak — monitoring. Plik nie wymagany (&gt;30 min do TET).CCtool wysł.CCtool zwalid.MinIOZbliża się TET (21:30), a dokument nie został jeszcze obsłużony.Brak. Czujność i przygotowanie. Sprawdź Perun4V (status obliczeń); sprawdź CN2; przygotuj się na ewentualne IVA BACKUP od CCA. Jeśli sytuacja się utrzyma → Kategoria C (powiązany stan).CCtool wysł.CCtool zwalid.MinIOWysyłka do CCTool trwa i oczekiwany jest ACK, dokument dostarczony na MINIO.Jeśli taki status „CCTool wysł." trwa dłużej niż 5 minut należy zweryfikować stan w CCTool, ewentualnie zgłosić problem.CCtool wysł.CCtool zwalid.MinIODokument wysłany prawidłowo do CCTool i na MINIO, trwa oczekiwanie na potwierdzenie ACK (status powinien się utrzymać krócej niż 3 minuty).Brak. Czekaj do 3-5 min na ACK; po tym czasie → stan timeout.CCtool wysł.CCtool zwalid.MinIOWysyłka do CCTool trwa i oczekiwany jest ACK. Dokument dostarczony na MINIO nie spełnia kryterium rozmiaru (w informacjach o wielkości rozmiaru dostępna z poziomu menu bocznego na statusie).Jeśli taki status „CCTool wysł." trwa dłużej niż 5 minut → zweryfikować stan w CCTool, ew. zgłosić problem Zweryfikować dokument IVA czy jest poprawny (pobierając go z CCM i rozpakowując) — pomimo zbyt małego rozmiaru sytuacja może być OK Jeśli plik z pkt. 2 jest niepoprawny → pozyskać IVA z PERUN i wysłać bezpośrednio z CCM bądź z GUI CCToolCCtool wysł.CCtool zwalid.MinIOZbliża się CET (22:06), a dokument nie został jeszcze obsłużony.Procedura (wg Confluence): Jeśli zbliża się CET (poniżej 3 minut) możliwa jest ręczna wysyłka IVA Backup z menu bocznego na poniższej pozycji pulpitu. Alternatywnie: R08 (Perun4V awaria), R09 (ERR-I), R10 (Process failed).CCtool wysł.CCtool zwalid.MinIODokument wysłany prawidłowo do CCTool i na MINIO, potwierdzenie ACK ma status czerwony co może oznaczać: (1) zawiera komunikat błędu (najedź kursorem na status); (2) proces zakończył się błędem — „Błąd procesu".Procedura: R05 — reakcja per kod ACK (20 gateClosed / 21 duplicatedVersion / 30 file size). Należy zweryfikować sytuację w CCTool.CCtool wysł.CCtool zwalid.MinIODokument wysłany prawidłowo do CCTool i na MINIO, trwa oczekiwanie na potwierdzenie ACK, które nie napłynęło w zadanym czasie (po najechaniu na znak zapytania można sprawdzić ile upłynęło czasu).Procedura: R06. Jeśli po około 3 minutach nie pojawi się status ACK wraz z informacją dostępną po najechaniu na status → należy zweryfikować sytuację w CCTool.CCtool wysł.CCtool zwalid.MinIODokument wysłany prawidłowo do CCTool i na MINIO. Dokument ACK (CCTool zwalid.) nie napłynął do CET.Procedury: R06, R18. Należy zweryfikować sytuację w CCTool. W przypadku wygenerowania ACK po stronie CCTool — sytuację zgłosić.CCtool wysł.CCtool zwalid.MinIOWysłany dokument nie spełnia kryterium rozmiaru (w informacjach o wielkości rozmiaru dostępna z poziomu menu bocznego na statusie). Trwa oczekiwanie na potwierdzenie ACK (CCTool zwalid.) — około 2 minut trwa taki status.Procedura: R05. Zweryfikować dokument IVA czy jest poprawny (pobierając go z CCM i rozpakowując) — pomimo zbyt małego rozmiaru sytuacja może być OK Jeśli plik z pkt. 1 jest niepoprawny → pozyskać IVA z PERUN i wysłać bezpośrednio z CCM bądź z GUI CCToolCCtool wysł.CCtool zwalid.MinIOWysłany dokument nie spełnia kryterium rozmiaru. Trwa oczekiwanie na potwierdzenie ACK (CCTool zwalid.), które nie napłynęło w zadanym czasie (po najechaniu na znak zapytania można sprawdzić ile upłynęło czasu).Procedura: R05, R06. Jeśli po około 3 minutach nie pojawi się status ACK wraz z informacją po najechaniu na status → zweryfikować sytuację w CCTool Zweryfikować dokument IVA (pobranie z CCM i rozpakowanie) — pomimo małego rozmiaru sytuacja może być OK Jeśli plik z pkt. 2 jest niepoprawny → pozyskać IVA z PERUN i wysłać bezpośrednio z CCM bądź z GUI CCToolCCtool wysł.CCtool zwalid.MinIOWysłany dokument nie spełnia kryterium rozmiaru, a otrzymane potwierdzenie ACK (CCTool zwalid.): (1) zawiera komunikat błędu; (2) proces zakończył się błędem — „Błąd procesu".Procedura: R05. Należy zweryfikować sytuację w CCTool Zweryfikować dokument IVA czy jest poprawny (pobranie z CCM i rozpakowanie) — pomimo małego rozmiaru sytuacja może być OK Jeśli plik z pkt. 2 jest niepoprawny → pozyskać IVA z PERUN i wysłać bezpośrednio z CCM bądź z GUI CCToolCCtool wysł.CCtool zwalid.MinIOWysłany dokument nie spełnia kryterium rozmiaru. Dokument ACK (CCTool zwalid.) napłynął po CET z pozytywnym komunikatem.Należy zweryfikować dokument IVA czy jest poprawny i czy został przyjęty w CCTool Jeśli plik z pkt. 1 jest niepoprawny → pozyskać IVA z PERUN i wysłać bezpośrednio z CCM bądź z GUI CCTool Po weryfikacji można nadać 'R' → Stan #21 (Kategoria A).CCtool wysł.CCtool zwalid.MinIOWysłany dokument nie spełnia kryterium rozmiaru. Dokument ACK (CCTool zwalid.) nie napłynął do CET.Zweryfikować sytuację w CCTool — w przypadku wygenerowania ACK po stronie CCTool sytuację zgłosić Zweryfikować dokument IVA (pobranie z CCM i rozpakowanie) — pomimo małego rozmiaru sytuacja może być OK Jeśli plik z pkt. 2 jest niepoprawny → pozyskać IVA z PERUN i wysłać bezpośrednio z CCM bądź z GUI CCToolCCtool wysł.CCtool zwalid.MinIODokument wysłany prawidłowo do CCTool i na MINIO po CET, potwierdzenie ACK ma status czerwony co może oznaczać: (1) zawiera komunikat błędu; (2) proces zakończył się błędem — „Błąd procesu".Procedura: R05. Należy zweryfikować sytuację w CCTool.CCtool wysł.CCtool zwalid.MinIODokument wysłany prawidłowo do CCTool i na MINIO po CET. Dokument ACK (CCTool zwalid.) nie napłynął do CET.Procedury: R06, R18. Należy zweryfikować sytuację w CCTool, w przypadku wygenerowania ACK po stronie CCTool sytuację zgłosić.CCtool wysł.CCtool zwalid.MinIODokument nie został dostarczony ani do CCTool ani na MINIO, w związku z tym potwierdzenie ACK nie napłynęło. Minął czas CET.Procedura (wg Confluence): Należy zweryfikować czy dokument IVA jest w PERUN. Jeśli TAK to należy go niezwłocznie pozyskać ręcznie i wysłać ją bezpośrednio z CCM bądź z GUI CCTool Procedury IDCC: R10 (Process failed) — oczekuj IVA BACKUP v1 od CCA; brak → R19 (CN2 nie kopiuje do CCA), R23 (brak raportu CCA). Zgłoś (CIZ, WPO, PSE-I) + telefon CCC. ❌ Zakaz fallbacku 20% Fmax z DA.MinIOPlik dostarczony prawidłowo na MinIO — status pozytywny.Brak działań — proces poprawny.MinIOStatus nadany ręcznie literą 'R' przez Dyspozytora po weryfikacji.Brak działań — decyzja ręczna Dyspozytora.MinIOPlik dostarczony po CET — status pozytywny.Brak działań — dostarczone po CET, OK.MinIOPrzedwczesne (&gt;30 min do TET) — plik jeszcze niewymagany.Monitoring — czekaj do TET.MinIOOczekiwanie / transfer w toku (stan przejściowy).Czekaj 5 min → sprawdź MinIO. Gdy brak → pobierz/wygeneruj plik ręcznie ze źródła i wgraj przez Manual Upload (GUI Core CC Tool) / wyślij z CCM.MinIOZbliża się TET — pliku jeszcze nie ma na MinIO.Sprawdź źródło (Kreator / Perun4V / Core CC Tool). Gdy brak → pobierz/wygeneruj plik ręcznie ze źródła i wgraj przez Manual Upload (GUI Core CC Tool) / wyślij z CCM.MinIOZbliża się CET / błąd dostarczenia — brak pliku na MinIO.Gdy pliku NIE ma na MinIO → pobierz/wygeneruj plik ręcznie ze źródła i wgraj przez Manual Upload (GUI Core CC Tool) / wyślij z CCM.MinIOMinął CET — plik niedostarczony. Krytyczne.Zgłoś (CIZ/WPO/PSE-I). Po CET — postępowanie krytyczne (brak lokalnego fallbacku).</w:t>
+      </w:r>
+    </w:p>
+    <w:p>
       <w:pPr>
         <w:pStyle w:val="Heading4"/>
       </w:pPr>
@@ -11362,6 +11954,16 @@
       </w:r>
     </w:p>
     <w:p>
+      <w:r>
+        <w:t>Warianty stanów (8)</w:t>
+      </w:r>
+    </w:p>
+    <w:p>
+      <w:r>
+        <w:t>Status kafelkaSytuacjaDziałania awaryjneMinIOPlik dostarczony prawidłowo na MinIO — status pozytywny.Brak działań — proces poprawny.MinIOStatus nadany ręcznie literą 'R' przez Dyspozytora po weryfikacji.Brak działań — decyzja ręczna Dyspozytora.MinIOPlik dostarczony po CET — status pozytywny.Brak działań — dostarczone po CET, OK.MinIOPrzedwczesne (&gt;30 min do TET) — plik jeszcze niewymagany.Monitoring — czekaj do TET.MinIOOczekiwanie / transfer w toku (stan przejściowy).Czekaj 5 min → sprawdź MinIO. Gdy brak → pobierz/wygeneruj plik ręcznie ze źródła i wgraj przez Manual Upload (GUI Core CC Tool) / wyślij z CCM.MinIOZbliża się TET — pliku jeszcze nie ma na MinIO.Sprawdź źródło (Kreator / Perun4V / Core CC Tool). Gdy brak → pobierz/wygeneruj plik ręcznie ze źródła i wgraj przez Manual Upload (GUI Core CC Tool) / wyślij z CCM.MinIOZbliża się CET / błąd dostarczenia — brak pliku na MinIO.Gdy pliku NIE ma na MinIO → pobierz/wygeneruj plik ręcznie ze źródła i wgraj przez Manual Upload (GUI Core CC Tool) / wyślij z CCM.MinIOMinął CET — plik niedostarczony. Krytyczne.Zgłoś (CIZ/WPO/PSE-I). Po CET — postępowanie krytyczne (brak lokalnego fallbacku).</w:t>
+      </w:r>
+    </w:p>
+    <w:p>
       <w:pPr>
         <w:pStyle w:val="Heading4"/>
       </w:pPr>
@@ -11443,6 +12045,16 @@
       </w:r>
     </w:p>
     <w:p>
+      <w:r>
+        <w:t>Warianty stanów (8)</w:t>
+      </w:r>
+    </w:p>
+    <w:p>
+      <w:r>
+        <w:t>Status kafelkaSytuacjaDziałania awaryjneMinIOPlik dostarczony prawidłowo na MinIO — status pozytywny.Brak działań — proces poprawny.MinIOStatus nadany ręcznie literą 'R' przez Dyspozytora po weryfikacji.Brak działań — decyzja ręczna Dyspozytora.MinIOPlik dostarczony po CET — status pozytywny.Brak działań — dostarczone po CET, OK.MinIOPrzedwczesne (&gt;30 min do TET) — plik jeszcze niewymagany.Monitoring — czekaj do TET.MinIOOczekiwanie / transfer w toku (stan przejściowy).Czekaj 5 min → sprawdź MinIO. Gdy brak → pobierz/wygeneruj plik ręcznie ze źródła i wgraj przez Manual Upload (GUI Core CC Tool) / wyślij z CCM.MinIOZbliża się TET — pliku jeszcze nie ma na MinIO.Sprawdź źródło (Kreator / Perun4V / Core CC Tool). Gdy brak → pobierz/wygeneruj plik ręcznie ze źródła i wgraj przez Manual Upload (GUI Core CC Tool) / wyślij z CCM.MinIOZbliża się CET / błąd dostarczenia — brak pliku na MinIO.Gdy pliku NIE ma na MinIO → pobierz/wygeneruj plik ręcznie ze źródła i wgraj przez Manual Upload (GUI Core CC Tool) / wyślij z CCM.MinIOMinął CET — plik niedostarczony. Krytyczne.Zgłoś (CIZ/WPO/PSE-I). Po CET — postępowanie krytyczne (brak lokalnego fallbacku).</w:t>
+      </w:r>
+    </w:p>
+    <w:p>
       <w:pPr>
         <w:pStyle w:val="Heading4"/>
       </w:pPr>
@@ -11539,6 +12151,16 @@
       </w:r>
     </w:p>
     <w:p>
+      <w:r>
+        <w:t>Warianty stanów (32)</w:t>
+      </w:r>
+    </w:p>
+    <w:p>
+      <w:r>
+        <w:t>Status kafelkaSytuacjaDziałania awaryjneCCtool wysł.CCtool zwalid.Dokument wysłany prawidłowo do CCTool, otrzymano potwierdzenie ACK z pozytywnym komunikatem.Brak działań — proces poprawny.CCtool wysł.CCtool zwalid.Dokument wysłany prawidłowo do CCTool. Dyspozytor ustawił status ręcznie 'R' po weryfikacji w CCTool.Brak działań.CCtool wysł.CCtool zwalid.Dokument wysłany prawidłowo do CCTool po CET, ACK napłynął po CET z pozytywnym komunikatem.Brak działań — dostarczone po CET, OK.CCtool wysł.CCtool zwalid.Dokument oznaczony ręcznie jako wysłany prawidłowo do CCTool oraz otrzymanie potwierdzenia ACK.Brak działań.CCtool wysł.CCtool zwalid.Dokument prawidłowo wysłany ręcznie z poziomu CCM. Otrzymano potwierdzenie ACK z pozytywnym komunikatem.Brak działań — wysyłka ręczna wykonana.CCtool wysł.CCtool zwalid.Dokument prawidłowo wysłany ręcznie z poziomu CCM. Trwa oczekiwanie na potwierdzenie ACK — około 2 min.Postępowanie:Czekaj 5 minOK → ustaw 'R' w CCMCCtool wysł.CCtool zwalid.Dokument wysłany ręcznie z poziomu CCM, ale ACK nie napłynął w żądanym czasie i zbliża się CET.Postępowanie:Core CC Tool → sprawdź czy plik dotarł (Message Viewer)Jeżeli:OK → oznacz 'R' w CCMbłąd → Plik został odrzucony — odczytaj kod błędu z potwierdzenia ACK i zareaguj zależnie od kodu:kod 20 (bramka dla pliku zamknięta) — zgłoś administratorowi Core CC Toolkod 21 (wersja nie jest wyższa niż już zapisana) — w źródle podnieś numer wersji i wyślij plik ponowniekod 30 (rozmiar pliku niezgodny) — pobierz poprawny plik i wyślij ponownie pełny opis w bazie ryzykbrak → Awaria transportu plików (Connector 2.0). Zgłoś awarię. W międzyczasie pobierz plik ze źródła (aplikacji ZP) i wyślij go ręcznie przez Core CC Tool (Manual Upload). pełny opis w bazie ryzykCCtool wysł.CCtool zwalid.Dokument wysłany ręcznie z poziomu CCM, a otrzymane ACK: (1) zawiera komunikat błędu (najedź kursorem); (2) proces zakończył się błędem — 'Błąd procesu'.Postępowanie:Najedź kursorem na status i odczytaj kod ACKJeżeli:kod 20 (bramka dla pliku zamknięta) → zgłoś administratorowi Core CC Toolkod 21 (wersja nie jest wyższa niż zapisana) → podnieś numer wersji w aplikacji ZP i wyślij plik ponownie przez Core CC Tool (Manual Upload)kod 30 (rozmiar pliku niezgodny) → pobierz poprawny plik z MinIO lub aplikacji ZP i wyślij ponownieCCtool wysł.CCtool zwalid.Dokument prawidłowo wysłany ręcznie z poziomu CCM. Otrzymano potwierdzenie ACK z pozytywnym komunikatem po CET.Brak działań — ręczna + ACK po CET, OK.CCtool wysł.CCtool zwalid.Dokument prawidłowo wysłany ręcznie z poziomu CCM. Nie otrzymano potwierdzenia ACK — upłynął czas CET.Postępowanie:Core CC Tool → sprawdź statusJeżeli:OK (Processed) → oznacz 'R' w CCM + zgłośbrak / awaria zwrotna → Awaria transportu plików (Connector 2.0). Zgłoś awarię. W międzyczasie pobierz plik ze źródła (aplikacji ZP) i wyślij go ręcznie przez Core CC Tool (Manual Upload). pełny opis w bazie ryzykCCtool wysł.CCtool zwalid.Dokument prawidłowo wysłany ręcznie z poziomu CCM. Nie otrzymano ACK, Dyspozytor ustawił status 'R' po weryfikacji w CCTool.Brak działań — decyzja ręczna Dyspozytora.CCtool wysł.CCtool zwalid.Dokument prawidłowo wysłany ręcznie z poziomu CCM po CET. Trwa oczekiwanie na potwierdzenie ACK — około 2 min.Postępowanie:Czekaj 2-5 minOK → ustaw 'R'CCtool wysł.CCtool zwalid.Dokument wysłany ręcznie z poziomu CCM po CET. Trwa oczekiwanie na potwierdzenie ACK — upłynęło więcej niż 2 minuty.Postępowanie:Core CC Tool → sprawdź czy plik dotarł (Message Viewer)Jeżeli:OK → oznacz 'R' w CCMbłąd → Plik został odrzucony — odczytaj kod błędu z potwierdzenia ACK i zareaguj zależnie od kodu:kod 20 (bramka dla pliku zamknięta) — zgłoś administratorowi Core CC Toolkod 21 (wersja nie jest wyższa niż już zapisana) — w źródle podnieś numer wersji i wyślij plik ponowniekod 30 (rozmiar pliku niezgodny) — pobierz poprawny plik i wyślij ponownie pełny opis w bazie ryzykbrak → Awaria transportu plików (Connector 2.0). Zgłoś awarię. W międzyczasie pobierz plik ze źródła (aplikacji ZP) i wyślij go ręcznie przez Core CC Tool (Manual Upload). pełny opis w bazie ryzykCCtool wysł.CCtool zwalid.Dokument wysłany ręcznie z poziomu CCM po CET, a otrzymane ACK: (1) komunikat błędu; (2) proces zakończył się błędem. Typowo kod 20 gateClosed.Postępowanie:Najedź kursorem na status i odczytaj kod ACK (typowo kod 20)Jeżeli:kod 20 (bramka dla pliku zamknięta) → po CET bramka jest zamknięta → zgłośinny kod → Plik został odrzucony — odczytaj kod błędu z potwierdzenia ACK i zareaguj zależnie od kodu:kod 20 (bramka dla pliku zamknięta) — zgłoś administratorowi Core CC Toolkod 21 (wersja nie jest wyższa niż już zapisana) — w źródle podnieś numer wersji i wyślij plik ponowniekod 30 (rozmiar pliku niezgodny) — pobierz poprawny plik i wyślij ponownie pełny opis w bazie ryzykCCtool wysł.CCtool zwalid.Dokument prawidłowo wysłany ręcznie z poziomu CCM po CET. Otrzymano potwierdzenie ACK z pozytywnym komunikatem (po CET).Brak działań — ręczna + ACK po CET, OK.CCtool wysł.CCtool zwalid.Dokument prawidłowo wysłany ręcznie z poziomu CCM po CET. Nie otrzymano potwierdzenia ACK — upłynął czas CET.Postępowanie:Core CC Tool → sprawdź statusJeżeli:OK (Processed) → oznacz 'R' w CCM + zgłośbrak / awaria zwrotna → Awaria transportu plików (Connector 2.0). Zgłoś awarię. W międzyczasie pobierz plik ze źródła (aplikacji ZP) i wyślij go ręcznie przez Core CC Tool (Manual Upload). pełny opis w bazie ryzykCCtool wysł.CCtool zwalid.Dokument oznaczony ręcznie jako wysłany prawidłowo do CCTool. Trwa oczekiwanie na ACK — około 2 min.Postępowanie:Czekaj 5 minOK → 'R' dla ACKCCtool wysł.CCtool zwalid.Dokument oznaczony ręcznie jako wysłany prawidłowo. Trwa oczekiwanie na ACK — upłynęło więcej niż 2 min.Postępowanie:Czekaj 5 minOK → 'R' dla ACKCCtool wysł.CCtool zwalid.Dokument oznaczony ręcznie jako wysłany prawidłowo. Nie otrzymano potwierdzenia ACK — upłynął czas CET.Postępowanie:Core CC Tool → sprawdź statusJeżeli:OK (Processed) → utrzymaj 'R'brak / awaria → Awaria transportu plików (Connector 2.0). Zgłoś awarię. W międzyczasie pobierz plik ze źródła (aplikacji ZP) i wyślij go ręcznie przez Core CC Tool (Manual Upload). pełny opis w bazie ryzykCCtool wysł.CCtool zwalid.Wysłany dokument nie spełnia kryterium rozmiaru. ACK nie otrzymano, Dyspozytor ustawił status 'R' po weryfikacji w CCTool.Brak działań — Dyspozytor zatwierdził zawartość.CCtool wysł.CCtool zwalid.Dokument jeszcze nie został wysłany do CCTool, ACK nie napłynął. Plik nie wymagany (&gt;30 min do TET).Brak działań — czekaj do TET.CCtool wysł.CCtool zwalid.Zbliża się CET — plik niedostarczony lub błąd wysyłki. Stan alarmowy.Postępowanie (alarm):Core CC Tool → sprawdź czy plik dotarł do Core CC ToolJeżeli:plik jest, brak ACK → Plik został odrzucony — odczytaj kod błędu z potwierdzenia ACK i zareaguj zależnie od kodu:kod 20 (bramka dla pliku zamknięta) — zgłoś administratorowi Core CC Toolkod 21 (wersja nie jest wyższa niż już zapisana) — w źródle podnieś numer wersji i wyślij plik ponowniekod 30 (rozmiar pliku niezgodny) — pobierz poprawny plik i wyślij ponownie pełny opis w bazie ryzykbrak pliku (awaria Connector 2.0) → Awaria transportu plików (Connector 2.0). Zgłoś awarię. W międzyczasie pobierz plik ze źródła (aplikacji ZP) i wyślij go ręcznie przez Core CC Tool (Manual Upload). pełny opis w bazie ryzykbrak pliku w źródle → Brak pliku lub wersji w aplikacji źródłowej. Otwórz aplikacji ZP, przejdź do bilansu i sprawdź wersję pliku: jeśli wersja jest dostępna — pobierz ją (Pobierz XML); jeśli brakuje — wygeneruj nową wersję; jeśli aplikacja nie działa — zgłoś. pełny opis w bazie ryzykCCtool wysł.CCtool zwalid.Wysłany dokument nie spełnia kryterium rozmiaru. Oczekiwanie na ACK — upłynęło więcej niż 2 min.Postępowanie:W aplikacji CCM kliknij plik lewym przyciskiem myszy → Informacje → sprawdź rozmiar; pobierz z MinIO i rozpakujJeżeli:zawartość OK mimo rozmiaru → oznacz 'R' (→ powiązany stan)zawartość niepoprawna → Plik został odrzucony — odczytaj kod błędu z potwierdzenia ACK i zareaguj zależnie od kodu:kod 20 (bramka dla pliku zamknięta) — zgłoś administratorowi Core CC Toolkod 21 (wersja nie jest wyższa niż już zapisana) — w źródle podnieś numer wersji i wyślij plik ponowniekod 30 (rozmiar pliku niezgodny) — pobierz poprawny plik i wyślij ponownie pełny opis w bazie ryzykCCtool wysł.CCtool zwalid.Wysłany dokument nie spełnia kryterium rozmiaru, a ACK ma status czerwony — typowo kod 30.Postępowanie:W aplikacji CCM kliknij plik lewym przyciskiem myszy → Informacje → potwierdź rozmiarPobierz poprawny plik z aplikacji ZP (Pobierz XML) i wyślij przez Core CC Tool (Manual Upload) z kolejnym numerem wersjiNadal za mały → zgłoś szczegóły w bazie ryzykCCtool wysł.CCtool zwalid.Wysłany dokument nie spełnia kryterium rozmiaru. ACK napłynął po CET z pozytywnym komunikatem. Sprzeczność.Postępowanie:Pobierz z MinIO → rozpakuj → sprawdź zawartośćJeżeli:zawartość OK → oznacz 'R' (→ powiązany stan); zgłośniepoprawna → zgłośCCtool wysł.CCtool zwalid.Dokument wysłany prawidłowo do CCTool, ale ACK negatywny (Rejected). Kody: 20/21/30.Postępowanie:Najedź kursorem na status i odczytaj kod ACKJeżeli:kod 20 (bramka dla pliku zamknięta) → zgłoś (administrator Core CC Tool otwiera bramkę); sprawdź proces IDx-AC-FORWARDINGkod 21 (wersja nie jest wyższa niż zapisana) → podnieś numer wersji w aplikacji ZP i wyślij plik ponownie przez Core CC Tool (Manual Upload)kod 30 (rozmiar pliku niezgodny) → pobierz poprawny plik z MinIO lub aplikacji ZP i wyślij ponownieCCtool wysł.CCtool zwalid.Dokument wysłany prawidłowo, trwa oczekiwanie na ACK, który nie napłynął w zadanym czasie (&gt;2-3 min).Postępowanie:Czekaj 5 min → Core CC Tool (⚠ nie wysyłaj ponownie!)Jeżeli:Processed → oznacz 'R' + zgłośRejected → patrz stan kod ACKbrak wpisu → Awaria transportu plików (Connector 2.0). Zgłoś awarię. W międzyczasie pobierz plik ze źródła (aplikacji ZP) i wyślij go ręcznie przez Core CC Tool (Manual Upload). pełny opis w bazie ryzykCCtool wysł.CCtool zwalid.Dokument wysłany prawidłowo, ACK nie napłynął do CET.Postępowanie:Core CC Tool → sprawdź statusJeżeli:Processed → oznacz 'R' + zgłoś (→ powiązany stan)Rejected → wyślij ponownie przez Core CC Tool (Manual Upload) "po CET"brak → Awaria transportu plików (Connector 2.0). Zgłoś awarię. W międzyczasie pobierz plik ze źródła (aplikacji ZP) i wyślij go ręcznie przez Core CC Tool (Manual Upload). pełny opis w bazie ryzyk + powiadom RCCCCtool wysł.CCtool zwalid.Wysłany dokument nie spełnia kryterium rozmiaru. ACK nie napłynął do CET. Krytyczne.Postępowanie (KRYTYCZNE w C):Pobierz poprawny plik z aplikacji ZP i wyślij przez Core CC Tool (Manual Upload) "po CET" (jeśli bramka otwarta)Natychmiast: zgłoś + powiadom RCC szczegóły w bazie ryzykCCtool wysł.CCtool zwalid.Dokument zarejestrowany w CCTool po CET (wysyłka pozytywna), ale walidacja zakończona negatywnie — ACK Rejected po CET.Postępowanie (po CET):Najedź kursorem na status i odczytaj kod ACK (kontekst: rejestracja po CET)Jeżeli:kod 20 (bramka dla pliku zamknięta) → po CET bramka zamknięta → zgłoś + powiadom RCCkod 21 (wersja nie jest wyższa niż zapisana) → podnieś numer wersji w aplikacji ZP i wyślij plik ponownie przez Core CC Tool (Manual Upload) (jeśli bramka otwarta)kod 30 (rozmiar pliku niezgodny) → pobierz poprawny plik z MinIO lub aplikacji ZP i wyślij ponownie (jeśli bramka otwarta)CCtool wysł.CCtool zwalid.Dokument zarejestrowany w CCTool po CET (wysyłka pozytywna), ale ACK walidacji nie napłynął — plik dostarczony, lecz niezwalidowany.Postępowanie (po CET):Core CC Tool → sprawdź status walidacji (plik dostarczony po CET)Jeżeli:Processed → oznacz 'R' w CCM + zgłośRejected → postępuj jak w Stanie 30 (odczytaj kod ACK)brak wpisu → Awaria transportu plików (Connector 2.0). Zgłoś awarię. W międzyczasie pobierz plik ze źródła (aplikacji ZP) i wyślij go ręcznie przez Core CC Tool (Manual Upload). pełny opis w bazie ryzyk + powiadom RCCCCtool wysł.CCtool zwalid.Dokument nie został dostarczony do CCTool, ACK nie napłynął. Minął czas CET. KRYTYCZNE — po CET dograć nie można.Postępowanie (KRYTYCZNE — brak naprawy):Telefon do RCC + zgłoś (priorytet P1)Po CET — brak naprawy. Diagnoza przyczyn: ZP · Connector 2.0 · Core CC Tool szczegóły w bazie ryzyk</w:t>
+      </w:r>
+    </w:p>
+    <w:p>
       <w:pPr>
         <w:pStyle w:val="Heading4"/>
       </w:pPr>
@@ -11600,6 +12222,16 @@
       </w:r>
     </w:p>
     <w:p>
+      <w:r>
+        <w:t>Warianty stanów (8)</w:t>
+      </w:r>
+    </w:p>
+    <w:p>
+      <w:r>
+        <w:t>Status kafelkaSytuacjaDziałania awaryjneMinIOPlik dostarczony prawidłowo na MinIO — status pozytywny.Brak działań — proces poprawny.MinIOStatus nadany ręcznie literą 'R' przez Dyspozytora po weryfikacji.Brak działań — decyzja ręczna Dyspozytora.MinIOPlik dostarczony po CET — status pozytywny.Brak działań — dostarczone po CET, OK.MinIOPrzedwczesne (&gt;30 min do TET) — plik jeszcze niewymagany.Monitoring — czekaj do TET.MinIOOczekiwanie / transfer w toku (stan przejściowy).Czekaj 5 min → sprawdź MinIO. Gdy brak → pobierz/wygeneruj plik ręcznie ze źródła i wgraj przez Manual Upload (GUI Core CC Tool) / wyślij z CCM.MinIOZbliża się TET — pliku jeszcze nie ma na MinIO.Sprawdź źródło (Kreator / Perun4V / Core CC Tool). Gdy brak → pobierz/wygeneruj plik ręcznie ze źródła i wgraj przez Manual Upload (GUI Core CC Tool) / wyślij z CCM.MinIOZbliża się CET / błąd dostarczenia — brak pliku na MinIO.Gdy pliku NIE ma na MinIO → pobierz/wygeneruj plik ręcznie ze źródła i wgraj przez Manual Upload (GUI Core CC Tool) / wyślij z CCM.MinIOMinął CET — plik niedostarczony. Krytyczne.Zgłoś (CIZ/WPO/PSE-I). Po CET — postępowanie krytyczne (brak lokalnego fallbacku).</w:t>
+      </w:r>
+    </w:p>
+    <w:p>
       <w:pPr>
         <w:pStyle w:val="Heading4"/>
       </w:pPr>
@@ -11661,6 +12293,16 @@
       </w:r>
     </w:p>
     <w:p>
+      <w:r>
+        <w:t>Warianty stanów (8)</w:t>
+      </w:r>
+    </w:p>
+    <w:p>
+      <w:r>
+        <w:t>Status kafelkaSytuacjaDziałania awaryjneMinIOPlik dostarczony prawidłowo na MinIO — status pozytywny.Brak działań — proces poprawny.MinIOStatus nadany ręcznie literą 'R' przez Dyspozytora po weryfikacji.Brak działań — decyzja ręczna Dyspozytora.MinIOPlik dostarczony po CET — status pozytywny.Brak działań — dostarczone po CET, OK.MinIOPrzedwczesne (&gt;30 min do TET) — plik jeszcze niewymagany.Monitoring — czekaj do TET.MinIOOczekiwanie / transfer w toku (stan przejściowy).Czekaj 5 min → sprawdź MinIO. Gdy brak → pobierz/wygeneruj plik ręcznie ze źródła i wgraj przez Manual Upload (GUI Core CC Tool) / wyślij z CCM.MinIOZbliża się TET — pliku jeszcze nie ma na MinIO.Sprawdź źródło (Kreator / Perun4V / Core CC Tool). Gdy brak → pobierz/wygeneruj plik ręcznie ze źródła i wgraj przez Manual Upload (GUI Core CC Tool) / wyślij z CCM.MinIOZbliża się CET / błąd dostarczenia — brak pliku na MinIO.Gdy pliku NIE ma na MinIO → pobierz/wygeneruj plik ręcznie ze źródła i wgraj przez Manual Upload (GUI Core CC Tool) / wyślij z CCM.MinIOMinął CET — plik niedostarczony. Krytyczne.Zgłoś (CIZ/WPO/PSE-I). Po CET — postępowanie krytyczne (brak lokalnego fallbacku).</w:t>
+      </w:r>
+    </w:p>
+    <w:p>
       <w:pPr>
         <w:pStyle w:val="Heading4"/>
       </w:pPr>
@@ -11722,6 +12364,16 @@
       </w:r>
     </w:p>
     <w:p>
+      <w:r>
+        <w:t>Warianty stanów (8)</w:t>
+      </w:r>
+    </w:p>
+    <w:p>
+      <w:r>
+        <w:t>Status kafelkaSytuacjaDziałania awaryjneMinIOPlik dostarczony prawidłowo na MinIO — status pozytywny.Brak działań — proces poprawny.MinIOStatus nadany ręcznie literą 'R' przez Dyspozytora po weryfikacji.Brak działań — decyzja ręczna Dyspozytora.MinIOPlik dostarczony po CET — status pozytywny.Brak działań — dostarczone po CET, OK.MinIOPrzedwczesne (&gt;30 min do TET) — plik jeszcze niewymagany.Monitoring — czekaj do TET.MinIOOczekiwanie / transfer w toku (stan przejściowy).Czekaj 5 min → sprawdź MinIO. Gdy brak → pobierz/wygeneruj plik ręcznie ze źródła i wgraj przez Manual Upload (GUI Core CC Tool) / wyślij z CCM.MinIOZbliża się TET — pliku jeszcze nie ma na MinIO.Sprawdź źródło (Kreator / Perun4V / Core CC Tool). Gdy brak → pobierz/wygeneruj plik ręcznie ze źródła i wgraj przez Manual Upload (GUI Core CC Tool) / wyślij z CCM.MinIOZbliża się CET / błąd dostarczenia — brak pliku na MinIO.Gdy pliku NIE ma na MinIO → pobierz/wygeneruj plik ręcznie ze źródła i wgraj przez Manual Upload (GUI Core CC Tool) / wyślij z CCM.MinIOMinął CET — plik niedostarczony. Krytyczne.Zgłoś (CIZ/WPO/PSE-I). Po CET — postępowanie krytyczne (brak lokalnego fallbacku).</w:t>
+      </w:r>
+    </w:p>
+    <w:p>
       <w:pPr>
         <w:pStyle w:val="Heading4"/>
       </w:pPr>
@@ -11788,6 +12440,16 @@
       </w:r>
     </w:p>
     <w:p>
+      <w:r>
+        <w:t>Warianty stanów (8)</w:t>
+      </w:r>
+    </w:p>
+    <w:p>
+      <w:r>
+        <w:t>Status kafelkaSytuacjaDziałania awaryjnesFTP/ZP wysł.Plik dostarczony prawidłowo na sFTP/ZP — status pozytywny.Brak działań — proces poprawny.sFTP/ZP wysł.Status nadany ręcznie literą 'R' przez Dyspozytora po weryfikacji.Brak działań — decyzja ręczna Dyspozytora.sFTP/ZP wysł.Plik dostarczony po CET — status pozytywny.Brak działań — dostarczone po CET, OK.sFTP/ZP wysł.Przedwczesne (&gt;30 min do TET) — plik jeszcze niewymagany.Monitoring — czekaj do TET.sFTP/ZP wysł.Oczekiwanie / transfer w toku (stan przejściowy).Czekaj 5 min → sprawdź sFTP/ZP. Gdy brak → wyślij plik ręcznie ze źródła na sFTP/ZP.sFTP/ZP wysł.Zbliża się TET — pliku jeszcze nie ma na sFTP/ZP.Sprawdź źródło (Kreator / Perun4V / Core CC Tool). Gdy brak → wyślij plik ręcznie ze źródła na sFTP/ZP.sFTP/ZP wysł.Zbliża się CET / błąd dostarczenia — brak pliku na sFTP/ZP.Gdy pliku NIE ma na sFTP/ZP → wyślij plik ręcznie ze źródła na sFTP/ZP.sFTP/ZP wysł.Minął CET — plik niedostarczony. Krytyczne.Zgłoś (CIZ/WPO/PSE-I). Po CET — postępowanie krytyczne (brak lokalnego fallbacku).</w:t>
+      </w:r>
+    </w:p>
+    <w:p>
       <w:pPr>
         <w:pStyle w:val="Heading4"/>
       </w:pPr>
@@ -11869,6 +12531,16 @@
       </w:r>
     </w:p>
     <w:p>
+      <w:r>
+        <w:t>Warianty stanów (18)</w:t>
+      </w:r>
+    </w:p>
+    <w:p>
+      <w:r>
+        <w:t>Status kafelkaSytuacjaDziałania awaryjneCCtool wysł.CCtool zwalid.Przedwczesne (&gt;30 min do TET). Walidacja ATC jeszcze nie ukończona.Monitoring — sprawdź w aplikacji CCM postęp walidacji paczki PERUN_IDx_ATC.CCtool wysł.CCtool zwalid.Zbliża się TET, brak FIDx-928. Walidacja paczki ATC w toku.Postępowanie:Rozwiń agregat PERUN_IDx_ATC → zweryfikuj składoweJeżeli:brak składowej → uzupełnij brakującą składową w aplikacji CCM ()składowe OK → monitoruj — czekaj na wynik walidacjiCCtool wysł.CCtool zwalid.Zbliża się CET — brak wyniku walidacji ATC. Stan alarmowy.Postępowanie (zbliża się CET):Ostatnia szansa: dokończ uzupełnienia paczki ATC w CCM; sprawdź Core CC Tool (Message Viewer)Jeżeli:plik dotrze → OK — koniecbłąd → odczytaj kod ACK (patrz powiązany stan)brak → zgłośCCtool wysł.CCtool zwalid.Minął CET, brak FIDx-928. KRYTYCZNE — brak lokalnego fallbacku.Postępowanie (KRYTYCZNE — minął CET):⛔ STOP — żadnych działań ręcznych. Brak lokalnego fallbacku (brak wyniku ATC w czasie → Dyspozytor nie wykonuje dalszych czynności).Zgłoś + telefon do RCC szczegóły w bazie ryzykCCtool wysł.CCtool zwalid.Happy Day — walidacja ATC zakończona poprawnie, wynik opublikowany.Brak interwencji — walidacja ATC zakończona poprawnie.CCtool wysł.CCtool zwalid.Wynik dotarł, ale ACK negatywny (Rejected).Postępowanie:Core CC Tool (Message Viewer) → odczytaj kod ACKJeżeli:kod 20 (bramka dla pliku zamknięta) → zgłoś (administrator Core CC Tool otwiera bramkę)kod 21 (błąd procesowy CCCt) → zgłoś — błąd procesu w Core CC Toolkod 30 (rozmiar niezgodny) → patrz stan rozmiarCCtool wysł.CCtool zwalid.Wynik dotarł, ACK nie napłynął w czasie (timeout).Postępowanie:Czekaj 5 min → Core CC Tool (Message Viewer)Jeżeli:Processed → oznacz 'R' w CCMbrak &gt;10 min → zgłoś — sprawdź transport zwrotny Connector 2.0 (R18)CCtool wysł.CCtool zwalid.Wynik dotarł, brak ACK do CET.Postępowanie:Sprawdź transport zwrotny Connector 2.0Jeżeli:transport OK, ACK błąd → odczytaj kod ACK (patrz powiązany stan)awaria transportu → zgłoś (R18)CCtool wysł.CCtool zwalid.Wynik dotarł, ACK napłynął po CET — pozytywny.Walidacja opóźniona, ale OK (ACK po CET pozytywny).CCtool wysł.CCtool zwalid.Status nadany ręcznie 'R' (nietypowe dla pliku zwrotnego).Brak działań — status nadany ręcznie przez Dyspozytora (nietypowe dla pliku zwrotnego).CCtool wysł.CCtool zwalid.Niepoprawny rozmiar wyniku FIDx-928.Postępowanie:W aplikacji CCM kliknij plik lewym przyciskiem myszy → Informacje → sprawdź rozmiar (pobranie ponownie nie ma sensu — plik zwrotny)Jeżeli:zawartość OK mimo rozmiaru → oznacz 'R' w CCMzawartość niepoprawna → zgłoś + telefon do RCCCCtool wysł.CCtool zwalid.Niepoprawny rozmiar + brak ACK (timeout).Postępowanie:Core CC Tool (Message Viewer) → sprawdź statusJeżeli:Processed → oznacz 'R' w CCMbrak → zgłoś + telefon do RCCCCtool wysł.CCtool zwalid.Niepoprawny rozmiar + ACK negatywny.Postępowanie:Core CC Tool (Message Viewer) → odczytaj kod ACKJeżeli:kod 20 (bramka zamknięta) → zgłoś (administrator Core CC Tool)kod 30 (rozmiar) → patrz powiązany staninny → zgłoś + telefon do RCCCCtool wysł.CCtool zwalid.Niepoprawny rozmiar + brak ACK do CET. KRYTYCZNE.Postępowanie (KRYTYCZNE):⛔ Krytyczne — minął CET, niepoprawny rozmiar i brak ACK.Zgłoś + telefon do RCC szczegóły w bazie ryzykCCtool wysł.CCtool zwalid.FIDx-928 dostarczony po CET — walidacja OK.Walidacja zakończona po terminie — OK.CCtool wysł.CCtool zwalid.Wysyłka zwrotna trwa (transport Connector 2.0).Postępowanie:Czekaj 5 min (transport zwrotny Connector 2.0)Jeżeli:zmieniło się na zielony → OK — koniecbrak &gt;10 min → zgłoś (R18)CCtool wysł.CCtool zwalid.Status ręczny przyznany (nietypowe dla pliku zwrotnego).Brak działań — status ręczny przyznany przez Dyspozytora (nietypowe dla pliku zwrotnego).CCtool wysł.CCtool zwalid.TET zbliża się, ACK błąd już teraz (błąd paczki ATC).Postępowanie:Core CC Tool (Message Viewer) → odczytaj błąd paczki ATCJeżeli:błąd składowej → uzupełnij składową w aplikacji CCMinny → odczytaj kod ACK (patrz powiązany stan)</w:t>
+      </w:r>
+    </w:p>
+    <w:p>
       <w:pPr>
         <w:pStyle w:val="Heading4"/>
       </w:pPr>
@@ -11945,6 +12617,16 @@
       </w:r>
     </w:p>
     <w:p>
+      <w:r>
+        <w:t>Warianty stanów (10)</w:t>
+      </w:r>
+    </w:p>
+    <w:p>
+      <w:r>
+        <w:t>Status kafelkaSytuacjaDziałania awaryjneMinIOsFTP/ZP wysł.Paczka dostarczona prawidłowo na MinIO i sFTP/ZP.Brak działań — proces poprawny.MinIOsFTP/ZP wysł.Status nadany ręcznie 'R' po weryfikacji.Brak działań — decyzja ręczna.MinIOsFTP/ZP wysł.Paczka dostarczona po CET — status pozytywny.Brak działań — po CET OK.MinIOsFTP/ZP wysł.Przedwczesne — paczka jeszcze niewymagana.Monitoring — czekaj do TET.MinIOsFTP/ZP wysł.Zbliża się TET — paczka niekompletna / brak.Sprawdź agregację składowych. Gdy brak → zagreguj/pobierz ręcznie i wrzuć (Manual Upload / wysyłka na sFTP).MinIOsFTP/ZP wysł.Na MinIO OK, brak / błąd na sFTP/ZP.Gdy brak na sFTP → wyślij plik ręcznie ze źródła na sFTP/ZP.MinIOsFTP/ZP wysł.Brak / błąd na MinIO, OK na sFTP/ZP.Gdy brak na MinIO → pobierz/wygeneruj ręcznie i wgraj przez Manual Upload (GUI Core CC Tool).MinIOsFTP/ZP wysł.Transfer w toku (MinIO i sFTP/ZP).Czekaj 5 min → sprawdź MinIO i sFTP. Gdy brak → ręcznie (Manual Upload / wysyłka na sFTP).MinIOsFTP/ZP wysł.Zbliża się CET — brak / błąd na MinIO i sFTP/ZP.Gdy brak na MinIO → Manual Upload; gdy brak na sFTP → wyślij ręcznie.MinIOsFTP/ZP wysł.Minął CET — paczka niedostarczona. Krytyczne.Zgłoś (CIZ/WPO/PSE-I). Postępowanie krytyczne.</w:t>
+      </w:r>
+    </w:p>
+    <w:p>
       <w:pPr>
         <w:pStyle w:val="Heading4"/>
       </w:pPr>
@@ -12021,6 +12703,16 @@
       </w:r>
     </w:p>
     <w:p>
+      <w:r>
+        <w:t>Warianty stanów (10)</w:t>
+      </w:r>
+    </w:p>
+    <w:p>
+      <w:r>
+        <w:t>Status kafelkaSytuacjaDziałania awaryjneMinIOsFTP/ZP wysł.Paczka dostarczona prawidłowo na MinIO i sFTP/ZP.Brak działań — proces poprawny.MinIOsFTP/ZP wysł.Status nadany ręcznie 'R' po weryfikacji.Brak działań — decyzja ręczna.MinIOsFTP/ZP wysł.Paczka dostarczona po CET — status pozytywny.Brak działań — po CET OK.MinIOsFTP/ZP wysł.Przedwczesne — paczka jeszcze niewymagana.Monitoring — czekaj do TET.MinIOsFTP/ZP wysł.Zbliża się TET — paczka niekompletna / brak.Sprawdź agregację składowych. Gdy brak → zagreguj/pobierz ręcznie i wrzuć (Manual Upload / wysyłka na sFTP).MinIOsFTP/ZP wysł.Na MinIO OK, brak / błąd na sFTP/ZP.Gdy brak na sFTP → wyślij plik ręcznie ze źródła na sFTP/ZP.MinIOsFTP/ZP wysł.Brak / błąd na MinIO, OK na sFTP/ZP.Gdy brak na MinIO → pobierz/wygeneruj ręcznie i wgraj przez Manual Upload (GUI Core CC Tool).MinIOsFTP/ZP wysł.Transfer w toku (MinIO i sFTP/ZP).Czekaj 5 min → sprawdź MinIO i sFTP. Gdy brak → ręcznie (Manual Upload / wysyłka na sFTP).MinIOsFTP/ZP wysł.Zbliża się CET — brak / błąd na MinIO i sFTP/ZP.Gdy brak na MinIO → Manual Upload; gdy brak na sFTP → wyślij ręcznie.MinIOsFTP/ZP wysł.Minął CET — paczka niedostarczona. Krytyczne.Zgłoś (CIZ/WPO/PSE-I). Postępowanie krytyczne.</w:t>
+      </w:r>
+    </w:p>
+    <w:p>
       <w:pPr>
         <w:pStyle w:val="Heading4"/>
       </w:pPr>
@@ -12092,6 +12784,16 @@
       </w:r>
     </w:p>
     <w:p>
+      <w:r>
+        <w:t>Warianty stanów (8)</w:t>
+      </w:r>
+    </w:p>
+    <w:p>
+      <w:r>
+        <w:t>Status kafelkaSytuacjaDziałania awaryjnesFTP/ZP wysł.Plik dostarczony prawidłowo na sFTP/ZP — status pozytywny.Brak działań — proces poprawny.sFTP/ZP wysł.Status nadany ręcznie literą 'R' przez Dyspozytora po weryfikacji.Brak działań — decyzja ręczna Dyspozytora.sFTP/ZP wysł.Plik dostarczony po CET — status pozytywny.Brak działań — dostarczone po CET, OK.sFTP/ZP wysł.Przedwczesne (&gt;30 min do TET) — plik jeszcze niewymagany.Monitoring — czekaj do TET.sFTP/ZP wysł.Oczekiwanie / transfer w toku (stan przejściowy).Czekaj 5 min → sprawdź sFTP/ZP. Gdy brak → wyślij plik ręcznie ze źródła na sFTP/ZP.sFTP/ZP wysł.Zbliża się TET — pliku jeszcze nie ma na sFTP/ZP.Sprawdź źródło (Kreator / Perun4V / Core CC Tool). Gdy brak → wyślij plik ręcznie ze źródła na sFTP/ZP.sFTP/ZP wysł.Zbliża się CET / błąd dostarczenia — brak pliku na sFTP/ZP.Gdy pliku NIE ma na sFTP/ZP → wyślij plik ręcznie ze źródła na sFTP/ZP.sFTP/ZP wysł.Minął CET — plik niedostarczony. Krytyczne.Zgłoś (CIZ/WPO/PSE-I). Po CET — postępowanie krytyczne (brak lokalnego fallbacku).</w:t>
+      </w:r>
+    </w:p>
+    <w:p>
       <w:pPr>
         <w:pStyle w:val="Heading4"/>
       </w:pPr>
@@ -12163,6 +12865,16 @@
       </w:r>
     </w:p>
     <w:p>
+      <w:r>
+        <w:t>Warianty stanów (8)</w:t>
+      </w:r>
+    </w:p>
+    <w:p>
+      <w:r>
+        <w:t>Status kafelkaSytuacjaDziałania awaryjnesFTP/ZP wysł.Plik dostarczony prawidłowo na sFTP/ZP — status pozytywny.Brak działań — proces poprawny.sFTP/ZP wysł.Status nadany ręcznie literą 'R' przez Dyspozytora po weryfikacji.Brak działań — decyzja ręczna Dyspozytora.sFTP/ZP wysł.Plik dostarczony po CET — status pozytywny.Brak działań — dostarczone po CET, OK.sFTP/ZP wysł.Przedwczesne (&gt;30 min do TET) — plik jeszcze niewymagany.Monitoring — czekaj do TET.sFTP/ZP wysł.Oczekiwanie / transfer w toku (stan przejściowy).Czekaj 5 min → sprawdź sFTP/ZP. Gdy brak → wyślij plik ręcznie ze źródła na sFTP/ZP.sFTP/ZP wysł.Zbliża się TET — pliku jeszcze nie ma na sFTP/ZP.Sprawdź źródło (Kreator / Perun4V / Core CC Tool). Gdy brak → wyślij plik ręcznie ze źródła na sFTP/ZP.sFTP/ZP wysł.Zbliża się CET / błąd dostarczenia — brak pliku na sFTP/ZP.Gdy pliku NIE ma na sFTP/ZP → wyślij plik ręcznie ze źródła na sFTP/ZP.sFTP/ZP wysł.Minął CET — plik niedostarczony. Krytyczne.Zgłoś (CIZ/WPO/PSE-I). Po CET — postępowanie krytyczne (brak lokalnego fallbacku).</w:t>
+      </w:r>
+    </w:p>
+    <w:p>
       <w:pPr>
         <w:pStyle w:val="Heading4"/>
       </w:pPr>
@@ -12224,6 +12936,16 @@
       </w:r>
     </w:p>
     <w:p>
+      <w:r>
+        <w:t>Warianty stanów (8)</w:t>
+      </w:r>
+    </w:p>
+    <w:p>
+      <w:r>
+        <w:t>Status kafelkaSytuacjaDziałania awaryjneMinIOPlik dostarczony prawidłowo na MinIO — status pozytywny.Brak działań — proces poprawny.MinIOStatus nadany ręcznie literą 'R' przez Dyspozytora po weryfikacji.Brak działań — decyzja ręczna Dyspozytora.MinIOPlik dostarczony po CET — status pozytywny.Brak działań — dostarczone po CET, OK.MinIOPrzedwczesne (&gt;30 min do TET) — plik jeszcze niewymagany.Monitoring — czekaj do TET.MinIOOczekiwanie / transfer w toku (stan przejściowy).Czekaj 5 min → sprawdź MinIO. Gdy brak → pobierz/wygeneruj plik ręcznie ze źródła i wgraj przez Manual Upload (GUI Core CC Tool) / wyślij z CCM.MinIOZbliża się TET — pliku jeszcze nie ma na MinIO.Sprawdź źródło (Kreator / Perun4V / Core CC Tool). Gdy brak → pobierz/wygeneruj plik ręcznie ze źródła i wgraj przez Manual Upload (GUI Core CC Tool) / wyślij z CCM.MinIOZbliża się CET / błąd dostarczenia — brak pliku na MinIO.Gdy pliku NIE ma na MinIO → pobierz/wygeneruj plik ręcznie ze źródła i wgraj przez Manual Upload (GUI Core CC Tool) / wyślij z CCM.MinIOMinął CET — plik niedostarczony. Krytyczne.Zgłoś (CIZ/WPO/PSE-I). Po CET — postępowanie krytyczne (brak lokalnego fallbacku).</w:t>
+      </w:r>
+    </w:p>
+    <w:p>
       <w:pPr>
         <w:pStyle w:val="Heading4"/>
       </w:pPr>
@@ -12285,6 +13007,16 @@
       </w:r>
     </w:p>
     <w:p>
+      <w:r>
+        <w:t>Warianty stanów (8)</w:t>
+      </w:r>
+    </w:p>
+    <w:p>
+      <w:r>
+        <w:t>Status kafelkaSytuacjaDziałania awaryjneMinIOPlik dostarczony prawidłowo na MinIO — status pozytywny.Brak działań — proces poprawny.MinIOStatus nadany ręcznie literą 'R' przez Dyspozytora po weryfikacji.Brak działań — decyzja ręczna Dyspozytora.MinIOPlik dostarczony po CET — status pozytywny.Brak działań — dostarczone po CET, OK.MinIOPrzedwczesne (&gt;30 min do TET) — plik jeszcze niewymagany.Monitoring — czekaj do TET.MinIOOczekiwanie / transfer w toku (stan przejściowy).Czekaj 5 min → sprawdź MinIO. Gdy brak → pobierz/wygeneruj plik ręcznie ze źródła i wgraj przez Manual Upload (GUI Core CC Tool) / wyślij z CCM.MinIOZbliża się TET — pliku jeszcze nie ma na MinIO.Sprawdź źródło (Kreator / Perun4V / Core CC Tool). Gdy brak → pobierz/wygeneruj plik ręcznie ze źródła i wgraj przez Manual Upload (GUI Core CC Tool) / wyślij z CCM.MinIOZbliża się CET / błąd dostarczenia — brak pliku na MinIO.Gdy pliku NIE ma na MinIO → pobierz/wygeneruj plik ręcznie ze źródła i wgraj przez Manual Upload (GUI Core CC Tool) / wyślij z CCM.MinIOMinął CET — plik niedostarczony. Krytyczne.Zgłoś (CIZ/WPO/PSE-I). Po CET — postępowanie krytyczne (brak lokalnego fallbacku).</w:t>
+      </w:r>
+    </w:p>
+    <w:p>
       <w:pPr>
         <w:pStyle w:val="Heading3"/>
       </w:pPr>
@@ -12379,6 +13111,16 @@
       </w:r>
     </w:p>
     <w:p>
+      <w:r>
+        <w:t>Warianty stanów (32)</w:t>
+      </w:r>
+    </w:p>
+    <w:p>
+      <w:r>
+        <w:t>Status kafelkaSytuacjaDziałania awaryjneCCtool wysł.CCtool zwalid.Dokument wysłany prawidłowo do CCTool, otrzymano potwierdzenie ACK z pozytywnym komunikatem.Brak działań — proces poprawny.CCtool wysł.CCtool zwalid.Dokument wysłany prawidłowo do CCTool. Dyspozytor ustawił status ręcznie 'R' po weryfikacji w CCTool.Brak działań.CCtool wysł.CCtool zwalid.Dokument wysłany prawidłowo do CCTool po CET, ACK napłynął po CET z pozytywnym komunikatem.Brak działań — dostarczone po CET, OK.CCtool wysł.CCtool zwalid.Dokument oznaczony ręcznie jako wysłany prawidłowo do CCTool oraz otrzymanie potwierdzenia ACK.Brak działań.CCtool wysł.CCtool zwalid.Dokument prawidłowo wysłany ręcznie z poziomu CCM. Otrzymano potwierdzenie ACK z pozytywnym komunikatem.Brak działań — wysyłka ręczna wykonana.CCtool wysł.CCtool zwalid.Dokument prawidłowo wysłany ręcznie z poziomu CCM. Trwa oczekiwanie na potwierdzenie ACK — około 2 min.Postępowanie:Czekaj 5 minOK → ustaw 'R' w CCMCCtool wysł.CCtool zwalid.Dokument wysłany ręcznie z poziomu CCM, ale ACK nie napłynął w żądanym czasie i zbliża się CET.Postępowanie:Core CC Tool → sprawdź czy plik dotarł (Message Viewer)Jeżeli:OK → oznacz 'R' w CCMbłąd → Plik został odrzucony — odczytaj kod błędu z potwierdzenia ACK i zareaguj zależnie od kodu:kod 20 (bramka dla pliku zamknięta) — zgłoś administratorowi Core CC Toolkod 21 (wersja nie jest wyższa niż już zapisana) — w źródle podnieś numer wersji i wyślij plik ponowniekod 30 (rozmiar pliku niezgodny) — pobierz poprawny plik i wyślij ponownie pełny opis w bazie ryzykbrak → Awaria transportu plików (Connector 2.0). Zgłoś awarię. W międzyczasie wygeneruj plik w KreatorIDCF_CGMES i wyślij go ręcznie przez Core CC Tool (Manual Upload). pełny opis w bazie ryzykCCtool wysł.CCtool zwalid.Dokument wysłany ręcznie z poziomu CCM, a otrzymane ACK: (1) zawiera komunikat błędu (najedź kursorem); (2) proces zakończył się błędem — 'Błąd procesu'.Postępowanie:Najedź kursorem na status i odczytaj kod ACKJeżeli:kod 20 (bramka dla pliku zamknięta) → zgłoś administratorowi Core CC Toolkod 21 (wersja nie jest wyższa niż zapisana) → wygeneruj kolejną wersję w KreatorIDCF_CGMES i opublikuj (Publikuj Connector) · szczegółowa procedura (ze screenami)kod 30 (rozmiar pliku niezgodny) → wygeneruj ponownie w KreatorIDCF_CGMES i opublikuj (Publikuj Connector) · szczegółowa procedura (ze screenami)CCtool wysł.CCtool zwalid.Dokument prawidłowo wysłany ręcznie z poziomu CCM. Otrzymano potwierdzenie ACK z pozytywnym komunikatem po CET.Brak działań — ręczna + ACK po CET, OK.CCtool wysł.CCtool zwalid.Dokument prawidłowo wysłany ręcznie z poziomu CCM. Nie otrzymano potwierdzenia ACK — upłynął czas CET.Postępowanie:Core CC Tool → sprawdź statusJeżeli:OK (Processed) → oznacz 'R' w CCM + zgłośbrak / awaria zwrotna → Awaria transportu plików (Connector 2.0). Zgłoś awarię. W międzyczasie wygeneruj plik w KreatorIDCF_CGMES i wyślij go ręcznie przez Core CC Tool (Manual Upload). pełny opis w bazie ryzykCCtool wysł.CCtool zwalid.Dokument prawidłowo wysłany ręcznie z poziomu CCM. Nie otrzymano ACK, Dyspozytor ustawił status 'R' po weryfikacji w CCTool.Brak działań — decyzja ręczna Dyspozytora.CCtool wysł.CCtool zwalid.Dokument prawidłowo wysłany ręcznie z poziomu CCM po CET. Trwa oczekiwanie na potwierdzenie ACK — około 2 min.Postępowanie:Czekaj 2-5 minOK → ustaw 'R'CCtool wysł.CCtool zwalid.Dokument wysłany ręcznie z poziomu CCM po CET. Trwa oczekiwanie na potwierdzenie ACK — upłynęło więcej niż 2 minuty.Postępowanie:Core CC Tool → sprawdź czy plik dotarł (Message Viewer)Jeżeli:OK → oznacz 'R' w CCMbłąd → Plik został odrzucony — odczytaj kod błędu z potwierdzenia ACK i zareaguj zależnie od kodu:kod 20 (bramka dla pliku zamknięta) — zgłoś administratorowi Core CC Toolkod 21 (wersja nie jest wyższa niż już zapisana) — w źródle podnieś numer wersji i wyślij plik ponowniekod 30 (rozmiar pliku niezgodny) — pobierz poprawny plik i wyślij ponownie pełny opis w bazie ryzykbrak → Awaria transportu plików (Connector 2.0). Zgłoś awarię. W międzyczasie wygeneruj plik w KreatorIDCF_CGMES i wyślij go ręcznie przez Core CC Tool (Manual Upload). pełny opis w bazie ryzykCCtool wysł.CCtool zwalid.Dokument wysłany ręcznie z poziomu CCM po CET, a otrzymane ACK: (1) komunikat błędu; (2) proces zakończył się błędem. Typowo kod 20 gateClosed.Postępowanie:Najedź kursorem na status i odczytaj kod ACK (typowo kod 20)Jeżeli:kod 20 (bramka dla pliku zamknięta) → po CET bramka jest zamknięta → zgłośinny kod → Plik został odrzucony — odczytaj kod błędu z potwierdzenia ACK i zareaguj zależnie od kodu:kod 20 (bramka dla pliku zamknięta) — zgłoś administratorowi Core CC Toolkod 21 (wersja nie jest wyższa niż już zapisana) — w źródle podnieś numer wersji i wyślij plik ponowniekod 30 (rozmiar pliku niezgodny) — pobierz poprawny plik i wyślij ponownie pełny opis w bazie ryzykCCtool wysł.CCtool zwalid.Dokument prawidłowo wysłany ręcznie z poziomu CCM po CET. Otrzymano potwierdzenie ACK z pozytywnym komunikatem (po CET).Brak działań — ręczna + ACK po CET, OK.CCtool wysł.CCtool zwalid.Dokument prawidłowo wysłany ręcznie z poziomu CCM po CET. Nie otrzymano potwierdzenia ACK — upłynął czas CET.Postępowanie:Core CC Tool → sprawdź statusJeżeli:OK (Processed) → oznacz 'R' w CCM + zgłośbrak / awaria zwrotna → Awaria transportu plików (Connector 2.0). Zgłoś awarię. W międzyczasie wygeneruj plik w KreatorIDCF_CGMES i wyślij go ręcznie przez Core CC Tool (Manual Upload). pełny opis w bazie ryzykCCtool wysł.CCtool zwalid.Dokument oznaczony ręcznie jako wysłany prawidłowo do CCTool. Trwa oczekiwanie na ACK — około 2 min.Postępowanie:Czekaj 5 minOK → 'R' dla ACKCCtool wysł.CCtool zwalid.Dokument oznaczony ręcznie jako wysłany prawidłowo. Trwa oczekiwanie na ACK — upłynęło więcej niż 2 min.Postępowanie:Czekaj 5 minOK → 'R' dla ACKCCtool wysł.CCtool zwalid.Dokument oznaczony ręcznie jako wysłany prawidłowo. Nie otrzymano potwierdzenia ACK — upłynął czas CET.Postępowanie:Core CC Tool → sprawdź statusJeżeli:OK (Processed) → utrzymaj 'R'brak / awaria → Awaria transportu plików (Connector 2.0). Zgłoś awarię. W międzyczasie wygeneruj plik w KreatorIDCF_CGMES i wyślij go ręcznie przez Core CC Tool (Manual Upload). pełny opis w bazie ryzykCCtool wysł.CCtool zwalid.Wysłany dokument nie spełnia kryterium rozmiaru. ACK nie otrzymano, Dyspozytor ustawił status 'R' po weryfikacji w CCTool.Brak działań — Dyspozytor zatwierdził zawartość.CCtool wysł.CCtool zwalid.Dokument jeszcze nie został wysłany do CCTool, ACK nie napłynął. Plik nie wymagany (&gt;30 min do TET).Brak działań — czekaj do TET.CCtool wysł.CCtool zwalid.Zbliża się CET — plik niedostarczony lub błąd wysyłki. Stan alarmowy.Postępowanie (alarm):Core CC Tool → sprawdź czy plik dotarł do Core CC ToolJeżeli:plik jest, brak ACK → Plik został odrzucony — odczytaj kod błędu z potwierdzenia ACK i zareaguj zależnie od kodu:kod 20 (bramka dla pliku zamknięta) — zgłoś administratorowi Core CC Toolkod 21 (wersja nie jest wyższa niż już zapisana) — w źródle podnieś numer wersji i wyślij plik ponowniekod 30 (rozmiar pliku niezgodny) — pobierz poprawny plik i wyślij ponownie pełny opis w bazie ryzykbrak pliku (awaria Connector 2.0) → Awaria transportu plików (Connector 2.0). Zgłoś awarię. W międzyczasie wygeneruj plik w KreatorIDCF_CGMES i wyślij go ręcznie przez Core CC Tool (Manual Upload). pełny opis w bazie ryzykbrak pliku w źródle → Brak pliku lub wersji w aplikacji źródłowej. Otwórz KreatorIDCF_CGMES i wygeneruj plik ponownie (kolejna wersja); jeśli aplikacja nie działa — zgłoś. pełny opis w bazie ryzykCCtool wysł.CCtool zwalid.Wysłany dokument nie spełnia kryterium rozmiaru. Oczekiwanie na ACK — upłynęło więcej niż 2 min.Postępowanie:W aplikacji CCM kliknij plik lewym przyciskiem myszy → Informacje → sprawdź rozmiar; pobierz z MinIO i rozpakujJeżeli:zawartość OK mimo rozmiaru → oznacz 'R' (→ powiązany stan)zawartość niepoprawna → Plik został odrzucony — odczytaj kod błędu z potwierdzenia ACK i zareaguj zależnie od kodu:kod 20 (bramka dla pliku zamknięta) — zgłoś administratorowi Core CC Toolkod 21 (wersja nie jest wyższa niż już zapisana) — w źródle podnieś numer wersji i wyślij plik ponowniekod 30 (rozmiar pliku niezgodny) — pobierz poprawny plik i wyślij ponownie pełny opis w bazie ryzykCCtool wysł.CCtool zwalid.Wysłany dokument nie spełnia kryterium rozmiaru, a ACK ma status czerwony — typowo kod 30.Postępowanie:W aplikacji CCM kliknij plik lewym przyciskiem myszy → Informacje → potwierdź rozmiarWygeneruj poprawny plik w KreatorIDCF_CGMES (kolejna wersja) i opublikuj (Publikuj Connector) · szczegółowa procedura (ze screenami)Nadal za mały → zgłoś szczegóły w bazie ryzykCCtool wysł.CCtool zwalid.Wysłany dokument nie spełnia kryterium rozmiaru. ACK napłynął po CET z pozytywnym komunikatem. Sprzeczność.Postępowanie:Pobierz z MinIO → rozpakuj → sprawdź zawartośćJeżeli:zawartość OK → oznacz 'R' (→ powiązany stan); zgłośniepoprawna → zgłośCCtool wysł.CCtool zwalid.Dokument wysłany prawidłowo do CCTool, ale ACK negatywny (Rejected). Kody: 20/21/30.Postępowanie:Najedź kursorem na status i odczytaj kod ACKJeżeli:kod 20 (bramka dla pliku zamknięta) → zgłoś (administrator Core CC Tool otwiera bramkę); sprawdź proces IDx-AC-FORWARDINGkod 21 (wersja nie jest wyższa niż zapisana) → wygeneruj kolejną wersję w KreatorIDCF_CGMES i opublikuj (Publikuj Connector) · szczegółowa procedura (ze screenami)kod 30 (rozmiar pliku niezgodny) → wygeneruj ponownie w KreatorIDCF_CGMES i opublikuj (Publikuj Connector) · szczegółowa procedura (ze screenami)CCtool wysł.CCtool zwalid.Dokument wysłany prawidłowo, trwa oczekiwanie na ACK, który nie napłynął w zadanym czasie (&gt;2-3 min).Postępowanie:Czekaj 5 min → Core CC Tool (⚠ nie wysyłaj ponownie!)Jeżeli:Processed → oznacz 'R' + zgłośRejected → patrz stan kod ACKbrak wpisu → Awaria transportu plików (Connector 2.0). Zgłoś awarię. W międzyczasie wygeneruj plik w KreatorIDCF_CGMES i wyślij go ręcznie przez Core CC Tool (Manual Upload). pełny opis w bazie ryzykCCtool wysł.CCtool zwalid.Dokument wysłany prawidłowo, ACK nie napłynął do CET.Postępowanie:Core CC Tool → sprawdź statusJeżeli:Processed → oznacz 'R' + zgłoś (→ powiązany stan)Rejected → wyślij ponownie przez Core CC Tool (Manual Upload) "po CET"brak → Awaria transportu plików (Connector 2.0). Zgłoś awarię. W międzyczasie wygeneruj plik w KreatorIDCF_CGMES i wyślij go ręcznie przez Core CC Tool (Manual Upload). pełny opis w bazie ryzyk + powiadom RCCCCtool wysł.CCtool zwalid.Wysłany dokument nie spełnia kryterium rozmiaru. ACK nie napłynął do CET. Krytyczne.Postępowanie (KRYTYCZNE w C):Wygeneruj poprawny plik w KreatorIDCF_CGMES i opublikuj (Publikuj Connector) · szczegółowa procedura (ze screenami) "po CET" (jeśli bramka otwarta)Natychmiast: zgłoś + powiadom RCC szczegóły w bazie ryzykCCtool wysł.CCtool zwalid.Dokument zarejestrowany w CCTool po CET (wysyłka pozytywna), ale walidacja zakończona negatywnie — ACK Rejected po CET.Postępowanie (po CET):Najedź kursorem na status i odczytaj kod ACK (kontekst: rejestracja po CET)Jeżeli:kod 20 (bramka dla pliku zamknięta) → po CET bramka zamknięta → zgłoś + powiadom RCCkod 21 (wersja nie jest wyższa niż zapisana) → wygeneruj kolejną wersję w KreatorIDCF_CGMES i opublikuj (Publikuj Connector) · szczegółowa procedura (ze screenami) (jeśli bramka otwarta)kod 30 (rozmiar pliku niezgodny) → wygeneruj ponownie w KreatorIDCF_CGMES i opublikuj (Publikuj Connector) · szczegółowa procedura (ze screenami) (jeśli bramka otwarta)CCtool wysł.CCtool zwalid.Dokument zarejestrowany w CCTool po CET (wysyłka pozytywna), ale ACK walidacji nie napłynął — plik dostarczony, lecz niezwalidowany.Postępowanie (po CET):Core CC Tool → sprawdź status walidacji (plik dostarczony po CET)Jeżeli:Processed → oznacz 'R' w CCM + zgłośRejected → postępuj jak w Stanie 30 (odczytaj kod ACK)brak wpisu → Awaria transportu plików (Connector 2.0). Zgłoś awarię. W międzyczasie wygeneruj plik w KreatorIDCF_CGMES i wyślij go ręcznie przez Core CC Tool (Manual Upload). pełny opis w bazie ryzyk + powiadom RCCCCtool wysł.CCtool zwalid.Dokument nie został dostarczony do CCTool, ACK nie napłynął. Minął czas CET. KRYTYCZNE — po CET dograć nie można.Postępowanie (KRYTYCZNE — brak naprawy):Telefon do RCC + zgłoś (priorytet P1)Po CET — brak naprawy. Diagnoza przyczyn: Kreator · Connector 2.0 · Core CC Tool szczegóły w bazie ryzyk</w:t>
+      </w:r>
+    </w:p>
+    <w:p>
       <w:pPr>
         <w:pStyle w:val="Heading4"/>
       </w:pPr>
@@ -12440,6 +13182,16 @@
       </w:r>
     </w:p>
     <w:p>
+      <w:r>
+        <w:t>Warianty stanów (8)</w:t>
+      </w:r>
+    </w:p>
+    <w:p>
+      <w:r>
+        <w:t>Status kafelkaSytuacjaDziałania awaryjneMinIOPlik dostarczony prawidłowo na MinIO — status pozytywny.Brak działań — proces poprawny.MinIOStatus nadany ręcznie literą 'R' przez Dyspozytora po weryfikacji.Brak działań — decyzja ręczna Dyspozytora.MinIOPlik dostarczony po CET — status pozytywny.Brak działań — dostarczone po CET, OK.MinIOPrzedwczesne (&gt;30 min do TET) — plik jeszcze niewymagany.Monitoring — czekaj do TET.MinIOOczekiwanie / transfer w toku (stan przejściowy).Czekaj 5 min → sprawdź MinIO. Gdy brak → pobierz/wygeneruj plik ręcznie ze źródła i wgraj przez Manual Upload (GUI Core CC Tool) / wyślij z CCM.MinIOZbliża się TET — pliku jeszcze nie ma na MinIO.Sprawdź źródło (Kreator / Perun4V / Core CC Tool). Gdy brak → pobierz/wygeneruj plik ręcznie ze źródła i wgraj przez Manual Upload (GUI Core CC Tool) / wyślij z CCM.MinIOZbliża się CET / błąd dostarczenia — brak pliku na MinIO.Gdy pliku NIE ma na MinIO → pobierz/wygeneruj plik ręcznie ze źródła i wgraj przez Manual Upload (GUI Core CC Tool) / wyślij z CCM.MinIOMinął CET — plik niedostarczony. Krytyczne.Zgłoś (CIZ/WPO/PSE-I). Po CET — postępowanie krytyczne (brak lokalnego fallbacku).</w:t>
+      </w:r>
+    </w:p>
+    <w:p>
       <w:pPr>
         <w:pStyle w:val="Heading4"/>
       </w:pPr>
@@ -12501,6 +13253,16 @@
       </w:r>
     </w:p>
     <w:p>
+      <w:r>
+        <w:t>Warianty stanów (8)</w:t>
+      </w:r>
+    </w:p>
+    <w:p>
+      <w:r>
+        <w:t>Status kafelkaSytuacjaDziałania awaryjneMinIOPlik dostarczony prawidłowo na MinIO — status pozytywny.Brak działań — proces poprawny.MinIOStatus nadany ręcznie literą 'R' przez Dyspozytora po weryfikacji.Brak działań — decyzja ręczna Dyspozytora.MinIOPlik dostarczony po CET — status pozytywny.Brak działań — dostarczone po CET, OK.MinIOPrzedwczesne (&gt;30 min do TET) — plik jeszcze niewymagany.Monitoring — czekaj do TET.MinIOOczekiwanie / transfer w toku (stan przejściowy).Czekaj 5 min → sprawdź MinIO. Gdy brak → pobierz/wygeneruj plik ręcznie ze źródła i wgraj przez Manual Upload (GUI Core CC Tool) / wyślij z CCM.MinIOZbliża się TET — pliku jeszcze nie ma na MinIO.Sprawdź źródło (Kreator / Perun4V / Core CC Tool). Gdy brak → pobierz/wygeneruj plik ręcznie ze źródła i wgraj przez Manual Upload (GUI Core CC Tool) / wyślij z CCM.MinIOZbliża się CET / błąd dostarczenia — brak pliku na MinIO.Gdy pliku NIE ma na MinIO → pobierz/wygeneruj plik ręcznie ze źródła i wgraj przez Manual Upload (GUI Core CC Tool) / wyślij z CCM.MinIOMinął CET — plik niedostarczony. Krytyczne.Zgłoś (CIZ/WPO/PSE-I). Po CET — postępowanie krytyczne (brak lokalnego fallbacku).</w:t>
+      </w:r>
+    </w:p>
+    <w:p>
       <w:pPr>
         <w:pStyle w:val="Heading4"/>
       </w:pPr>
@@ -12587,6 +13349,16 @@
       </w:r>
     </w:p>
     <w:p>
+      <w:r>
+        <w:t>Warianty stanów (32)</w:t>
+      </w:r>
+    </w:p>
+    <w:p>
+      <w:r>
+        <w:t>Status kafelkaSytuacjaDziałania awaryjneCCtool wysł.CCtool zwalid.Dokument wysłany prawidłowo do CCTool, otrzymano potwierdzenie ACK z pozytywnym komunikatem.Brak działań — proces poprawny.CCtool wysł.CCtool zwalid.Dokument wysłany prawidłowo do CCTool. Dyspozytor ustawił status ręcznie 'R' po weryfikacji w CCTool.Brak działań.CCtool wysł.CCtool zwalid.Dokument wysłany prawidłowo do CCTool po CET, ACK napłynął po CET z pozytywnym komunikatem.Brak działań — dostarczone po CET, OK.CCtool wysł.CCtool zwalid.Dokument oznaczony ręcznie jako wysłany prawidłowo do CCTool oraz otrzymanie potwierdzenia ACK.Brak działań.CCtool wysł.CCtool zwalid.Dokument prawidłowo wysłany ręcznie z poziomu CCM. Otrzymano potwierdzenie ACK z pozytywnym komunikatem.Brak działań — wysyłka ręczna wykonana.CCtool wysł.CCtool zwalid.Dokument prawidłowo wysłany ręcznie z poziomu CCM. Trwa oczekiwanie na potwierdzenie ACK — około 2 min.Postępowanie:Czekaj 5 minOK → ustaw 'R' w CCMCCtool wysł.CCtool zwalid.Dokument wysłany ręcznie z poziomu CCM, ale ACK nie napłynął w żądanym czasie i zbliża się CET.Postępowanie:Core CC Tool → sprawdź czy plik dotarł (Message Viewer)Jeżeli:OK → oznacz 'R' w CCMbłąd → Plik został odrzucony — odczytaj kod błędu z potwierdzenia ACK i zareaguj zależnie od kodu:kod 20 (bramka dla pliku zamknięta) — zgłoś administratorowi Core CC Toolkod 21 (wersja nie jest wyższa niż już zapisana) — w źródle podnieś numer wersji i wyślij plik ponowniekod 30 (rozmiar pliku niezgodny) — pobierz poprawny plik i wyślij ponownie pełny opis w bazie ryzykbrak → Awaria transportu plików (Connector 2.0). Zgłoś awarię. W międzyczasie wygeneruj plik w KreatorIDCF_CGMES i wyślij go ręcznie przez Core CC Tool (Manual Upload). pełny opis w bazie ryzykCCtool wysł.CCtool zwalid.Dokument wysłany ręcznie z poziomu CCM, a otrzymane ACK: (1) zawiera komunikat błędu (najedź kursorem); (2) proces zakończył się błędem — 'Błąd procesu'.Postępowanie:Najedź kursorem na status i odczytaj kod ACKJeżeli:kod 20 (bramka dla pliku zamknięta) → zgłoś administratorowi Core CC Toolkod 21 (wersja nie jest wyższa niż zapisana) → wygeneruj kolejną wersję w KreatorIDCF_CGMES i opublikuj (Publikuj Connector) · szczegółowa procedura (ze screenami)kod 30 (rozmiar pliku niezgodny) → wygeneruj ponownie w KreatorIDCF_CGMES i opublikuj (Publikuj Connector) · szczegółowa procedura (ze screenami)CCtool wysł.CCtool zwalid.Dokument prawidłowo wysłany ręcznie z poziomu CCM. Otrzymano potwierdzenie ACK z pozytywnym komunikatem po CET.Brak działań — ręczna + ACK po CET, OK.CCtool wysł.CCtool zwalid.Dokument prawidłowo wysłany ręcznie z poziomu CCM. Nie otrzymano potwierdzenia ACK — upłynął czas CET.Postępowanie:Core CC Tool → sprawdź statusJeżeli:OK (Processed) → oznacz 'R' w CCM + zgłośbrak / awaria zwrotna → Awaria transportu plików (Connector 2.0). Zgłoś awarię. W międzyczasie wygeneruj plik w KreatorIDCF_CGMES i wyślij go ręcznie przez Core CC Tool (Manual Upload). pełny opis w bazie ryzykCCtool wysł.CCtool zwalid.Dokument prawidłowo wysłany ręcznie z poziomu CCM. Nie otrzymano ACK, Dyspozytor ustawił status 'R' po weryfikacji w CCTool.Brak działań — decyzja ręczna Dyspozytora.CCtool wysł.CCtool zwalid.Dokument prawidłowo wysłany ręcznie z poziomu CCM po CET. Trwa oczekiwanie na potwierdzenie ACK — około 2 min.Postępowanie:Czekaj 2-5 minOK → ustaw 'R'CCtool wysł.CCtool zwalid.Dokument wysłany ręcznie z poziomu CCM po CET. Trwa oczekiwanie na potwierdzenie ACK — upłynęło więcej niż 2 minuty.Postępowanie:Core CC Tool → sprawdź czy plik dotarł (Message Viewer)Jeżeli:OK → oznacz 'R' w CCMbłąd → Plik został odrzucony — odczytaj kod błędu z potwierdzenia ACK i zareaguj zależnie od kodu:kod 20 (bramka dla pliku zamknięta) — zgłoś administratorowi Core CC Toolkod 21 (wersja nie jest wyższa niż już zapisana) — w źródle podnieś numer wersji i wyślij plik ponowniekod 30 (rozmiar pliku niezgodny) — pobierz poprawny plik i wyślij ponownie pełny opis w bazie ryzykbrak → Awaria transportu plików (Connector 2.0). Zgłoś awarię. W międzyczasie wygeneruj plik w KreatorIDCF_CGMES i wyślij go ręcznie przez Core CC Tool (Manual Upload). pełny opis w bazie ryzykCCtool wysł.CCtool zwalid.Dokument wysłany ręcznie z poziomu CCM po CET, a otrzymane ACK: (1) komunikat błędu; (2) proces zakończył się błędem. Typowo kod 20 gateClosed.Postępowanie:Najedź kursorem na status i odczytaj kod ACK (typowo kod 20)Jeżeli:kod 20 (bramka dla pliku zamknięta) → po CET bramka jest zamknięta → zgłośinny kod → Plik został odrzucony — odczytaj kod błędu z potwierdzenia ACK i zareaguj zależnie od kodu:kod 20 (bramka dla pliku zamknięta) — zgłoś administratorowi Core CC Toolkod 21 (wersja nie jest wyższa niż już zapisana) — w źródle podnieś numer wersji i wyślij plik ponowniekod 30 (rozmiar pliku niezgodny) — pobierz poprawny plik i wyślij ponownie pełny opis w bazie ryzykCCtool wysł.CCtool zwalid.Dokument prawidłowo wysłany ręcznie z poziomu CCM po CET. Otrzymano potwierdzenie ACK z pozytywnym komunikatem (po CET).Brak działań — ręczna + ACK po CET, OK.CCtool wysł.CCtool zwalid.Dokument prawidłowo wysłany ręcznie z poziomu CCM po CET. Nie otrzymano potwierdzenia ACK — upłynął czas CET.Postępowanie:Core CC Tool → sprawdź statusJeżeli:OK (Processed) → oznacz 'R' w CCM + zgłośbrak / awaria zwrotna → Awaria transportu plików (Connector 2.0). Zgłoś awarię. W międzyczasie wygeneruj plik w KreatorIDCF_CGMES i wyślij go ręcznie przez Core CC Tool (Manual Upload). pełny opis w bazie ryzykCCtool wysł.CCtool zwalid.Dokument oznaczony ręcznie jako wysłany prawidłowo do CCTool. Trwa oczekiwanie na ACK — około 2 min.Postępowanie:Czekaj 5 minOK → 'R' dla ACKCCtool wysł.CCtool zwalid.Dokument oznaczony ręcznie jako wysłany prawidłowo. Trwa oczekiwanie na ACK — upłynęło więcej niż 2 min.Postępowanie:Czekaj 5 minOK → 'R' dla ACKCCtool wysł.CCtool zwalid.Dokument oznaczony ręcznie jako wysłany prawidłowo. Nie otrzymano potwierdzenia ACK — upłynął czas CET.Postępowanie:Core CC Tool → sprawdź statusJeżeli:OK (Processed) → utrzymaj 'R'brak / awaria → Awaria transportu plików (Connector 2.0). Zgłoś awarię. W międzyczasie wygeneruj plik w KreatorIDCF_CGMES i wyślij go ręcznie przez Core CC Tool (Manual Upload). pełny opis w bazie ryzykCCtool wysł.CCtool zwalid.Wysłany dokument nie spełnia kryterium rozmiaru. ACK nie otrzymano, Dyspozytor ustawił status 'R' po weryfikacji w CCTool.Brak działań — Dyspozytor zatwierdził zawartość.CCtool wysł.CCtool zwalid.Dokument jeszcze nie został wysłany do CCTool, ACK nie napłynął. Plik nie wymagany (&gt;30 min do TET).Brak działań — czekaj do TET.CCtool wysł.CCtool zwalid.Zbliża się CET — plik niedostarczony lub błąd wysyłki. Stan alarmowy.Postępowanie (alarm):Core CC Tool → sprawdź czy plik dotarł do Core CC ToolJeżeli:plik jest, brak ACK → Plik został odrzucony — odczytaj kod błędu z potwierdzenia ACK i zareaguj zależnie od kodu:kod 20 (bramka dla pliku zamknięta) — zgłoś administratorowi Core CC Toolkod 21 (wersja nie jest wyższa niż już zapisana) — w źródle podnieś numer wersji i wyślij plik ponowniekod 30 (rozmiar pliku niezgodny) — pobierz poprawny plik i wyślij ponownie pełny opis w bazie ryzykbrak pliku (awaria Connector 2.0) → Awaria transportu plików (Connector 2.0). Zgłoś awarię. W międzyczasie wygeneruj plik w KreatorIDCF_CGMES i wyślij go ręcznie przez Core CC Tool (Manual Upload). pełny opis w bazie ryzykbrak pliku w źródle → Brak pliku lub wersji w aplikacji źródłowej. Otwórz KreatorIDCF_CGMES i wygeneruj plik ponownie (kolejna wersja); jeśli aplikacja nie działa — zgłoś. pełny opis w bazie ryzykCCtool wysł.CCtool zwalid.Wysłany dokument nie spełnia kryterium rozmiaru. Oczekiwanie na ACK — upłynęło więcej niż 2 min.Postępowanie:W aplikacji CCM kliknij plik lewym przyciskiem myszy → Informacje → sprawdź rozmiar; pobierz z MinIO i rozpakujJeżeli:zawartość OK mimo rozmiaru → oznacz 'R' (→ powiązany stan)zawartość niepoprawna → Plik został odrzucony — odczytaj kod błędu z potwierdzenia ACK i zareaguj zależnie od kodu:kod 20 (bramka dla pliku zamknięta) — zgłoś administratorowi Core CC Toolkod 21 (wersja nie jest wyższa niż już zapisana) — w źródle podnieś numer wersji i wyślij plik ponowniekod 30 (rozmiar pliku niezgodny) — pobierz poprawny plik i wyślij ponownie pełny opis w bazie ryzykCCtool wysł.CCtool zwalid.Wysłany dokument nie spełnia kryterium rozmiaru, a ACK ma status czerwony — typowo kod 30.Postępowanie:W aplikacji CCM kliknij plik lewym przyciskiem myszy → Informacje → potwierdź rozmiarWygeneruj poprawny plik w KreatorIDCF_CGMES (kolejna wersja) i opublikuj (Publikuj Connector) · szczegółowa procedura (ze screenami)Nadal za mały → zgłoś szczegóły w bazie ryzykCCtool wysł.CCtool zwalid.Wysłany dokument nie spełnia kryterium rozmiaru. ACK napłynął po CET z pozytywnym komunikatem. Sprzeczność.Postępowanie:Pobierz z MinIO → rozpakuj → sprawdź zawartośćJeżeli:zawartość OK → oznacz 'R' (→ powiązany stan); zgłośniepoprawna → zgłośCCtool wysł.CCtool zwalid.Dokument wysłany prawidłowo do CCTool, ale ACK negatywny (Rejected). Kody: 20/21/30.Postępowanie:Najedź kursorem na status i odczytaj kod ACKJeżeli:kod 20 (bramka dla pliku zamknięta) → zgłoś (administrator Core CC Tool otwiera bramkę); sprawdź proces IDx-AC-FORWARDINGkod 21 (wersja nie jest wyższa niż zapisana) → wygeneruj kolejną wersję w KreatorIDCF_CGMES i opublikuj (Publikuj Connector) · szczegółowa procedura (ze screenami)kod 30 (rozmiar pliku niezgodny) → wygeneruj ponownie w KreatorIDCF_CGMES i opublikuj (Publikuj Connector) · szczegółowa procedura (ze screenami)CCtool wysł.CCtool zwalid.Dokument wysłany prawidłowo, trwa oczekiwanie na ACK, który nie napłynął w zadanym czasie (&gt;2-3 min).Postępowanie:Czekaj 5 min → Core CC Tool (⚠ nie wysyłaj ponownie!)Jeżeli:Processed → oznacz 'R' + zgłośRejected → patrz stan kod ACKbrak wpisu → Awaria transportu plików (Connector 2.0). Zgłoś awarię. W międzyczasie wygeneruj plik w KreatorIDCF_CGMES i wyślij go ręcznie przez Core CC Tool (Manual Upload). pełny opis w bazie ryzykCCtool wysł.CCtool zwalid.Dokument wysłany prawidłowo, ACK nie napłynął do CET.Postępowanie:Core CC Tool → sprawdź statusJeżeli:Processed → oznacz 'R' + zgłoś (→ powiązany stan)Rejected → wyślij ponownie przez Core CC Tool (Manual Upload) "po CET"brak → Awaria transportu plików (Connector 2.0). Zgłoś awarię. W międzyczasie wygeneruj plik w KreatorIDCF_CGMES i wyślij go ręcznie przez Core CC Tool (Manual Upload). pełny opis w bazie ryzyk + powiadom RCCCCtool wysł.CCtool zwalid.Wysłany dokument nie spełnia kryterium rozmiaru. ACK nie napłynął do CET. Krytyczne.Postępowanie (KRYTYCZNE w C):Wygeneruj poprawny plik w KreatorIDCF_CGMES i opublikuj (Publikuj Connector) · szczegółowa procedura (ze screenami) "po CET" (jeśli bramka otwarta)Natychmiast: zgłoś + powiadom RCC szczegóły w bazie ryzykCCtool wysł.CCtool zwalid.Dokument zarejestrowany w CCTool po CET (wysyłka pozytywna), ale walidacja zakończona negatywnie — ACK Rejected po CET.Postępowanie (po CET):Najedź kursorem na status i odczytaj kod ACK (kontekst: rejestracja po CET)Jeżeli:kod 20 (bramka dla pliku zamknięta) → po CET bramka zamknięta → zgłoś + powiadom RCCkod 21 (wersja nie jest wyższa niż zapisana) → wygeneruj kolejną wersję w KreatorIDCF_CGMES i opublikuj (Publikuj Connector) · szczegółowa procedura (ze screenami) (jeśli bramka otwarta)kod 30 (rozmiar pliku niezgodny) → wygeneruj ponownie w KreatorIDCF_CGMES i opublikuj (Publikuj Connector) · szczegółowa procedura (ze screenami) (jeśli bramka otwarta)CCtool wysł.CCtool zwalid.Dokument zarejestrowany w CCTool po CET (wysyłka pozytywna), ale ACK walidacji nie napłynął — plik dostarczony, lecz niezwalidowany.Postępowanie (po CET):Core CC Tool → sprawdź status walidacji (plik dostarczony po CET)Jeżeli:Processed → oznacz 'R' w CCM + zgłośRejected → postępuj jak w Stanie 30 (odczytaj kod ACK)brak wpisu → Awaria transportu plików (Connector 2.0). Zgłoś awarię. W międzyczasie wygeneruj plik w KreatorIDCF_CGMES i wyślij go ręcznie przez Core CC Tool (Manual Upload). pełny opis w bazie ryzyk + powiadom RCCCCtool wysł.CCtool zwalid.Dokument nie został dostarczony do CCTool, ACK nie napłynął. Minął czas CET. KRYTYCZNE — po CET dograć nie można.Postępowanie (KRYTYCZNE — brak naprawy):Telefon do RCC + zgłoś (priorytet P1)Po CET — brak naprawy. Diagnoza przyczyn: Kreator · Connector 2.0 · Core CC Tool szczegóły w bazie ryzyk</w:t>
+      </w:r>
+    </w:p>
+    <w:p>
       <w:pPr>
         <w:pStyle w:val="Heading4"/>
       </w:pPr>
@@ -12648,6 +13420,16 @@
       </w:r>
     </w:p>
     <w:p>
+      <w:r>
+        <w:t>Warianty stanów (8)</w:t>
+      </w:r>
+    </w:p>
+    <w:p>
+      <w:r>
+        <w:t>Status kafelkaSytuacjaDziałania awaryjneMinIOPlik dostarczony prawidłowo na MinIO — status pozytywny.Brak działań — proces poprawny.MinIOStatus nadany ręcznie literą 'R' przez Dyspozytora po weryfikacji.Brak działań — decyzja ręczna Dyspozytora.MinIOPlik dostarczony po CET — status pozytywny.Brak działań — dostarczone po CET, OK.MinIOPrzedwczesne (&gt;30 min do TET) — plik jeszcze niewymagany.Monitoring — czekaj do TET.MinIOOczekiwanie / transfer w toku (stan przejściowy).Czekaj 5 min → sprawdź MinIO. Gdy brak → pobierz/wygeneruj plik ręcznie ze źródła i wgraj przez Manual Upload (GUI Core CC Tool) / wyślij z CCM.MinIOZbliża się TET — pliku jeszcze nie ma na MinIO.Sprawdź źródło (Kreator / Perun4V / Core CC Tool). Gdy brak → pobierz/wygeneruj plik ręcznie ze źródła i wgraj przez Manual Upload (GUI Core CC Tool) / wyślij z CCM.MinIOZbliża się CET / błąd dostarczenia — brak pliku na MinIO.Gdy pliku NIE ma na MinIO → pobierz/wygeneruj plik ręcznie ze źródła i wgraj przez Manual Upload (GUI Core CC Tool) / wyślij z CCM.MinIOMinął CET — plik niedostarczony. Krytyczne.Zgłoś (CIZ/WPO/PSE-I). Po CET — postępowanie krytyczne (brak lokalnego fallbacku).</w:t>
+      </w:r>
+    </w:p>
+    <w:p>
       <w:pPr>
         <w:pStyle w:val="Heading4"/>
       </w:pPr>
@@ -12709,6 +13491,16 @@
       </w:r>
     </w:p>
     <w:p>
+      <w:r>
+        <w:t>Warianty stanów (8)</w:t>
+      </w:r>
+    </w:p>
+    <w:p>
+      <w:r>
+        <w:t>Status kafelkaSytuacjaDziałania awaryjneMinIOPlik dostarczony prawidłowo na MinIO — status pozytywny.Brak działań — proces poprawny.MinIOStatus nadany ręcznie literą 'R' przez Dyspozytora po weryfikacji.Brak działań — decyzja ręczna Dyspozytora.MinIOPlik dostarczony po CET — status pozytywny.Brak działań — dostarczone po CET, OK.MinIOPrzedwczesne (&gt;30 min do TET) — plik jeszcze niewymagany.Monitoring — czekaj do TET.MinIOOczekiwanie / transfer w toku (stan przejściowy).Czekaj 5 min → sprawdź MinIO. Gdy brak → pobierz/wygeneruj plik ręcznie ze źródła i wgraj przez Manual Upload (GUI Core CC Tool) / wyślij z CCM.MinIOZbliża się TET — pliku jeszcze nie ma na MinIO.Sprawdź źródło (Kreator / Perun4V / Core CC Tool). Gdy brak → pobierz/wygeneruj plik ręcznie ze źródła i wgraj przez Manual Upload (GUI Core CC Tool) / wyślij z CCM.MinIOZbliża się CET / błąd dostarczenia — brak pliku na MinIO.Gdy pliku NIE ma na MinIO → pobierz/wygeneruj plik ręcznie ze źródła i wgraj przez Manual Upload (GUI Core CC Tool) / wyślij z CCM.MinIOMinął CET — plik niedostarczony. Krytyczne.Zgłoś (CIZ/WPO/PSE-I). Po CET — postępowanie krytyczne (brak lokalnego fallbacku).</w:t>
+      </w:r>
+    </w:p>
+    <w:p>
       <w:pPr>
         <w:pStyle w:val="Heading4"/>
       </w:pPr>
@@ -12770,6 +13562,16 @@
       </w:r>
     </w:p>
     <w:p>
+      <w:r>
+        <w:t>Warianty stanów (8)</w:t>
+      </w:r>
+    </w:p>
+    <w:p>
+      <w:r>
+        <w:t>Status kafelkaSytuacjaDziałania awaryjneMinIOPlik dostarczony prawidłowo na MinIO — status pozytywny.Brak działań — proces poprawny.MinIOStatus nadany ręcznie literą 'R' przez Dyspozytora po weryfikacji.Brak działań — decyzja ręczna Dyspozytora.MinIOPlik dostarczony po CET — status pozytywny.Brak działań — dostarczone po CET, OK.MinIOPrzedwczesne (&gt;30 min do TET) — plik jeszcze niewymagany.Monitoring — czekaj do TET.MinIOOczekiwanie / transfer w toku (stan przejściowy).Czekaj 5 min → sprawdź MinIO. Gdy brak → pobierz/wygeneruj plik ręcznie ze źródła i wgraj przez Manual Upload (GUI Core CC Tool) / wyślij z CCM.MinIOZbliża się TET — pliku jeszcze nie ma na MinIO.Sprawdź źródło (Kreator / Perun4V / Core CC Tool). Gdy brak → pobierz/wygeneruj plik ręcznie ze źródła i wgraj przez Manual Upload (GUI Core CC Tool) / wyślij z CCM.MinIOZbliża się CET / błąd dostarczenia — brak pliku na MinIO.Gdy pliku NIE ma na MinIO → pobierz/wygeneruj plik ręcznie ze źródła i wgraj przez Manual Upload (GUI Core CC Tool) / wyślij z CCM.MinIOMinął CET — plik niedostarczony. Krytyczne.Zgłoś (CIZ/WPO/PSE-I). Po CET — postępowanie krytyczne (brak lokalnego fallbacku).</w:t>
+      </w:r>
+    </w:p>
+    <w:p>
       <w:pPr>
         <w:pStyle w:val="Heading4"/>
       </w:pPr>
@@ -12831,6 +13633,16 @@
       </w:r>
     </w:p>
     <w:p>
+      <w:r>
+        <w:t>Warianty stanów (8)</w:t>
+      </w:r>
+    </w:p>
+    <w:p>
+      <w:r>
+        <w:t>Status kafelkaSytuacjaDziałania awaryjneMinIOPlik dostarczony prawidłowo na MinIO — status pozytywny.Brak działań — proces poprawny.MinIOStatus nadany ręcznie literą 'R' przez Dyspozytora po weryfikacji.Brak działań — decyzja ręczna Dyspozytora.MinIOPlik dostarczony po CET — status pozytywny.Brak działań — dostarczone po CET, OK.MinIOPrzedwczesne (&gt;30 min do TET) — plik jeszcze niewymagany.Monitoring — czekaj do TET.MinIOOczekiwanie / transfer w toku (stan przejściowy).Czekaj 5 min → sprawdź MinIO. Gdy brak → pobierz/wygeneruj plik ręcznie ze źródła i wgraj przez Manual Upload (GUI Core CC Tool) / wyślij z CCM.MinIOZbliża się TET — pliku jeszcze nie ma na MinIO.Sprawdź źródło (Kreator / Perun4V / Core CC Tool). Gdy brak → pobierz/wygeneruj plik ręcznie ze źródła i wgraj przez Manual Upload (GUI Core CC Tool) / wyślij z CCM.MinIOZbliża się CET / błąd dostarczenia — brak pliku na MinIO.Gdy pliku NIE ma na MinIO → pobierz/wygeneruj plik ręcznie ze źródła i wgraj przez Manual Upload (GUI Core CC Tool) / wyślij z CCM.MinIOMinął CET — plik niedostarczony. Krytyczne.Zgłoś (CIZ/WPO/PSE-I). Po CET — postępowanie krytyczne (brak lokalnego fallbacku).</w:t>
+      </w:r>
+    </w:p>
+    <w:p>
       <w:pPr>
         <w:pStyle w:val="Heading4"/>
       </w:pPr>
@@ -12892,6 +13704,16 @@
       </w:r>
     </w:p>
     <w:p>
+      <w:r>
+        <w:t>Warianty stanów (8)</w:t>
+      </w:r>
+    </w:p>
+    <w:p>
+      <w:r>
+        <w:t>Status kafelkaSytuacjaDziałania awaryjneMinIOPlik dostarczony prawidłowo na MinIO — status pozytywny.Brak działań — proces poprawny.MinIOStatus nadany ręcznie literą 'R' przez Dyspozytora po weryfikacji.Brak działań — decyzja ręczna Dyspozytora.MinIOPlik dostarczony po CET — status pozytywny.Brak działań — dostarczone po CET, OK.MinIOPrzedwczesne (&gt;30 min do TET) — plik jeszcze niewymagany.Monitoring — czekaj do TET.MinIOOczekiwanie / transfer w toku (stan przejściowy).Czekaj 5 min → sprawdź MinIO. Gdy brak → pobierz/wygeneruj plik ręcznie ze źródła i wgraj przez Manual Upload (GUI Core CC Tool) / wyślij z CCM.MinIOZbliża się TET — pliku jeszcze nie ma na MinIO.Sprawdź źródło (Kreator / Perun4V / Core CC Tool). Gdy brak → pobierz/wygeneruj plik ręcznie ze źródła i wgraj przez Manual Upload (GUI Core CC Tool) / wyślij z CCM.MinIOZbliża się CET / błąd dostarczenia — brak pliku na MinIO.Gdy pliku NIE ma na MinIO → pobierz/wygeneruj plik ręcznie ze źródła i wgraj przez Manual Upload (GUI Core CC Tool) / wyślij z CCM.MinIOMinął CET — plik niedostarczony. Krytyczne.Zgłoś (CIZ/WPO/PSE-I). Po CET — postępowanie krytyczne (brak lokalnego fallbacku).</w:t>
+      </w:r>
+    </w:p>
+    <w:p>
       <w:pPr>
         <w:pStyle w:val="Heading4"/>
       </w:pPr>
@@ -12953,6 +13775,16 @@
       </w:r>
     </w:p>
     <w:p>
+      <w:r>
+        <w:t>Warianty stanów (8)</w:t>
+      </w:r>
+    </w:p>
+    <w:p>
+      <w:r>
+        <w:t>Status kafelkaSytuacjaDziałania awaryjneMinIOPlik dostarczony prawidłowo na MinIO — status pozytywny.Brak działań — proces poprawny.MinIOStatus nadany ręcznie literą 'R' przez Dyspozytora po weryfikacji.Brak działań — decyzja ręczna Dyspozytora.MinIOPlik dostarczony po CET — status pozytywny.Brak działań — dostarczone po CET, OK.MinIOPrzedwczesne (&gt;30 min do TET) — plik jeszcze niewymagany.Monitoring — czekaj do TET.MinIOOczekiwanie / transfer w toku (stan przejściowy).Czekaj 5 min → sprawdź MinIO. Gdy brak → pobierz/wygeneruj plik ręcznie ze źródła i wgraj przez Manual Upload (GUI Core CC Tool) / wyślij z CCM.MinIOZbliża się TET — pliku jeszcze nie ma na MinIO.Sprawdź źródło (Kreator / Perun4V / Core CC Tool). Gdy brak → pobierz/wygeneruj plik ręcznie ze źródła i wgraj przez Manual Upload (GUI Core CC Tool) / wyślij z CCM.MinIOZbliża się CET / błąd dostarczenia — brak pliku na MinIO.Gdy pliku NIE ma na MinIO → pobierz/wygeneruj plik ręcznie ze źródła i wgraj przez Manual Upload (GUI Core CC Tool) / wyślij z CCM.MinIOMinął CET — plik niedostarczony. Krytyczne.Zgłoś (CIZ/WPO/PSE-I). Po CET — postępowanie krytyczne (brak lokalnego fallbacku).</w:t>
+      </w:r>
+    </w:p>
+    <w:p>
       <w:pPr>
         <w:pStyle w:val="Heading4"/>
       </w:pPr>
@@ -13014,6 +13846,16 @@
       </w:r>
     </w:p>
     <w:p>
+      <w:r>
+        <w:t>Warianty stanów (8)</w:t>
+      </w:r>
+    </w:p>
+    <w:p>
+      <w:r>
+        <w:t>Status kafelkaSytuacjaDziałania awaryjneMinIOPlik dostarczony prawidłowo na MinIO — status pozytywny.Brak działań — proces poprawny.MinIOStatus nadany ręcznie literą 'R' przez Dyspozytora po weryfikacji.Brak działań — decyzja ręczna Dyspozytora.MinIOPlik dostarczony po CET — status pozytywny.Brak działań — dostarczone po CET, OK.MinIOPrzedwczesne (&gt;30 min do TET) — plik jeszcze niewymagany.Monitoring — czekaj do TET.MinIOOczekiwanie / transfer w toku (stan przejściowy).Czekaj 5 min → sprawdź MinIO. Gdy brak → pobierz/wygeneruj plik ręcznie ze źródła i wgraj przez Manual Upload (GUI Core CC Tool) / wyślij z CCM.MinIOZbliża się TET — pliku jeszcze nie ma na MinIO.Sprawdź źródło (Kreator / Perun4V / Core CC Tool). Gdy brak → pobierz/wygeneruj plik ręcznie ze źródła i wgraj przez Manual Upload (GUI Core CC Tool) / wyślij z CCM.MinIOZbliża się CET / błąd dostarczenia — brak pliku na MinIO.Gdy pliku NIE ma na MinIO → pobierz/wygeneruj plik ręcznie ze źródła i wgraj przez Manual Upload (GUI Core CC Tool) / wyślij z CCM.MinIOMinął CET — plik niedostarczony. Krytyczne.Zgłoś (CIZ/WPO/PSE-I). Po CET — postępowanie krytyczne (brak lokalnego fallbacku).</w:t>
+      </w:r>
+    </w:p>
+    <w:p>
       <w:pPr>
         <w:pStyle w:val="Heading4"/>
       </w:pPr>
@@ -13075,6 +13917,16 @@
       </w:r>
     </w:p>
     <w:p>
+      <w:r>
+        <w:t>Warianty stanów (8)</w:t>
+      </w:r>
+    </w:p>
+    <w:p>
+      <w:r>
+        <w:t>Status kafelkaSytuacjaDziałania awaryjneMinIOPlik dostarczony prawidłowo na MinIO — status pozytywny.Brak działań — proces poprawny.MinIOStatus nadany ręcznie literą 'R' przez Dyspozytora po weryfikacji.Brak działań — decyzja ręczna Dyspozytora.MinIOPlik dostarczony po CET — status pozytywny.Brak działań — dostarczone po CET, OK.MinIOPrzedwczesne (&gt;30 min do TET) — plik jeszcze niewymagany.Monitoring — czekaj do TET.MinIOOczekiwanie / transfer w toku (stan przejściowy).Czekaj 5 min → sprawdź MinIO. Gdy brak → pobierz/wygeneruj plik ręcznie ze źródła i wgraj przez Manual Upload (GUI Core CC Tool) / wyślij z CCM.MinIOZbliża się TET — pliku jeszcze nie ma na MinIO.Sprawdź źródło (Kreator / Perun4V / Core CC Tool). Gdy brak → pobierz/wygeneruj plik ręcznie ze źródła i wgraj przez Manual Upload (GUI Core CC Tool) / wyślij z CCM.MinIOZbliża się CET / błąd dostarczenia — brak pliku na MinIO.Gdy pliku NIE ma na MinIO → pobierz/wygeneruj plik ręcznie ze źródła i wgraj przez Manual Upload (GUI Core CC Tool) / wyślij z CCM.MinIOMinął CET — plik niedostarczony. Krytyczne.Zgłoś (CIZ/WPO/PSE-I). Po CET — postępowanie krytyczne (brak lokalnego fallbacku).</w:t>
+      </w:r>
+    </w:p>
+    <w:p>
       <w:pPr>
         <w:pStyle w:val="Heading4"/>
       </w:pPr>
@@ -13136,6 +13988,16 @@
       </w:r>
     </w:p>
     <w:p>
+      <w:r>
+        <w:t>Warianty stanów (8)</w:t>
+      </w:r>
+    </w:p>
+    <w:p>
+      <w:r>
+        <w:t>Status kafelkaSytuacjaDziałania awaryjneMinIOPlik dostarczony prawidłowo na MinIO — status pozytywny.Brak działań — proces poprawny.MinIOStatus nadany ręcznie literą 'R' przez Dyspozytora po weryfikacji.Brak działań — decyzja ręczna Dyspozytora.MinIOPlik dostarczony po CET — status pozytywny.Brak działań — dostarczone po CET, OK.MinIOPrzedwczesne (&gt;30 min do TET) — plik jeszcze niewymagany.Monitoring — czekaj do TET.MinIOOczekiwanie / transfer w toku (stan przejściowy).Czekaj 5 min → sprawdź MinIO. Gdy brak → pobierz/wygeneruj plik ręcznie ze źródła i wgraj przez Manual Upload (GUI Core CC Tool) / wyślij z CCM.MinIOZbliża się TET — pliku jeszcze nie ma na MinIO.Sprawdź źródło (Kreator / Perun4V / Core CC Tool). Gdy brak → pobierz/wygeneruj plik ręcznie ze źródła i wgraj przez Manual Upload (GUI Core CC Tool) / wyślij z CCM.MinIOZbliża się CET / błąd dostarczenia — brak pliku na MinIO.Gdy pliku NIE ma na MinIO → pobierz/wygeneruj plik ręcznie ze źródła i wgraj przez Manual Upload (GUI Core CC Tool) / wyślij z CCM.MinIOMinął CET — plik niedostarczony. Krytyczne.Zgłoś (CIZ/WPO/PSE-I). Po CET — postępowanie krytyczne (brak lokalnego fallbacku).</w:t>
+      </w:r>
+    </w:p>
+    <w:p>
       <w:pPr>
         <w:pStyle w:val="Heading4"/>
       </w:pPr>
@@ -13197,6 +14059,16 @@
       </w:r>
     </w:p>
     <w:p>
+      <w:r>
+        <w:t>Warianty stanów (8)</w:t>
+      </w:r>
+    </w:p>
+    <w:p>
+      <w:r>
+        <w:t>Status kafelkaSytuacjaDziałania awaryjneMinIOPlik dostarczony prawidłowo na MinIO — status pozytywny.Brak działań — proces poprawny.MinIOStatus nadany ręcznie literą 'R' przez Dyspozytora po weryfikacji.Brak działań — decyzja ręczna Dyspozytora.MinIOPlik dostarczony po CET — status pozytywny.Brak działań — dostarczone po CET, OK.MinIOPrzedwczesne (&gt;30 min do TET) — plik jeszcze niewymagany.Monitoring — czekaj do TET.MinIOOczekiwanie / transfer w toku (stan przejściowy).Czekaj 5 min → sprawdź MinIO. Gdy brak → pobierz/wygeneruj plik ręcznie ze źródła i wgraj przez Manual Upload (GUI Core CC Tool) / wyślij z CCM.MinIOZbliża się TET — pliku jeszcze nie ma na MinIO.Sprawdź źródło (Kreator / Perun4V / Core CC Tool). Gdy brak → pobierz/wygeneruj plik ręcznie ze źródła i wgraj przez Manual Upload (GUI Core CC Tool) / wyślij z CCM.MinIOZbliża się CET / błąd dostarczenia — brak pliku na MinIO.Gdy pliku NIE ma na MinIO → pobierz/wygeneruj plik ręcznie ze źródła i wgraj przez Manual Upload (GUI Core CC Tool) / wyślij z CCM.MinIOMinął CET — plik niedostarczony. Krytyczne.Zgłoś (CIZ/WPO/PSE-I). Po CET — postępowanie krytyczne (brak lokalnego fallbacku).</w:t>
+      </w:r>
+    </w:p>
+    <w:p>
       <w:pPr>
         <w:pStyle w:val="Heading4"/>
       </w:pPr>
@@ -13258,6 +14130,16 @@
       </w:r>
     </w:p>
     <w:p>
+      <w:r>
+        <w:t>Warianty stanów (8)</w:t>
+      </w:r>
+    </w:p>
+    <w:p>
+      <w:r>
+        <w:t>Status kafelkaSytuacjaDziałania awaryjneMinIOPlik dostarczony prawidłowo na MinIO — status pozytywny.Brak działań — proces poprawny.MinIOStatus nadany ręcznie literą 'R' przez Dyspozytora po weryfikacji.Brak działań — decyzja ręczna Dyspozytora.MinIOPlik dostarczony po CET — status pozytywny.Brak działań — dostarczone po CET, OK.MinIOPrzedwczesne (&gt;30 min do TET) — plik jeszcze niewymagany.Monitoring — czekaj do TET.MinIOOczekiwanie / transfer w toku (stan przejściowy).Czekaj 5 min → sprawdź MinIO. Gdy brak → pobierz/wygeneruj plik ręcznie ze źródła i wgraj przez Manual Upload (GUI Core CC Tool) / wyślij z CCM.MinIOZbliża się TET — pliku jeszcze nie ma na MinIO.Sprawdź źródło (Kreator / Perun4V / Core CC Tool). Gdy brak → pobierz/wygeneruj plik ręcznie ze źródła i wgraj przez Manual Upload (GUI Core CC Tool) / wyślij z CCM.MinIOZbliża się CET / błąd dostarczenia — brak pliku na MinIO.Gdy pliku NIE ma na MinIO → pobierz/wygeneruj plik ręcznie ze źródła i wgraj przez Manual Upload (GUI Core CC Tool) / wyślij z CCM.MinIOMinął CET — plik niedostarczony. Krytyczne.Zgłoś (CIZ/WPO/PSE-I). Po CET — postępowanie krytyczne (brak lokalnego fallbacku).</w:t>
+      </w:r>
+    </w:p>
+    <w:p>
       <w:pPr>
         <w:pStyle w:val="Heading4"/>
       </w:pPr>
@@ -13319,6 +14201,16 @@
       </w:r>
     </w:p>
     <w:p>
+      <w:r>
+        <w:t>Warianty stanów (8)</w:t>
+      </w:r>
+    </w:p>
+    <w:p>
+      <w:r>
+        <w:t>Status kafelkaSytuacjaDziałania awaryjneMinIOPlik dostarczony prawidłowo na MinIO — status pozytywny.Brak działań — proces poprawny.MinIOStatus nadany ręcznie literą 'R' przez Dyspozytora po weryfikacji.Brak działań — decyzja ręczna Dyspozytora.MinIOPlik dostarczony po CET — status pozytywny.Brak działań — dostarczone po CET, OK.MinIOPrzedwczesne (&gt;30 min do TET) — plik jeszcze niewymagany.Monitoring — czekaj do TET.MinIOOczekiwanie / transfer w toku (stan przejściowy).Czekaj 5 min → sprawdź MinIO. Gdy brak → pobierz/wygeneruj plik ręcznie ze źródła i wgraj przez Manual Upload (GUI Core CC Tool) / wyślij z CCM.MinIOZbliża się TET — pliku jeszcze nie ma na MinIO.Sprawdź źródło (Kreator / Perun4V / Core CC Tool). Gdy brak → pobierz/wygeneruj plik ręcznie ze źródła i wgraj przez Manual Upload (GUI Core CC Tool) / wyślij z CCM.MinIOZbliża się CET / błąd dostarczenia — brak pliku na MinIO.Gdy pliku NIE ma na MinIO → pobierz/wygeneruj plik ręcznie ze źródła i wgraj przez Manual Upload (GUI Core CC Tool) / wyślij z CCM.MinIOMinął CET — plik niedostarczony. Krytyczne.Zgłoś (CIZ/WPO/PSE-I). Po CET — postępowanie krytyczne (brak lokalnego fallbacku).</w:t>
+      </w:r>
+    </w:p>
+    <w:p>
       <w:pPr>
         <w:pStyle w:val="Heading4"/>
       </w:pPr>
@@ -13380,6 +14272,16 @@
       </w:r>
     </w:p>
     <w:p>
+      <w:r>
+        <w:t>Warianty stanów (8)</w:t>
+      </w:r>
+    </w:p>
+    <w:p>
+      <w:r>
+        <w:t>Status kafelkaSytuacjaDziałania awaryjneMinIOPlik dostarczony prawidłowo na MinIO — status pozytywny.Brak działań — proces poprawny.MinIOStatus nadany ręcznie literą 'R' przez Dyspozytora po weryfikacji.Brak działań — decyzja ręczna Dyspozytora.MinIOPlik dostarczony po CET — status pozytywny.Brak działań — dostarczone po CET, OK.MinIOPrzedwczesne (&gt;30 min do TET) — plik jeszcze niewymagany.Monitoring — czekaj do TET.MinIOOczekiwanie / transfer w toku (stan przejściowy).Czekaj 5 min → sprawdź MinIO. Gdy brak → pobierz/wygeneruj plik ręcznie ze źródła i wgraj przez Manual Upload (GUI Core CC Tool) / wyślij z CCM.MinIOZbliża się TET — pliku jeszcze nie ma na MinIO.Sprawdź źródło (Kreator / Perun4V / Core CC Tool). Gdy brak → pobierz/wygeneruj plik ręcznie ze źródła i wgraj przez Manual Upload (GUI Core CC Tool) / wyślij z CCM.MinIOZbliża się CET / błąd dostarczenia — brak pliku na MinIO.Gdy pliku NIE ma na MinIO → pobierz/wygeneruj plik ręcznie ze źródła i wgraj przez Manual Upload (GUI Core CC Tool) / wyślij z CCM.MinIOMinął CET — plik niedostarczony. Krytyczne.Zgłoś (CIZ/WPO/PSE-I). Po CET — postępowanie krytyczne (brak lokalnego fallbacku).</w:t>
+      </w:r>
+    </w:p>
+    <w:p>
       <w:pPr>
         <w:pStyle w:val="Heading4"/>
       </w:pPr>
@@ -13441,6 +14343,16 @@
       </w:r>
     </w:p>
     <w:p>
+      <w:r>
+        <w:t>Warianty stanów (8)</w:t>
+      </w:r>
+    </w:p>
+    <w:p>
+      <w:r>
+        <w:t>Status kafelkaSytuacjaDziałania awaryjneMinIOPlik dostarczony prawidłowo na MinIO — status pozytywny.Brak działań — proces poprawny.MinIOStatus nadany ręcznie literą 'R' przez Dyspozytora po weryfikacji.Brak działań — decyzja ręczna Dyspozytora.MinIOPlik dostarczony po CET — status pozytywny.Brak działań — dostarczone po CET, OK.MinIOPrzedwczesne (&gt;30 min do TET) — plik jeszcze niewymagany.Monitoring — czekaj do TET.MinIOOczekiwanie / transfer w toku (stan przejściowy).Czekaj 5 min → sprawdź MinIO. Gdy brak → pobierz/wygeneruj plik ręcznie ze źródła i wgraj przez Manual Upload (GUI Core CC Tool) / wyślij z CCM.MinIOZbliża się TET — pliku jeszcze nie ma na MinIO.Sprawdź źródło (Kreator / Perun4V / Core CC Tool). Gdy brak → pobierz/wygeneruj plik ręcznie ze źródła i wgraj przez Manual Upload (GUI Core CC Tool) / wyślij z CCM.MinIOZbliża się CET / błąd dostarczenia — brak pliku na MinIO.Gdy pliku NIE ma na MinIO → pobierz/wygeneruj plik ręcznie ze źródła i wgraj przez Manual Upload (GUI Core CC Tool) / wyślij z CCM.MinIOMinął CET — plik niedostarczony. Krytyczne.Zgłoś (CIZ/WPO/PSE-I). Po CET — postępowanie krytyczne (brak lokalnego fallbacku).</w:t>
+      </w:r>
+    </w:p>
+    <w:p>
       <w:pPr>
         <w:pStyle w:val="Heading4"/>
       </w:pPr>
@@ -13502,6 +14414,16 @@
       </w:r>
     </w:p>
     <w:p>
+      <w:r>
+        <w:t>Warianty stanów (8)</w:t>
+      </w:r>
+    </w:p>
+    <w:p>
+      <w:r>
+        <w:t>Status kafelkaSytuacjaDziałania awaryjneMinIOPlik dostarczony prawidłowo na MinIO — status pozytywny.Brak działań — proces poprawny.MinIOStatus nadany ręcznie literą 'R' przez Dyspozytora po weryfikacji.Brak działań — decyzja ręczna Dyspozytora.MinIOPlik dostarczony po CET — status pozytywny.Brak działań — dostarczone po CET, OK.MinIOPrzedwczesne (&gt;30 min do TET) — plik jeszcze niewymagany.Monitoring — czekaj do TET.MinIOOczekiwanie / transfer w toku (stan przejściowy).Czekaj 5 min → sprawdź MinIO. Gdy brak → pobierz/wygeneruj plik ręcznie ze źródła i wgraj przez Manual Upload (GUI Core CC Tool) / wyślij z CCM.MinIOZbliża się TET — pliku jeszcze nie ma na MinIO.Sprawdź źródło (Kreator / Perun4V / Core CC Tool). Gdy brak → pobierz/wygeneruj plik ręcznie ze źródła i wgraj przez Manual Upload (GUI Core CC Tool) / wyślij z CCM.MinIOZbliża się CET / błąd dostarczenia — brak pliku na MinIO.Gdy pliku NIE ma na MinIO → pobierz/wygeneruj plik ręcznie ze źródła i wgraj przez Manual Upload (GUI Core CC Tool) / wyślij z CCM.MinIOMinął CET — plik niedostarczony. Krytyczne.Zgłoś (CIZ/WPO/PSE-I). Po CET — postępowanie krytyczne (brak lokalnego fallbacku).</w:t>
+      </w:r>
+    </w:p>
+    <w:p>
       <w:pPr>
         <w:pStyle w:val="Heading4"/>
       </w:pPr>
@@ -13563,6 +14485,16 @@
       </w:r>
     </w:p>
     <w:p>
+      <w:r>
+        <w:t>Warianty stanów (8)</w:t>
+      </w:r>
+    </w:p>
+    <w:p>
+      <w:r>
+        <w:t>Status kafelkaSytuacjaDziałania awaryjneMinIOPlik dostarczony prawidłowo na MinIO — status pozytywny.Brak działań — proces poprawny.MinIOStatus nadany ręcznie literą 'R' przez Dyspozytora po weryfikacji.Brak działań — decyzja ręczna Dyspozytora.MinIOPlik dostarczony po CET — status pozytywny.Brak działań — dostarczone po CET, OK.MinIOPrzedwczesne (&gt;30 min do TET) — plik jeszcze niewymagany.Monitoring — czekaj do TET.MinIOOczekiwanie / transfer w toku (stan przejściowy).Czekaj 5 min → sprawdź MinIO. Gdy brak → pobierz/wygeneruj plik ręcznie ze źródła i wgraj przez Manual Upload (GUI Core CC Tool) / wyślij z CCM.MinIOZbliża się TET — pliku jeszcze nie ma na MinIO.Sprawdź źródło (Kreator / Perun4V / Core CC Tool). Gdy brak → pobierz/wygeneruj plik ręcznie ze źródła i wgraj przez Manual Upload (GUI Core CC Tool) / wyślij z CCM.MinIOZbliża się CET / błąd dostarczenia — brak pliku na MinIO.Gdy pliku NIE ma na MinIO → pobierz/wygeneruj plik ręcznie ze źródła i wgraj przez Manual Upload (GUI Core CC Tool) / wyślij z CCM.MinIOMinął CET — plik niedostarczony. Krytyczne.Zgłoś (CIZ/WPO/PSE-I). Po CET — postępowanie krytyczne (brak lokalnego fallbacku).</w:t>
+      </w:r>
+    </w:p>
+    <w:p>
       <w:pPr>
         <w:pStyle w:val="Heading4"/>
       </w:pPr>
@@ -13624,6 +14556,16 @@
       </w:r>
     </w:p>
     <w:p>
+      <w:r>
+        <w:t>Warianty stanów (8)</w:t>
+      </w:r>
+    </w:p>
+    <w:p>
+      <w:r>
+        <w:t>Status kafelkaSytuacjaDziałania awaryjneMinIOPlik dostarczony prawidłowo na MinIO — status pozytywny.Brak działań — proces poprawny.MinIOStatus nadany ręcznie literą 'R' przez Dyspozytora po weryfikacji.Brak działań — decyzja ręczna Dyspozytora.MinIOPlik dostarczony po CET — status pozytywny.Brak działań — dostarczone po CET, OK.MinIOPrzedwczesne (&gt;30 min do TET) — plik jeszcze niewymagany.Monitoring — czekaj do TET.MinIOOczekiwanie / transfer w toku (stan przejściowy).Czekaj 5 min → sprawdź MinIO. Gdy brak → pobierz/wygeneruj plik ręcznie ze źródła i wgraj przez Manual Upload (GUI Core CC Tool) / wyślij z CCM.MinIOZbliża się TET — pliku jeszcze nie ma na MinIO.Sprawdź źródło (Kreator / Perun4V / Core CC Tool). Gdy brak → pobierz/wygeneruj plik ręcznie ze źródła i wgraj przez Manual Upload (GUI Core CC Tool) / wyślij z CCM.MinIOZbliża się CET / błąd dostarczenia — brak pliku na MinIO.Gdy pliku NIE ma na MinIO → pobierz/wygeneruj plik ręcznie ze źródła i wgraj przez Manual Upload (GUI Core CC Tool) / wyślij z CCM.MinIOMinął CET — plik niedostarczony. Krytyczne.Zgłoś (CIZ/WPO/PSE-I). Po CET — postępowanie krytyczne (brak lokalnego fallbacku).</w:t>
+      </w:r>
+    </w:p>
+    <w:p>
       <w:pPr>
         <w:pStyle w:val="Heading4"/>
       </w:pPr>
@@ -13685,6 +14627,16 @@
       </w:r>
     </w:p>
     <w:p>
+      <w:r>
+        <w:t>Warianty stanów (8)</w:t>
+      </w:r>
+    </w:p>
+    <w:p>
+      <w:r>
+        <w:t>Status kafelkaSytuacjaDziałania awaryjneMinIOPlik dostarczony prawidłowo na MinIO — status pozytywny.Brak działań — proces poprawny.MinIOStatus nadany ręcznie literą 'R' przez Dyspozytora po weryfikacji.Brak działań — decyzja ręczna Dyspozytora.MinIOPlik dostarczony po CET — status pozytywny.Brak działań — dostarczone po CET, OK.MinIOPrzedwczesne (&gt;30 min do TET) — plik jeszcze niewymagany.Monitoring — czekaj do TET.MinIOOczekiwanie / transfer w toku (stan przejściowy).Czekaj 5 min → sprawdź MinIO. Gdy brak → pobierz/wygeneruj plik ręcznie ze źródła i wgraj przez Manual Upload (GUI Core CC Tool) / wyślij z CCM.MinIOZbliża się TET — pliku jeszcze nie ma na MinIO.Sprawdź źródło (Kreator / Perun4V / Core CC Tool). Gdy brak → pobierz/wygeneruj plik ręcznie ze źródła i wgraj przez Manual Upload (GUI Core CC Tool) / wyślij z CCM.MinIOZbliża się CET / błąd dostarczenia — brak pliku na MinIO.Gdy pliku NIE ma na MinIO → pobierz/wygeneruj plik ręcznie ze źródła i wgraj przez Manual Upload (GUI Core CC Tool) / wyślij z CCM.MinIOMinął CET — plik niedostarczony. Krytyczne.Zgłoś (CIZ/WPO/PSE-I). Po CET — postępowanie krytyczne (brak lokalnego fallbacku).</w:t>
+      </w:r>
+    </w:p>
+    <w:p>
       <w:pPr>
         <w:pStyle w:val="Heading4"/>
       </w:pPr>
@@ -13746,6 +14698,16 @@
       </w:r>
     </w:p>
     <w:p>
+      <w:r>
+        <w:t>Warianty stanów (8)</w:t>
+      </w:r>
+    </w:p>
+    <w:p>
+      <w:r>
+        <w:t>Status kafelkaSytuacjaDziałania awaryjneMinIOPlik dostarczony prawidłowo na MinIO — status pozytywny.Brak działań — proces poprawny.MinIOStatus nadany ręcznie literą 'R' przez Dyspozytora po weryfikacji.Brak działań — decyzja ręczna Dyspozytora.MinIOPlik dostarczony po CET — status pozytywny.Brak działań — dostarczone po CET, OK.MinIOPrzedwczesne (&gt;30 min do TET) — plik jeszcze niewymagany.Monitoring — czekaj do TET.MinIOOczekiwanie / transfer w toku (stan przejściowy).Czekaj 5 min → sprawdź MinIO. Gdy brak → pobierz/wygeneruj plik ręcznie ze źródła i wgraj przez Manual Upload (GUI Core CC Tool) / wyślij z CCM.MinIOZbliża się TET — pliku jeszcze nie ma na MinIO.Sprawdź źródło (Kreator / Perun4V / Core CC Tool). Gdy brak → pobierz/wygeneruj plik ręcznie ze źródła i wgraj przez Manual Upload (GUI Core CC Tool) / wyślij z CCM.MinIOZbliża się CET / błąd dostarczenia — brak pliku na MinIO.Gdy pliku NIE ma na MinIO → pobierz/wygeneruj plik ręcznie ze źródła i wgraj przez Manual Upload (GUI Core CC Tool) / wyślij z CCM.MinIOMinął CET — plik niedostarczony. Krytyczne.Zgłoś (CIZ/WPO/PSE-I). Po CET — postępowanie krytyczne (brak lokalnego fallbacku).</w:t>
+      </w:r>
+    </w:p>
+    <w:p>
       <w:pPr>
         <w:pStyle w:val="Heading4"/>
       </w:pPr>
@@ -13807,6 +14769,16 @@
       </w:r>
     </w:p>
     <w:p>
+      <w:r>
+        <w:t>Warianty stanów (8)</w:t>
+      </w:r>
+    </w:p>
+    <w:p>
+      <w:r>
+        <w:t>Status kafelkaSytuacjaDziałania awaryjneMinIOPlik dostarczony prawidłowo na MinIO — status pozytywny.Brak działań — proces poprawny.MinIOStatus nadany ręcznie literą 'R' przez Dyspozytora po weryfikacji.Brak działań — decyzja ręczna Dyspozytora.MinIOPlik dostarczony po CET — status pozytywny.Brak działań — dostarczone po CET, OK.MinIOPrzedwczesne (&gt;30 min do TET) — plik jeszcze niewymagany.Monitoring — czekaj do TET.MinIOOczekiwanie / transfer w toku (stan przejściowy).Czekaj 5 min → sprawdź MinIO. Gdy brak → pobierz/wygeneruj plik ręcznie ze źródła i wgraj przez Manual Upload (GUI Core CC Tool) / wyślij z CCM.MinIOZbliża się TET — pliku jeszcze nie ma na MinIO.Sprawdź źródło (Kreator / Perun4V / Core CC Tool). Gdy brak → pobierz/wygeneruj plik ręcznie ze źródła i wgraj przez Manual Upload (GUI Core CC Tool) / wyślij z CCM.MinIOZbliża się CET / błąd dostarczenia — brak pliku na MinIO.Gdy pliku NIE ma na MinIO → pobierz/wygeneruj plik ręcznie ze źródła i wgraj przez Manual Upload (GUI Core CC Tool) / wyślij z CCM.MinIOMinął CET — plik niedostarczony. Krytyczne.Zgłoś (CIZ/WPO/PSE-I). Po CET — postępowanie krytyczne (brak lokalnego fallbacku).</w:t>
+      </w:r>
+    </w:p>
+    <w:p>
       <w:pPr>
         <w:pStyle w:val="Heading4"/>
       </w:pPr>
@@ -13888,6 +14860,16 @@
       </w:r>
     </w:p>
     <w:p>
+      <w:r>
+        <w:t>Warianty stanów (46)</w:t>
+      </w:r>
+    </w:p>
+    <w:p>
+      <w:r>
+        <w:t>Status kafelkaSytuacjaDziałania awaryjneCCtool wysł.CCtool zwalid.MinIODokument został wysłany prawidłowo do CCTool i na MINIO, otrzymano potwierdzenie ACK z pozytywnym komunikatem (komunikat statusu powinien się pojawić po najechaniu kursorem na status).Brak — proces przebiegł poprawnie.CCtool wysł.CCtool zwalid.MinIODokument wysłany prawidłowo do CCTool i na MINIO, Dokument ACK (CCTool zwalid.) napłynął po CET z pozytywnym komunikatem.Brak działań — proces poprawny.CCtool wysł.CCtool zwalid.MinIODokument wysłany prawidłowo do CCTool i na MINIO, nie otrzymano potwierdzenia ACK, natomiast Dyspozytor ustawił status ręcznie 'R' po weryfikacji po stronie CCTool, iż proces został zrealizowany poprawnie.Brak działań — proces poprawny.CCtool wysł.CCtool zwalid.MinIODokument wysłany prawidłowo do CCTool i na MINIO po CET, Dokument ACK (CCTool zwalid.) napłynął po CET z pozytywnym komunikatem.Brak działań — proces poprawny.CCtool wysł.CCtool zwalid.MinIODokument IVA został oznaczony ręcznie jako wysłany prawidłowo do CCTool i na MINIO oraz otrzymanie potwierdzenia ACK.Brak działań — proces poprawny.CCtool wysł.CCtool zwalid.MinIODokument IVA prawidłowo wysłany ręcznie z poziomu aplikacji CCM w jednym miejscu (np. z menu bocznego „CCTool wysł." bądź „MINIO" korzystając z opcji „Wyślij"). Otrzymano potwierdzenie ACK z pozytywnym komunikatem.Brak działań — proces poprawny.CCtool wysł.CCtool zwalid.MinIODokument IVA prawidłowo wysłany ręcznie z poziomu CCM. Trwa oczekiwanie na potwierdzenie ACK (CCTool zwalid.) — około 2 minut trwa taki status.Po 5 min jeśli proces przebiegł poprawnie → ustaw 'R' dla ACK.CCtool wysł.CCtool zwalid.MinIODokument wysłany ręcznie z poziomu CCM, ale nie napłynął ACK w żądanym czasie i zbliża się Critical End Time dla obsługi tego dokumentu.Monitoring CCCt MV; jeśli proces OK → status 'R' dla ACK.CCtool wysł.CCtool zwalid.MinIODokument wysłany ręcznie z poziomu CCM, a otrzymane potwierdzenie ACK (CCTool zwalid.): (1) zawiera komunikat błędu (najedź kursorem na status); (2) proces zakończył się błędem — „Błąd procesu".Weryfikacja sytuacji w CCTool. Decyzja Dyspozytora o ewentualnej kolejnej iteracji.CCtool wysł.CCtool zwalid.MinIODokument IVA prawidłowo wysłany ręcznie z poziomu CCM. Otrzymano potwierdzenie ACK z pozytywnym komunikatem po CET.Brak działań — proces poprawny.CCtool wysł.CCtool zwalid.MinIODokument IVA prawidłowo wysłany ręcznie z poziomu CCM. Nie otrzymano potwierdzenia ACK — upłynął czas CET.Weryfikacja w CCCt MV; jeśli Processed → status 'R' ręcznie. Diagnostyka CN2 zwrotny → zgłoś.CCtool wysł.CCtool zwalid.MinIODokument IVA prawidłowo wysłany ręcznie z poziomu CCM. Nie otrzymano ACK, natomiast Dyspozytor ustawił status ręcznie 'R' po weryfikacji po stronie CCTool, iż proces został zrealizowany poprawnie.Brak działań — proces poprawny.CCtool wysł.CCtool zwalid.MinIODokument IVA prawidłowo wysłany ręcznie z poziomu CCM po CET (opcja „Wyślij po CET"). Trwa oczekiwanie na potwierdzenie ACK (CCTool zwalid.) — około 2 minut trwa taki status.Brak działań — proces poprawny.CCtool wysł.CCtool zwalid.MinIODokument wysłany ręcznie z poziomu CCM po CET. Trwa oczekiwanie na potwierdzenie ACK (CCTool zwalid.) — upłynęło więcej niż 2 minuty (czas oczekiwania można sprawdzić najeżdżając kursorem na status).Weryfikacja sytuacji w CCTool; jeśli proces przebiegł poprawnie → ustaw status 'R' dla ACK.CCtool wysł.CCtool zwalid.MinIODokument wysłany ręcznie z poziomu CCM po CET, a otrzymane potwierdzenie ACK (CCTool zwalid.): (1) zawiera komunikat błędu; (2) proces zakończył się błędem — „Błąd procesu".Weryfikacja sytuacji w CCTool. Zgłoś.CCtool wysł.CCtool zwalid.MinIODokument IVA prawidłowo wysłany ręcznie z poziomu CCM po CET. Otrzymano potwierdzenie ACK z pozytywnym komunikatem.Brak działań — proces poprawny.CCtool wysł.CCtool zwalid.MinIODokument IVA prawidłowo wysłany ręcznie z poziomu CCM po CET. Nie otrzymano potwierdzenia ACK — upłynął czas CET.Diagnostyka CN2 zwrotny → zgłoś.CCtool wysł.CCtool zwalid.MinIODokument IVA został oznaczony ręcznie jako wysłany prawidłowo do CCTool i na MINIO. Trwa oczekiwanie na potwierdzenie ACK (CCTool zwalid.) — około 2 minut trwa taki status.Weryfikacja w CCTool; po 5 min jeśli proces przebiegł poprawnie → ustaw 'R' dla ACK.CCtool wysł.CCtool zwalid.MinIODokument IVA został oznaczony ręcznie jako wysłany prawidłowo do CCTool i na MINIO. Trwa oczekiwanie na potwierdzenie ACK (CCTool zwalid.) — upłynęło więcej niż 2 minuty.Weryfikacja w CCTool; jeśli proces przebiegł poprawnie → ustaw 'R' dla ACK.CCtool wysł.CCtool zwalid.MinIODokument IVA został oznaczony ręcznie jako wysłany prawidłowo do CCTool i na MINIO. Nie otrzymano potwierdzenia ACK — upłynął czas CET.Diagnostyka CN2 zwrotny → zgłoś.CCtool wysł.CCtool zwalid.MinIOWysłany dokument nie spełnia kryterium rozmiaru (w informacjach o wielkości rozmiaru dostępna z poziomu menu bocznego na statusie). Nie otrzymano potwierdzenie ACK, natomiast Dyspozytor ustawił status ręcznie 'R' po weryfikacji po stronie CCTool, iż proces został zrealizowany poprawnie.Zgłoś informacyjnie (ew. zmiana konfiguracji rozmiaru).CCtool wysł.CCtool zwalid.MinIODokument jeszcze nie został wysłany ani do CCTool ani na MINIO, w związku z tym potwierdzenie ACK nie napłynęło.Brak — monitoring. Plik nie wymagany (&gt;30 min do TET).CCtool wysł.CCtool zwalid.MinIOZbliża się TET (21:30), a dokument nie został jeszcze obsłużony.Brak. Czujność i przygotowanie. Sprawdź Perun4V (status obliczeń); sprawdź CN2; przygotuj się na ewentualne IVA BACKUP od CCA. Jeśli sytuacja się utrzyma → Kategoria C (powiązany stan).CCtool wysł.CCtool zwalid.MinIOWysyłka do CCTool trwa i oczekiwany jest ACK, dokument dostarczony na MINIO.Jeśli taki status „CCTool wysł." trwa dłużej niż 5 minut należy zweryfikować stan w CCTool, ewentualnie zgłosić problem.CCtool wysł.CCtool zwalid.MinIODokument wysłany prawidłowo do CCTool i na MINIO, trwa oczekiwanie na potwierdzenie ACK (status powinien się utrzymać krócej niż 3 minuty).Brak. Czekaj do 3-5 min na ACK; po tym czasie → stan timeout.CCtool wysł.CCtool zwalid.MinIOWysyłka do CCTool trwa i oczekiwany jest ACK. Dokument dostarczony na MINIO nie spełnia kryterium rozmiaru (w informacjach o wielkości rozmiaru dostępna z poziomu menu bocznego na statusie).Jeśli taki status „CCTool wysł." trwa dłużej niż 5 minut → zweryfikować stan w CCTool, ew. zgłosić problem Zweryfikować dokument IVA czy jest poprawny (pobierając go z CCM i rozpakowując) — pomimo zbyt małego rozmiaru sytuacja może być OK Jeśli plik z pkt. 2 jest niepoprawny → pozyskać IVA z PERUN i wysłać bezpośrednio z CCM bądź z GUI CCToolCCtool wysł.CCtool zwalid.MinIOZbliża się CET (22:06), a dokument nie został jeszcze obsłużony.Procedura (wg Confluence): Jeśli zbliża się CET (poniżej 3 minut) możliwa jest ręczna wysyłka IVA Backup z menu bocznego na poniższej pozycji pulpitu. Alternatywnie: R08 (Perun4V awaria), R09 (ERR-I), R10 (Process failed).CCtool wysł.CCtool zwalid.MinIODokument wysłany prawidłowo do CCTool i na MINIO, potwierdzenie ACK ma status czerwony co może oznaczać: (1) zawiera komunikat błędu (najedź kursorem na status); (2) proces zakończył się błędem — „Błąd procesu".Procedura: R05 — reakcja per kod ACK (20 gateClosed / 21 duplicatedVersion / 30 file size). Należy zweryfikować sytuację w CCTool.CCtool wysł.CCtool zwalid.MinIODokument wysłany prawidłowo do CCTool i na MINIO, trwa oczekiwanie na potwierdzenie ACK, które nie napłynęło w zadanym czasie (po najechaniu na znak zapytania można sprawdzić ile upłynęło czasu).Procedura: R06. Jeśli po około 3 minutach nie pojawi się status ACK wraz z informacją dostępną po najechaniu na status → należy zweryfikować sytuację w CCTool.CCtool wysł.CCtool zwalid.MinIODokument wysłany prawidłowo do CCTool i na MINIO. Dokument ACK (CCTool zwalid.) nie napłynął do CET.Procedury: R06, R18. Należy zweryfikować sytuację w CCTool. W przypadku wygenerowania ACK po stronie CCTool — sytuację zgłosić.CCtool wysł.CCtool zwalid.MinIOWysłany dokument nie spełnia kryterium rozmiaru (w informacjach o wielkości rozmiaru dostępna z poziomu menu bocznego na statusie). Trwa oczekiwanie na potwierdzenie ACK (CCTool zwalid.) — około 2 minut trwa taki status.Procedura: R05. Zweryfikować dokument IVA czy jest poprawny (pobierając go z CCM i rozpakowując) — pomimo zbyt małego rozmiaru sytuacja może być OK Jeśli plik z pkt. 1 jest niepoprawny → pozyskać IVA z PERUN i wysłać bezpośrednio z CCM bądź z GUI CCToolCCtool wysł.CCtool zwalid.MinIOWysłany dokument nie spełnia kryterium rozmiaru. Trwa oczekiwanie na potwierdzenie ACK (CCTool zwalid.), które nie napłynęło w zadanym czasie (po najechaniu na znak zapytania można sprawdzić ile upłynęło czasu).Procedura: R05, R06. Jeśli po około 3 minutach nie pojawi się status ACK wraz z informacją po najechaniu na status → zweryfikować sytuację w CCTool Zweryfikować dokument IVA (pobranie z CCM i rozpakowanie) — pomimo małego rozmiaru sytuacja może być OK Jeśli plik z pkt. 2 jest niepoprawny → pozyskać IVA z PERUN i wysłać bezpośrednio z CCM bądź z GUI CCToolCCtool wysł.CCtool zwalid.MinIOWysłany dokument nie spełnia kryterium rozmiaru, a otrzymane potwierdzenie ACK (CCTool zwalid.): (1) zawiera komunikat błędu; (2) proces zakończył się błędem — „Błąd procesu".Procedura: R05. Należy zweryfikować sytuację w CCTool Zweryfikować dokument IVA czy jest poprawny (pobranie z CCM i rozpakowanie) — pomimo małego rozmiaru sytuacja może być OK Jeśli plik z pkt. 2 jest niepoprawny → pozyskać IVA z PERUN i wysłać bezpośrednio z CCM bądź z GUI CCToolCCtool wysł.CCtool zwalid.MinIOWysłany dokument nie spełnia kryterium rozmiaru. Dokument ACK (CCTool zwalid.) napłynął po CET z pozytywnym komunikatem.Należy zweryfikować dokument IVA czy jest poprawny i czy został przyjęty w CCTool Jeśli plik z pkt. 1 jest niepoprawny → pozyskać IVA z PERUN i wysłać bezpośrednio z CCM bądź z GUI CCTool Po weryfikacji można nadać 'R' → Stan #21 (Kategoria A).CCtool wysł.CCtool zwalid.MinIOWysłany dokument nie spełnia kryterium rozmiaru. Dokument ACK (CCTool zwalid.) nie napłynął do CET.Zweryfikować sytuację w CCTool — w przypadku wygenerowania ACK po stronie CCTool sytuację zgłosić Zweryfikować dokument IVA (pobranie z CCM i rozpakowanie) — pomimo małego rozmiaru sytuacja może być OK Jeśli plik z pkt. 2 jest niepoprawny → pozyskać IVA z PERUN i wysłać bezpośrednio z CCM bądź z GUI CCToolCCtool wysł.CCtool zwalid.MinIODokument wysłany prawidłowo do CCTool i na MINIO po CET, potwierdzenie ACK ma status czerwony co może oznaczać: (1) zawiera komunikat błędu; (2) proces zakończył się błędem — „Błąd procesu".Procedura: R05. Należy zweryfikować sytuację w CCTool.CCtool wysł.CCtool zwalid.MinIODokument wysłany prawidłowo do CCTool i na MINIO po CET. Dokument ACK (CCTool zwalid.) nie napłynął do CET.Procedury: R06, R18. Należy zweryfikować sytuację w CCTool, w przypadku wygenerowania ACK po stronie CCTool sytuację zgłosić.CCtool wysł.CCtool zwalid.MinIODokument nie został dostarczony ani do CCTool ani na MINIO, w związku z tym potwierdzenie ACK nie napłynęło. Minął czas CET.Procedura (wg Confluence): Należy zweryfikować czy dokument IVA jest w PERUN. Jeśli TAK to należy go niezwłocznie pozyskać ręcznie i wysłać ją bezpośrednio z CCM bądź z GUI CCTool Procedury IDCC: R10 (Process failed) — oczekuj IVA BACKUP v1 od CCA; brak → R19 (CN2 nie kopiuje do CCA), R23 (brak raportu CCA). Zgłoś (CIZ, WPO, PSE-I) + telefon CCC. ❌ Zakaz fallbacku 20% Fmax z DA.MinIOPlik dostarczony prawidłowo na MinIO — status pozytywny.Brak działań — proces poprawny.MinIOStatus nadany ręcznie literą 'R' przez Dyspozytora po weryfikacji.Brak działań — decyzja ręczna Dyspozytora.MinIOPlik dostarczony po CET — status pozytywny.Brak działań — dostarczone po CET, OK.MinIOPrzedwczesne (&gt;30 min do TET) — plik jeszcze niewymagany.Monitoring — czekaj do TET.MinIOOczekiwanie / transfer w toku (stan przejściowy).Czekaj 5 min → sprawdź MinIO. Gdy brak → pobierz/wygeneruj plik ręcznie ze źródła i wgraj przez Manual Upload (GUI Core CC Tool) / wyślij z CCM.MinIOZbliża się TET — pliku jeszcze nie ma na MinIO.Sprawdź źródło (Kreator / Perun4V / Core CC Tool). Gdy brak → pobierz/wygeneruj plik ręcznie ze źródła i wgraj przez Manual Upload (GUI Core CC Tool) / wyślij z CCM.MinIOZbliża się CET / błąd dostarczenia — brak pliku na MinIO.Gdy pliku NIE ma na MinIO → pobierz/wygeneruj plik ręcznie ze źródła i wgraj przez Manual Upload (GUI Core CC Tool) / wyślij z CCM.MinIOMinął CET — plik niedostarczony. Krytyczne.Zgłoś (CIZ/WPO/PSE-I). Po CET — postępowanie krytyczne (brak lokalnego fallbacku).</w:t>
+      </w:r>
+    </w:p>
+    <w:p>
       <w:pPr>
         <w:pStyle w:val="Heading4"/>
       </w:pPr>
@@ -13964,6 +14946,16 @@
       </w:r>
     </w:p>
     <w:p>
+      <w:r>
+        <w:t>Warianty stanów (46)</w:t>
+      </w:r>
+    </w:p>
+    <w:p>
+      <w:r>
+        <w:t>Status kafelkaSytuacjaDziałania awaryjneCCtool wysł.CCtool zwalid.MinIODokument został wysłany prawidłowo do CCTool i na MINIO, otrzymano potwierdzenie ACK z pozytywnym komunikatem (komunikat statusu powinien się pojawić po najechaniu kursorem na status).Brak — proces przebiegł poprawnie.CCtool wysł.CCtool zwalid.MinIODokument wysłany prawidłowo do CCTool i na MINIO, Dokument ACK (CCTool zwalid.) napłynął po CET z pozytywnym komunikatem.Brak działań — proces poprawny.CCtool wysł.CCtool zwalid.MinIODokument wysłany prawidłowo do CCTool i na MINIO, nie otrzymano potwierdzenia ACK, natomiast Dyspozytor ustawił status ręcznie 'R' po weryfikacji po stronie CCTool, iż proces został zrealizowany poprawnie.Brak działań — proces poprawny.CCtool wysł.CCtool zwalid.MinIODokument wysłany prawidłowo do CCTool i na MINIO po CET, Dokument ACK (CCTool zwalid.) napłynął po CET z pozytywnym komunikatem.Brak działań — proces poprawny.CCtool wysł.CCtool zwalid.MinIODokument IVA został oznaczony ręcznie jako wysłany prawidłowo do CCTool i na MINIO oraz otrzymanie potwierdzenia ACK.Brak działań — proces poprawny.CCtool wysł.CCtool zwalid.MinIODokument IVA prawidłowo wysłany ręcznie z poziomu aplikacji CCM w jednym miejscu (np. z menu bocznego „CCTool wysł." bądź „MINIO" korzystając z opcji „Wyślij"). Otrzymano potwierdzenie ACK z pozytywnym komunikatem.Brak działań — proces poprawny.CCtool wysł.CCtool zwalid.MinIODokument IVA prawidłowo wysłany ręcznie z poziomu CCM. Trwa oczekiwanie na potwierdzenie ACK (CCTool zwalid.) — około 2 minut trwa taki status.Po 5 min jeśli proces przebiegł poprawnie → ustaw 'R' dla ACK.CCtool wysł.CCtool zwalid.MinIODokument wysłany ręcznie z poziomu CCM, ale nie napłynął ACK w żądanym czasie i zbliża się Critical End Time dla obsługi tego dokumentu.Monitoring CCCt MV; jeśli proces OK → status 'R' dla ACK.CCtool wysł.CCtool zwalid.MinIODokument wysłany ręcznie z poziomu CCM, a otrzymane potwierdzenie ACK (CCTool zwalid.): (1) zawiera komunikat błędu (najedź kursorem na status); (2) proces zakończył się błędem — „Błąd procesu".Weryfikacja sytuacji w CCTool. Decyzja Dyspozytora o ewentualnej kolejnej iteracji.CCtool wysł.CCtool zwalid.MinIODokument IVA prawidłowo wysłany ręcznie z poziomu CCM. Otrzymano potwierdzenie ACK z pozytywnym komunikatem po CET.Brak działań — proces poprawny.CCtool wysł.CCtool zwalid.MinIODokument IVA prawidłowo wysłany ręcznie z poziomu CCM. Nie otrzymano potwierdzenia ACK — upłynął czas CET.Weryfikacja w CCCt MV; jeśli Processed → status 'R' ręcznie. Diagnostyka CN2 zwrotny → zgłoś.CCtool wysł.CCtool zwalid.MinIODokument IVA prawidłowo wysłany ręcznie z poziomu CCM. Nie otrzymano ACK, natomiast Dyspozytor ustawił status ręcznie 'R' po weryfikacji po stronie CCTool, iż proces został zrealizowany poprawnie.Brak działań — proces poprawny.CCtool wysł.CCtool zwalid.MinIODokument IVA prawidłowo wysłany ręcznie z poziomu CCM po CET (opcja „Wyślij po CET"). Trwa oczekiwanie na potwierdzenie ACK (CCTool zwalid.) — około 2 minut trwa taki status.Brak działań — proces poprawny.CCtool wysł.CCtool zwalid.MinIODokument wysłany ręcznie z poziomu CCM po CET. Trwa oczekiwanie na potwierdzenie ACK (CCTool zwalid.) — upłynęło więcej niż 2 minuty (czas oczekiwania można sprawdzić najeżdżając kursorem na status).Weryfikacja sytuacji w CCTool; jeśli proces przebiegł poprawnie → ustaw status 'R' dla ACK.CCtool wysł.CCtool zwalid.MinIODokument wysłany ręcznie z poziomu CCM po CET, a otrzymane potwierdzenie ACK (CCTool zwalid.): (1) zawiera komunikat błędu; (2) proces zakończył się błędem — „Błąd procesu".Weryfikacja sytuacji w CCTool. Zgłoś.CCtool wysł.CCtool zwalid.MinIODokument IVA prawidłowo wysłany ręcznie z poziomu CCM po CET. Otrzymano potwierdzenie ACK z pozytywnym komunikatem.Brak działań — proces poprawny.CCtool wysł.CCtool zwalid.MinIODokument IVA prawidłowo wysłany ręcznie z poziomu CCM po CET. Nie otrzymano potwierdzenia ACK — upłynął czas CET.Diagnostyka CN2 zwrotny → zgłoś.CCtool wysł.CCtool zwalid.MinIODokument IVA został oznaczony ręcznie jako wysłany prawidłowo do CCTool i na MINIO. Trwa oczekiwanie na potwierdzenie ACK (CCTool zwalid.) — około 2 minut trwa taki status.Weryfikacja w CCTool; po 5 min jeśli proces przebiegł poprawnie → ustaw 'R' dla ACK.CCtool wysł.CCtool zwalid.MinIODokument IVA został oznaczony ręcznie jako wysłany prawidłowo do CCTool i na MINIO. Trwa oczekiwanie na potwierdzenie ACK (CCTool zwalid.) — upłynęło więcej niż 2 minuty.Weryfikacja w CCTool; jeśli proces przebiegł poprawnie → ustaw 'R' dla ACK.CCtool wysł.CCtool zwalid.MinIODokument IVA został oznaczony ręcznie jako wysłany prawidłowo do CCTool i na MINIO. Nie otrzymano potwierdzenia ACK — upłynął czas CET.Diagnostyka CN2 zwrotny → zgłoś.CCtool wysł.CCtool zwalid.MinIOWysłany dokument nie spełnia kryterium rozmiaru (w informacjach o wielkości rozmiaru dostępna z poziomu menu bocznego na statusie). Nie otrzymano potwierdzenie ACK, natomiast Dyspozytor ustawił status ręcznie 'R' po weryfikacji po stronie CCTool, iż proces został zrealizowany poprawnie.Zgłoś informacyjnie (ew. zmiana konfiguracji rozmiaru).CCtool wysł.CCtool zwalid.MinIODokument jeszcze nie został wysłany ani do CCTool ani na MINIO, w związku z tym potwierdzenie ACK nie napłynęło.Brak — monitoring. Plik nie wymagany (&gt;30 min do TET).CCtool wysł.CCtool zwalid.MinIOZbliża się TET (21:30), a dokument nie został jeszcze obsłużony.Brak. Czujność i przygotowanie. Sprawdź Perun4V (status obliczeń); sprawdź CN2; przygotuj się na ewentualne IVA BACKUP od CCA. Jeśli sytuacja się utrzyma → Kategoria C (powiązany stan).CCtool wysł.CCtool zwalid.MinIOWysyłka do CCTool trwa i oczekiwany jest ACK, dokument dostarczony na MINIO.Jeśli taki status „CCTool wysł." trwa dłużej niż 5 minut należy zweryfikować stan w CCTool, ewentualnie zgłosić problem.CCtool wysł.CCtool zwalid.MinIODokument wysłany prawidłowo do CCTool i na MINIO, trwa oczekiwanie na potwierdzenie ACK (status powinien się utrzymać krócej niż 3 minuty).Brak. Czekaj do 3-5 min na ACK; po tym czasie → stan timeout.CCtool wysł.CCtool zwalid.MinIOWysyłka do CCTool trwa i oczekiwany jest ACK. Dokument dostarczony na MINIO nie spełnia kryterium rozmiaru (w informacjach o wielkości rozmiaru dostępna z poziomu menu bocznego na statusie).Jeśli taki status „CCTool wysł." trwa dłużej niż 5 minut → zweryfikować stan w CCTool, ew. zgłosić problem Zweryfikować dokument IVA czy jest poprawny (pobierając go z CCM i rozpakowując) — pomimo zbyt małego rozmiaru sytuacja może być OK Jeśli plik z pkt. 2 jest niepoprawny → pozyskać IVA z PERUN i wysłać bezpośrednio z CCM bądź z GUI CCToolCCtool wysł.CCtool zwalid.MinIOZbliża się CET (22:06), a dokument nie został jeszcze obsłużony.Procedura (wg Confluence): Jeśli zbliża się CET (poniżej 3 minut) możliwa jest ręczna wysyłka IVA Backup z menu bocznego na poniższej pozycji pulpitu. Alternatywnie: R08 (Perun4V awaria), R09 (ERR-I), R10 (Process failed).CCtool wysł.CCtool zwalid.MinIODokument wysłany prawidłowo do CCTool i na MINIO, potwierdzenie ACK ma status czerwony co może oznaczać: (1) zawiera komunikat błędu (najedź kursorem na status); (2) proces zakończył się błędem — „Błąd procesu".Procedura: R05 — reakcja per kod ACK (20 gateClosed / 21 duplicatedVersion / 30 file size). Należy zweryfikować sytuację w CCTool.CCtool wysł.CCtool zwalid.MinIODokument wysłany prawidłowo do CCTool i na MINIO, trwa oczekiwanie na potwierdzenie ACK, które nie napłynęło w zadanym czasie (po najechaniu na znak zapytania można sprawdzić ile upłynęło czasu).Procedura: R06. Jeśli po około 3 minutach nie pojawi się status ACK wraz z informacją dostępną po najechaniu na status → należy zweryfikować sytuację w CCTool.CCtool wysł.CCtool zwalid.MinIODokument wysłany prawidłowo do CCTool i na MINIO. Dokument ACK (CCTool zwalid.) nie napłynął do CET.Procedury: R06, R18. Należy zweryfikować sytuację w CCTool. W przypadku wygenerowania ACK po stronie CCTool — sytuację zgłosić.CCtool wysł.CCtool zwalid.MinIOWysłany dokument nie spełnia kryterium rozmiaru (w informacjach o wielkości rozmiaru dostępna z poziomu menu bocznego na statusie). Trwa oczekiwanie na potwierdzenie ACK (CCTool zwalid.) — około 2 minut trwa taki status.Procedura: R05. Zweryfikować dokument IVA czy jest poprawny (pobierając go z CCM i rozpakowując) — pomimo zbyt małego rozmiaru sytuacja może być OK Jeśli plik z pkt. 1 jest niepoprawny → pozyskać IVA z PERUN i wysłać bezpośrednio z CCM bądź z GUI CCToolCCtool wysł.CCtool zwalid.MinIOWysłany dokument nie spełnia kryterium rozmiaru. Trwa oczekiwanie na potwierdzenie ACK (CCTool zwalid.), które nie napłynęło w zadanym czasie (po najechaniu na znak zapytania można sprawdzić ile upłynęło czasu).Procedura: R05, R06. Jeśli po około 3 minutach nie pojawi się status ACK wraz z informacją po najechaniu na status → zweryfikować sytuację w CCTool Zweryfikować dokument IVA (pobranie z CCM i rozpakowanie) — pomimo małego rozmiaru sytuacja może być OK Jeśli plik z pkt. 2 jest niepoprawny → pozyskać IVA z PERUN i wysłać bezpośrednio z CCM bądź z GUI CCToolCCtool wysł.CCtool zwalid.MinIOWysłany dokument nie spełnia kryterium rozmiaru, a otrzymane potwierdzenie ACK (CCTool zwalid.): (1) zawiera komunikat błędu; (2) proces zakończył się błędem — „Błąd procesu".Procedura: R05. Należy zweryfikować sytuację w CCTool Zweryfikować dokument IVA czy jest poprawny (pobranie z CCM i rozpakowanie) — pomimo małego rozmiaru sytuacja może być OK Jeśli plik z pkt. 2 jest niepoprawny → pozyskać IVA z PERUN i wysłać bezpośrednio z CCM bądź z GUI CCToolCCtool wysł.CCtool zwalid.MinIOWysłany dokument nie spełnia kryterium rozmiaru. Dokument ACK (CCTool zwalid.) napłynął po CET z pozytywnym komunikatem.Należy zweryfikować dokument IVA czy jest poprawny i czy został przyjęty w CCTool Jeśli plik z pkt. 1 jest niepoprawny → pozyskać IVA z PERUN i wysłać bezpośrednio z CCM bądź z GUI CCTool Po weryfikacji można nadać 'R' → Stan #21 (Kategoria A).CCtool wysł.CCtool zwalid.MinIOWysłany dokument nie spełnia kryterium rozmiaru. Dokument ACK (CCTool zwalid.) nie napłynął do CET.Zweryfikować sytuację w CCTool — w przypadku wygenerowania ACK po stronie CCTool sytuację zgłosić Zweryfikować dokument IVA (pobranie z CCM i rozpakowanie) — pomimo małego rozmiaru sytuacja może być OK Jeśli plik z pkt. 2 jest niepoprawny → pozyskać IVA z PERUN i wysłać bezpośrednio z CCM bądź z GUI CCToolCCtool wysł.CCtool zwalid.MinIODokument wysłany prawidłowo do CCTool i na MINIO po CET, potwierdzenie ACK ma status czerwony co może oznaczać: (1) zawiera komunikat błędu; (2) proces zakończył się błędem — „Błąd procesu".Procedura: R05. Należy zweryfikować sytuację w CCTool.CCtool wysł.CCtool zwalid.MinIODokument wysłany prawidłowo do CCTool i na MINIO po CET. Dokument ACK (CCTool zwalid.) nie napłynął do CET.Procedury: R06, R18. Należy zweryfikować sytuację w CCTool, w przypadku wygenerowania ACK po stronie CCTool sytuację zgłosić.CCtool wysł.CCtool zwalid.MinIODokument nie został dostarczony ani do CCTool ani na MINIO, w związku z tym potwierdzenie ACK nie napłynęło. Minął czas CET.Procedura (wg Confluence): Należy zweryfikować czy dokument IVA jest w PERUN. Jeśli TAK to należy go niezwłocznie pozyskać ręcznie i wysłać ją bezpośrednio z CCM bądź z GUI CCTool Procedury IDCC: R10 (Process failed) — oczekuj IVA BACKUP v1 od CCA; brak → R19 (CN2 nie kopiuje do CCA), R23 (brak raportu CCA). Zgłoś (CIZ, WPO, PSE-I) + telefon CCC. ❌ Zakaz fallbacku 20% Fmax z DA.MinIOPlik dostarczony prawidłowo na MinIO — status pozytywny.Brak działań — proces poprawny.MinIOStatus nadany ręcznie literą 'R' przez Dyspozytora po weryfikacji.Brak działań — decyzja ręczna Dyspozytora.MinIOPlik dostarczony po CET — status pozytywny.Brak działań — dostarczone po CET, OK.MinIOPrzedwczesne (&gt;30 min do TET) — plik jeszcze niewymagany.Monitoring — czekaj do TET.MinIOOczekiwanie / transfer w toku (stan przejściowy).Czekaj 5 min → sprawdź MinIO. Gdy brak → pobierz/wygeneruj plik ręcznie ze źródła i wgraj przez Manual Upload (GUI Core CC Tool) / wyślij z CCM.MinIOZbliża się TET — pliku jeszcze nie ma na MinIO.Sprawdź źródło (Kreator / Perun4V / Core CC Tool). Gdy brak → pobierz/wygeneruj plik ręcznie ze źródła i wgraj przez Manual Upload (GUI Core CC Tool) / wyślij z CCM.MinIOZbliża się CET / błąd dostarczenia — brak pliku na MinIO.Gdy pliku NIE ma na MinIO → pobierz/wygeneruj plik ręcznie ze źródła i wgraj przez Manual Upload (GUI Core CC Tool) / wyślij z CCM.MinIOMinął CET — plik niedostarczony. Krytyczne.Zgłoś (CIZ/WPO/PSE-I). Po CET — postępowanie krytyczne (brak lokalnego fallbacku).</w:t>
+      </w:r>
+    </w:p>
+    <w:p>
       <w:pPr>
         <w:pStyle w:val="Heading4"/>
       </w:pPr>
@@ -14045,6 +15037,16 @@
       </w:r>
     </w:p>
     <w:p>
+      <w:r>
+        <w:t>Warianty stanów (8)</w:t>
+      </w:r>
+    </w:p>
+    <w:p>
+      <w:r>
+        <w:t>Status kafelkaSytuacjaDziałania awaryjneMinIOPlik dostarczony prawidłowo na MinIO — status pozytywny.Brak działań — proces poprawny.MinIOStatus nadany ręcznie literą 'R' przez Dyspozytora po weryfikacji.Brak działań — decyzja ręczna Dyspozytora.MinIOPlik dostarczony po CET — status pozytywny.Brak działań — dostarczone po CET, OK.MinIOPrzedwczesne (&gt;30 min do TET) — plik jeszcze niewymagany.Monitoring — czekaj do TET.MinIOOczekiwanie / transfer w toku (stan przejściowy).Czekaj 5 min → sprawdź MinIO. Gdy brak → pobierz/wygeneruj plik ręcznie ze źródła i wgraj przez Manual Upload (GUI Core CC Tool) / wyślij z CCM.MinIOZbliża się TET — pliku jeszcze nie ma na MinIO.Sprawdź źródło (Kreator / Perun4V / Core CC Tool). Gdy brak → pobierz/wygeneruj plik ręcznie ze źródła i wgraj przez Manual Upload (GUI Core CC Tool) / wyślij z CCM.MinIOZbliża się CET / błąd dostarczenia — brak pliku na MinIO.Gdy pliku NIE ma na MinIO → pobierz/wygeneruj plik ręcznie ze źródła i wgraj przez Manual Upload (GUI Core CC Tool) / wyślij z CCM.MinIOMinął CET — plik niedostarczony. Krytyczne.Zgłoś (CIZ/WPO/PSE-I). Po CET — postępowanie krytyczne (brak lokalnego fallbacku).</w:t>
+      </w:r>
+    </w:p>
+    <w:p>
       <w:pPr>
         <w:pStyle w:val="Heading4"/>
       </w:pPr>
@@ -14126,6 +15128,16 @@
       </w:r>
     </w:p>
     <w:p>
+      <w:r>
+        <w:t>Warianty stanów (8)</w:t>
+      </w:r>
+    </w:p>
+    <w:p>
+      <w:r>
+        <w:t>Status kafelkaSytuacjaDziałania awaryjneMinIOPlik dostarczony prawidłowo na MinIO — status pozytywny.Brak działań — proces poprawny.MinIOStatus nadany ręcznie literą 'R' przez Dyspozytora po weryfikacji.Brak działań — decyzja ręczna Dyspozytora.MinIOPlik dostarczony po CET — status pozytywny.Brak działań — dostarczone po CET, OK.MinIOPrzedwczesne (&gt;30 min do TET) — plik jeszcze niewymagany.Monitoring — czekaj do TET.MinIOOczekiwanie / transfer w toku (stan przejściowy).Czekaj 5 min → sprawdź MinIO. Gdy brak → pobierz/wygeneruj plik ręcznie ze źródła i wgraj przez Manual Upload (GUI Core CC Tool) / wyślij z CCM.MinIOZbliża się TET — pliku jeszcze nie ma na MinIO.Sprawdź źródło (Kreator / Perun4V / Core CC Tool). Gdy brak → pobierz/wygeneruj plik ręcznie ze źródła i wgraj przez Manual Upload (GUI Core CC Tool) / wyślij z CCM.MinIOZbliża się CET / błąd dostarczenia — brak pliku na MinIO.Gdy pliku NIE ma na MinIO → pobierz/wygeneruj plik ręcznie ze źródła i wgraj przez Manual Upload (GUI Core CC Tool) / wyślij z CCM.MinIOMinął CET — plik niedostarczony. Krytyczne.Zgłoś (CIZ/WPO/PSE-I). Po CET — postępowanie krytyczne (brak lokalnego fallbacku).</w:t>
+      </w:r>
+    </w:p>
+    <w:p>
       <w:pPr>
         <w:pStyle w:val="Heading4"/>
       </w:pPr>
@@ -14222,6 +15234,16 @@
       </w:r>
     </w:p>
     <w:p>
+      <w:r>
+        <w:t>Warianty stanów (32)</w:t>
+      </w:r>
+    </w:p>
+    <w:p>
+      <w:r>
+        <w:t>Status kafelkaSytuacjaDziałania awaryjneCCtool wysł.CCtool zwalid.Dokument wysłany prawidłowo do CCTool, otrzymano potwierdzenie ACK z pozytywnym komunikatem.Brak działań — proces poprawny.CCtool wysł.CCtool zwalid.Dokument wysłany prawidłowo do CCTool. Dyspozytor ustawił status ręcznie 'R' po weryfikacji w CCTool.Brak działań.CCtool wysł.CCtool zwalid.Dokument wysłany prawidłowo do CCTool po CET, ACK napłynął po CET z pozytywnym komunikatem.Brak działań — dostarczone po CET, OK.CCtool wysł.CCtool zwalid.Dokument oznaczony ręcznie jako wysłany prawidłowo do CCTool oraz otrzymanie potwierdzenia ACK.Brak działań.CCtool wysł.CCtool zwalid.Dokument prawidłowo wysłany ręcznie z poziomu CCM. Otrzymano potwierdzenie ACK z pozytywnym komunikatem.Brak działań — wysyłka ręczna wykonana.CCtool wysł.CCtool zwalid.Dokument prawidłowo wysłany ręcznie z poziomu CCM. Trwa oczekiwanie na potwierdzenie ACK — około 2 min.Postępowanie:Czekaj 5 minOK → ustaw 'R' w CCMCCtool wysł.CCtool zwalid.Dokument wysłany ręcznie z poziomu CCM, ale ACK nie napłynął w żądanym czasie i zbliża się CET.Postępowanie:Core CC Tool → sprawdź czy plik dotarł (Message Viewer)Jeżeli:OK → oznacz 'R' w CCMbłąd → Plik został odrzucony — odczytaj kod błędu z potwierdzenia ACK i zareaguj zależnie od kodu:kod 20 (bramka dla pliku zamknięta) — zgłoś administratorowi Core CC Toolkod 21 (wersja nie jest wyższa niż już zapisana) — w źródle podnieś numer wersji i wyślij plik ponowniekod 30 (rozmiar pliku niezgodny) — pobierz poprawny plik i wyślij ponownie pełny opis w bazie ryzykbrak → Awaria transportu plików (Connector 2.0). Zgłoś awarię. W międzyczasie pobierz plik ze źródła (aplikacji ZP) i wyślij go ręcznie przez Core CC Tool (Manual Upload). pełny opis w bazie ryzykCCtool wysł.CCtool zwalid.Dokument wysłany ręcznie z poziomu CCM, a otrzymane ACK: (1) zawiera komunikat błędu (najedź kursorem); (2) proces zakończył się błędem — 'Błąd procesu'.Postępowanie:Najedź kursorem na status i odczytaj kod ACKJeżeli:kod 20 (bramka dla pliku zamknięta) → zgłoś administratorowi Core CC Toolkod 21 (wersja nie jest wyższa niż zapisana) → podnieś numer wersji w aplikacji ZP i wyślij plik ponownie przez Core CC Tool (Manual Upload)kod 30 (rozmiar pliku niezgodny) → pobierz poprawny plik z MinIO lub aplikacji ZP i wyślij ponownieCCtool wysł.CCtool zwalid.Dokument prawidłowo wysłany ręcznie z poziomu CCM. Otrzymano potwierdzenie ACK z pozytywnym komunikatem po CET.Brak działań — ręczna + ACK po CET, OK.CCtool wysł.CCtool zwalid.Dokument prawidłowo wysłany ręcznie z poziomu CCM. Nie otrzymano potwierdzenia ACK — upłynął czas CET.Postępowanie:Core CC Tool → sprawdź statusJeżeli:OK (Processed) → oznacz 'R' w CCM + zgłośbrak / awaria zwrotna → Awaria transportu plików (Connector 2.0). Zgłoś awarię. W międzyczasie pobierz plik ze źródła (aplikacji ZP) i wyślij go ręcznie przez Core CC Tool (Manual Upload). pełny opis w bazie ryzykCCtool wysł.CCtool zwalid.Dokument prawidłowo wysłany ręcznie z poziomu CCM. Nie otrzymano ACK, Dyspozytor ustawił status 'R' po weryfikacji w CCTool.Brak działań — decyzja ręczna Dyspozytora.CCtool wysł.CCtool zwalid.Dokument prawidłowo wysłany ręcznie z poziomu CCM po CET. Trwa oczekiwanie na potwierdzenie ACK — około 2 min.Postępowanie:Czekaj 2-5 minOK → ustaw 'R'CCtool wysł.CCtool zwalid.Dokument wysłany ręcznie z poziomu CCM po CET. Trwa oczekiwanie na potwierdzenie ACK — upłynęło więcej niż 2 minuty.Postępowanie:Core CC Tool → sprawdź czy plik dotarł (Message Viewer)Jeżeli:OK → oznacz 'R' w CCMbłąd → Plik został odrzucony — odczytaj kod błędu z potwierdzenia ACK i zareaguj zależnie od kodu:kod 20 (bramka dla pliku zamknięta) — zgłoś administratorowi Core CC Toolkod 21 (wersja nie jest wyższa niż już zapisana) — w źródle podnieś numer wersji i wyślij plik ponowniekod 30 (rozmiar pliku niezgodny) — pobierz poprawny plik i wyślij ponownie pełny opis w bazie ryzykbrak → Awaria transportu plików (Connector 2.0). Zgłoś awarię. W międzyczasie pobierz plik ze źródła (aplikacji ZP) i wyślij go ręcznie przez Core CC Tool (Manual Upload). pełny opis w bazie ryzykCCtool wysł.CCtool zwalid.Dokument wysłany ręcznie z poziomu CCM po CET, a otrzymane ACK: (1) komunikat błędu; (2) proces zakończył się błędem. Typowo kod 20 gateClosed.Postępowanie:Najedź kursorem na status i odczytaj kod ACK (typowo kod 20)Jeżeli:kod 20 (bramka dla pliku zamknięta) → po CET bramka jest zamknięta → zgłośinny kod → Plik został odrzucony — odczytaj kod błędu z potwierdzenia ACK i zareaguj zależnie od kodu:kod 20 (bramka dla pliku zamknięta) — zgłoś administratorowi Core CC Toolkod 21 (wersja nie jest wyższa niż już zapisana) — w źródle podnieś numer wersji i wyślij plik ponowniekod 30 (rozmiar pliku niezgodny) — pobierz poprawny plik i wyślij ponownie pełny opis w bazie ryzykCCtool wysł.CCtool zwalid.Dokument prawidłowo wysłany ręcznie z poziomu CCM po CET. Otrzymano potwierdzenie ACK z pozytywnym komunikatem (po CET).Brak działań — ręczna + ACK po CET, OK.CCtool wysł.CCtool zwalid.Dokument prawidłowo wysłany ręcznie z poziomu CCM po CET. Nie otrzymano potwierdzenia ACK — upłynął czas CET.Postępowanie:Core CC Tool → sprawdź statusJeżeli:OK (Processed) → oznacz 'R' w CCM + zgłośbrak / awaria zwrotna → Awaria transportu plików (Connector 2.0). Zgłoś awarię. W międzyczasie pobierz plik ze źródła (aplikacji ZP) i wyślij go ręcznie przez Core CC Tool (Manual Upload). pełny opis w bazie ryzykCCtool wysł.CCtool zwalid.Dokument oznaczony ręcznie jako wysłany prawidłowo do CCTool. Trwa oczekiwanie na ACK — około 2 min.Postępowanie:Czekaj 5 minOK → 'R' dla ACKCCtool wysł.CCtool zwalid.Dokument oznaczony ręcznie jako wysłany prawidłowo. Trwa oczekiwanie na ACK — upłynęło więcej niż 2 min.Postępowanie:Czekaj 5 minOK → 'R' dla ACKCCtool wysł.CCtool zwalid.Dokument oznaczony ręcznie jako wysłany prawidłowo. Nie otrzymano potwierdzenia ACK — upłynął czas CET.Postępowanie:Core CC Tool → sprawdź statusJeżeli:OK (Processed) → utrzymaj 'R'brak / awaria → Awaria transportu plików (Connector 2.0). Zgłoś awarię. W międzyczasie pobierz plik ze źródła (aplikacji ZP) i wyślij go ręcznie przez Core CC Tool (Manual Upload). pełny opis w bazie ryzykCCtool wysł.CCtool zwalid.Wysłany dokument nie spełnia kryterium rozmiaru. ACK nie otrzymano, Dyspozytor ustawił status 'R' po weryfikacji w CCTool.Brak działań — Dyspozytor zatwierdził zawartość.CCtool wysł.CCtool zwalid.Dokument jeszcze nie został wysłany do CCTool, ACK nie napłynął. Plik nie wymagany (&gt;30 min do TET).Brak działań — czekaj do TET.CCtool wysł.CCtool zwalid.Zbliża się CET — plik niedostarczony lub błąd wysyłki. Stan alarmowy.Postępowanie (alarm):Core CC Tool → sprawdź czy plik dotarł do Core CC ToolJeżeli:plik jest, brak ACK → Plik został odrzucony — odczytaj kod błędu z potwierdzenia ACK i zareaguj zależnie od kodu:kod 20 (bramka dla pliku zamknięta) — zgłoś administratorowi Core CC Toolkod 21 (wersja nie jest wyższa niż już zapisana) — w źródle podnieś numer wersji i wyślij plik ponowniekod 30 (rozmiar pliku niezgodny) — pobierz poprawny plik i wyślij ponownie pełny opis w bazie ryzykbrak pliku (awaria Connector 2.0) → Awaria transportu plików (Connector 2.0). Zgłoś awarię. W międzyczasie pobierz plik ze źródła (aplikacji ZP) i wyślij go ręcznie przez Core CC Tool (Manual Upload). pełny opis w bazie ryzykbrak pliku w źródle → Brak pliku lub wersji w aplikacji źródłowej. Otwórz aplikacji ZP, przejdź do bilansu i sprawdź wersję pliku: jeśli wersja jest dostępna — pobierz ją (Pobierz XML); jeśli brakuje — wygeneruj nową wersję; jeśli aplikacja nie działa — zgłoś. pełny opis w bazie ryzykCCtool wysł.CCtool zwalid.Wysłany dokument nie spełnia kryterium rozmiaru. Oczekiwanie na ACK — upłynęło więcej niż 2 min.Postępowanie:W aplikacji CCM kliknij plik lewym przyciskiem myszy → Informacje → sprawdź rozmiar; pobierz z MinIO i rozpakujJeżeli:zawartość OK mimo rozmiaru → oznacz 'R' (→ powiązany stan)zawartość niepoprawna → Plik został odrzucony — odczytaj kod błędu z potwierdzenia ACK i zareaguj zależnie od kodu:kod 20 (bramka dla pliku zamknięta) — zgłoś administratorowi Core CC Toolkod 21 (wersja nie jest wyższa niż już zapisana) — w źródle podnieś numer wersji i wyślij plik ponowniekod 30 (rozmiar pliku niezgodny) — pobierz poprawny plik i wyślij ponownie pełny opis w bazie ryzykCCtool wysł.CCtool zwalid.Wysłany dokument nie spełnia kryterium rozmiaru, a ACK ma status czerwony — typowo kod 30.Postępowanie:W aplikacji CCM kliknij plik lewym przyciskiem myszy → Informacje → potwierdź rozmiarPobierz poprawny plik z aplikacji ZP (Pobierz XML) i wyślij przez Core CC Tool (Manual Upload) z kolejnym numerem wersjiNadal za mały → zgłoś szczegóły w bazie ryzykCCtool wysł.CCtool zwalid.Wysłany dokument nie spełnia kryterium rozmiaru. ACK napłynął po CET z pozytywnym komunikatem. Sprzeczność.Postępowanie:Pobierz z MinIO → rozpakuj → sprawdź zawartośćJeżeli:zawartość OK → oznacz 'R' (→ powiązany stan); zgłośniepoprawna → zgłośCCtool wysł.CCtool zwalid.Dokument wysłany prawidłowo do CCTool, ale ACK negatywny (Rejected). Kody: 20/21/30.Postępowanie:Najedź kursorem na status i odczytaj kod ACKJeżeli:kod 20 (bramka dla pliku zamknięta) → zgłoś (administrator Core CC Tool otwiera bramkę); sprawdź proces IDx-AC-FORWARDINGkod 21 (wersja nie jest wyższa niż zapisana) → podnieś numer wersji w aplikacji ZP i wyślij plik ponownie przez Core CC Tool (Manual Upload)kod 30 (rozmiar pliku niezgodny) → pobierz poprawny plik z MinIO lub aplikacji ZP i wyślij ponownieCCtool wysł.CCtool zwalid.Dokument wysłany prawidłowo, trwa oczekiwanie na ACK, który nie napłynął w zadanym czasie (&gt;2-3 min).Postępowanie:Czekaj 5 min → Core CC Tool (⚠ nie wysyłaj ponownie!)Jeżeli:Processed → oznacz 'R' + zgłośRejected → patrz stan kod ACKbrak wpisu → Awaria transportu plików (Connector 2.0). Zgłoś awarię. W międzyczasie pobierz plik ze źródła (aplikacji ZP) i wyślij go ręcznie przez Core CC Tool (Manual Upload). pełny opis w bazie ryzykCCtool wysł.CCtool zwalid.Dokument wysłany prawidłowo, ACK nie napłynął do CET.Postępowanie:Core CC Tool → sprawdź statusJeżeli:Processed → oznacz 'R' + zgłoś (→ powiązany stan)Rejected → wyślij ponownie przez Core CC Tool (Manual Upload) "po CET"brak → Awaria transportu plików (Connector 2.0). Zgłoś awarię. W międzyczasie pobierz plik ze źródła (aplikacji ZP) i wyślij go ręcznie przez Core CC Tool (Manual Upload). pełny opis w bazie ryzyk + powiadom RCCCCtool wysł.CCtool zwalid.Wysłany dokument nie spełnia kryterium rozmiaru. ACK nie napłynął do CET. Krytyczne.Postępowanie (KRYTYCZNE w C):Pobierz poprawny plik z aplikacji ZP i wyślij przez Core CC Tool (Manual Upload) "po CET" (jeśli bramka otwarta)Natychmiast: zgłoś + powiadom RCC szczegóły w bazie ryzykCCtool wysł.CCtool zwalid.Dokument zarejestrowany w CCTool po CET (wysyłka pozytywna), ale walidacja zakończona negatywnie — ACK Rejected po CET.Postępowanie (po CET):Najedź kursorem na status i odczytaj kod ACK (kontekst: rejestracja po CET)Jeżeli:kod 20 (bramka dla pliku zamknięta) → po CET bramka zamknięta → zgłoś + powiadom RCCkod 21 (wersja nie jest wyższa niż zapisana) → podnieś numer wersji w aplikacji ZP i wyślij plik ponownie przez Core CC Tool (Manual Upload) (jeśli bramka otwarta)kod 30 (rozmiar pliku niezgodny) → pobierz poprawny plik z MinIO lub aplikacji ZP i wyślij ponownie (jeśli bramka otwarta)CCtool wysł.CCtool zwalid.Dokument zarejestrowany w CCTool po CET (wysyłka pozytywna), ale ACK walidacji nie napłynął — plik dostarczony, lecz niezwalidowany.Postępowanie (po CET):Core CC Tool → sprawdź status walidacji (plik dostarczony po CET)Jeżeli:Processed → oznacz 'R' w CCM + zgłośRejected → postępuj jak w Stanie 30 (odczytaj kod ACK)brak wpisu → Awaria transportu plików (Connector 2.0). Zgłoś awarię. W międzyczasie pobierz plik ze źródła (aplikacji ZP) i wyślij go ręcznie przez Core CC Tool (Manual Upload). pełny opis w bazie ryzyk + powiadom RCCCCtool wysł.CCtool zwalid.Dokument nie został dostarczony do CCTool, ACK nie napłynął. Minął czas CET. KRYTYCZNE — po CET dograć nie można.Postępowanie (KRYTYCZNE — brak naprawy):Telefon do RCC + zgłoś (priorytet P1)Po CET — brak naprawy. Diagnoza przyczyn: ZP · Connector 2.0 · Core CC Tool szczegóły w bazie ryzyk</w:t>
+      </w:r>
+    </w:p>
+    <w:p>
       <w:pPr>
         <w:pStyle w:val="Heading4"/>
       </w:pPr>
@@ -14283,6 +15305,16 @@
       </w:r>
     </w:p>
     <w:p>
+      <w:r>
+        <w:t>Warianty stanów (8)</w:t>
+      </w:r>
+    </w:p>
+    <w:p>
+      <w:r>
+        <w:t>Status kafelkaSytuacjaDziałania awaryjneMinIOPlik dostarczony prawidłowo na MinIO — status pozytywny.Brak działań — proces poprawny.MinIOStatus nadany ręcznie literą 'R' przez Dyspozytora po weryfikacji.Brak działań — decyzja ręczna Dyspozytora.MinIOPlik dostarczony po CET — status pozytywny.Brak działań — dostarczone po CET, OK.MinIOPrzedwczesne (&gt;30 min do TET) — plik jeszcze niewymagany.Monitoring — czekaj do TET.MinIOOczekiwanie / transfer w toku (stan przejściowy).Czekaj 5 min → sprawdź MinIO. Gdy brak → pobierz/wygeneruj plik ręcznie ze źródła i wgraj przez Manual Upload (GUI Core CC Tool) / wyślij z CCM.MinIOZbliża się TET — pliku jeszcze nie ma na MinIO.Sprawdź źródło (Kreator / Perun4V / Core CC Tool). Gdy brak → pobierz/wygeneruj plik ręcznie ze źródła i wgraj przez Manual Upload (GUI Core CC Tool) / wyślij z CCM.MinIOZbliża się CET / błąd dostarczenia — brak pliku na MinIO.Gdy pliku NIE ma na MinIO → pobierz/wygeneruj plik ręcznie ze źródła i wgraj przez Manual Upload (GUI Core CC Tool) / wyślij z CCM.MinIOMinął CET — plik niedostarczony. Krytyczne.Zgłoś (CIZ/WPO/PSE-I). Po CET — postępowanie krytyczne (brak lokalnego fallbacku).</w:t>
+      </w:r>
+    </w:p>
+    <w:p>
       <w:pPr>
         <w:pStyle w:val="Heading4"/>
       </w:pPr>
@@ -14344,6 +15376,16 @@
       </w:r>
     </w:p>
     <w:p>
+      <w:r>
+        <w:t>Warianty stanów (8)</w:t>
+      </w:r>
+    </w:p>
+    <w:p>
+      <w:r>
+        <w:t>Status kafelkaSytuacjaDziałania awaryjneMinIOPlik dostarczony prawidłowo na MinIO — status pozytywny.Brak działań — proces poprawny.MinIOStatus nadany ręcznie literą 'R' przez Dyspozytora po weryfikacji.Brak działań — decyzja ręczna Dyspozytora.MinIOPlik dostarczony po CET — status pozytywny.Brak działań — dostarczone po CET, OK.MinIOPrzedwczesne (&gt;30 min do TET) — plik jeszcze niewymagany.Monitoring — czekaj do TET.MinIOOczekiwanie / transfer w toku (stan przejściowy).Czekaj 5 min → sprawdź MinIO. Gdy brak → pobierz/wygeneruj plik ręcznie ze źródła i wgraj przez Manual Upload (GUI Core CC Tool) / wyślij z CCM.MinIOZbliża się TET — pliku jeszcze nie ma na MinIO.Sprawdź źródło (Kreator / Perun4V / Core CC Tool). Gdy brak → pobierz/wygeneruj plik ręcznie ze źródła i wgraj przez Manual Upload (GUI Core CC Tool) / wyślij z CCM.MinIOZbliża się CET / błąd dostarczenia — brak pliku na MinIO.Gdy pliku NIE ma na MinIO → pobierz/wygeneruj plik ręcznie ze źródła i wgraj przez Manual Upload (GUI Core CC Tool) / wyślij z CCM.MinIOMinął CET — plik niedostarczony. Krytyczne.Zgłoś (CIZ/WPO/PSE-I). Po CET — postępowanie krytyczne (brak lokalnego fallbacku).</w:t>
+      </w:r>
+    </w:p>
+    <w:p>
       <w:pPr>
         <w:pStyle w:val="Heading4"/>
       </w:pPr>
@@ -14405,6 +15447,16 @@
       </w:r>
     </w:p>
     <w:p>
+      <w:r>
+        <w:t>Warianty stanów (8)</w:t>
+      </w:r>
+    </w:p>
+    <w:p>
+      <w:r>
+        <w:t>Status kafelkaSytuacjaDziałania awaryjneMinIOPlik dostarczony prawidłowo na MinIO — status pozytywny.Brak działań — proces poprawny.MinIOStatus nadany ręcznie literą 'R' przez Dyspozytora po weryfikacji.Brak działań — decyzja ręczna Dyspozytora.MinIOPlik dostarczony po CET — status pozytywny.Brak działań — dostarczone po CET, OK.MinIOPrzedwczesne (&gt;30 min do TET) — plik jeszcze niewymagany.Monitoring — czekaj do TET.MinIOOczekiwanie / transfer w toku (stan przejściowy).Czekaj 5 min → sprawdź MinIO. Gdy brak → pobierz/wygeneruj plik ręcznie ze źródła i wgraj przez Manual Upload (GUI Core CC Tool) / wyślij z CCM.MinIOZbliża się TET — pliku jeszcze nie ma na MinIO.Sprawdź źródło (Kreator / Perun4V / Core CC Tool). Gdy brak → pobierz/wygeneruj plik ręcznie ze źródła i wgraj przez Manual Upload (GUI Core CC Tool) / wyślij z CCM.MinIOZbliża się CET / błąd dostarczenia — brak pliku na MinIO.Gdy pliku NIE ma na MinIO → pobierz/wygeneruj plik ręcznie ze źródła i wgraj przez Manual Upload (GUI Core CC Tool) / wyślij z CCM.MinIOMinął CET — plik niedostarczony. Krytyczne.Zgłoś (CIZ/WPO/PSE-I). Po CET — postępowanie krytyczne (brak lokalnego fallbacku).</w:t>
+      </w:r>
+    </w:p>
+    <w:p>
       <w:pPr>
         <w:pStyle w:val="Heading4"/>
       </w:pPr>
@@ -14471,6 +15523,16 @@
       </w:r>
     </w:p>
     <w:p>
+      <w:r>
+        <w:t>Warianty stanów (8)</w:t>
+      </w:r>
+    </w:p>
+    <w:p>
+      <w:r>
+        <w:t>Status kafelkaSytuacjaDziałania awaryjnesFTP/ZP wysł.Plik dostarczony prawidłowo na sFTP/ZP — status pozytywny.Brak działań — proces poprawny.sFTP/ZP wysł.Status nadany ręcznie literą 'R' przez Dyspozytora po weryfikacji.Brak działań — decyzja ręczna Dyspozytora.sFTP/ZP wysł.Plik dostarczony po CET — status pozytywny.Brak działań — dostarczone po CET, OK.sFTP/ZP wysł.Przedwczesne (&gt;30 min do TET) — plik jeszcze niewymagany.Monitoring — czekaj do TET.sFTP/ZP wysł.Oczekiwanie / transfer w toku (stan przejściowy).Czekaj 5 min → sprawdź sFTP/ZP. Gdy brak → wyślij plik ręcznie ze źródła na sFTP/ZP.sFTP/ZP wysł.Zbliża się TET — pliku jeszcze nie ma na sFTP/ZP.Sprawdź źródło (Kreator / Perun4V / Core CC Tool). Gdy brak → wyślij plik ręcznie ze źródła na sFTP/ZP.sFTP/ZP wysł.Zbliża się CET / błąd dostarczenia — brak pliku na sFTP/ZP.Gdy pliku NIE ma na sFTP/ZP → wyślij plik ręcznie ze źródła na sFTP/ZP.sFTP/ZP wysł.Minął CET — plik niedostarczony. Krytyczne.Zgłoś (CIZ/WPO/PSE-I). Po CET — postępowanie krytyczne (brak lokalnego fallbacku).</w:t>
+      </w:r>
+    </w:p>
+    <w:p>
       <w:pPr>
         <w:pStyle w:val="Heading4"/>
       </w:pPr>
@@ -14552,6 +15614,16 @@
       </w:r>
     </w:p>
     <w:p>
+      <w:r>
+        <w:t>Warianty stanów (18)</w:t>
+      </w:r>
+    </w:p>
+    <w:p>
+      <w:r>
+        <w:t>Status kafelkaSytuacjaDziałania awaryjneCCtool wysł.CCtool zwalid.Przedwczesne (&gt;30 min do TET). Walidacja ATC jeszcze nie ukończona.Monitoring — sprawdź w aplikacji CCM postęp walidacji paczki PERUN_IDx_ATC.CCtool wysł.CCtool zwalid.Zbliża się TET, brak FIDx-928. Walidacja paczki ATC w toku.Postępowanie:Rozwiń agregat PERUN_IDx_ATC → zweryfikuj składoweJeżeli:brak składowej → uzupełnij brakującą składową w aplikacji CCM ()składowe OK → monitoruj — czekaj na wynik walidacjiCCtool wysł.CCtool zwalid.Zbliża się CET — brak wyniku walidacji ATC. Stan alarmowy.Postępowanie (zbliża się CET):Ostatnia szansa: dokończ uzupełnienia paczki ATC w CCM; sprawdź Core CC Tool (Message Viewer)Jeżeli:plik dotrze → OK — koniecbłąd → odczytaj kod ACK (patrz powiązany stan)brak → zgłośCCtool wysł.CCtool zwalid.Minął CET, brak FIDx-928. KRYTYCZNE — brak lokalnego fallbacku.Postępowanie (KRYTYCZNE — minął CET):⛔ STOP — żadnych działań ręcznych. Brak lokalnego fallbacku (brak wyniku ATC w czasie → Dyspozytor nie wykonuje dalszych czynności).Zgłoś + telefon do RCC szczegóły w bazie ryzykCCtool wysł.CCtool zwalid.Happy Day — walidacja ATC zakończona poprawnie, wynik opublikowany.Brak interwencji — walidacja ATC zakończona poprawnie.CCtool wysł.CCtool zwalid.Wynik dotarł, ale ACK negatywny (Rejected).Postępowanie:Core CC Tool (Message Viewer) → odczytaj kod ACKJeżeli:kod 20 (bramka dla pliku zamknięta) → zgłoś (administrator Core CC Tool otwiera bramkę)kod 21 (błąd procesowy CCCt) → zgłoś — błąd procesu w Core CC Toolkod 30 (rozmiar niezgodny) → patrz stan rozmiarCCtool wysł.CCtool zwalid.Wynik dotarł, ACK nie napłynął w czasie (timeout).Postępowanie:Czekaj 5 min → Core CC Tool (Message Viewer)Jeżeli:Processed → oznacz 'R' w CCMbrak &gt;10 min → zgłoś — sprawdź transport zwrotny Connector 2.0 (R18)CCtool wysł.CCtool zwalid.Wynik dotarł, brak ACK do CET.Postępowanie:Sprawdź transport zwrotny Connector 2.0Jeżeli:transport OK, ACK błąd → odczytaj kod ACK (patrz powiązany stan)awaria transportu → zgłoś (R18)CCtool wysł.CCtool zwalid.Wynik dotarł, ACK napłynął po CET — pozytywny.Walidacja opóźniona, ale OK (ACK po CET pozytywny).CCtool wysł.CCtool zwalid.Status nadany ręcznie 'R' (nietypowe dla pliku zwrotnego).Brak działań — status nadany ręcznie przez Dyspozytora (nietypowe dla pliku zwrotnego).CCtool wysł.CCtool zwalid.Niepoprawny rozmiar wyniku FIDx-928.Postępowanie:W aplikacji CCM kliknij plik lewym przyciskiem myszy → Informacje → sprawdź rozmiar (pobranie ponownie nie ma sensu — plik zwrotny)Jeżeli:zawartość OK mimo rozmiaru → oznacz 'R' w CCMzawartość niepoprawna → zgłoś + telefon do RCCCCtool wysł.CCtool zwalid.Niepoprawny rozmiar + brak ACK (timeout).Postępowanie:Core CC Tool (Message Viewer) → sprawdź statusJeżeli:Processed → oznacz 'R' w CCMbrak → zgłoś + telefon do RCCCCtool wysł.CCtool zwalid.Niepoprawny rozmiar + ACK negatywny.Postępowanie:Core CC Tool (Message Viewer) → odczytaj kod ACKJeżeli:kod 20 (bramka zamknięta) → zgłoś (administrator Core CC Tool)kod 30 (rozmiar) → patrz powiązany staninny → zgłoś + telefon do RCCCCtool wysł.CCtool zwalid.Niepoprawny rozmiar + brak ACK do CET. KRYTYCZNE.Postępowanie (KRYTYCZNE):⛔ Krytyczne — minął CET, niepoprawny rozmiar i brak ACK.Zgłoś + telefon do RCC szczegóły w bazie ryzykCCtool wysł.CCtool zwalid.FIDx-928 dostarczony po CET — walidacja OK.Walidacja zakończona po terminie — OK.CCtool wysł.CCtool zwalid.Wysyłka zwrotna trwa (transport Connector 2.0).Postępowanie:Czekaj 5 min (transport zwrotny Connector 2.0)Jeżeli:zmieniło się na zielony → OK — koniecbrak &gt;10 min → zgłoś (R18)CCtool wysł.CCtool zwalid.Status ręczny przyznany (nietypowe dla pliku zwrotnego).Brak działań — status ręczny przyznany przez Dyspozytora (nietypowe dla pliku zwrotnego).CCtool wysł.CCtool zwalid.TET zbliża się, ACK błąd już teraz (błąd paczki ATC).Postępowanie:Core CC Tool (Message Viewer) → odczytaj błąd paczki ATCJeżeli:błąd składowej → uzupełnij składową w aplikacji CCMinny → odczytaj kod ACK (patrz powiązany stan)</w:t>
+      </w:r>
+    </w:p>
+    <w:p>
       <w:pPr>
         <w:pStyle w:val="Heading4"/>
       </w:pPr>
@@ -14628,6 +15700,16 @@
       </w:r>
     </w:p>
     <w:p>
+      <w:r>
+        <w:t>Warianty stanów (10)</w:t>
+      </w:r>
+    </w:p>
+    <w:p>
+      <w:r>
+        <w:t>Status kafelkaSytuacjaDziałania awaryjneMinIOsFTP/ZP wysł.Paczka dostarczona prawidłowo na MinIO i sFTP/ZP.Brak działań — proces poprawny.MinIOsFTP/ZP wysł.Status nadany ręcznie 'R' po weryfikacji.Brak działań — decyzja ręczna.MinIOsFTP/ZP wysł.Paczka dostarczona po CET — status pozytywny.Brak działań — po CET OK.MinIOsFTP/ZP wysł.Przedwczesne — paczka jeszcze niewymagana.Monitoring — czekaj do TET.MinIOsFTP/ZP wysł.Zbliża się TET — paczka niekompletna / brak.Sprawdź agregację składowych. Gdy brak → zagreguj/pobierz ręcznie i wrzuć (Manual Upload / wysyłka na sFTP).MinIOsFTP/ZP wysł.Na MinIO OK, brak / błąd na sFTP/ZP.Gdy brak na sFTP → wyślij plik ręcznie ze źródła na sFTP/ZP.MinIOsFTP/ZP wysł.Brak / błąd na MinIO, OK na sFTP/ZP.Gdy brak na MinIO → pobierz/wygeneruj ręcznie i wgraj przez Manual Upload (GUI Core CC Tool).MinIOsFTP/ZP wysł.Transfer w toku (MinIO i sFTP/ZP).Czekaj 5 min → sprawdź MinIO i sFTP. Gdy brak → ręcznie (Manual Upload / wysyłka na sFTP).MinIOsFTP/ZP wysł.Zbliża się CET — brak / błąd na MinIO i sFTP/ZP.Gdy brak na MinIO → Manual Upload; gdy brak na sFTP → wyślij ręcznie.MinIOsFTP/ZP wysł.Minął CET — paczka niedostarczona. Krytyczne.Zgłoś (CIZ/WPO/PSE-I). Postępowanie krytyczne.</w:t>
+      </w:r>
+    </w:p>
+    <w:p>
       <w:pPr>
         <w:pStyle w:val="Heading4"/>
       </w:pPr>
@@ -14704,6 +15786,16 @@
       </w:r>
     </w:p>
     <w:p>
+      <w:r>
+        <w:t>Warianty stanów (10)</w:t>
+      </w:r>
+    </w:p>
+    <w:p>
+      <w:r>
+        <w:t>Status kafelkaSytuacjaDziałania awaryjneMinIOsFTP/ZP wysł.Paczka dostarczona prawidłowo na MinIO i sFTP/ZP.Brak działań — proces poprawny.MinIOsFTP/ZP wysł.Status nadany ręcznie 'R' po weryfikacji.Brak działań — decyzja ręczna.MinIOsFTP/ZP wysł.Paczka dostarczona po CET — status pozytywny.Brak działań — po CET OK.MinIOsFTP/ZP wysł.Przedwczesne — paczka jeszcze niewymagana.Monitoring — czekaj do TET.MinIOsFTP/ZP wysł.Zbliża się TET — paczka niekompletna / brak.Sprawdź agregację składowych. Gdy brak → zagreguj/pobierz ręcznie i wrzuć (Manual Upload / wysyłka na sFTP).MinIOsFTP/ZP wysł.Na MinIO OK, brak / błąd na sFTP/ZP.Gdy brak na sFTP → wyślij plik ręcznie ze źródła na sFTP/ZP.MinIOsFTP/ZP wysł.Brak / błąd na MinIO, OK na sFTP/ZP.Gdy brak na MinIO → pobierz/wygeneruj ręcznie i wgraj przez Manual Upload (GUI Core CC Tool).MinIOsFTP/ZP wysł.Transfer w toku (MinIO i sFTP/ZP).Czekaj 5 min → sprawdź MinIO i sFTP. Gdy brak → ręcznie (Manual Upload / wysyłka na sFTP).MinIOsFTP/ZP wysł.Zbliża się CET — brak / błąd na MinIO i sFTP/ZP.Gdy brak na MinIO → Manual Upload; gdy brak na sFTP → wyślij ręcznie.MinIOsFTP/ZP wysł.Minął CET — paczka niedostarczona. Krytyczne.Zgłoś (CIZ/WPO/PSE-I). Postępowanie krytyczne.</w:t>
+      </w:r>
+    </w:p>
+    <w:p>
       <w:pPr>
         <w:pStyle w:val="Heading4"/>
       </w:pPr>
@@ -14775,6 +15867,16 @@
       </w:r>
     </w:p>
     <w:p>
+      <w:r>
+        <w:t>Warianty stanów (8)</w:t>
+      </w:r>
+    </w:p>
+    <w:p>
+      <w:r>
+        <w:t>Status kafelkaSytuacjaDziałania awaryjnesFTP/ZP wysł.Plik dostarczony prawidłowo na sFTP/ZP — status pozytywny.Brak działań — proces poprawny.sFTP/ZP wysł.Status nadany ręcznie literą 'R' przez Dyspozytora po weryfikacji.Brak działań — decyzja ręczna Dyspozytora.sFTP/ZP wysł.Plik dostarczony po CET — status pozytywny.Brak działań — dostarczone po CET, OK.sFTP/ZP wysł.Przedwczesne (&gt;30 min do TET) — plik jeszcze niewymagany.Monitoring — czekaj do TET.sFTP/ZP wysł.Oczekiwanie / transfer w toku (stan przejściowy).Czekaj 5 min → sprawdź sFTP/ZP. Gdy brak → wyślij plik ręcznie ze źródła na sFTP/ZP.sFTP/ZP wysł.Zbliża się TET — pliku jeszcze nie ma na sFTP/ZP.Sprawdź źródło (Kreator / Perun4V / Core CC Tool). Gdy brak → wyślij plik ręcznie ze źródła na sFTP/ZP.sFTP/ZP wysł.Zbliża się CET / błąd dostarczenia — brak pliku na sFTP/ZP.Gdy pliku NIE ma na sFTP/ZP → wyślij plik ręcznie ze źródła na sFTP/ZP.sFTP/ZP wysł.Minął CET — plik niedostarczony. Krytyczne.Zgłoś (CIZ/WPO/PSE-I). Po CET — postępowanie krytyczne (brak lokalnego fallbacku).</w:t>
+      </w:r>
+    </w:p>
+    <w:p>
       <w:pPr>
         <w:pStyle w:val="Heading4"/>
       </w:pPr>
@@ -14846,6 +15948,16 @@
       </w:r>
     </w:p>
     <w:p>
+      <w:r>
+        <w:t>Warianty stanów (8)</w:t>
+      </w:r>
+    </w:p>
+    <w:p>
+      <w:r>
+        <w:t>Status kafelkaSytuacjaDziałania awaryjnesFTP/ZP wysł.Plik dostarczony prawidłowo na sFTP/ZP — status pozytywny.Brak działań — proces poprawny.sFTP/ZP wysł.Status nadany ręcznie literą 'R' przez Dyspozytora po weryfikacji.Brak działań — decyzja ręczna Dyspozytora.sFTP/ZP wysł.Plik dostarczony po CET — status pozytywny.Brak działań — dostarczone po CET, OK.sFTP/ZP wysł.Przedwczesne (&gt;30 min do TET) — plik jeszcze niewymagany.Monitoring — czekaj do TET.sFTP/ZP wysł.Oczekiwanie / transfer w toku (stan przejściowy).Czekaj 5 min → sprawdź sFTP/ZP. Gdy brak → wyślij plik ręcznie ze źródła na sFTP/ZP.sFTP/ZP wysł.Zbliża się TET — pliku jeszcze nie ma na sFTP/ZP.Sprawdź źródło (Kreator / Perun4V / Core CC Tool). Gdy brak → wyślij plik ręcznie ze źródła na sFTP/ZP.sFTP/ZP wysł.Zbliża się CET / błąd dostarczenia — brak pliku na sFTP/ZP.Gdy pliku NIE ma na sFTP/ZP → wyślij plik ręcznie ze źródła na sFTP/ZP.sFTP/ZP wysł.Minął CET — plik niedostarczony. Krytyczne.Zgłoś (CIZ/WPO/PSE-I). Po CET — postępowanie krytyczne (brak lokalnego fallbacku).</w:t>
+      </w:r>
+    </w:p>
+    <w:p>
       <w:pPr>
         <w:pStyle w:val="Heading4"/>
       </w:pPr>
@@ -14907,6 +16019,16 @@
       </w:r>
     </w:p>
     <w:p>
+      <w:r>
+        <w:t>Warianty stanów (8)</w:t>
+      </w:r>
+    </w:p>
+    <w:p>
+      <w:r>
+        <w:t>Status kafelkaSytuacjaDziałania awaryjneMinIOPlik dostarczony prawidłowo na MinIO — status pozytywny.Brak działań — proces poprawny.MinIOStatus nadany ręcznie literą 'R' przez Dyspozytora po weryfikacji.Brak działań — decyzja ręczna Dyspozytora.MinIOPlik dostarczony po CET — status pozytywny.Brak działań — dostarczone po CET, OK.MinIOPrzedwczesne (&gt;30 min do TET) — plik jeszcze niewymagany.Monitoring — czekaj do TET.MinIOOczekiwanie / transfer w toku (stan przejściowy).Czekaj 5 min → sprawdź MinIO. Gdy brak → pobierz/wygeneruj plik ręcznie ze źródła i wgraj przez Manual Upload (GUI Core CC Tool) / wyślij z CCM.MinIOZbliża się TET — pliku jeszcze nie ma na MinIO.Sprawdź źródło (Kreator / Perun4V / Core CC Tool). Gdy brak → pobierz/wygeneruj plik ręcznie ze źródła i wgraj przez Manual Upload (GUI Core CC Tool) / wyślij z CCM.MinIOZbliża się CET / błąd dostarczenia — brak pliku na MinIO.Gdy pliku NIE ma na MinIO → pobierz/wygeneruj plik ręcznie ze źródła i wgraj przez Manual Upload (GUI Core CC Tool) / wyślij z CCM.MinIOMinął CET — plik niedostarczony. Krytyczne.Zgłoś (CIZ/WPO/PSE-I). Po CET — postępowanie krytyczne (brak lokalnego fallbacku).</w:t>
+      </w:r>
+    </w:p>
+    <w:p>
       <w:pPr>
         <w:pStyle w:val="Heading4"/>
       </w:pPr>
@@ -14968,6 +16090,16 @@
       </w:r>
     </w:p>
     <w:p>
+      <w:r>
+        <w:t>Warianty stanów (8)</w:t>
+      </w:r>
+    </w:p>
+    <w:p>
+      <w:r>
+        <w:t>Status kafelkaSytuacjaDziałania awaryjneMinIOPlik dostarczony prawidłowo na MinIO — status pozytywny.Brak działań — proces poprawny.MinIOStatus nadany ręcznie literą 'R' przez Dyspozytora po weryfikacji.Brak działań — decyzja ręczna Dyspozytora.MinIOPlik dostarczony po CET — status pozytywny.Brak działań — dostarczone po CET, OK.MinIOPrzedwczesne (&gt;30 min do TET) — plik jeszcze niewymagany.Monitoring — czekaj do TET.MinIOOczekiwanie / transfer w toku (stan przejściowy).Czekaj 5 min → sprawdź MinIO. Gdy brak → pobierz/wygeneruj plik ręcznie ze źródła i wgraj przez Manual Upload (GUI Core CC Tool) / wyślij z CCM.MinIOZbliża się TET — pliku jeszcze nie ma na MinIO.Sprawdź źródło (Kreator / Perun4V / Core CC Tool). Gdy brak → pobierz/wygeneruj plik ręcznie ze źródła i wgraj przez Manual Upload (GUI Core CC Tool) / wyślij z CCM.MinIOZbliża się CET / błąd dostarczenia — brak pliku na MinIO.Gdy pliku NIE ma na MinIO → pobierz/wygeneruj plik ręcznie ze źródła i wgraj przez Manual Upload (GUI Core CC Tool) / wyślij z CCM.MinIOMinął CET — plik niedostarczony. Krytyczne.Zgłoś (CIZ/WPO/PSE-I). Po CET — postępowanie krytyczne (brak lokalnego fallbacku).</w:t>
+      </w:r>
+    </w:p>
+    <w:p>
       <w:pPr>
         <w:pStyle w:val="Heading3"/>
       </w:pPr>
@@ -15062,6 +16194,16 @@
       </w:r>
     </w:p>
     <w:p>
+      <w:r>
+        <w:t>Warianty stanów (32)</w:t>
+      </w:r>
+    </w:p>
+    <w:p>
+      <w:r>
+        <w:t>Status kafelkaSytuacjaDziałania awaryjneCCtool wysł.CCtool zwalid.Dokument wysłany prawidłowo do CCTool, otrzymano potwierdzenie ACK z pozytywnym komunikatem.Brak działań — proces poprawny.CCtool wysł.CCtool zwalid.Dokument wysłany prawidłowo do CCTool. Dyspozytor ustawił status ręcznie 'R' po weryfikacji w CCTool.Brak działań.CCtool wysł.CCtool zwalid.Dokument wysłany prawidłowo do CCTool po CET, ACK napłynął po CET z pozytywnym komunikatem.Brak działań — dostarczone po CET, OK.CCtool wysł.CCtool zwalid.Dokument oznaczony ręcznie jako wysłany prawidłowo do CCTool oraz otrzymanie potwierdzenia ACK.Brak działań.CCtool wysł.CCtool zwalid.Dokument prawidłowo wysłany ręcznie z poziomu CCM. Otrzymano potwierdzenie ACK z pozytywnym komunikatem.Brak działań — wysyłka ręczna wykonana.CCtool wysł.CCtool zwalid.Dokument prawidłowo wysłany ręcznie z poziomu CCM. Trwa oczekiwanie na potwierdzenie ACK — około 2 min.Postępowanie:Czekaj 5 minOK → ustaw 'R' w CCMCCtool wysł.CCtool zwalid.Dokument wysłany ręcznie z poziomu CCM, ale ACK nie napłynął w żądanym czasie i zbliża się CET.Postępowanie:Core CC Tool → sprawdź czy plik dotarł (Message Viewer)Jeżeli:OK → oznacz 'R' w CCMbłąd → Plik został odrzucony — odczytaj kod błędu z potwierdzenia ACK i zareaguj zależnie od kodu:kod 20 (bramka dla pliku zamknięta) — zgłoś administratorowi Core CC Toolkod 21 (wersja nie jest wyższa niż już zapisana) — w źródle podnieś numer wersji i wyślij plik ponowniekod 30 (rozmiar pliku niezgodny) — pobierz poprawny plik i wyślij ponownie pełny opis w bazie ryzykbrak → Awaria transportu plików (Connector 2.0). Zgłoś awarię. W międzyczasie wygeneruj plik w KreatorIDCF_CGMES i wyślij go ręcznie przez Core CC Tool (Manual Upload). pełny opis w bazie ryzykCCtool wysł.CCtool zwalid.Dokument wysłany ręcznie z poziomu CCM, a otrzymane ACK: (1) zawiera komunikat błędu (najedź kursorem); (2) proces zakończył się błędem — 'Błąd procesu'.Postępowanie:Najedź kursorem na status i odczytaj kod ACKJeżeli:kod 20 (bramka dla pliku zamknięta) → zgłoś administratorowi Core CC Toolkod 21 (wersja nie jest wyższa niż zapisana) → wygeneruj kolejną wersję w KreatorIDCF_CGMES i opublikuj (Publikuj Connector) · szczegółowa procedura (ze screenami)kod 30 (rozmiar pliku niezgodny) → wygeneruj ponownie w KreatorIDCF_CGMES i opublikuj (Publikuj Connector) · szczegółowa procedura (ze screenami)CCtool wysł.CCtool zwalid.Dokument prawidłowo wysłany ręcznie z poziomu CCM. Otrzymano potwierdzenie ACK z pozytywnym komunikatem po CET.Brak działań — ręczna + ACK po CET, OK.CCtool wysł.CCtool zwalid.Dokument prawidłowo wysłany ręcznie z poziomu CCM. Nie otrzymano potwierdzenia ACK — upłynął czas CET.Postępowanie:Core CC Tool → sprawdź statusJeżeli:OK (Processed) → oznacz 'R' w CCM + zgłośbrak / awaria zwrotna → Awaria transportu plików (Connector 2.0). Zgłoś awarię. W międzyczasie wygeneruj plik w KreatorIDCF_CGMES i wyślij go ręcznie przez Core CC Tool (Manual Upload). pełny opis w bazie ryzykCCtool wysł.CCtool zwalid.Dokument prawidłowo wysłany ręcznie z poziomu CCM. Nie otrzymano ACK, Dyspozytor ustawił status 'R' po weryfikacji w CCTool.Brak działań — decyzja ręczna Dyspozytora.CCtool wysł.CCtool zwalid.Dokument prawidłowo wysłany ręcznie z poziomu CCM po CET. Trwa oczekiwanie na potwierdzenie ACK — około 2 min.Postępowanie:Czekaj 2-5 minOK → ustaw 'R'CCtool wysł.CCtool zwalid.Dokument wysłany ręcznie z poziomu CCM po CET. Trwa oczekiwanie na potwierdzenie ACK — upłynęło więcej niż 2 minuty.Postępowanie:Core CC Tool → sprawdź czy plik dotarł (Message Viewer)Jeżeli:OK → oznacz 'R' w CCMbłąd → Plik został odrzucony — odczytaj kod błędu z potwierdzenia ACK i zareaguj zależnie od kodu:kod 20 (bramka dla pliku zamknięta) — zgłoś administratorowi Core CC Toolkod 21 (wersja nie jest wyższa niż już zapisana) — w źródle podnieś numer wersji i wyślij plik ponowniekod 30 (rozmiar pliku niezgodny) — pobierz poprawny plik i wyślij ponownie pełny opis w bazie ryzykbrak → Awaria transportu plików (Connector 2.0). Zgłoś awarię. W międzyczasie wygeneruj plik w KreatorIDCF_CGMES i wyślij go ręcznie przez Core CC Tool (Manual Upload). pełny opis w bazie ryzykCCtool wysł.CCtool zwalid.Dokument wysłany ręcznie z poziomu CCM po CET, a otrzymane ACK: (1) komunikat błędu; (2) proces zakończył się błędem. Typowo kod 20 gateClosed.Postępowanie:Najedź kursorem na status i odczytaj kod ACK (typowo kod 20)Jeżeli:kod 20 (bramka dla pliku zamknięta) → po CET bramka jest zamknięta → zgłośinny kod → Plik został odrzucony — odczytaj kod błędu z potwierdzenia ACK i zareaguj zależnie od kodu:kod 20 (bramka dla pliku zamknięta) — zgłoś administratorowi Core CC Toolkod 21 (wersja nie jest wyższa niż już zapisana) — w źródle podnieś numer wersji i wyślij plik ponowniekod 30 (rozmiar pliku niezgodny) — pobierz poprawny plik i wyślij ponownie pełny opis w bazie ryzykCCtool wysł.CCtool zwalid.Dokument prawidłowo wysłany ręcznie z poziomu CCM po CET. Otrzymano potwierdzenie ACK z pozytywnym komunikatem (po CET).Brak działań — ręczna + ACK po CET, OK.CCtool wysł.CCtool zwalid.Dokument prawidłowo wysłany ręcznie z poziomu CCM po CET. Nie otrzymano potwierdzenia ACK — upłynął czas CET.Postępowanie:Core CC Tool → sprawdź statusJeżeli:OK (Processed) → oznacz 'R' w CCM + zgłośbrak / awaria zwrotna → Awaria transportu plików (Connector 2.0). Zgłoś awarię. W międzyczasie wygeneruj plik w KreatorIDCF_CGMES i wyślij go ręcznie przez Core CC Tool (Manual Upload). pełny opis w bazie ryzykCCtool wysł.CCtool zwalid.Dokument oznaczony ręcznie jako wysłany prawidłowo do CCTool. Trwa oczekiwanie na ACK — około 2 min.Postępowanie:Czekaj 5 minOK → 'R' dla ACKCCtool wysł.CCtool zwalid.Dokument oznaczony ręcznie jako wysłany prawidłowo. Trwa oczekiwanie na ACK — upłynęło więcej niż 2 min.Postępowanie:Czekaj 5 minOK → 'R' dla ACKCCtool wysł.CCtool zwalid.Dokument oznaczony ręcznie jako wysłany prawidłowo. Nie otrzymano potwierdzenia ACK — upłynął czas CET.Postępowanie:Core CC Tool → sprawdź statusJeżeli:OK (Processed) → utrzymaj 'R'brak / awaria → Awaria transportu plików (Connector 2.0). Zgłoś awarię. W międzyczasie wygeneruj plik w KreatorIDCF_CGMES i wyślij go ręcznie przez Core CC Tool (Manual Upload). pełny opis w bazie ryzykCCtool wysł.CCtool zwalid.Wysłany dokument nie spełnia kryterium rozmiaru. ACK nie otrzymano, Dyspozytor ustawił status 'R' po weryfikacji w CCTool.Brak działań — Dyspozytor zatwierdził zawartość.CCtool wysł.CCtool zwalid.Dokument jeszcze nie został wysłany do CCTool, ACK nie napłynął. Plik nie wymagany (&gt;30 min do TET).Brak działań — czekaj do TET.CCtool wysł.CCtool zwalid.Zbliża się CET — plik niedostarczony lub błąd wysyłki. Stan alarmowy.Postępowanie (alarm):Core CC Tool → sprawdź czy plik dotarł do Core CC ToolJeżeli:plik jest, brak ACK → Plik został odrzucony — odczytaj kod błędu z potwierdzenia ACK i zareaguj zależnie od kodu:kod 20 (bramka dla pliku zamknięta) — zgłoś administratorowi Core CC Toolkod 21 (wersja nie jest wyższa niż już zapisana) — w źródle podnieś numer wersji i wyślij plik ponowniekod 30 (rozmiar pliku niezgodny) — pobierz poprawny plik i wyślij ponownie pełny opis w bazie ryzykbrak pliku (awaria Connector 2.0) → Awaria transportu plików (Connector 2.0). Zgłoś awarię. W międzyczasie wygeneruj plik w KreatorIDCF_CGMES i wyślij go ręcznie przez Core CC Tool (Manual Upload). pełny opis w bazie ryzykbrak pliku w źródle → Brak pliku lub wersji w aplikacji źródłowej. Otwórz KreatorIDCF_CGMES i wygeneruj plik ponownie (kolejna wersja); jeśli aplikacja nie działa — zgłoś. pełny opis w bazie ryzykCCtool wysł.CCtool zwalid.Wysłany dokument nie spełnia kryterium rozmiaru. Oczekiwanie na ACK — upłynęło więcej niż 2 min.Postępowanie:W aplikacji CCM kliknij plik lewym przyciskiem myszy → Informacje → sprawdź rozmiar; pobierz z MinIO i rozpakujJeżeli:zawartość OK mimo rozmiaru → oznacz 'R' (→ powiązany stan)zawartość niepoprawna → Plik został odrzucony — odczytaj kod błędu z potwierdzenia ACK i zareaguj zależnie od kodu:kod 20 (bramka dla pliku zamknięta) — zgłoś administratorowi Core CC Toolkod 21 (wersja nie jest wyższa niż już zapisana) — w źródle podnieś numer wersji i wyślij plik ponowniekod 30 (rozmiar pliku niezgodny) — pobierz poprawny plik i wyślij ponownie pełny opis w bazie ryzykCCtool wysł.CCtool zwalid.Wysłany dokument nie spełnia kryterium rozmiaru, a ACK ma status czerwony — typowo kod 30.Postępowanie:W aplikacji CCM kliknij plik lewym przyciskiem myszy → Informacje → potwierdź rozmiarWygeneruj poprawny plik w KreatorIDCF_CGMES (kolejna wersja) i opublikuj (Publikuj Connector) · szczegółowa procedura (ze screenami)Nadal za mały → zgłoś szczegóły w bazie ryzykCCtool wysł.CCtool zwalid.Wysłany dokument nie spełnia kryterium rozmiaru. ACK napłynął po CET z pozytywnym komunikatem. Sprzeczność.Postępowanie:Pobierz z MinIO → rozpakuj → sprawdź zawartośćJeżeli:zawartość OK → oznacz 'R' (→ powiązany stan); zgłośniepoprawna → zgłośCCtool wysł.CCtool zwalid.Dokument wysłany prawidłowo do CCTool, ale ACK negatywny (Rejected). Kody: 20/21/30.Postępowanie:Najedź kursorem na status i odczytaj kod ACKJeżeli:kod 20 (bramka dla pliku zamknięta) → zgłoś (administrator Core CC Tool otwiera bramkę); sprawdź proces IDx-AC-FORWARDINGkod 21 (wersja nie jest wyższa niż zapisana) → wygeneruj kolejną wersję w KreatorIDCF_CGMES i opublikuj (Publikuj Connector) · szczegółowa procedura (ze screenami)kod 30 (rozmiar pliku niezgodny) → wygeneruj ponownie w KreatorIDCF_CGMES i opublikuj (Publikuj Connector) · szczegółowa procedura (ze screenami)CCtool wysł.CCtool zwalid.Dokument wysłany prawidłowo, trwa oczekiwanie na ACK, który nie napłynął w zadanym czasie (&gt;2-3 min).Postępowanie:Czekaj 5 min → Core CC Tool (⚠ nie wysyłaj ponownie!)Jeżeli:Processed → oznacz 'R' + zgłośRejected → patrz stan kod ACKbrak wpisu → Awaria transportu plików (Connector 2.0). Zgłoś awarię. W międzyczasie wygeneruj plik w KreatorIDCF_CGMES i wyślij go ręcznie przez Core CC Tool (Manual Upload). pełny opis w bazie ryzykCCtool wysł.CCtool zwalid.Dokument wysłany prawidłowo, ACK nie napłynął do CET.Postępowanie:Core CC Tool → sprawdź statusJeżeli:Processed → oznacz 'R' + zgłoś (→ powiązany stan)Rejected → wyślij ponownie przez Core CC Tool (Manual Upload) "po CET"brak → Awaria transportu plików (Connector 2.0). Zgłoś awarię. W międzyczasie wygeneruj plik w KreatorIDCF_CGMES i wyślij go ręcznie przez Core CC Tool (Manual Upload). pełny opis w bazie ryzyk + powiadom RCCCCtool wysł.CCtool zwalid.Wysłany dokument nie spełnia kryterium rozmiaru. ACK nie napłynął do CET. Krytyczne.Postępowanie (KRYTYCZNE w C):Wygeneruj poprawny plik w KreatorIDCF_CGMES i opublikuj (Publikuj Connector) · szczegółowa procedura (ze screenami) "po CET" (jeśli bramka otwarta)Natychmiast: zgłoś + powiadom RCC szczegóły w bazie ryzykCCtool wysł.CCtool zwalid.Dokument zarejestrowany w CCTool po CET (wysyłka pozytywna), ale walidacja zakończona negatywnie — ACK Rejected po CET.Postępowanie (po CET):Najedź kursorem na status i odczytaj kod ACK (kontekst: rejestracja po CET)Jeżeli:kod 20 (bramka dla pliku zamknięta) → po CET bramka zamknięta → zgłoś + powiadom RCCkod 21 (wersja nie jest wyższa niż zapisana) → wygeneruj kolejną wersję w KreatorIDCF_CGMES i opublikuj (Publikuj Connector) · szczegółowa procedura (ze screenami) (jeśli bramka otwarta)kod 30 (rozmiar pliku niezgodny) → wygeneruj ponownie w KreatorIDCF_CGMES i opublikuj (Publikuj Connector) · szczegółowa procedura (ze screenami) (jeśli bramka otwarta)CCtool wysł.CCtool zwalid.Dokument zarejestrowany w CCTool po CET (wysyłka pozytywna), ale ACK walidacji nie napłynął — plik dostarczony, lecz niezwalidowany.Postępowanie (po CET):Core CC Tool → sprawdź status walidacji (plik dostarczony po CET)Jeżeli:Processed → oznacz 'R' w CCM + zgłośRejected → postępuj jak w Stanie 30 (odczytaj kod ACK)brak wpisu → Awaria transportu plików (Connector 2.0). Zgłoś awarię. W międzyczasie wygeneruj plik w KreatorIDCF_CGMES i wyślij go ręcznie przez Core CC Tool (Manual Upload). pełny opis w bazie ryzyk + powiadom RCCCCtool wysł.CCtool zwalid.Dokument nie został dostarczony do CCTool, ACK nie napłynął. Minął czas CET. KRYTYCZNE — po CET dograć nie można.Postępowanie (KRYTYCZNE — brak naprawy):Telefon do RCC + zgłoś (priorytet P1)Po CET — brak naprawy. Diagnoza przyczyn: Kreator · Connector 2.0 · Core CC Tool szczegóły w bazie ryzyk</w:t>
+      </w:r>
+    </w:p>
+    <w:p>
       <w:pPr>
         <w:pStyle w:val="Heading4"/>
       </w:pPr>
@@ -15123,6 +16265,16 @@
       </w:r>
     </w:p>
     <w:p>
+      <w:r>
+        <w:t>Warianty stanów (8)</w:t>
+      </w:r>
+    </w:p>
+    <w:p>
+      <w:r>
+        <w:t>Status kafelkaSytuacjaDziałania awaryjneMinIOPlik dostarczony prawidłowo na MinIO — status pozytywny.Brak działań — proces poprawny.MinIOStatus nadany ręcznie literą 'R' przez Dyspozytora po weryfikacji.Brak działań — decyzja ręczna Dyspozytora.MinIOPlik dostarczony po CET — status pozytywny.Brak działań — dostarczone po CET, OK.MinIOPrzedwczesne (&gt;30 min do TET) — plik jeszcze niewymagany.Monitoring — czekaj do TET.MinIOOczekiwanie / transfer w toku (stan przejściowy).Czekaj 5 min → sprawdź MinIO. Gdy brak → pobierz/wygeneruj plik ręcznie ze źródła i wgraj przez Manual Upload (GUI Core CC Tool) / wyślij z CCM.MinIOZbliża się TET — pliku jeszcze nie ma na MinIO.Sprawdź źródło (Kreator / Perun4V / Core CC Tool). Gdy brak → pobierz/wygeneruj plik ręcznie ze źródła i wgraj przez Manual Upload (GUI Core CC Tool) / wyślij z CCM.MinIOZbliża się CET / błąd dostarczenia — brak pliku na MinIO.Gdy pliku NIE ma na MinIO → pobierz/wygeneruj plik ręcznie ze źródła i wgraj przez Manual Upload (GUI Core CC Tool) / wyślij z CCM.MinIOMinął CET — plik niedostarczony. Krytyczne.Zgłoś (CIZ/WPO/PSE-I). Po CET — postępowanie krytyczne (brak lokalnego fallbacku).</w:t>
+      </w:r>
+    </w:p>
+    <w:p>
       <w:pPr>
         <w:pStyle w:val="Heading4"/>
       </w:pPr>
@@ -15184,6 +16336,16 @@
       </w:r>
     </w:p>
     <w:p>
+      <w:r>
+        <w:t>Warianty stanów (8)</w:t>
+      </w:r>
+    </w:p>
+    <w:p>
+      <w:r>
+        <w:t>Status kafelkaSytuacjaDziałania awaryjneMinIOPlik dostarczony prawidłowo na MinIO — status pozytywny.Brak działań — proces poprawny.MinIOStatus nadany ręcznie literą 'R' przez Dyspozytora po weryfikacji.Brak działań — decyzja ręczna Dyspozytora.MinIOPlik dostarczony po CET — status pozytywny.Brak działań — dostarczone po CET, OK.MinIOPrzedwczesne (&gt;30 min do TET) — plik jeszcze niewymagany.Monitoring — czekaj do TET.MinIOOczekiwanie / transfer w toku (stan przejściowy).Czekaj 5 min → sprawdź MinIO. Gdy brak → pobierz/wygeneruj plik ręcznie ze źródła i wgraj przez Manual Upload (GUI Core CC Tool) / wyślij z CCM.MinIOZbliża się TET — pliku jeszcze nie ma na MinIO.Sprawdź źródło (Kreator / Perun4V / Core CC Tool). Gdy brak → pobierz/wygeneruj plik ręcznie ze źródła i wgraj przez Manual Upload (GUI Core CC Tool) / wyślij z CCM.MinIOZbliża się CET / błąd dostarczenia — brak pliku na MinIO.Gdy pliku NIE ma na MinIO → pobierz/wygeneruj plik ręcznie ze źródła i wgraj przez Manual Upload (GUI Core CC Tool) / wyślij z CCM.MinIOMinął CET — plik niedostarczony. Krytyczne.Zgłoś (CIZ/WPO/PSE-I). Po CET — postępowanie krytyczne (brak lokalnego fallbacku).</w:t>
+      </w:r>
+    </w:p>
+    <w:p>
       <w:pPr>
         <w:pStyle w:val="Heading4"/>
       </w:pPr>
@@ -15270,6 +16432,16 @@
       </w:r>
     </w:p>
     <w:p>
+      <w:r>
+        <w:t>Warianty stanów (32)</w:t>
+      </w:r>
+    </w:p>
+    <w:p>
+      <w:r>
+        <w:t>Status kafelkaSytuacjaDziałania awaryjneCCtool wysł.CCtool zwalid.Dokument wysłany prawidłowo do CCTool, otrzymano potwierdzenie ACK z pozytywnym komunikatem.Brak działań — proces poprawny.CCtool wysł.CCtool zwalid.Dokument wysłany prawidłowo do CCTool. Dyspozytor ustawił status ręcznie 'R' po weryfikacji w CCTool.Brak działań.CCtool wysł.CCtool zwalid.Dokument wysłany prawidłowo do CCTool po CET, ACK napłynął po CET z pozytywnym komunikatem.Brak działań — dostarczone po CET, OK.CCtool wysł.CCtool zwalid.Dokument oznaczony ręcznie jako wysłany prawidłowo do CCTool oraz otrzymanie potwierdzenia ACK.Brak działań.CCtool wysł.CCtool zwalid.Dokument prawidłowo wysłany ręcznie z poziomu CCM. Otrzymano potwierdzenie ACK z pozytywnym komunikatem.Brak działań — wysyłka ręczna wykonana.CCtool wysł.CCtool zwalid.Dokument prawidłowo wysłany ręcznie z poziomu CCM. Trwa oczekiwanie na potwierdzenie ACK — około 2 min.Postępowanie:Czekaj 5 minOK → ustaw 'R' w CCMCCtool wysł.CCtool zwalid.Dokument wysłany ręcznie z poziomu CCM, ale ACK nie napłynął w żądanym czasie i zbliża się CET.Postępowanie:Core CC Tool → sprawdź czy plik dotarł (Message Viewer)Jeżeli:OK → oznacz 'R' w CCMbłąd → Plik został odrzucony — odczytaj kod błędu z potwierdzenia ACK i zareaguj zależnie od kodu:kod 20 (bramka dla pliku zamknięta) — zgłoś administratorowi Core CC Toolkod 21 (wersja nie jest wyższa niż już zapisana) — w źródle podnieś numer wersji i wyślij plik ponowniekod 30 (rozmiar pliku niezgodny) — pobierz poprawny plik i wyślij ponownie pełny opis w bazie ryzykbrak → Awaria transportu plików (Connector 2.0). Zgłoś awarię. W międzyczasie wygeneruj plik w KreatorIDCF_CGMES i wyślij go ręcznie przez Core CC Tool (Manual Upload). pełny opis w bazie ryzykCCtool wysł.CCtool zwalid.Dokument wysłany ręcznie z poziomu CCM, a otrzymane ACK: (1) zawiera komunikat błędu (najedź kursorem); (2) proces zakończył się błędem — 'Błąd procesu'.Postępowanie:Najedź kursorem na status i odczytaj kod ACKJeżeli:kod 20 (bramka dla pliku zamknięta) → zgłoś administratorowi Core CC Toolkod 21 (wersja nie jest wyższa niż zapisana) → wygeneruj kolejną wersję w KreatorIDCF_CGMES i opublikuj (Publikuj Connector) · szczegółowa procedura (ze screenami)kod 30 (rozmiar pliku niezgodny) → wygeneruj ponownie w KreatorIDCF_CGMES i opublikuj (Publikuj Connector) · szczegółowa procedura (ze screenami)CCtool wysł.CCtool zwalid.Dokument prawidłowo wysłany ręcznie z poziomu CCM. Otrzymano potwierdzenie ACK z pozytywnym komunikatem po CET.Brak działań — ręczna + ACK po CET, OK.CCtool wysł.CCtool zwalid.Dokument prawidłowo wysłany ręcznie z poziomu CCM. Nie otrzymano potwierdzenia ACK — upłynął czas CET.Postępowanie:Core CC Tool → sprawdź statusJeżeli:OK (Processed) → oznacz 'R' w CCM + zgłośbrak / awaria zwrotna → Awaria transportu plików (Connector 2.0). Zgłoś awarię. W międzyczasie wygeneruj plik w KreatorIDCF_CGMES i wyślij go ręcznie przez Core CC Tool (Manual Upload). pełny opis w bazie ryzykCCtool wysł.CCtool zwalid.Dokument prawidłowo wysłany ręcznie z poziomu CCM. Nie otrzymano ACK, Dyspozytor ustawił status 'R' po weryfikacji w CCTool.Brak działań — decyzja ręczna Dyspozytora.CCtool wysł.CCtool zwalid.Dokument prawidłowo wysłany ręcznie z poziomu CCM po CET. Trwa oczekiwanie na potwierdzenie ACK — około 2 min.Postępowanie:Czekaj 2-5 minOK → ustaw 'R'CCtool wysł.CCtool zwalid.Dokument wysłany ręcznie z poziomu CCM po CET. Trwa oczekiwanie na potwierdzenie ACK — upłynęło więcej niż 2 minuty.Postępowanie:Core CC Tool → sprawdź czy plik dotarł (Message Viewer)Jeżeli:OK → oznacz 'R' w CCMbłąd → Plik został odrzucony — odczytaj kod błędu z potwierdzenia ACK i zareaguj zależnie od kodu:kod 20 (bramka dla pliku zamknięta) — zgłoś administratorowi Core CC Toolkod 21 (wersja nie jest wyższa niż już zapisana) — w źródle podnieś numer wersji i wyślij plik ponowniekod 30 (rozmiar pliku niezgodny) — pobierz poprawny plik i wyślij ponownie pełny opis w bazie ryzykbrak → Awaria transportu plików (Connector 2.0). Zgłoś awarię. W międzyczasie wygeneruj plik w KreatorIDCF_CGMES i wyślij go ręcznie przez Core CC Tool (Manual Upload). pełny opis w bazie ryzykCCtool wysł.CCtool zwalid.Dokument wysłany ręcznie z poziomu CCM po CET, a otrzymane ACK: (1) komunikat błędu; (2) proces zakończył się błędem. Typowo kod 20 gateClosed.Postępowanie:Najedź kursorem na status i odczytaj kod ACK (typowo kod 20)Jeżeli:kod 20 (bramka dla pliku zamknięta) → po CET bramka jest zamknięta → zgłośinny kod → Plik został odrzucony — odczytaj kod błędu z potwierdzenia ACK i zareaguj zależnie od kodu:kod 20 (bramka dla pliku zamknięta) — zgłoś administratorowi Core CC Toolkod 21 (wersja nie jest wyższa niż już zapisana) — w źródle podnieś numer wersji i wyślij plik ponowniekod 30 (rozmiar pliku niezgodny) — pobierz poprawny plik i wyślij ponownie pełny opis w bazie ryzykCCtool wysł.CCtool zwalid.Dokument prawidłowo wysłany ręcznie z poziomu CCM po CET. Otrzymano potwierdzenie ACK z pozytywnym komunikatem (po CET).Brak działań — ręczna + ACK po CET, OK.CCtool wysł.CCtool zwalid.Dokument prawidłowo wysłany ręcznie z poziomu CCM po CET. Nie otrzymano potwierdzenia ACK — upłynął czas CET.Postępowanie:Core CC Tool → sprawdź statusJeżeli:OK (Processed) → oznacz 'R' w CCM + zgłośbrak / awaria zwrotna → Awaria transportu plików (Connector 2.0). Zgłoś awarię. W międzyczasie wygeneruj plik w KreatorIDCF_CGMES i wyślij go ręcznie przez Core CC Tool (Manual Upload). pełny opis w bazie ryzykCCtool wysł.CCtool zwalid.Dokument oznaczony ręcznie jako wysłany prawidłowo do CCTool. Trwa oczekiwanie na ACK — około 2 min.Postępowanie:Czekaj 5 minOK → 'R' dla ACKCCtool wysł.CCtool zwalid.Dokument oznaczony ręcznie jako wysłany prawidłowo. Trwa oczekiwanie na ACK — upłynęło więcej niż 2 min.Postępowanie:Czekaj 5 minOK → 'R' dla ACKCCtool wysł.CCtool zwalid.Dokument oznaczony ręcznie jako wysłany prawidłowo. Nie otrzymano potwierdzenia ACK — upłynął czas CET.Postępowanie:Core CC Tool → sprawdź statusJeżeli:OK (Processed) → utrzymaj 'R'brak / awaria → Awaria transportu plików (Connector 2.0). Zgłoś awarię. W międzyczasie wygeneruj plik w KreatorIDCF_CGMES i wyślij go ręcznie przez Core CC Tool (Manual Upload). pełny opis w bazie ryzykCCtool wysł.CCtool zwalid.Wysłany dokument nie spełnia kryterium rozmiaru. ACK nie otrzymano, Dyspozytor ustawił status 'R' po weryfikacji w CCTool.Brak działań — Dyspozytor zatwierdził zawartość.CCtool wysł.CCtool zwalid.Dokument jeszcze nie został wysłany do CCTool, ACK nie napłynął. Plik nie wymagany (&gt;30 min do TET).Brak działań — czekaj do TET.CCtool wysł.CCtool zwalid.Zbliża się CET — plik niedostarczony lub błąd wysyłki. Stan alarmowy.Postępowanie (alarm):Core CC Tool → sprawdź czy plik dotarł do Core CC ToolJeżeli:plik jest, brak ACK → Plik został odrzucony — odczytaj kod błędu z potwierdzenia ACK i zareaguj zależnie od kodu:kod 20 (bramka dla pliku zamknięta) — zgłoś administratorowi Core CC Toolkod 21 (wersja nie jest wyższa niż już zapisana) — w źródle podnieś numer wersji i wyślij plik ponowniekod 30 (rozmiar pliku niezgodny) — pobierz poprawny plik i wyślij ponownie pełny opis w bazie ryzykbrak pliku (awaria Connector 2.0) → Awaria transportu plików (Connector 2.0). Zgłoś awarię. W międzyczasie wygeneruj plik w KreatorIDCF_CGMES i wyślij go ręcznie przez Core CC Tool (Manual Upload). pełny opis w bazie ryzykbrak pliku w źródle → Brak pliku lub wersji w aplikacji źródłowej. Otwórz KreatorIDCF_CGMES i wygeneruj plik ponownie (kolejna wersja); jeśli aplikacja nie działa — zgłoś. pełny opis w bazie ryzykCCtool wysł.CCtool zwalid.Wysłany dokument nie spełnia kryterium rozmiaru. Oczekiwanie na ACK — upłynęło więcej niż 2 min.Postępowanie:W aplikacji CCM kliknij plik lewym przyciskiem myszy → Informacje → sprawdź rozmiar; pobierz z MinIO i rozpakujJeżeli:zawartość OK mimo rozmiaru → oznacz 'R' (→ powiązany stan)zawartość niepoprawna → Plik został odrzucony — odczytaj kod błędu z potwierdzenia ACK i zareaguj zależnie od kodu:kod 20 (bramka dla pliku zamknięta) — zgłoś administratorowi Core CC Toolkod 21 (wersja nie jest wyższa niż już zapisana) — w źródle podnieś numer wersji i wyślij plik ponowniekod 30 (rozmiar pliku niezgodny) — pobierz poprawny plik i wyślij ponownie pełny opis w bazie ryzykCCtool wysł.CCtool zwalid.Wysłany dokument nie spełnia kryterium rozmiaru, a ACK ma status czerwony — typowo kod 30.Postępowanie:W aplikacji CCM kliknij plik lewym przyciskiem myszy → Informacje → potwierdź rozmiarWygeneruj poprawny plik w KreatorIDCF_CGMES (kolejna wersja) i opublikuj (Publikuj Connector) · szczegółowa procedura (ze screenami)Nadal za mały → zgłoś szczegóły w bazie ryzykCCtool wysł.CCtool zwalid.Wysłany dokument nie spełnia kryterium rozmiaru. ACK napłynął po CET z pozytywnym komunikatem. Sprzeczność.Postępowanie:Pobierz z MinIO → rozpakuj → sprawdź zawartośćJeżeli:zawartość OK → oznacz 'R' (→ powiązany stan); zgłośniepoprawna → zgłośCCtool wysł.CCtool zwalid.Dokument wysłany prawidłowo do CCTool, ale ACK negatywny (Rejected). Kody: 20/21/30.Postępowanie:Najedź kursorem na status i odczytaj kod ACKJeżeli:kod 20 (bramka dla pliku zamknięta) → zgłoś (administrator Core CC Tool otwiera bramkę); sprawdź proces IDx-AC-FORWARDINGkod 21 (wersja nie jest wyższa niż zapisana) → wygeneruj kolejną wersję w KreatorIDCF_CGMES i opublikuj (Publikuj Connector) · szczegółowa procedura (ze screenami)kod 30 (rozmiar pliku niezgodny) → wygeneruj ponownie w KreatorIDCF_CGMES i opublikuj (Publikuj Connector) · szczegółowa procedura (ze screenami)CCtool wysł.CCtool zwalid.Dokument wysłany prawidłowo, trwa oczekiwanie na ACK, który nie napłynął w zadanym czasie (&gt;2-3 min).Postępowanie:Czekaj 5 min → Core CC Tool (⚠ nie wysyłaj ponownie!)Jeżeli:Processed → oznacz 'R' + zgłośRejected → patrz stan kod ACKbrak wpisu → Awaria transportu plików (Connector 2.0). Zgłoś awarię. W międzyczasie wygeneruj plik w KreatorIDCF_CGMES i wyślij go ręcznie przez Core CC Tool (Manual Upload). pełny opis w bazie ryzykCCtool wysł.CCtool zwalid.Dokument wysłany prawidłowo, ACK nie napłynął do CET.Postępowanie:Core CC Tool → sprawdź statusJeżeli:Processed → oznacz 'R' + zgłoś (→ powiązany stan)Rejected → wyślij ponownie przez Core CC Tool (Manual Upload) "po CET"brak → Awaria transportu plików (Connector 2.0). Zgłoś awarię. W międzyczasie wygeneruj plik w KreatorIDCF_CGMES i wyślij go ręcznie przez Core CC Tool (Manual Upload). pełny opis w bazie ryzyk + powiadom RCCCCtool wysł.CCtool zwalid.Wysłany dokument nie spełnia kryterium rozmiaru. ACK nie napłynął do CET. Krytyczne.Postępowanie (KRYTYCZNE w C):Wygeneruj poprawny plik w KreatorIDCF_CGMES i opublikuj (Publikuj Connector) · szczegółowa procedura (ze screenami) "po CET" (jeśli bramka otwarta)Natychmiast: zgłoś + powiadom RCC szczegóły w bazie ryzykCCtool wysł.CCtool zwalid.Dokument zarejestrowany w CCTool po CET (wysyłka pozytywna), ale walidacja zakończona negatywnie — ACK Rejected po CET.Postępowanie (po CET):Najedź kursorem na status i odczytaj kod ACK (kontekst: rejestracja po CET)Jeżeli:kod 20 (bramka dla pliku zamknięta) → po CET bramka zamknięta → zgłoś + powiadom RCCkod 21 (wersja nie jest wyższa niż zapisana) → wygeneruj kolejną wersję w KreatorIDCF_CGMES i opublikuj (Publikuj Connector) · szczegółowa procedura (ze screenami) (jeśli bramka otwarta)kod 30 (rozmiar pliku niezgodny) → wygeneruj ponownie w KreatorIDCF_CGMES i opublikuj (Publikuj Connector) · szczegółowa procedura (ze screenami) (jeśli bramka otwarta)CCtool wysł.CCtool zwalid.Dokument zarejestrowany w CCTool po CET (wysyłka pozytywna), ale ACK walidacji nie napłynął — plik dostarczony, lecz niezwalidowany.Postępowanie (po CET):Core CC Tool → sprawdź status walidacji (plik dostarczony po CET)Jeżeli:Processed → oznacz 'R' w CCM + zgłośRejected → postępuj jak w Stanie 30 (odczytaj kod ACK)brak wpisu → Awaria transportu plików (Connector 2.0). Zgłoś awarię. W międzyczasie wygeneruj plik w KreatorIDCF_CGMES i wyślij go ręcznie przez Core CC Tool (Manual Upload). pełny opis w bazie ryzyk + powiadom RCCCCtool wysł.CCtool zwalid.Dokument nie został dostarczony do CCTool, ACK nie napłynął. Minął czas CET. KRYTYCZNE — po CET dograć nie można.Postępowanie (KRYTYCZNE — brak naprawy):Telefon do RCC + zgłoś (priorytet P1)Po CET — brak naprawy. Diagnoza przyczyn: Kreator · Connector 2.0 · Core CC Tool szczegóły w bazie ryzyk</w:t>
+      </w:r>
+    </w:p>
+    <w:p>
       <w:pPr>
         <w:pStyle w:val="Heading4"/>
       </w:pPr>
@@ -15331,6 +16503,16 @@
       </w:r>
     </w:p>
     <w:p>
+      <w:r>
+        <w:t>Warianty stanów (8)</w:t>
+      </w:r>
+    </w:p>
+    <w:p>
+      <w:r>
+        <w:t>Status kafelkaSytuacjaDziałania awaryjneMinIOPlik dostarczony prawidłowo na MinIO — status pozytywny.Brak działań — proces poprawny.MinIOStatus nadany ręcznie literą 'R' przez Dyspozytora po weryfikacji.Brak działań — decyzja ręczna Dyspozytora.MinIOPlik dostarczony po CET — status pozytywny.Brak działań — dostarczone po CET, OK.MinIOPrzedwczesne (&gt;30 min do TET) — plik jeszcze niewymagany.Monitoring — czekaj do TET.MinIOOczekiwanie / transfer w toku (stan przejściowy).Czekaj 5 min → sprawdź MinIO. Gdy brak → pobierz/wygeneruj plik ręcznie ze źródła i wgraj przez Manual Upload (GUI Core CC Tool) / wyślij z CCM.MinIOZbliża się TET — pliku jeszcze nie ma na MinIO.Sprawdź źródło (Kreator / Perun4V / Core CC Tool). Gdy brak → pobierz/wygeneruj plik ręcznie ze źródła i wgraj przez Manual Upload (GUI Core CC Tool) / wyślij z CCM.MinIOZbliża się CET / błąd dostarczenia — brak pliku na MinIO.Gdy pliku NIE ma na MinIO → pobierz/wygeneruj plik ręcznie ze źródła i wgraj przez Manual Upload (GUI Core CC Tool) / wyślij z CCM.MinIOMinął CET — plik niedostarczony. Krytyczne.Zgłoś (CIZ/WPO/PSE-I). Po CET — postępowanie krytyczne (brak lokalnego fallbacku).</w:t>
+      </w:r>
+    </w:p>
+    <w:p>
       <w:pPr>
         <w:pStyle w:val="Heading4"/>
       </w:pPr>
@@ -15392,6 +16574,16 @@
       </w:r>
     </w:p>
     <w:p>
+      <w:r>
+        <w:t>Warianty stanów (8)</w:t>
+      </w:r>
+    </w:p>
+    <w:p>
+      <w:r>
+        <w:t>Status kafelkaSytuacjaDziałania awaryjneMinIOPlik dostarczony prawidłowo na MinIO — status pozytywny.Brak działań — proces poprawny.MinIOStatus nadany ręcznie literą 'R' przez Dyspozytora po weryfikacji.Brak działań — decyzja ręczna Dyspozytora.MinIOPlik dostarczony po CET — status pozytywny.Brak działań — dostarczone po CET, OK.MinIOPrzedwczesne (&gt;30 min do TET) — plik jeszcze niewymagany.Monitoring — czekaj do TET.MinIOOczekiwanie / transfer w toku (stan przejściowy).Czekaj 5 min → sprawdź MinIO. Gdy brak → pobierz/wygeneruj plik ręcznie ze źródła i wgraj przez Manual Upload (GUI Core CC Tool) / wyślij z CCM.MinIOZbliża się TET — pliku jeszcze nie ma na MinIO.Sprawdź źródło (Kreator / Perun4V / Core CC Tool). Gdy brak → pobierz/wygeneruj plik ręcznie ze źródła i wgraj przez Manual Upload (GUI Core CC Tool) / wyślij z CCM.MinIOZbliża się CET / błąd dostarczenia — brak pliku na MinIO.Gdy pliku NIE ma na MinIO → pobierz/wygeneruj plik ręcznie ze źródła i wgraj przez Manual Upload (GUI Core CC Tool) / wyślij z CCM.MinIOMinął CET — plik niedostarczony. Krytyczne.Zgłoś (CIZ/WPO/PSE-I). Po CET — postępowanie krytyczne (brak lokalnego fallbacku).</w:t>
+      </w:r>
+    </w:p>
+    <w:p>
       <w:pPr>
         <w:pStyle w:val="Heading4"/>
       </w:pPr>
@@ -15453,6 +16645,16 @@
       </w:r>
     </w:p>
     <w:p>
+      <w:r>
+        <w:t>Warianty stanów (8)</w:t>
+      </w:r>
+    </w:p>
+    <w:p>
+      <w:r>
+        <w:t>Status kafelkaSytuacjaDziałania awaryjneMinIOPlik dostarczony prawidłowo na MinIO — status pozytywny.Brak działań — proces poprawny.MinIOStatus nadany ręcznie literą 'R' przez Dyspozytora po weryfikacji.Brak działań — decyzja ręczna Dyspozytora.MinIOPlik dostarczony po CET — status pozytywny.Brak działań — dostarczone po CET, OK.MinIOPrzedwczesne (&gt;30 min do TET) — plik jeszcze niewymagany.Monitoring — czekaj do TET.MinIOOczekiwanie / transfer w toku (stan przejściowy).Czekaj 5 min → sprawdź MinIO. Gdy brak → pobierz/wygeneruj plik ręcznie ze źródła i wgraj przez Manual Upload (GUI Core CC Tool) / wyślij z CCM.MinIOZbliża się TET — pliku jeszcze nie ma na MinIO.Sprawdź źródło (Kreator / Perun4V / Core CC Tool). Gdy brak → pobierz/wygeneruj plik ręcznie ze źródła i wgraj przez Manual Upload (GUI Core CC Tool) / wyślij z CCM.MinIOZbliża się CET / błąd dostarczenia — brak pliku na MinIO.Gdy pliku NIE ma na MinIO → pobierz/wygeneruj plik ręcznie ze źródła i wgraj przez Manual Upload (GUI Core CC Tool) / wyślij z CCM.MinIOMinął CET — plik niedostarczony. Krytyczne.Zgłoś (CIZ/WPO/PSE-I). Po CET — postępowanie krytyczne (brak lokalnego fallbacku).</w:t>
+      </w:r>
+    </w:p>
+    <w:p>
       <w:pPr>
         <w:pStyle w:val="Heading4"/>
       </w:pPr>
@@ -15514,6 +16716,16 @@
       </w:r>
     </w:p>
     <w:p>
+      <w:r>
+        <w:t>Warianty stanów (8)</w:t>
+      </w:r>
+    </w:p>
+    <w:p>
+      <w:r>
+        <w:t>Status kafelkaSytuacjaDziałania awaryjneMinIOPlik dostarczony prawidłowo na MinIO — status pozytywny.Brak działań — proces poprawny.MinIOStatus nadany ręcznie literą 'R' przez Dyspozytora po weryfikacji.Brak działań — decyzja ręczna Dyspozytora.MinIOPlik dostarczony po CET — status pozytywny.Brak działań — dostarczone po CET, OK.MinIOPrzedwczesne (&gt;30 min do TET) — plik jeszcze niewymagany.Monitoring — czekaj do TET.MinIOOczekiwanie / transfer w toku (stan przejściowy).Czekaj 5 min → sprawdź MinIO. Gdy brak → pobierz/wygeneruj plik ręcznie ze źródła i wgraj przez Manual Upload (GUI Core CC Tool) / wyślij z CCM.MinIOZbliża się TET — pliku jeszcze nie ma na MinIO.Sprawdź źródło (Kreator / Perun4V / Core CC Tool). Gdy brak → pobierz/wygeneruj plik ręcznie ze źródła i wgraj przez Manual Upload (GUI Core CC Tool) / wyślij z CCM.MinIOZbliża się CET / błąd dostarczenia — brak pliku na MinIO.Gdy pliku NIE ma na MinIO → pobierz/wygeneruj plik ręcznie ze źródła i wgraj przez Manual Upload (GUI Core CC Tool) / wyślij z CCM.MinIOMinął CET — plik niedostarczony. Krytyczne.Zgłoś (CIZ/WPO/PSE-I). Po CET — postępowanie krytyczne (brak lokalnego fallbacku).</w:t>
+      </w:r>
+    </w:p>
+    <w:p>
       <w:pPr>
         <w:pStyle w:val="Heading4"/>
       </w:pPr>
@@ -15575,6 +16787,16 @@
       </w:r>
     </w:p>
     <w:p>
+      <w:r>
+        <w:t>Warianty stanów (8)</w:t>
+      </w:r>
+    </w:p>
+    <w:p>
+      <w:r>
+        <w:t>Status kafelkaSytuacjaDziałania awaryjneMinIOPlik dostarczony prawidłowo na MinIO — status pozytywny.Brak działań — proces poprawny.MinIOStatus nadany ręcznie literą 'R' przez Dyspozytora po weryfikacji.Brak działań — decyzja ręczna Dyspozytora.MinIOPlik dostarczony po CET — status pozytywny.Brak działań — dostarczone po CET, OK.MinIOPrzedwczesne (&gt;30 min do TET) — plik jeszcze niewymagany.Monitoring — czekaj do TET.MinIOOczekiwanie / transfer w toku (stan przejściowy).Czekaj 5 min → sprawdź MinIO. Gdy brak → pobierz/wygeneruj plik ręcznie ze źródła i wgraj przez Manual Upload (GUI Core CC Tool) / wyślij z CCM.MinIOZbliża się TET — pliku jeszcze nie ma na MinIO.Sprawdź źródło (Kreator / Perun4V / Core CC Tool). Gdy brak → pobierz/wygeneruj plik ręcznie ze źródła i wgraj przez Manual Upload (GUI Core CC Tool) / wyślij z CCM.MinIOZbliża się CET / błąd dostarczenia — brak pliku na MinIO.Gdy pliku NIE ma na MinIO → pobierz/wygeneruj plik ręcznie ze źródła i wgraj przez Manual Upload (GUI Core CC Tool) / wyślij z CCM.MinIOMinął CET — plik niedostarczony. Krytyczne.Zgłoś (CIZ/WPO/PSE-I). Po CET — postępowanie krytyczne (brak lokalnego fallbacku).</w:t>
+      </w:r>
+    </w:p>
+    <w:p>
       <w:pPr>
         <w:pStyle w:val="Heading4"/>
       </w:pPr>
@@ -15636,6 +16858,16 @@
       </w:r>
     </w:p>
     <w:p>
+      <w:r>
+        <w:t>Warianty stanów (8)</w:t>
+      </w:r>
+    </w:p>
+    <w:p>
+      <w:r>
+        <w:t>Status kafelkaSytuacjaDziałania awaryjneMinIOPlik dostarczony prawidłowo na MinIO — status pozytywny.Brak działań — proces poprawny.MinIOStatus nadany ręcznie literą 'R' przez Dyspozytora po weryfikacji.Brak działań — decyzja ręczna Dyspozytora.MinIOPlik dostarczony po CET — status pozytywny.Brak działań — dostarczone po CET, OK.MinIOPrzedwczesne (&gt;30 min do TET) — plik jeszcze niewymagany.Monitoring — czekaj do TET.MinIOOczekiwanie / transfer w toku (stan przejściowy).Czekaj 5 min → sprawdź MinIO. Gdy brak → pobierz/wygeneruj plik ręcznie ze źródła i wgraj przez Manual Upload (GUI Core CC Tool) / wyślij z CCM.MinIOZbliża się TET — pliku jeszcze nie ma na MinIO.Sprawdź źródło (Kreator / Perun4V / Core CC Tool). Gdy brak → pobierz/wygeneruj plik ręcznie ze źródła i wgraj przez Manual Upload (GUI Core CC Tool) / wyślij z CCM.MinIOZbliża się CET / błąd dostarczenia — brak pliku na MinIO.Gdy pliku NIE ma na MinIO → pobierz/wygeneruj plik ręcznie ze źródła i wgraj przez Manual Upload (GUI Core CC Tool) / wyślij z CCM.MinIOMinął CET — plik niedostarczony. Krytyczne.Zgłoś (CIZ/WPO/PSE-I). Po CET — postępowanie krytyczne (brak lokalnego fallbacku).</w:t>
+      </w:r>
+    </w:p>
+    <w:p>
       <w:pPr>
         <w:pStyle w:val="Heading4"/>
       </w:pPr>
@@ -15697,6 +16929,16 @@
       </w:r>
     </w:p>
     <w:p>
+      <w:r>
+        <w:t>Warianty stanów (8)</w:t>
+      </w:r>
+    </w:p>
+    <w:p>
+      <w:r>
+        <w:t>Status kafelkaSytuacjaDziałania awaryjneMinIOPlik dostarczony prawidłowo na MinIO — status pozytywny.Brak działań — proces poprawny.MinIOStatus nadany ręcznie literą 'R' przez Dyspozytora po weryfikacji.Brak działań — decyzja ręczna Dyspozytora.MinIOPlik dostarczony po CET — status pozytywny.Brak działań — dostarczone po CET, OK.MinIOPrzedwczesne (&gt;30 min do TET) — plik jeszcze niewymagany.Monitoring — czekaj do TET.MinIOOczekiwanie / transfer w toku (stan przejściowy).Czekaj 5 min → sprawdź MinIO. Gdy brak → pobierz/wygeneruj plik ręcznie ze źródła i wgraj przez Manual Upload (GUI Core CC Tool) / wyślij z CCM.MinIOZbliża się TET — pliku jeszcze nie ma na MinIO.Sprawdź źródło (Kreator / Perun4V / Core CC Tool). Gdy brak → pobierz/wygeneruj plik ręcznie ze źródła i wgraj przez Manual Upload (GUI Core CC Tool) / wyślij z CCM.MinIOZbliża się CET / błąd dostarczenia — brak pliku na MinIO.Gdy pliku NIE ma na MinIO → pobierz/wygeneruj plik ręcznie ze źródła i wgraj przez Manual Upload (GUI Core CC Tool) / wyślij z CCM.MinIOMinął CET — plik niedostarczony. Krytyczne.Zgłoś (CIZ/WPO/PSE-I). Po CET — postępowanie krytyczne (brak lokalnego fallbacku).</w:t>
+      </w:r>
+    </w:p>
+    <w:p>
       <w:pPr>
         <w:pStyle w:val="Heading4"/>
       </w:pPr>
@@ -15758,6 +17000,16 @@
       </w:r>
     </w:p>
     <w:p>
+      <w:r>
+        <w:t>Warianty stanów (8)</w:t>
+      </w:r>
+    </w:p>
+    <w:p>
+      <w:r>
+        <w:t>Status kafelkaSytuacjaDziałania awaryjneMinIOPlik dostarczony prawidłowo na MinIO — status pozytywny.Brak działań — proces poprawny.MinIOStatus nadany ręcznie literą 'R' przez Dyspozytora po weryfikacji.Brak działań — decyzja ręczna Dyspozytora.MinIOPlik dostarczony po CET — status pozytywny.Brak działań — dostarczone po CET, OK.MinIOPrzedwczesne (&gt;30 min do TET) — plik jeszcze niewymagany.Monitoring — czekaj do TET.MinIOOczekiwanie / transfer w toku (stan przejściowy).Czekaj 5 min → sprawdź MinIO. Gdy brak → pobierz/wygeneruj plik ręcznie ze źródła i wgraj przez Manual Upload (GUI Core CC Tool) / wyślij z CCM.MinIOZbliża się TET — pliku jeszcze nie ma na MinIO.Sprawdź źródło (Kreator / Perun4V / Core CC Tool). Gdy brak → pobierz/wygeneruj plik ręcznie ze źródła i wgraj przez Manual Upload (GUI Core CC Tool) / wyślij z CCM.MinIOZbliża się CET / błąd dostarczenia — brak pliku na MinIO.Gdy pliku NIE ma na MinIO → pobierz/wygeneruj plik ręcznie ze źródła i wgraj przez Manual Upload (GUI Core CC Tool) / wyślij z CCM.MinIOMinął CET — plik niedostarczony. Krytyczne.Zgłoś (CIZ/WPO/PSE-I). Po CET — postępowanie krytyczne (brak lokalnego fallbacku).</w:t>
+      </w:r>
+    </w:p>
+    <w:p>
       <w:pPr>
         <w:pStyle w:val="Heading4"/>
       </w:pPr>
@@ -15819,6 +17071,16 @@
       </w:r>
     </w:p>
     <w:p>
+      <w:r>
+        <w:t>Warianty stanów (8)</w:t>
+      </w:r>
+    </w:p>
+    <w:p>
+      <w:r>
+        <w:t>Status kafelkaSytuacjaDziałania awaryjneMinIOPlik dostarczony prawidłowo na MinIO — status pozytywny.Brak działań — proces poprawny.MinIOStatus nadany ręcznie literą 'R' przez Dyspozytora po weryfikacji.Brak działań — decyzja ręczna Dyspozytora.MinIOPlik dostarczony po CET — status pozytywny.Brak działań — dostarczone po CET, OK.MinIOPrzedwczesne (&gt;30 min do TET) — plik jeszcze niewymagany.Monitoring — czekaj do TET.MinIOOczekiwanie / transfer w toku (stan przejściowy).Czekaj 5 min → sprawdź MinIO. Gdy brak → pobierz/wygeneruj plik ręcznie ze źródła i wgraj przez Manual Upload (GUI Core CC Tool) / wyślij z CCM.MinIOZbliża się TET — pliku jeszcze nie ma na MinIO.Sprawdź źródło (Kreator / Perun4V / Core CC Tool). Gdy brak → pobierz/wygeneruj plik ręcznie ze źródła i wgraj przez Manual Upload (GUI Core CC Tool) / wyślij z CCM.MinIOZbliża się CET / błąd dostarczenia — brak pliku na MinIO.Gdy pliku NIE ma na MinIO → pobierz/wygeneruj plik ręcznie ze źródła i wgraj przez Manual Upload (GUI Core CC Tool) / wyślij z CCM.MinIOMinął CET — plik niedostarczony. Krytyczne.Zgłoś (CIZ/WPO/PSE-I). Po CET — postępowanie krytyczne (brak lokalnego fallbacku).</w:t>
+      </w:r>
+    </w:p>
+    <w:p>
       <w:pPr>
         <w:pStyle w:val="Heading4"/>
       </w:pPr>
@@ -15880,6 +17142,16 @@
       </w:r>
     </w:p>
     <w:p>
+      <w:r>
+        <w:t>Warianty stanów (8)</w:t>
+      </w:r>
+    </w:p>
+    <w:p>
+      <w:r>
+        <w:t>Status kafelkaSytuacjaDziałania awaryjneMinIOPlik dostarczony prawidłowo na MinIO — status pozytywny.Brak działań — proces poprawny.MinIOStatus nadany ręcznie literą 'R' przez Dyspozytora po weryfikacji.Brak działań — decyzja ręczna Dyspozytora.MinIOPlik dostarczony po CET — status pozytywny.Brak działań — dostarczone po CET, OK.MinIOPrzedwczesne (&gt;30 min do TET) — plik jeszcze niewymagany.Monitoring — czekaj do TET.MinIOOczekiwanie / transfer w toku (stan przejściowy).Czekaj 5 min → sprawdź MinIO. Gdy brak → pobierz/wygeneruj plik ręcznie ze źródła i wgraj przez Manual Upload (GUI Core CC Tool) / wyślij z CCM.MinIOZbliża się TET — pliku jeszcze nie ma na MinIO.Sprawdź źródło (Kreator / Perun4V / Core CC Tool). Gdy brak → pobierz/wygeneruj plik ręcznie ze źródła i wgraj przez Manual Upload (GUI Core CC Tool) / wyślij z CCM.MinIOZbliża się CET / błąd dostarczenia — brak pliku na MinIO.Gdy pliku NIE ma na MinIO → pobierz/wygeneruj plik ręcznie ze źródła i wgraj przez Manual Upload (GUI Core CC Tool) / wyślij z CCM.MinIOMinął CET — plik niedostarczony. Krytyczne.Zgłoś (CIZ/WPO/PSE-I). Po CET — postępowanie krytyczne (brak lokalnego fallbacku).</w:t>
+      </w:r>
+    </w:p>
+    <w:p>
       <w:pPr>
         <w:pStyle w:val="Heading4"/>
       </w:pPr>
@@ -15941,6 +17213,16 @@
       </w:r>
     </w:p>
     <w:p>
+      <w:r>
+        <w:t>Warianty stanów (8)</w:t>
+      </w:r>
+    </w:p>
+    <w:p>
+      <w:r>
+        <w:t>Status kafelkaSytuacjaDziałania awaryjneMinIOPlik dostarczony prawidłowo na MinIO — status pozytywny.Brak działań — proces poprawny.MinIOStatus nadany ręcznie literą 'R' przez Dyspozytora po weryfikacji.Brak działań — decyzja ręczna Dyspozytora.MinIOPlik dostarczony po CET — status pozytywny.Brak działań — dostarczone po CET, OK.MinIOPrzedwczesne (&gt;30 min do TET) — plik jeszcze niewymagany.Monitoring — czekaj do TET.MinIOOczekiwanie / transfer w toku (stan przejściowy).Czekaj 5 min → sprawdź MinIO. Gdy brak → pobierz/wygeneruj plik ręcznie ze źródła i wgraj przez Manual Upload (GUI Core CC Tool) / wyślij z CCM.MinIOZbliża się TET — pliku jeszcze nie ma na MinIO.Sprawdź źródło (Kreator / Perun4V / Core CC Tool). Gdy brak → pobierz/wygeneruj plik ręcznie ze źródła i wgraj przez Manual Upload (GUI Core CC Tool) / wyślij z CCM.MinIOZbliża się CET / błąd dostarczenia — brak pliku na MinIO.Gdy pliku NIE ma na MinIO → pobierz/wygeneruj plik ręcznie ze źródła i wgraj przez Manual Upload (GUI Core CC Tool) / wyślij z CCM.MinIOMinął CET — plik niedostarczony. Krytyczne.Zgłoś (CIZ/WPO/PSE-I). Po CET — postępowanie krytyczne (brak lokalnego fallbacku).</w:t>
+      </w:r>
+    </w:p>
+    <w:p>
       <w:pPr>
         <w:pStyle w:val="Heading4"/>
       </w:pPr>
@@ -16002,6 +17284,16 @@
       </w:r>
     </w:p>
     <w:p>
+      <w:r>
+        <w:t>Warianty stanów (8)</w:t>
+      </w:r>
+    </w:p>
+    <w:p>
+      <w:r>
+        <w:t>Status kafelkaSytuacjaDziałania awaryjneMinIOPlik dostarczony prawidłowo na MinIO — status pozytywny.Brak działań — proces poprawny.MinIOStatus nadany ręcznie literą 'R' przez Dyspozytora po weryfikacji.Brak działań — decyzja ręczna Dyspozytora.MinIOPlik dostarczony po CET — status pozytywny.Brak działań — dostarczone po CET, OK.MinIOPrzedwczesne (&gt;30 min do TET) — plik jeszcze niewymagany.Monitoring — czekaj do TET.MinIOOczekiwanie / transfer w toku (stan przejściowy).Czekaj 5 min → sprawdź MinIO. Gdy brak → pobierz/wygeneruj plik ręcznie ze źródła i wgraj przez Manual Upload (GUI Core CC Tool) / wyślij z CCM.MinIOZbliża się TET — pliku jeszcze nie ma na MinIO.Sprawdź źródło (Kreator / Perun4V / Core CC Tool). Gdy brak → pobierz/wygeneruj plik ręcznie ze źródła i wgraj przez Manual Upload (GUI Core CC Tool) / wyślij z CCM.MinIOZbliża się CET / błąd dostarczenia — brak pliku na MinIO.Gdy pliku NIE ma na MinIO → pobierz/wygeneruj plik ręcznie ze źródła i wgraj przez Manual Upload (GUI Core CC Tool) / wyślij z CCM.MinIOMinął CET — plik niedostarczony. Krytyczne.Zgłoś (CIZ/WPO/PSE-I). Po CET — postępowanie krytyczne (brak lokalnego fallbacku).</w:t>
+      </w:r>
+    </w:p>
+    <w:p>
       <w:pPr>
         <w:pStyle w:val="Heading4"/>
       </w:pPr>
@@ -16063,6 +17355,16 @@
       </w:r>
     </w:p>
     <w:p>
+      <w:r>
+        <w:t>Warianty stanów (8)</w:t>
+      </w:r>
+    </w:p>
+    <w:p>
+      <w:r>
+        <w:t>Status kafelkaSytuacjaDziałania awaryjneMinIOPlik dostarczony prawidłowo na MinIO — status pozytywny.Brak działań — proces poprawny.MinIOStatus nadany ręcznie literą 'R' przez Dyspozytora po weryfikacji.Brak działań — decyzja ręczna Dyspozytora.MinIOPlik dostarczony po CET — status pozytywny.Brak działań — dostarczone po CET, OK.MinIOPrzedwczesne (&gt;30 min do TET) — plik jeszcze niewymagany.Monitoring — czekaj do TET.MinIOOczekiwanie / transfer w toku (stan przejściowy).Czekaj 5 min → sprawdź MinIO. Gdy brak → pobierz/wygeneruj plik ręcznie ze źródła i wgraj przez Manual Upload (GUI Core CC Tool) / wyślij z CCM.MinIOZbliża się TET — pliku jeszcze nie ma na MinIO.Sprawdź źródło (Kreator / Perun4V / Core CC Tool). Gdy brak → pobierz/wygeneruj plik ręcznie ze źródła i wgraj przez Manual Upload (GUI Core CC Tool) / wyślij z CCM.MinIOZbliża się CET / błąd dostarczenia — brak pliku na MinIO.Gdy pliku NIE ma na MinIO → pobierz/wygeneruj plik ręcznie ze źródła i wgraj przez Manual Upload (GUI Core CC Tool) / wyślij z CCM.MinIOMinął CET — plik niedostarczony. Krytyczne.Zgłoś (CIZ/WPO/PSE-I). Po CET — postępowanie krytyczne (brak lokalnego fallbacku).</w:t>
+      </w:r>
+    </w:p>
+    <w:p>
       <w:pPr>
         <w:pStyle w:val="Heading4"/>
       </w:pPr>
@@ -16124,6 +17426,16 @@
       </w:r>
     </w:p>
     <w:p>
+      <w:r>
+        <w:t>Warianty stanów (8)</w:t>
+      </w:r>
+    </w:p>
+    <w:p>
+      <w:r>
+        <w:t>Status kafelkaSytuacjaDziałania awaryjneMinIOPlik dostarczony prawidłowo na MinIO — status pozytywny.Brak działań — proces poprawny.MinIOStatus nadany ręcznie literą 'R' przez Dyspozytora po weryfikacji.Brak działań — decyzja ręczna Dyspozytora.MinIOPlik dostarczony po CET — status pozytywny.Brak działań — dostarczone po CET, OK.MinIOPrzedwczesne (&gt;30 min do TET) — plik jeszcze niewymagany.Monitoring — czekaj do TET.MinIOOczekiwanie / transfer w toku (stan przejściowy).Czekaj 5 min → sprawdź MinIO. Gdy brak → pobierz/wygeneruj plik ręcznie ze źródła i wgraj przez Manual Upload (GUI Core CC Tool) / wyślij z CCM.MinIOZbliża się TET — pliku jeszcze nie ma na MinIO.Sprawdź źródło (Kreator / Perun4V / Core CC Tool). Gdy brak → pobierz/wygeneruj plik ręcznie ze źródła i wgraj przez Manual Upload (GUI Core CC Tool) / wyślij z CCM.MinIOZbliża się CET / błąd dostarczenia — brak pliku na MinIO.Gdy pliku NIE ma na MinIO → pobierz/wygeneruj plik ręcznie ze źródła i wgraj przez Manual Upload (GUI Core CC Tool) / wyślij z CCM.MinIOMinął CET — plik niedostarczony. Krytyczne.Zgłoś (CIZ/WPO/PSE-I). Po CET — postępowanie krytyczne (brak lokalnego fallbacku).</w:t>
+      </w:r>
+    </w:p>
+    <w:p>
       <w:pPr>
         <w:pStyle w:val="Heading4"/>
       </w:pPr>
@@ -16185,6 +17497,16 @@
       </w:r>
     </w:p>
     <w:p>
+      <w:r>
+        <w:t>Warianty stanów (8)</w:t>
+      </w:r>
+    </w:p>
+    <w:p>
+      <w:r>
+        <w:t>Status kafelkaSytuacjaDziałania awaryjneMinIOPlik dostarczony prawidłowo na MinIO — status pozytywny.Brak działań — proces poprawny.MinIOStatus nadany ręcznie literą 'R' przez Dyspozytora po weryfikacji.Brak działań — decyzja ręczna Dyspozytora.MinIOPlik dostarczony po CET — status pozytywny.Brak działań — dostarczone po CET, OK.MinIOPrzedwczesne (&gt;30 min do TET) — plik jeszcze niewymagany.Monitoring — czekaj do TET.MinIOOczekiwanie / transfer w toku (stan przejściowy).Czekaj 5 min → sprawdź MinIO. Gdy brak → pobierz/wygeneruj plik ręcznie ze źródła i wgraj przez Manual Upload (GUI Core CC Tool) / wyślij z CCM.MinIOZbliża się TET — pliku jeszcze nie ma na MinIO.Sprawdź źródło (Kreator / Perun4V / Core CC Tool). Gdy brak → pobierz/wygeneruj plik ręcznie ze źródła i wgraj przez Manual Upload (GUI Core CC Tool) / wyślij z CCM.MinIOZbliża się CET / błąd dostarczenia — brak pliku na MinIO.Gdy pliku NIE ma na MinIO → pobierz/wygeneruj plik ręcznie ze źródła i wgraj przez Manual Upload (GUI Core CC Tool) / wyślij z CCM.MinIOMinął CET — plik niedostarczony. Krytyczne.Zgłoś (CIZ/WPO/PSE-I). Po CET — postępowanie krytyczne (brak lokalnego fallbacku).</w:t>
+      </w:r>
+    </w:p>
+    <w:p>
       <w:pPr>
         <w:pStyle w:val="Heading4"/>
       </w:pPr>
@@ -16246,6 +17568,16 @@
       </w:r>
     </w:p>
     <w:p>
+      <w:r>
+        <w:t>Warianty stanów (8)</w:t>
+      </w:r>
+    </w:p>
+    <w:p>
+      <w:r>
+        <w:t>Status kafelkaSytuacjaDziałania awaryjneMinIOPlik dostarczony prawidłowo na MinIO — status pozytywny.Brak działań — proces poprawny.MinIOStatus nadany ręcznie literą 'R' przez Dyspozytora po weryfikacji.Brak działań — decyzja ręczna Dyspozytora.MinIOPlik dostarczony po CET — status pozytywny.Brak działań — dostarczone po CET, OK.MinIOPrzedwczesne (&gt;30 min do TET) — plik jeszcze niewymagany.Monitoring — czekaj do TET.MinIOOczekiwanie / transfer w toku (stan przejściowy).Czekaj 5 min → sprawdź MinIO. Gdy brak → pobierz/wygeneruj plik ręcznie ze źródła i wgraj przez Manual Upload (GUI Core CC Tool) / wyślij z CCM.MinIOZbliża się TET — pliku jeszcze nie ma na MinIO.Sprawdź źródło (Kreator / Perun4V / Core CC Tool). Gdy brak → pobierz/wygeneruj plik ręcznie ze źródła i wgraj przez Manual Upload (GUI Core CC Tool) / wyślij z CCM.MinIOZbliża się CET / błąd dostarczenia — brak pliku na MinIO.Gdy pliku NIE ma na MinIO → pobierz/wygeneruj plik ręcznie ze źródła i wgraj przez Manual Upload (GUI Core CC Tool) / wyślij z CCM.MinIOMinął CET — plik niedostarczony. Krytyczne.Zgłoś (CIZ/WPO/PSE-I). Po CET — postępowanie krytyczne (brak lokalnego fallbacku).</w:t>
+      </w:r>
+    </w:p>
+    <w:p>
       <w:pPr>
         <w:pStyle w:val="Heading4"/>
       </w:pPr>
@@ -16307,6 +17639,16 @@
       </w:r>
     </w:p>
     <w:p>
+      <w:r>
+        <w:t>Warianty stanów (8)</w:t>
+      </w:r>
+    </w:p>
+    <w:p>
+      <w:r>
+        <w:t>Status kafelkaSytuacjaDziałania awaryjneMinIOPlik dostarczony prawidłowo na MinIO — status pozytywny.Brak działań — proces poprawny.MinIOStatus nadany ręcznie literą 'R' przez Dyspozytora po weryfikacji.Brak działań — decyzja ręczna Dyspozytora.MinIOPlik dostarczony po CET — status pozytywny.Brak działań — dostarczone po CET, OK.MinIOPrzedwczesne (&gt;30 min do TET) — plik jeszcze niewymagany.Monitoring — czekaj do TET.MinIOOczekiwanie / transfer w toku (stan przejściowy).Czekaj 5 min → sprawdź MinIO. Gdy brak → pobierz/wygeneruj plik ręcznie ze źródła i wgraj przez Manual Upload (GUI Core CC Tool) / wyślij z CCM.MinIOZbliża się TET — pliku jeszcze nie ma na MinIO.Sprawdź źródło (Kreator / Perun4V / Core CC Tool). Gdy brak → pobierz/wygeneruj plik ręcznie ze źródła i wgraj przez Manual Upload (GUI Core CC Tool) / wyślij z CCM.MinIOZbliża się CET / błąd dostarczenia — brak pliku na MinIO.Gdy pliku NIE ma na MinIO → pobierz/wygeneruj plik ręcznie ze źródła i wgraj przez Manual Upload (GUI Core CC Tool) / wyślij z CCM.MinIOMinął CET — plik niedostarczony. Krytyczne.Zgłoś (CIZ/WPO/PSE-I). Po CET — postępowanie krytyczne (brak lokalnego fallbacku).</w:t>
+      </w:r>
+    </w:p>
+    <w:p>
       <w:pPr>
         <w:pStyle w:val="Heading4"/>
       </w:pPr>
@@ -16368,6 +17710,16 @@
       </w:r>
     </w:p>
     <w:p>
+      <w:r>
+        <w:t>Warianty stanów (8)</w:t>
+      </w:r>
+    </w:p>
+    <w:p>
+      <w:r>
+        <w:t>Status kafelkaSytuacjaDziałania awaryjneMinIOPlik dostarczony prawidłowo na MinIO — status pozytywny.Brak działań — proces poprawny.MinIOStatus nadany ręcznie literą 'R' przez Dyspozytora po weryfikacji.Brak działań — decyzja ręczna Dyspozytora.MinIOPlik dostarczony po CET — status pozytywny.Brak działań — dostarczone po CET, OK.MinIOPrzedwczesne (&gt;30 min do TET) — plik jeszcze niewymagany.Monitoring — czekaj do TET.MinIOOczekiwanie / transfer w toku (stan przejściowy).Czekaj 5 min → sprawdź MinIO. Gdy brak → pobierz/wygeneruj plik ręcznie ze źródła i wgraj przez Manual Upload (GUI Core CC Tool) / wyślij z CCM.MinIOZbliża się TET — pliku jeszcze nie ma na MinIO.Sprawdź źródło (Kreator / Perun4V / Core CC Tool). Gdy brak → pobierz/wygeneruj plik ręcznie ze źródła i wgraj przez Manual Upload (GUI Core CC Tool) / wyślij z CCM.MinIOZbliża się CET / błąd dostarczenia — brak pliku na MinIO.Gdy pliku NIE ma na MinIO → pobierz/wygeneruj plik ręcznie ze źródła i wgraj przez Manual Upload (GUI Core CC Tool) / wyślij z CCM.MinIOMinął CET — plik niedostarczony. Krytyczne.Zgłoś (CIZ/WPO/PSE-I). Po CET — postępowanie krytyczne (brak lokalnego fallbacku).</w:t>
+      </w:r>
+    </w:p>
+    <w:p>
       <w:pPr>
         <w:pStyle w:val="Heading4"/>
       </w:pPr>
@@ -16429,6 +17781,16 @@
       </w:r>
     </w:p>
     <w:p>
+      <w:r>
+        <w:t>Warianty stanów (8)</w:t>
+      </w:r>
+    </w:p>
+    <w:p>
+      <w:r>
+        <w:t>Status kafelkaSytuacjaDziałania awaryjneMinIOPlik dostarczony prawidłowo na MinIO — status pozytywny.Brak działań — proces poprawny.MinIOStatus nadany ręcznie literą 'R' przez Dyspozytora po weryfikacji.Brak działań — decyzja ręczna Dyspozytora.MinIOPlik dostarczony po CET — status pozytywny.Brak działań — dostarczone po CET, OK.MinIOPrzedwczesne (&gt;30 min do TET) — plik jeszcze niewymagany.Monitoring — czekaj do TET.MinIOOczekiwanie / transfer w toku (stan przejściowy).Czekaj 5 min → sprawdź MinIO. Gdy brak → pobierz/wygeneruj plik ręcznie ze źródła i wgraj przez Manual Upload (GUI Core CC Tool) / wyślij z CCM.MinIOZbliża się TET — pliku jeszcze nie ma na MinIO.Sprawdź źródło (Kreator / Perun4V / Core CC Tool). Gdy brak → pobierz/wygeneruj plik ręcznie ze źródła i wgraj przez Manual Upload (GUI Core CC Tool) / wyślij z CCM.MinIOZbliża się CET / błąd dostarczenia — brak pliku na MinIO.Gdy pliku NIE ma na MinIO → pobierz/wygeneruj plik ręcznie ze źródła i wgraj przez Manual Upload (GUI Core CC Tool) / wyślij z CCM.MinIOMinął CET — plik niedostarczony. Krytyczne.Zgłoś (CIZ/WPO/PSE-I). Po CET — postępowanie krytyczne (brak lokalnego fallbacku).</w:t>
+      </w:r>
+    </w:p>
+    <w:p>
       <w:pPr>
         <w:pStyle w:val="Heading4"/>
       </w:pPr>
@@ -16490,6 +17852,16 @@
       </w:r>
     </w:p>
     <w:p>
+      <w:r>
+        <w:t>Warianty stanów (8)</w:t>
+      </w:r>
+    </w:p>
+    <w:p>
+      <w:r>
+        <w:t>Status kafelkaSytuacjaDziałania awaryjneMinIOPlik dostarczony prawidłowo na MinIO — status pozytywny.Brak działań — proces poprawny.MinIOStatus nadany ręcznie literą 'R' przez Dyspozytora po weryfikacji.Brak działań — decyzja ręczna Dyspozytora.MinIOPlik dostarczony po CET — status pozytywny.Brak działań — dostarczone po CET, OK.MinIOPrzedwczesne (&gt;30 min do TET) — plik jeszcze niewymagany.Monitoring — czekaj do TET.MinIOOczekiwanie / transfer w toku (stan przejściowy).Czekaj 5 min → sprawdź MinIO. Gdy brak → pobierz/wygeneruj plik ręcznie ze źródła i wgraj przez Manual Upload (GUI Core CC Tool) / wyślij z CCM.MinIOZbliża się TET — pliku jeszcze nie ma na MinIO.Sprawdź źródło (Kreator / Perun4V / Core CC Tool). Gdy brak → pobierz/wygeneruj plik ręcznie ze źródła i wgraj przez Manual Upload (GUI Core CC Tool) / wyślij z CCM.MinIOZbliża się CET / błąd dostarczenia — brak pliku na MinIO.Gdy pliku NIE ma na MinIO → pobierz/wygeneruj plik ręcznie ze źródła i wgraj przez Manual Upload (GUI Core CC Tool) / wyślij z CCM.MinIOMinął CET — plik niedostarczony. Krytyczne.Zgłoś (CIZ/WPO/PSE-I). Po CET — postępowanie krytyczne (brak lokalnego fallbacku).</w:t>
+      </w:r>
+    </w:p>
+    <w:p>
       <w:pPr>
         <w:pStyle w:val="Heading4"/>
       </w:pPr>
@@ -16571,6 +17943,16 @@
       </w:r>
     </w:p>
     <w:p>
+      <w:r>
+        <w:t>Warianty stanów (46)</w:t>
+      </w:r>
+    </w:p>
+    <w:p>
+      <w:r>
+        <w:t>Status kafelkaSytuacjaDziałania awaryjneCCtool wysł.CCtool zwalid.MinIODokument został wysłany prawidłowo do CCTool i na MINIO, otrzymano potwierdzenie ACK z pozytywnym komunikatem (komunikat statusu powinien się pojawić po najechaniu kursorem na status).Brak — proces przebiegł poprawnie.CCtool wysł.CCtool zwalid.MinIODokument wysłany prawidłowo do CCTool i na MINIO, Dokument ACK (CCTool zwalid.) napłynął po CET z pozytywnym komunikatem.Brak działań — proces poprawny.CCtool wysł.CCtool zwalid.MinIODokument wysłany prawidłowo do CCTool i na MINIO, nie otrzymano potwierdzenia ACK, natomiast Dyspozytor ustawił status ręcznie 'R' po weryfikacji po stronie CCTool, iż proces został zrealizowany poprawnie.Brak działań — proces poprawny.CCtool wysł.CCtool zwalid.MinIODokument wysłany prawidłowo do CCTool i na MINIO po CET, Dokument ACK (CCTool zwalid.) napłynął po CET z pozytywnym komunikatem.Brak działań — proces poprawny.CCtool wysł.CCtool zwalid.MinIODokument IVA został oznaczony ręcznie jako wysłany prawidłowo do CCTool i na MINIO oraz otrzymanie potwierdzenia ACK.Brak działań — proces poprawny.CCtool wysł.CCtool zwalid.MinIODokument IVA prawidłowo wysłany ręcznie z poziomu aplikacji CCM w jednym miejscu (np. z menu bocznego „CCTool wysł." bądź „MINIO" korzystając z opcji „Wyślij"). Otrzymano potwierdzenie ACK z pozytywnym komunikatem.Brak działań — proces poprawny.CCtool wysł.CCtool zwalid.MinIODokument IVA prawidłowo wysłany ręcznie z poziomu CCM. Trwa oczekiwanie na potwierdzenie ACK (CCTool zwalid.) — około 2 minut trwa taki status.Po 5 min jeśli proces przebiegł poprawnie → ustaw 'R' dla ACK.CCtool wysł.CCtool zwalid.MinIODokument wysłany ręcznie z poziomu CCM, ale nie napłynął ACK w żądanym czasie i zbliża się Critical End Time dla obsługi tego dokumentu.Monitoring CCCt MV; jeśli proces OK → status 'R' dla ACK.CCtool wysł.CCtool zwalid.MinIODokument wysłany ręcznie z poziomu CCM, a otrzymane potwierdzenie ACK (CCTool zwalid.): (1) zawiera komunikat błędu (najedź kursorem na status); (2) proces zakończył się błędem — „Błąd procesu".Weryfikacja sytuacji w CCTool. Decyzja Dyspozytora o ewentualnej kolejnej iteracji.CCtool wysł.CCtool zwalid.MinIODokument IVA prawidłowo wysłany ręcznie z poziomu CCM. Otrzymano potwierdzenie ACK z pozytywnym komunikatem po CET.Brak działań — proces poprawny.CCtool wysł.CCtool zwalid.MinIODokument IVA prawidłowo wysłany ręcznie z poziomu CCM. Nie otrzymano potwierdzenia ACK — upłynął czas CET.Weryfikacja w CCCt MV; jeśli Processed → status 'R' ręcznie. Diagnostyka CN2 zwrotny → zgłoś.CCtool wysł.CCtool zwalid.MinIODokument IVA prawidłowo wysłany ręcznie z poziomu CCM. Nie otrzymano ACK, natomiast Dyspozytor ustawił status ręcznie 'R' po weryfikacji po stronie CCTool, iż proces został zrealizowany poprawnie.Brak działań — proces poprawny.CCtool wysł.CCtool zwalid.MinIODokument IVA prawidłowo wysłany ręcznie z poziomu CCM po CET (opcja „Wyślij po CET"). Trwa oczekiwanie na potwierdzenie ACK (CCTool zwalid.) — około 2 minut trwa taki status.Brak działań — proces poprawny.CCtool wysł.CCtool zwalid.MinIODokument wysłany ręcznie z poziomu CCM po CET. Trwa oczekiwanie na potwierdzenie ACK (CCTool zwalid.) — upłynęło więcej niż 2 minuty (czas oczekiwania można sprawdzić najeżdżając kursorem na status).Weryfikacja sytuacji w CCTool; jeśli proces przebiegł poprawnie → ustaw status 'R' dla ACK.CCtool wysł.CCtool zwalid.MinIODokument wysłany ręcznie z poziomu CCM po CET, a otrzymane potwierdzenie ACK (CCTool zwalid.): (1) zawiera komunikat błędu; (2) proces zakończył się błędem — „Błąd procesu".Weryfikacja sytuacji w CCTool. Zgłoś.CCtool wysł.CCtool zwalid.MinIODokument IVA prawidłowo wysłany ręcznie z poziomu CCM po CET. Otrzymano potwierdzenie ACK z pozytywnym komunikatem.Brak działań — proces poprawny.CCtool wysł.CCtool zwalid.MinIODokument IVA prawidłowo wysłany ręcznie z poziomu CCM po CET. Nie otrzymano potwierdzenia ACK — upłynął czas CET.Diagnostyka CN2 zwrotny → zgłoś.CCtool wysł.CCtool zwalid.MinIODokument IVA został oznaczony ręcznie jako wysłany prawidłowo do CCTool i na MINIO. Trwa oczekiwanie na potwierdzenie ACK (CCTool zwalid.) — około 2 minut trwa taki status.Weryfikacja w CCTool; po 5 min jeśli proces przebiegł poprawnie → ustaw 'R' dla ACK.CCtool wysł.CCtool zwalid.MinIODokument IVA został oznaczony ręcznie jako wysłany prawidłowo do CCTool i na MINIO. Trwa oczekiwanie na potwierdzenie ACK (CCTool zwalid.) — upłynęło więcej niż 2 minuty.Weryfikacja w CCTool; jeśli proces przebiegł poprawnie → ustaw 'R' dla ACK.CCtool wysł.CCtool zwalid.MinIODokument IVA został oznaczony ręcznie jako wysłany prawidłowo do CCTool i na MINIO. Nie otrzymano potwierdzenia ACK — upłynął czas CET.Diagnostyka CN2 zwrotny → zgłoś.CCtool wysł.CCtool zwalid.MinIOWysłany dokument nie spełnia kryterium rozmiaru (w informacjach o wielkości rozmiaru dostępna z poziomu menu bocznego na statusie). Nie otrzymano potwierdzenie ACK, natomiast Dyspozytor ustawił status ręcznie 'R' po weryfikacji po stronie CCTool, iż proces został zrealizowany poprawnie.Zgłoś informacyjnie (ew. zmiana konfiguracji rozmiaru).CCtool wysł.CCtool zwalid.MinIODokument jeszcze nie został wysłany ani do CCTool ani na MINIO, w związku z tym potwierdzenie ACK nie napłynęło.Brak — monitoring. Plik nie wymagany (&gt;30 min do TET).CCtool wysł.CCtool zwalid.MinIOZbliża się TET (21:30), a dokument nie został jeszcze obsłużony.Brak. Czujność i przygotowanie. Sprawdź Perun4V (status obliczeń); sprawdź CN2; przygotuj się na ewentualne IVA BACKUP od CCA. Jeśli sytuacja się utrzyma → Kategoria C (powiązany stan).CCtool wysł.CCtool zwalid.MinIOWysyłka do CCTool trwa i oczekiwany jest ACK, dokument dostarczony na MINIO.Jeśli taki status „CCTool wysł." trwa dłużej niż 5 minut należy zweryfikować stan w CCTool, ewentualnie zgłosić problem.CCtool wysł.CCtool zwalid.MinIODokument wysłany prawidłowo do CCTool i na MINIO, trwa oczekiwanie na potwierdzenie ACK (status powinien się utrzymać krócej niż 3 minuty).Brak. Czekaj do 3-5 min na ACK; po tym czasie → stan timeout.CCtool wysł.CCtool zwalid.MinIOWysyłka do CCTool trwa i oczekiwany jest ACK. Dokument dostarczony na MINIO nie spełnia kryterium rozmiaru (w informacjach o wielkości rozmiaru dostępna z poziomu menu bocznego na statusie).Jeśli taki status „CCTool wysł." trwa dłużej niż 5 minut → zweryfikować stan w CCTool, ew. zgłosić problem Zweryfikować dokument IVA czy jest poprawny (pobierając go z CCM i rozpakowując) — pomimo zbyt małego rozmiaru sytuacja może być OK Jeśli plik z pkt. 2 jest niepoprawny → pozyskać IVA z PERUN i wysłać bezpośrednio z CCM bądź z GUI CCToolCCtool wysł.CCtool zwalid.MinIOZbliża się CET (22:06), a dokument nie został jeszcze obsłużony.Procedura (wg Confluence): Jeśli zbliża się CET (poniżej 3 minut) możliwa jest ręczna wysyłka IVA Backup z menu bocznego na poniższej pozycji pulpitu. Alternatywnie: R08 (Perun4V awaria), R09 (ERR-I), R10 (Process failed).CCtool wysł.CCtool zwalid.MinIODokument wysłany prawidłowo do CCTool i na MINIO, potwierdzenie ACK ma status czerwony co może oznaczać: (1) zawiera komunikat błędu (najedź kursorem na status); (2) proces zakończył się błędem — „Błąd procesu".Procedura: R05 — reakcja per kod ACK (20 gateClosed / 21 duplicatedVersion / 30 file size). Należy zweryfikować sytuację w CCTool.CCtool wysł.CCtool zwalid.MinIODokument wysłany prawidłowo do CCTool i na MINIO, trwa oczekiwanie na potwierdzenie ACK, które nie napłynęło w zadanym czasie (po najechaniu na znak zapytania można sprawdzić ile upłynęło czasu).Procedura: R06. Jeśli po około 3 minutach nie pojawi się status ACK wraz z informacją dostępną po najechaniu na status → należy zweryfikować sytuację w CCTool.CCtool wysł.CCtool zwalid.MinIODokument wysłany prawidłowo do CCTool i na MINIO. Dokument ACK (CCTool zwalid.) nie napłynął do CET.Procedury: R06, R18. Należy zweryfikować sytuację w CCTool. W przypadku wygenerowania ACK po stronie CCTool — sytuację zgłosić.CCtool wysł.CCtool zwalid.MinIOWysłany dokument nie spełnia kryterium rozmiaru (w informacjach o wielkości rozmiaru dostępna z poziomu menu bocznego na statusie). Trwa oczekiwanie na potwierdzenie ACK (CCTool zwalid.) — około 2 minut trwa taki status.Procedura: R05. Zweryfikować dokument IVA czy jest poprawny (pobierając go z CCM i rozpakowując) — pomimo zbyt małego rozmiaru sytuacja może być OK Jeśli plik z pkt. 1 jest niepoprawny → pozyskać IVA z PERUN i wysłać bezpośrednio z CCM bądź z GUI CCToolCCtool wysł.CCtool zwalid.MinIOWysłany dokument nie spełnia kryterium rozmiaru. Trwa oczekiwanie na potwierdzenie ACK (CCTool zwalid.), które nie napłynęło w zadanym czasie (po najechaniu na znak zapytania można sprawdzić ile upłynęło czasu).Procedura: R05, R06. Jeśli po około 3 minutach nie pojawi się status ACK wraz z informacją po najechaniu na status → zweryfikować sytuację w CCTool Zweryfikować dokument IVA (pobranie z CCM i rozpakowanie) — pomimo małego rozmiaru sytuacja może być OK Jeśli plik z pkt. 2 jest niepoprawny → pozyskać IVA z PERUN i wysłać bezpośrednio z CCM bądź z GUI CCToolCCtool wysł.CCtool zwalid.MinIOWysłany dokument nie spełnia kryterium rozmiaru, a otrzymane potwierdzenie ACK (CCTool zwalid.): (1) zawiera komunikat błędu; (2) proces zakończył się błędem — „Błąd procesu".Procedura: R05. Należy zweryfikować sytuację w CCTool Zweryfikować dokument IVA czy jest poprawny (pobranie z CCM i rozpakowanie) — pomimo małego rozmiaru sytuacja może być OK Jeśli plik z pkt. 2 jest niepoprawny → pozyskać IVA z PERUN i wysłać bezpośrednio z CCM bądź z GUI CCToolCCtool wysł.CCtool zwalid.MinIOWysłany dokument nie spełnia kryterium rozmiaru. Dokument ACK (CCTool zwalid.) napłynął po CET z pozytywnym komunikatem.Należy zweryfikować dokument IVA czy jest poprawny i czy został przyjęty w CCTool Jeśli plik z pkt. 1 jest niepoprawny → pozyskać IVA z PERUN i wysłać bezpośrednio z CCM bądź z GUI CCTool Po weryfikacji można nadać 'R' → Stan #21 (Kategoria A).CCtool wysł.CCtool zwalid.MinIOWysłany dokument nie spełnia kryterium rozmiaru. Dokument ACK (CCTool zwalid.) nie napłynął do CET.Zweryfikować sytuację w CCTool — w przypadku wygenerowania ACK po stronie CCTool sytuację zgłosić Zweryfikować dokument IVA (pobranie z CCM i rozpakowanie) — pomimo małego rozmiaru sytuacja może być OK Jeśli plik z pkt. 2 jest niepoprawny → pozyskać IVA z PERUN i wysłać bezpośrednio z CCM bądź z GUI CCToolCCtool wysł.CCtool zwalid.MinIODokument wysłany prawidłowo do CCTool i na MINIO po CET, potwierdzenie ACK ma status czerwony co może oznaczać: (1) zawiera komunikat błędu; (2) proces zakończył się błędem — „Błąd procesu".Procedura: R05. Należy zweryfikować sytuację w CCTool.CCtool wysł.CCtool zwalid.MinIODokument wysłany prawidłowo do CCTool i na MINIO po CET. Dokument ACK (CCTool zwalid.) nie napłynął do CET.Procedury: R06, R18. Należy zweryfikować sytuację w CCTool, w przypadku wygenerowania ACK po stronie CCTool sytuację zgłosić.CCtool wysł.CCtool zwalid.MinIODokument nie został dostarczony ani do CCTool ani na MINIO, w związku z tym potwierdzenie ACK nie napłynęło. Minął czas CET.Procedura (wg Confluence): Należy zweryfikować czy dokument IVA jest w PERUN. Jeśli TAK to należy go niezwłocznie pozyskać ręcznie i wysłać ją bezpośrednio z CCM bądź z GUI CCTool Procedury IDCC: R10 (Process failed) — oczekuj IVA BACKUP v1 od CCA; brak → R19 (CN2 nie kopiuje do CCA), R23 (brak raportu CCA). Zgłoś (CIZ, WPO, PSE-I) + telefon CCC. ❌ Zakaz fallbacku 20% Fmax z DA.MinIOPlik dostarczony prawidłowo na MinIO — status pozytywny.Brak działań — proces poprawny.MinIOStatus nadany ręcznie literą 'R' przez Dyspozytora po weryfikacji.Brak działań — decyzja ręczna Dyspozytora.MinIOPlik dostarczony po CET — status pozytywny.Brak działań — dostarczone po CET, OK.MinIOPrzedwczesne (&gt;30 min do TET) — plik jeszcze niewymagany.Monitoring — czekaj do TET.MinIOOczekiwanie / transfer w toku (stan przejściowy).Czekaj 5 min → sprawdź MinIO. Gdy brak → pobierz/wygeneruj plik ręcznie ze źródła i wgraj przez Manual Upload (GUI Core CC Tool) / wyślij z CCM.MinIOZbliża się TET — pliku jeszcze nie ma na MinIO.Sprawdź źródło (Kreator / Perun4V / Core CC Tool). Gdy brak → pobierz/wygeneruj plik ręcznie ze źródła i wgraj przez Manual Upload (GUI Core CC Tool) / wyślij z CCM.MinIOZbliża się CET / błąd dostarczenia — brak pliku na MinIO.Gdy pliku NIE ma na MinIO → pobierz/wygeneruj plik ręcznie ze źródła i wgraj przez Manual Upload (GUI Core CC Tool) / wyślij z CCM.MinIOMinął CET — plik niedostarczony. Krytyczne.Zgłoś (CIZ/WPO/PSE-I). Po CET — postępowanie krytyczne (brak lokalnego fallbacku).</w:t>
+      </w:r>
+    </w:p>
+    <w:p>
       <w:pPr>
         <w:pStyle w:val="Heading4"/>
       </w:pPr>
@@ -16647,6 +18029,16 @@
       </w:r>
     </w:p>
     <w:p>
+      <w:r>
+        <w:t>Warianty stanów (46)</w:t>
+      </w:r>
+    </w:p>
+    <w:p>
+      <w:r>
+        <w:t>Status kafelkaSytuacjaDziałania awaryjneCCtool wysł.CCtool zwalid.MinIODokument został wysłany prawidłowo do CCTool i na MINIO, otrzymano potwierdzenie ACK z pozytywnym komunikatem (komunikat statusu powinien się pojawić po najechaniu kursorem na status).Brak — proces przebiegł poprawnie.CCtool wysł.CCtool zwalid.MinIODokument wysłany prawidłowo do CCTool i na MINIO, Dokument ACK (CCTool zwalid.) napłynął po CET z pozytywnym komunikatem.Brak działań — proces poprawny.CCtool wysł.CCtool zwalid.MinIODokument wysłany prawidłowo do CCTool i na MINIO, nie otrzymano potwierdzenia ACK, natomiast Dyspozytor ustawił status ręcznie 'R' po weryfikacji po stronie CCTool, iż proces został zrealizowany poprawnie.Brak działań — proces poprawny.CCtool wysł.CCtool zwalid.MinIODokument wysłany prawidłowo do CCTool i na MINIO po CET, Dokument ACK (CCTool zwalid.) napłynął po CET z pozytywnym komunikatem.Brak działań — proces poprawny.CCtool wysł.CCtool zwalid.MinIODokument IVA został oznaczony ręcznie jako wysłany prawidłowo do CCTool i na MINIO oraz otrzymanie potwierdzenia ACK.Brak działań — proces poprawny.CCtool wysł.CCtool zwalid.MinIODokument IVA prawidłowo wysłany ręcznie z poziomu aplikacji CCM w jednym miejscu (np. z menu bocznego „CCTool wysł." bądź „MINIO" korzystając z opcji „Wyślij"). Otrzymano potwierdzenie ACK z pozytywnym komunikatem.Brak działań — proces poprawny.CCtool wysł.CCtool zwalid.MinIODokument IVA prawidłowo wysłany ręcznie z poziomu CCM. Trwa oczekiwanie na potwierdzenie ACK (CCTool zwalid.) — około 2 minut trwa taki status.Po 5 min jeśli proces przebiegł poprawnie → ustaw 'R' dla ACK.CCtool wysł.CCtool zwalid.MinIODokument wysłany ręcznie z poziomu CCM, ale nie napłynął ACK w żądanym czasie i zbliża się Critical End Time dla obsługi tego dokumentu.Monitoring CCCt MV; jeśli proces OK → status 'R' dla ACK.CCtool wysł.CCtool zwalid.MinIODokument wysłany ręcznie z poziomu CCM, a otrzymane potwierdzenie ACK (CCTool zwalid.): (1) zawiera komunikat błędu (najedź kursorem na status); (2) proces zakończył się błędem — „Błąd procesu".Weryfikacja sytuacji w CCTool. Decyzja Dyspozytora o ewentualnej kolejnej iteracji.CCtool wysł.CCtool zwalid.MinIODokument IVA prawidłowo wysłany ręcznie z poziomu CCM. Otrzymano potwierdzenie ACK z pozytywnym komunikatem po CET.Brak działań — proces poprawny.CCtool wysł.CCtool zwalid.MinIODokument IVA prawidłowo wysłany ręcznie z poziomu CCM. Nie otrzymano potwierdzenia ACK — upłynął czas CET.Weryfikacja w CCCt MV; jeśli Processed → status 'R' ręcznie. Diagnostyka CN2 zwrotny → zgłoś.CCtool wysł.CCtool zwalid.MinIODokument IVA prawidłowo wysłany ręcznie z poziomu CCM. Nie otrzymano ACK, natomiast Dyspozytor ustawił status ręcznie 'R' po weryfikacji po stronie CCTool, iż proces został zrealizowany poprawnie.Brak działań — proces poprawny.CCtool wysł.CCtool zwalid.MinIODokument IVA prawidłowo wysłany ręcznie z poziomu CCM po CET (opcja „Wyślij po CET"). Trwa oczekiwanie na potwierdzenie ACK (CCTool zwalid.) — około 2 minut trwa taki status.Brak działań — proces poprawny.CCtool wysł.CCtool zwalid.MinIODokument wysłany ręcznie z poziomu CCM po CET. Trwa oczekiwanie na potwierdzenie ACK (CCTool zwalid.) — upłynęło więcej niż 2 minuty (czas oczekiwania można sprawdzić najeżdżając kursorem na status).Weryfikacja sytuacji w CCTool; jeśli proces przebiegł poprawnie → ustaw status 'R' dla ACK.CCtool wysł.CCtool zwalid.MinIODokument wysłany ręcznie z poziomu CCM po CET, a otrzymane potwierdzenie ACK (CCTool zwalid.): (1) zawiera komunikat błędu; (2) proces zakończył się błędem — „Błąd procesu".Weryfikacja sytuacji w CCTool. Zgłoś.CCtool wysł.CCtool zwalid.MinIODokument IVA prawidłowo wysłany ręcznie z poziomu CCM po CET. Otrzymano potwierdzenie ACK z pozytywnym komunikatem.Brak działań — proces poprawny.CCtool wysł.CCtool zwalid.MinIODokument IVA prawidłowo wysłany ręcznie z poziomu CCM po CET. Nie otrzymano potwierdzenia ACK — upłynął czas CET.Diagnostyka CN2 zwrotny → zgłoś.CCtool wysł.CCtool zwalid.MinIODokument IVA został oznaczony ręcznie jako wysłany prawidłowo do CCTool i na MINIO. Trwa oczekiwanie na potwierdzenie ACK (CCTool zwalid.) — około 2 minut trwa taki status.Weryfikacja w CCTool; po 5 min jeśli proces przebiegł poprawnie → ustaw 'R' dla ACK.CCtool wysł.CCtool zwalid.MinIODokument IVA został oznaczony ręcznie jako wysłany prawidłowo do CCTool i na MINIO. Trwa oczekiwanie na potwierdzenie ACK (CCTool zwalid.) — upłynęło więcej niż 2 minuty.Weryfikacja w CCTool; jeśli proces przebiegł poprawnie → ustaw 'R' dla ACK.CCtool wysł.CCtool zwalid.MinIODokument IVA został oznaczony ręcznie jako wysłany prawidłowo do CCTool i na MINIO. Nie otrzymano potwierdzenia ACK — upłynął czas CET.Diagnostyka CN2 zwrotny → zgłoś.CCtool wysł.CCtool zwalid.MinIOWysłany dokument nie spełnia kryterium rozmiaru (w informacjach o wielkości rozmiaru dostępna z poziomu menu bocznego na statusie). Nie otrzymano potwierdzenie ACK, natomiast Dyspozytor ustawił status ręcznie 'R' po weryfikacji po stronie CCTool, iż proces został zrealizowany poprawnie.Zgłoś informacyjnie (ew. zmiana konfiguracji rozmiaru).CCtool wysł.CCtool zwalid.MinIODokument jeszcze nie został wysłany ani do CCTool ani na MINIO, w związku z tym potwierdzenie ACK nie napłynęło.Brak — monitoring. Plik nie wymagany (&gt;30 min do TET).CCtool wysł.CCtool zwalid.MinIOZbliża się TET (21:30), a dokument nie został jeszcze obsłużony.Brak. Czujność i przygotowanie. Sprawdź Perun4V (status obliczeń); sprawdź CN2; przygotuj się na ewentualne IVA BACKUP od CCA. Jeśli sytuacja się utrzyma → Kategoria C (powiązany stan).CCtool wysł.CCtool zwalid.MinIOWysyłka do CCTool trwa i oczekiwany jest ACK, dokument dostarczony na MINIO.Jeśli taki status „CCTool wysł." trwa dłużej niż 5 minut należy zweryfikować stan w CCTool, ewentualnie zgłosić problem.CCtool wysł.CCtool zwalid.MinIODokument wysłany prawidłowo do CCTool i na MINIO, trwa oczekiwanie na potwierdzenie ACK (status powinien się utrzymać krócej niż 3 minuty).Brak. Czekaj do 3-5 min na ACK; po tym czasie → stan timeout.CCtool wysł.CCtool zwalid.MinIOWysyłka do CCTool trwa i oczekiwany jest ACK. Dokument dostarczony na MINIO nie spełnia kryterium rozmiaru (w informacjach o wielkości rozmiaru dostępna z poziomu menu bocznego na statusie).Jeśli taki status „CCTool wysł." trwa dłużej niż 5 minut → zweryfikować stan w CCTool, ew. zgłosić problem Zweryfikować dokument IVA czy jest poprawny (pobierając go z CCM i rozpakowując) — pomimo zbyt małego rozmiaru sytuacja może być OK Jeśli plik z pkt. 2 jest niepoprawny → pozyskać IVA z PERUN i wysłać bezpośrednio z CCM bądź z GUI CCToolCCtool wysł.CCtool zwalid.MinIOZbliża się CET (22:06), a dokument nie został jeszcze obsłużony.Procedura (wg Confluence): Jeśli zbliża się CET (poniżej 3 minut) możliwa jest ręczna wysyłka IVA Backup z menu bocznego na poniższej pozycji pulpitu. Alternatywnie: R08 (Perun4V awaria), R09 (ERR-I), R10 (Process failed).CCtool wysł.CCtool zwalid.MinIODokument wysłany prawidłowo do CCTool i na MINIO, potwierdzenie ACK ma status czerwony co może oznaczać: (1) zawiera komunikat błędu (najedź kursorem na status); (2) proces zakończył się błędem — „Błąd procesu".Procedura: R05 — reakcja per kod ACK (20 gateClosed / 21 duplicatedVersion / 30 file size). Należy zweryfikować sytuację w CCTool.CCtool wysł.CCtool zwalid.MinIODokument wysłany prawidłowo do CCTool i na MINIO, trwa oczekiwanie na potwierdzenie ACK, które nie napłynęło w zadanym czasie (po najechaniu na znak zapytania można sprawdzić ile upłynęło czasu).Procedura: R06. Jeśli po około 3 minutach nie pojawi się status ACK wraz z informacją dostępną po najechaniu na status → należy zweryfikować sytuację w CCTool.CCtool wysł.CCtool zwalid.MinIODokument wysłany prawidłowo do CCTool i na MINIO. Dokument ACK (CCTool zwalid.) nie napłynął do CET.Procedury: R06, R18. Należy zweryfikować sytuację w CCTool. W przypadku wygenerowania ACK po stronie CCTool — sytuację zgłosić.CCtool wysł.CCtool zwalid.MinIOWysłany dokument nie spełnia kryterium rozmiaru (w informacjach o wielkości rozmiaru dostępna z poziomu menu bocznego na statusie). Trwa oczekiwanie na potwierdzenie ACK (CCTool zwalid.) — około 2 minut trwa taki status.Procedura: R05. Zweryfikować dokument IVA czy jest poprawny (pobierając go z CCM i rozpakowując) — pomimo zbyt małego rozmiaru sytuacja może być OK Jeśli plik z pkt. 1 jest niepoprawny → pozyskać IVA z PERUN i wysłać bezpośrednio z CCM bądź z GUI CCToolCCtool wysł.CCtool zwalid.MinIOWysłany dokument nie spełnia kryterium rozmiaru. Trwa oczekiwanie na potwierdzenie ACK (CCTool zwalid.), które nie napłynęło w zadanym czasie (po najechaniu na znak zapytania można sprawdzić ile upłynęło czasu).Procedura: R05, R06. Jeśli po około 3 minutach nie pojawi się status ACK wraz z informacją po najechaniu na status → zweryfikować sytuację w CCTool Zweryfikować dokument IVA (pobranie z CCM i rozpakowanie) — pomimo małego rozmiaru sytuacja może być OK Jeśli plik z pkt. 2 jest niepoprawny → pozyskać IVA z PERUN i wysłać bezpośrednio z CCM bądź z GUI CCToolCCtool wysł.CCtool zwalid.MinIOWysłany dokument nie spełnia kryterium rozmiaru, a otrzymane potwierdzenie ACK (CCTool zwalid.): (1) zawiera komunikat błędu; (2) proces zakończył się błędem — „Błąd procesu".Procedura: R05. Należy zweryfikować sytuację w CCTool Zweryfikować dokument IVA czy jest poprawny (pobranie z CCM i rozpakowanie) — pomimo małego rozmiaru sytuacja może być OK Jeśli plik z pkt. 2 jest niepoprawny → pozyskać IVA z PERUN i wysłać bezpośrednio z CCM bądź z GUI CCToolCCtool wysł.CCtool zwalid.MinIOWysłany dokument nie spełnia kryterium rozmiaru. Dokument ACK (CCTool zwalid.) napłynął po CET z pozytywnym komunikatem.Należy zweryfikować dokument IVA czy jest poprawny i czy został przyjęty w CCTool Jeśli plik z pkt. 1 jest niepoprawny → pozyskać IVA z PERUN i wysłać bezpośrednio z CCM bądź z GUI CCTool Po weryfikacji można nadać 'R' → Stan #21 (Kategoria A).CCtool wysł.CCtool zwalid.MinIOWysłany dokument nie spełnia kryterium rozmiaru. Dokument ACK (CCTool zwalid.) nie napłynął do CET.Zweryfikować sytuację w CCTool — w przypadku wygenerowania ACK po stronie CCTool sytuację zgłosić Zweryfikować dokument IVA (pobranie z CCM i rozpakowanie) — pomimo małego rozmiaru sytuacja może być OK Jeśli plik z pkt. 2 jest niepoprawny → pozyskać IVA z PERUN i wysłać bezpośrednio z CCM bądź z GUI CCToolCCtool wysł.CCtool zwalid.MinIODokument wysłany prawidłowo do CCTool i na MINIO po CET, potwierdzenie ACK ma status czerwony co może oznaczać: (1) zawiera komunikat błędu; (2) proces zakończył się błędem — „Błąd procesu".Procedura: R05. Należy zweryfikować sytuację w CCTool.CCtool wysł.CCtool zwalid.MinIODokument wysłany prawidłowo do CCTool i na MINIO po CET. Dokument ACK (CCTool zwalid.) nie napłynął do CET.Procedury: R06, R18. Należy zweryfikować sytuację w CCTool, w przypadku wygenerowania ACK po stronie CCTool sytuację zgłosić.CCtool wysł.CCtool zwalid.MinIODokument nie został dostarczony ani do CCTool ani na MINIO, w związku z tym potwierdzenie ACK nie napłynęło. Minął czas CET.Procedura (wg Confluence): Należy zweryfikować czy dokument IVA jest w PERUN. Jeśli TAK to należy go niezwłocznie pozyskać ręcznie i wysłać ją bezpośrednio z CCM bądź z GUI CCTool Procedury IDCC: R10 (Process failed) — oczekuj IVA BACKUP v1 od CCA; brak → R19 (CN2 nie kopiuje do CCA), R23 (brak raportu CCA). Zgłoś (CIZ, WPO, PSE-I) + telefon CCC. ❌ Zakaz fallbacku 20% Fmax z DA.MinIOPlik dostarczony prawidłowo na MinIO — status pozytywny.Brak działań — proces poprawny.MinIOStatus nadany ręcznie literą 'R' przez Dyspozytora po weryfikacji.Brak działań — decyzja ręczna Dyspozytora.MinIOPlik dostarczony po CET — status pozytywny.Brak działań — dostarczone po CET, OK.MinIOPrzedwczesne (&gt;30 min do TET) — plik jeszcze niewymagany.Monitoring — czekaj do TET.MinIOOczekiwanie / transfer w toku (stan przejściowy).Czekaj 5 min → sprawdź MinIO. Gdy brak → pobierz/wygeneruj plik ręcznie ze źródła i wgraj przez Manual Upload (GUI Core CC Tool) / wyślij z CCM.MinIOZbliża się TET — pliku jeszcze nie ma na MinIO.Sprawdź źródło (Kreator / Perun4V / Core CC Tool). Gdy brak → pobierz/wygeneruj plik ręcznie ze źródła i wgraj przez Manual Upload (GUI Core CC Tool) / wyślij z CCM.MinIOZbliża się CET / błąd dostarczenia — brak pliku na MinIO.Gdy pliku NIE ma na MinIO → pobierz/wygeneruj plik ręcznie ze źródła i wgraj przez Manual Upload (GUI Core CC Tool) / wyślij z CCM.MinIOMinął CET — plik niedostarczony. Krytyczne.Zgłoś (CIZ/WPO/PSE-I). Po CET — postępowanie krytyczne (brak lokalnego fallbacku).</w:t>
+      </w:r>
+    </w:p>
+    <w:p>
       <w:pPr>
         <w:pStyle w:val="Heading4"/>
       </w:pPr>
@@ -16728,6 +18120,16 @@
       </w:r>
     </w:p>
     <w:p>
+      <w:r>
+        <w:t>Warianty stanów (8)</w:t>
+      </w:r>
+    </w:p>
+    <w:p>
+      <w:r>
+        <w:t>Status kafelkaSytuacjaDziałania awaryjneMinIOPlik dostarczony prawidłowo na MinIO — status pozytywny.Brak działań — proces poprawny.MinIOStatus nadany ręcznie literą 'R' przez Dyspozytora po weryfikacji.Brak działań — decyzja ręczna Dyspozytora.MinIOPlik dostarczony po CET — status pozytywny.Brak działań — dostarczone po CET, OK.MinIOPrzedwczesne (&gt;30 min do TET) — plik jeszcze niewymagany.Monitoring — czekaj do TET.MinIOOczekiwanie / transfer w toku (stan przejściowy).Czekaj 5 min → sprawdź MinIO. Gdy brak → pobierz/wygeneruj plik ręcznie ze źródła i wgraj przez Manual Upload (GUI Core CC Tool) / wyślij z CCM.MinIOZbliża się TET — pliku jeszcze nie ma na MinIO.Sprawdź źródło (Kreator / Perun4V / Core CC Tool). Gdy brak → pobierz/wygeneruj plik ręcznie ze źródła i wgraj przez Manual Upload (GUI Core CC Tool) / wyślij z CCM.MinIOZbliża się CET / błąd dostarczenia — brak pliku na MinIO.Gdy pliku NIE ma na MinIO → pobierz/wygeneruj plik ręcznie ze źródła i wgraj przez Manual Upload (GUI Core CC Tool) / wyślij z CCM.MinIOMinął CET — plik niedostarczony. Krytyczne.Zgłoś (CIZ/WPO/PSE-I). Po CET — postępowanie krytyczne (brak lokalnego fallbacku).</w:t>
+      </w:r>
+    </w:p>
+    <w:p>
       <w:pPr>
         <w:pStyle w:val="Heading4"/>
       </w:pPr>
@@ -16809,6 +18211,16 @@
       </w:r>
     </w:p>
     <w:p>
+      <w:r>
+        <w:t>Warianty stanów (8)</w:t>
+      </w:r>
+    </w:p>
+    <w:p>
+      <w:r>
+        <w:t>Status kafelkaSytuacjaDziałania awaryjneMinIOPlik dostarczony prawidłowo na MinIO — status pozytywny.Brak działań — proces poprawny.MinIOStatus nadany ręcznie literą 'R' przez Dyspozytora po weryfikacji.Brak działań — decyzja ręczna Dyspozytora.MinIOPlik dostarczony po CET — status pozytywny.Brak działań — dostarczone po CET, OK.MinIOPrzedwczesne (&gt;30 min do TET) — plik jeszcze niewymagany.Monitoring — czekaj do TET.MinIOOczekiwanie / transfer w toku (stan przejściowy).Czekaj 5 min → sprawdź MinIO. Gdy brak → pobierz/wygeneruj plik ręcznie ze źródła i wgraj przez Manual Upload (GUI Core CC Tool) / wyślij z CCM.MinIOZbliża się TET — pliku jeszcze nie ma na MinIO.Sprawdź źródło (Kreator / Perun4V / Core CC Tool). Gdy brak → pobierz/wygeneruj plik ręcznie ze źródła i wgraj przez Manual Upload (GUI Core CC Tool) / wyślij z CCM.MinIOZbliża się CET / błąd dostarczenia — brak pliku na MinIO.Gdy pliku NIE ma na MinIO → pobierz/wygeneruj plik ręcznie ze źródła i wgraj przez Manual Upload (GUI Core CC Tool) / wyślij z CCM.MinIOMinął CET — plik niedostarczony. Krytyczne.Zgłoś (CIZ/WPO/PSE-I). Po CET — postępowanie krytyczne (brak lokalnego fallbacku).</w:t>
+      </w:r>
+    </w:p>
+    <w:p>
       <w:pPr>
         <w:pStyle w:val="Heading4"/>
       </w:pPr>
@@ -16905,6 +18317,16 @@
       </w:r>
     </w:p>
     <w:p>
+      <w:r>
+        <w:t>Warianty stanów (32)</w:t>
+      </w:r>
+    </w:p>
+    <w:p>
+      <w:r>
+        <w:t>Status kafelkaSytuacjaDziałania awaryjneCCtool wysł.CCtool zwalid.Dokument wysłany prawidłowo do CCTool, otrzymano potwierdzenie ACK z pozytywnym komunikatem.Brak działań — proces poprawny.CCtool wysł.CCtool zwalid.Dokument wysłany prawidłowo do CCTool. Dyspozytor ustawił status ręcznie 'R' po weryfikacji w CCTool.Brak działań.CCtool wysł.CCtool zwalid.Dokument wysłany prawidłowo do CCTool po CET, ACK napłynął po CET z pozytywnym komunikatem.Brak działań — dostarczone po CET, OK.CCtool wysł.CCtool zwalid.Dokument oznaczony ręcznie jako wysłany prawidłowo do CCTool oraz otrzymanie potwierdzenia ACK.Brak działań.CCtool wysł.CCtool zwalid.Dokument prawidłowo wysłany ręcznie z poziomu CCM. Otrzymano potwierdzenie ACK z pozytywnym komunikatem.Brak działań — wysyłka ręczna wykonana.CCtool wysł.CCtool zwalid.Dokument prawidłowo wysłany ręcznie z poziomu CCM. Trwa oczekiwanie na potwierdzenie ACK — około 2 min.Postępowanie:Czekaj 5 minOK → ustaw 'R' w CCMCCtool wysł.CCtool zwalid.Dokument wysłany ręcznie z poziomu CCM, ale ACK nie napłynął w żądanym czasie i zbliża się CET.Postępowanie:Core CC Tool → sprawdź czy plik dotarł (Message Viewer)Jeżeli:OK → oznacz 'R' w CCMbłąd → Plik został odrzucony — odczytaj kod błędu z potwierdzenia ACK i zareaguj zależnie od kodu:kod 20 (bramka dla pliku zamknięta) — zgłoś administratorowi Core CC Toolkod 21 (wersja nie jest wyższa niż już zapisana) — w źródle podnieś numer wersji i wyślij plik ponowniekod 30 (rozmiar pliku niezgodny) — pobierz poprawny plik i wyślij ponownie pełny opis w bazie ryzykbrak → Awaria transportu plików (Connector 2.0). Zgłoś awarię. W międzyczasie pobierz plik ze źródła (aplikacji ZP) i wyślij go ręcznie przez Core CC Tool (Manual Upload). pełny opis w bazie ryzykCCtool wysł.CCtool zwalid.Dokument wysłany ręcznie z poziomu CCM, a otrzymane ACK: (1) zawiera komunikat błędu (najedź kursorem); (2) proces zakończył się błędem — 'Błąd procesu'.Postępowanie:Najedź kursorem na status i odczytaj kod ACKJeżeli:kod 20 (bramka dla pliku zamknięta) → zgłoś administratorowi Core CC Toolkod 21 (wersja nie jest wyższa niż zapisana) → podnieś numer wersji w aplikacji ZP i wyślij plik ponownie przez Core CC Tool (Manual Upload)kod 30 (rozmiar pliku niezgodny) → pobierz poprawny plik z MinIO lub aplikacji ZP i wyślij ponownieCCtool wysł.CCtool zwalid.Dokument prawidłowo wysłany ręcznie z poziomu CCM. Otrzymano potwierdzenie ACK z pozytywnym komunikatem po CET.Brak działań — ręczna + ACK po CET, OK.CCtool wysł.CCtool zwalid.Dokument prawidłowo wysłany ręcznie z poziomu CCM. Nie otrzymano potwierdzenia ACK — upłynął czas CET.Postępowanie:Core CC Tool → sprawdź statusJeżeli:OK (Processed) → oznacz 'R' w CCM + zgłośbrak / awaria zwrotna → Awaria transportu plików (Connector 2.0). Zgłoś awarię. W międzyczasie pobierz plik ze źródła (aplikacji ZP) i wyślij go ręcznie przez Core CC Tool (Manual Upload). pełny opis w bazie ryzykCCtool wysł.CCtool zwalid.Dokument prawidłowo wysłany ręcznie z poziomu CCM. Nie otrzymano ACK, Dyspozytor ustawił status 'R' po weryfikacji w CCTool.Brak działań — decyzja ręczna Dyspozytora.CCtool wysł.CCtool zwalid.Dokument prawidłowo wysłany ręcznie z poziomu CCM po CET. Trwa oczekiwanie na potwierdzenie ACK — około 2 min.Postępowanie:Czekaj 2-5 minOK → ustaw 'R'CCtool wysł.CCtool zwalid.Dokument wysłany ręcznie z poziomu CCM po CET. Trwa oczekiwanie na potwierdzenie ACK — upłynęło więcej niż 2 minuty.Postępowanie:Core CC Tool → sprawdź czy plik dotarł (Message Viewer)Jeżeli:OK → oznacz 'R' w CCMbłąd → Plik został odrzucony — odczytaj kod błędu z potwierdzenia ACK i zareaguj zależnie od kodu:kod 20 (bramka dla pliku zamknięta) — zgłoś administratorowi Core CC Toolkod 21 (wersja nie jest wyższa niż już zapisana) — w źródle podnieś numer wersji i wyślij plik ponowniekod 30 (rozmiar pliku niezgodny) — pobierz poprawny plik i wyślij ponownie pełny opis w bazie ryzykbrak → Awaria transportu plików (Connector 2.0). Zgłoś awarię. W międzyczasie pobierz plik ze źródła (aplikacji ZP) i wyślij go ręcznie przez Core CC Tool (Manual Upload). pełny opis w bazie ryzykCCtool wysł.CCtool zwalid.Dokument wysłany ręcznie z poziomu CCM po CET, a otrzymane ACK: (1) komunikat błędu; (2) proces zakończył się błędem. Typowo kod 20 gateClosed.Postępowanie:Najedź kursorem na status i odczytaj kod ACK (typowo kod 20)Jeżeli:kod 20 (bramka dla pliku zamknięta) → po CET bramka jest zamknięta → zgłośinny kod → Plik został odrzucony — odczytaj kod błędu z potwierdzenia ACK i zareaguj zależnie od kodu:kod 20 (bramka dla pliku zamknięta) — zgłoś administratorowi Core CC Toolkod 21 (wersja nie jest wyższa niż już zapisana) — w źródle podnieś numer wersji i wyślij plik ponowniekod 30 (rozmiar pliku niezgodny) — pobierz poprawny plik i wyślij ponownie pełny opis w bazie ryzykCCtool wysł.CCtool zwalid.Dokument prawidłowo wysłany ręcznie z poziomu CCM po CET. Otrzymano potwierdzenie ACK z pozytywnym komunikatem (po CET).Brak działań — ręczna + ACK po CET, OK.CCtool wysł.CCtool zwalid.Dokument prawidłowo wysłany ręcznie z poziomu CCM po CET. Nie otrzymano potwierdzenia ACK — upłynął czas CET.Postępowanie:Core CC Tool → sprawdź statusJeżeli:OK (Processed) → oznacz 'R' w CCM + zgłośbrak / awaria zwrotna → Awaria transportu plików (Connector 2.0). Zgłoś awarię. W międzyczasie pobierz plik ze źródła (aplikacji ZP) i wyślij go ręcznie przez Core CC Tool (Manual Upload). pełny opis w bazie ryzykCCtool wysł.CCtool zwalid.Dokument oznaczony ręcznie jako wysłany prawidłowo do CCTool. Trwa oczekiwanie na ACK — około 2 min.Postępowanie:Czekaj 5 minOK → 'R' dla ACKCCtool wysł.CCtool zwalid.Dokument oznaczony ręcznie jako wysłany prawidłowo. Trwa oczekiwanie na ACK — upłynęło więcej niż 2 min.Postępowanie:Czekaj 5 minOK → 'R' dla ACKCCtool wysł.CCtool zwalid.Dokument oznaczony ręcznie jako wysłany prawidłowo. Nie otrzymano potwierdzenia ACK — upłynął czas CET.Postępowanie:Core CC Tool → sprawdź statusJeżeli:OK (Processed) → utrzymaj 'R'brak / awaria → Awaria transportu plików (Connector 2.0). Zgłoś awarię. W międzyczasie pobierz plik ze źródła (aplikacji ZP) i wyślij go ręcznie przez Core CC Tool (Manual Upload). pełny opis w bazie ryzykCCtool wysł.CCtool zwalid.Wysłany dokument nie spełnia kryterium rozmiaru. ACK nie otrzymano, Dyspozytor ustawił status 'R' po weryfikacji w CCTool.Brak działań — Dyspozytor zatwierdził zawartość.CCtool wysł.CCtool zwalid.Dokument jeszcze nie został wysłany do CCTool, ACK nie napłynął. Plik nie wymagany (&gt;30 min do TET).Brak działań — czekaj do TET.CCtool wysł.CCtool zwalid.Zbliża się CET — plik niedostarczony lub błąd wysyłki. Stan alarmowy.Postępowanie (alarm):Core CC Tool → sprawdź czy plik dotarł do Core CC ToolJeżeli:plik jest, brak ACK → Plik został odrzucony — odczytaj kod błędu z potwierdzenia ACK i zareaguj zależnie od kodu:kod 20 (bramka dla pliku zamknięta) — zgłoś administratorowi Core CC Toolkod 21 (wersja nie jest wyższa niż już zapisana) — w źródle podnieś numer wersji i wyślij plik ponowniekod 30 (rozmiar pliku niezgodny) — pobierz poprawny plik i wyślij ponownie pełny opis w bazie ryzykbrak pliku (awaria Connector 2.0) → Awaria transportu plików (Connector 2.0). Zgłoś awarię. W międzyczasie pobierz plik ze źródła (aplikacji ZP) i wyślij go ręcznie przez Core CC Tool (Manual Upload). pełny opis w bazie ryzykbrak pliku w źródle → Brak pliku lub wersji w aplikacji źródłowej. Otwórz aplikacji ZP, przejdź do bilansu i sprawdź wersję pliku: jeśli wersja jest dostępna — pobierz ją (Pobierz XML); jeśli brakuje — wygeneruj nową wersję; jeśli aplikacja nie działa — zgłoś. pełny opis w bazie ryzykCCtool wysł.CCtool zwalid.Wysłany dokument nie spełnia kryterium rozmiaru. Oczekiwanie na ACK — upłynęło więcej niż 2 min.Postępowanie:W aplikacji CCM kliknij plik lewym przyciskiem myszy → Informacje → sprawdź rozmiar; pobierz z MinIO i rozpakujJeżeli:zawartość OK mimo rozmiaru → oznacz 'R' (→ powiązany stan)zawartość niepoprawna → Plik został odrzucony — odczytaj kod błędu z potwierdzenia ACK i zareaguj zależnie od kodu:kod 20 (bramka dla pliku zamknięta) — zgłoś administratorowi Core CC Toolkod 21 (wersja nie jest wyższa niż już zapisana) — w źródle podnieś numer wersji i wyślij plik ponowniekod 30 (rozmiar pliku niezgodny) — pobierz poprawny plik i wyślij ponownie pełny opis w bazie ryzykCCtool wysł.CCtool zwalid.Wysłany dokument nie spełnia kryterium rozmiaru, a ACK ma status czerwony — typowo kod 30.Postępowanie:W aplikacji CCM kliknij plik lewym przyciskiem myszy → Informacje → potwierdź rozmiarPobierz poprawny plik z aplikacji ZP (Pobierz XML) i wyślij przez Core CC Tool (Manual Upload) z kolejnym numerem wersjiNadal za mały → zgłoś szczegóły w bazie ryzykCCtool wysł.CCtool zwalid.Wysłany dokument nie spełnia kryterium rozmiaru. ACK napłynął po CET z pozytywnym komunikatem. Sprzeczność.Postępowanie:Pobierz z MinIO → rozpakuj → sprawdź zawartośćJeżeli:zawartość OK → oznacz 'R' (→ powiązany stan); zgłośniepoprawna → zgłośCCtool wysł.CCtool zwalid.Dokument wysłany prawidłowo do CCTool, ale ACK negatywny (Rejected). Kody: 20/21/30.Postępowanie:Najedź kursorem na status i odczytaj kod ACKJeżeli:kod 20 (bramka dla pliku zamknięta) → zgłoś (administrator Core CC Tool otwiera bramkę); sprawdź proces IDx-AC-FORWARDINGkod 21 (wersja nie jest wyższa niż zapisana) → podnieś numer wersji w aplikacji ZP i wyślij plik ponownie przez Core CC Tool (Manual Upload)kod 30 (rozmiar pliku niezgodny) → pobierz poprawny plik z MinIO lub aplikacji ZP i wyślij ponownieCCtool wysł.CCtool zwalid.Dokument wysłany prawidłowo, trwa oczekiwanie na ACK, który nie napłynął w zadanym czasie (&gt;2-3 min).Postępowanie:Czekaj 5 min → Core CC Tool (⚠ nie wysyłaj ponownie!)Jeżeli:Processed → oznacz 'R' + zgłośRejected → patrz stan kod ACKbrak wpisu → Awaria transportu plików (Connector 2.0). Zgłoś awarię. W międzyczasie pobierz plik ze źródła (aplikacji ZP) i wyślij go ręcznie przez Core CC Tool (Manual Upload). pełny opis w bazie ryzykCCtool wysł.CCtool zwalid.Dokument wysłany prawidłowo, ACK nie napłynął do CET.Postępowanie:Core CC Tool → sprawdź statusJeżeli:Processed → oznacz 'R' + zgłoś (→ powiązany stan)Rejected → wyślij ponownie przez Core CC Tool (Manual Upload) "po CET"brak → Awaria transportu plików (Connector 2.0). Zgłoś awarię. W międzyczasie pobierz plik ze źródła (aplikacji ZP) i wyślij go ręcznie przez Core CC Tool (Manual Upload). pełny opis w bazie ryzyk + powiadom RCCCCtool wysł.CCtool zwalid.Wysłany dokument nie spełnia kryterium rozmiaru. ACK nie napłynął do CET. Krytyczne.Postępowanie (KRYTYCZNE w C):Pobierz poprawny plik z aplikacji ZP i wyślij przez Core CC Tool (Manual Upload) "po CET" (jeśli bramka otwarta)Natychmiast: zgłoś + powiadom RCC szczegóły w bazie ryzykCCtool wysł.CCtool zwalid.Dokument zarejestrowany w CCTool po CET (wysyłka pozytywna), ale walidacja zakończona negatywnie — ACK Rejected po CET.Postępowanie (po CET):Najedź kursorem na status i odczytaj kod ACK (kontekst: rejestracja po CET)Jeżeli:kod 20 (bramka dla pliku zamknięta) → po CET bramka zamknięta → zgłoś + powiadom RCCkod 21 (wersja nie jest wyższa niż zapisana) → podnieś numer wersji w aplikacji ZP i wyślij plik ponownie przez Core CC Tool (Manual Upload) (jeśli bramka otwarta)kod 30 (rozmiar pliku niezgodny) → pobierz poprawny plik z MinIO lub aplikacji ZP i wyślij ponownie (jeśli bramka otwarta)CCtool wysł.CCtool zwalid.Dokument zarejestrowany w CCTool po CET (wysyłka pozytywna), ale ACK walidacji nie napłynął — plik dostarczony, lecz niezwalidowany.Postępowanie (po CET):Core CC Tool → sprawdź status walidacji (plik dostarczony po CET)Jeżeli:Processed → oznacz 'R' w CCM + zgłośRejected → postępuj jak w Stanie 30 (odczytaj kod ACK)brak wpisu → Awaria transportu plików (Connector 2.0). Zgłoś awarię. W międzyczasie pobierz plik ze źródła (aplikacji ZP) i wyślij go ręcznie przez Core CC Tool (Manual Upload). pełny opis w bazie ryzyk + powiadom RCCCCtool wysł.CCtool zwalid.Dokument nie został dostarczony do CCTool, ACK nie napłynął. Minął czas CET. KRYTYCZNE — po CET dograć nie można.Postępowanie (KRYTYCZNE — brak naprawy):Telefon do RCC + zgłoś (priorytet P1)Po CET — brak naprawy. Diagnoza przyczyn: ZP · Connector 2.0 · Core CC Tool szczegóły w bazie ryzyk</w:t>
+      </w:r>
+    </w:p>
+    <w:p>
       <w:pPr>
         <w:pStyle w:val="Heading4"/>
       </w:pPr>
@@ -16966,6 +18388,16 @@
       </w:r>
     </w:p>
     <w:p>
+      <w:r>
+        <w:t>Warianty stanów (8)</w:t>
+      </w:r>
+    </w:p>
+    <w:p>
+      <w:r>
+        <w:t>Status kafelkaSytuacjaDziałania awaryjneMinIOPlik dostarczony prawidłowo na MinIO — status pozytywny.Brak działań — proces poprawny.MinIOStatus nadany ręcznie literą 'R' przez Dyspozytora po weryfikacji.Brak działań — decyzja ręczna Dyspozytora.MinIOPlik dostarczony po CET — status pozytywny.Brak działań — dostarczone po CET, OK.MinIOPrzedwczesne (&gt;30 min do TET) — plik jeszcze niewymagany.Monitoring — czekaj do TET.MinIOOczekiwanie / transfer w toku (stan przejściowy).Czekaj 5 min → sprawdź MinIO. Gdy brak → pobierz/wygeneruj plik ręcznie ze źródła i wgraj przez Manual Upload (GUI Core CC Tool) / wyślij z CCM.MinIOZbliża się TET — pliku jeszcze nie ma na MinIO.Sprawdź źródło (Kreator / Perun4V / Core CC Tool). Gdy brak → pobierz/wygeneruj plik ręcznie ze źródła i wgraj przez Manual Upload (GUI Core CC Tool) / wyślij z CCM.MinIOZbliża się CET / błąd dostarczenia — brak pliku na MinIO.Gdy pliku NIE ma na MinIO → pobierz/wygeneruj plik ręcznie ze źródła i wgraj przez Manual Upload (GUI Core CC Tool) / wyślij z CCM.MinIOMinął CET — plik niedostarczony. Krytyczne.Zgłoś (CIZ/WPO/PSE-I). Po CET — postępowanie krytyczne (brak lokalnego fallbacku).</w:t>
+      </w:r>
+    </w:p>
+    <w:p>
       <w:pPr>
         <w:pStyle w:val="Heading4"/>
       </w:pPr>
@@ -17027,6 +18459,16 @@
       </w:r>
     </w:p>
     <w:p>
+      <w:r>
+        <w:t>Warianty stanów (8)</w:t>
+      </w:r>
+    </w:p>
+    <w:p>
+      <w:r>
+        <w:t>Status kafelkaSytuacjaDziałania awaryjneMinIOPlik dostarczony prawidłowo na MinIO — status pozytywny.Brak działań — proces poprawny.MinIOStatus nadany ręcznie literą 'R' przez Dyspozytora po weryfikacji.Brak działań — decyzja ręczna Dyspozytora.MinIOPlik dostarczony po CET — status pozytywny.Brak działań — dostarczone po CET, OK.MinIOPrzedwczesne (&gt;30 min do TET) — plik jeszcze niewymagany.Monitoring — czekaj do TET.MinIOOczekiwanie / transfer w toku (stan przejściowy).Czekaj 5 min → sprawdź MinIO. Gdy brak → pobierz/wygeneruj plik ręcznie ze źródła i wgraj przez Manual Upload (GUI Core CC Tool) / wyślij z CCM.MinIOZbliża się TET — pliku jeszcze nie ma na MinIO.Sprawdź źródło (Kreator / Perun4V / Core CC Tool). Gdy brak → pobierz/wygeneruj plik ręcznie ze źródła i wgraj przez Manual Upload (GUI Core CC Tool) / wyślij z CCM.MinIOZbliża się CET / błąd dostarczenia — brak pliku na MinIO.Gdy pliku NIE ma na MinIO → pobierz/wygeneruj plik ręcznie ze źródła i wgraj przez Manual Upload (GUI Core CC Tool) / wyślij z CCM.MinIOMinął CET — plik niedostarczony. Krytyczne.Zgłoś (CIZ/WPO/PSE-I). Po CET — postępowanie krytyczne (brak lokalnego fallbacku).</w:t>
+      </w:r>
+    </w:p>
+    <w:p>
       <w:pPr>
         <w:pStyle w:val="Heading4"/>
       </w:pPr>
@@ -17088,6 +18530,16 @@
       </w:r>
     </w:p>
     <w:p>
+      <w:r>
+        <w:t>Warianty stanów (8)</w:t>
+      </w:r>
+    </w:p>
+    <w:p>
+      <w:r>
+        <w:t>Status kafelkaSytuacjaDziałania awaryjneMinIOPlik dostarczony prawidłowo na MinIO — status pozytywny.Brak działań — proces poprawny.MinIOStatus nadany ręcznie literą 'R' przez Dyspozytora po weryfikacji.Brak działań — decyzja ręczna Dyspozytora.MinIOPlik dostarczony po CET — status pozytywny.Brak działań — dostarczone po CET, OK.MinIOPrzedwczesne (&gt;30 min do TET) — plik jeszcze niewymagany.Monitoring — czekaj do TET.MinIOOczekiwanie / transfer w toku (stan przejściowy).Czekaj 5 min → sprawdź MinIO. Gdy brak → pobierz/wygeneruj plik ręcznie ze źródła i wgraj przez Manual Upload (GUI Core CC Tool) / wyślij z CCM.MinIOZbliża się TET — pliku jeszcze nie ma na MinIO.Sprawdź źródło (Kreator / Perun4V / Core CC Tool). Gdy brak → pobierz/wygeneruj plik ręcznie ze źródła i wgraj przez Manual Upload (GUI Core CC Tool) / wyślij z CCM.MinIOZbliża się CET / błąd dostarczenia — brak pliku na MinIO.Gdy pliku NIE ma na MinIO → pobierz/wygeneruj plik ręcznie ze źródła i wgraj przez Manual Upload (GUI Core CC Tool) / wyślij z CCM.MinIOMinął CET — plik niedostarczony. Krytyczne.Zgłoś (CIZ/WPO/PSE-I). Po CET — postępowanie krytyczne (brak lokalnego fallbacku).</w:t>
+      </w:r>
+    </w:p>
+    <w:p>
       <w:pPr>
         <w:pStyle w:val="Heading4"/>
       </w:pPr>
@@ -17154,6 +18606,16 @@
       </w:r>
     </w:p>
     <w:p>
+      <w:r>
+        <w:t>Warianty stanów (8)</w:t>
+      </w:r>
+    </w:p>
+    <w:p>
+      <w:r>
+        <w:t>Status kafelkaSytuacjaDziałania awaryjnesFTP/ZP wysł.Plik dostarczony prawidłowo na sFTP/ZP — status pozytywny.Brak działań — proces poprawny.sFTP/ZP wysł.Status nadany ręcznie literą 'R' przez Dyspozytora po weryfikacji.Brak działań — decyzja ręczna Dyspozytora.sFTP/ZP wysł.Plik dostarczony po CET — status pozytywny.Brak działań — dostarczone po CET, OK.sFTP/ZP wysł.Przedwczesne (&gt;30 min do TET) — plik jeszcze niewymagany.Monitoring — czekaj do TET.sFTP/ZP wysł.Oczekiwanie / transfer w toku (stan przejściowy).Czekaj 5 min → sprawdź sFTP/ZP. Gdy brak → wyślij plik ręcznie ze źródła na sFTP/ZP.sFTP/ZP wysł.Zbliża się TET — pliku jeszcze nie ma na sFTP/ZP.Sprawdź źródło (Kreator / Perun4V / Core CC Tool). Gdy brak → wyślij plik ręcznie ze źródła na sFTP/ZP.sFTP/ZP wysł.Zbliża się CET / błąd dostarczenia — brak pliku na sFTP/ZP.Gdy pliku NIE ma na sFTP/ZP → wyślij plik ręcznie ze źródła na sFTP/ZP.sFTP/ZP wysł.Minął CET — plik niedostarczony. Krytyczne.Zgłoś (CIZ/WPO/PSE-I). Po CET — postępowanie krytyczne (brak lokalnego fallbacku).</w:t>
+      </w:r>
+    </w:p>
+    <w:p>
       <w:pPr>
         <w:pStyle w:val="Heading4"/>
       </w:pPr>
@@ -17235,6 +18697,16 @@
       </w:r>
     </w:p>
     <w:p>
+      <w:r>
+        <w:t>Warianty stanów (18)</w:t>
+      </w:r>
+    </w:p>
+    <w:p>
+      <w:r>
+        <w:t>Status kafelkaSytuacjaDziałania awaryjneCCtool wysł.CCtool zwalid.Przedwczesne (&gt;30 min do TET). Walidacja ATC jeszcze nie ukończona.Monitoring — sprawdź w aplikacji CCM postęp walidacji paczki PERUN_IDx_ATC.CCtool wysł.CCtool zwalid.Zbliża się TET, brak FIDx-928. Walidacja paczki ATC w toku.Postępowanie:Rozwiń agregat PERUN_IDx_ATC → zweryfikuj składoweJeżeli:brak składowej → uzupełnij brakującą składową w aplikacji CCM ()składowe OK → monitoruj — czekaj na wynik walidacjiCCtool wysł.CCtool zwalid.Zbliża się CET — brak wyniku walidacji ATC. Stan alarmowy.Postępowanie (zbliża się CET):Ostatnia szansa: dokończ uzupełnienia paczki ATC w CCM; sprawdź Core CC Tool (Message Viewer)Jeżeli:plik dotrze → OK — koniecbłąd → odczytaj kod ACK (patrz powiązany stan)brak → zgłośCCtool wysł.CCtool zwalid.Minął CET, brak FIDx-928. KRYTYCZNE — brak lokalnego fallbacku.Postępowanie (KRYTYCZNE — minął CET):⛔ STOP — żadnych działań ręcznych. Brak lokalnego fallbacku (brak wyniku ATC w czasie → Dyspozytor nie wykonuje dalszych czynności).Zgłoś + telefon do RCC szczegóły w bazie ryzykCCtool wysł.CCtool zwalid.Happy Day — walidacja ATC zakończona poprawnie, wynik opublikowany.Brak interwencji — walidacja ATC zakończona poprawnie.CCtool wysł.CCtool zwalid.Wynik dotarł, ale ACK negatywny (Rejected).Postępowanie:Core CC Tool (Message Viewer) → odczytaj kod ACKJeżeli:kod 20 (bramka dla pliku zamknięta) → zgłoś (administrator Core CC Tool otwiera bramkę)kod 21 (błąd procesowy CCCt) → zgłoś — błąd procesu w Core CC Toolkod 30 (rozmiar niezgodny) → patrz stan rozmiarCCtool wysł.CCtool zwalid.Wynik dotarł, ACK nie napłynął w czasie (timeout).Postępowanie:Czekaj 5 min → Core CC Tool (Message Viewer)Jeżeli:Processed → oznacz 'R' w CCMbrak &gt;10 min → zgłoś — sprawdź transport zwrotny Connector 2.0 (R18)CCtool wysł.CCtool zwalid.Wynik dotarł, brak ACK do CET.Postępowanie:Sprawdź transport zwrotny Connector 2.0Jeżeli:transport OK, ACK błąd → odczytaj kod ACK (patrz powiązany stan)awaria transportu → zgłoś (R18)CCtool wysł.CCtool zwalid.Wynik dotarł, ACK napłynął po CET — pozytywny.Walidacja opóźniona, ale OK (ACK po CET pozytywny).CCtool wysł.CCtool zwalid.Status nadany ręcznie 'R' (nietypowe dla pliku zwrotnego).Brak działań — status nadany ręcznie przez Dyspozytora (nietypowe dla pliku zwrotnego).CCtool wysł.CCtool zwalid.Niepoprawny rozmiar wyniku FIDx-928.Postępowanie:W aplikacji CCM kliknij plik lewym przyciskiem myszy → Informacje → sprawdź rozmiar (pobranie ponownie nie ma sensu — plik zwrotny)Jeżeli:zawartość OK mimo rozmiaru → oznacz 'R' w CCMzawartość niepoprawna → zgłoś + telefon do RCCCCtool wysł.CCtool zwalid.Niepoprawny rozmiar + brak ACK (timeout).Postępowanie:Core CC Tool (Message Viewer) → sprawdź statusJeżeli:Processed → oznacz 'R' w CCMbrak → zgłoś + telefon do RCCCCtool wysł.CCtool zwalid.Niepoprawny rozmiar + ACK negatywny.Postępowanie:Core CC Tool (Message Viewer) → odczytaj kod ACKJeżeli:kod 20 (bramka zamknięta) → zgłoś (administrator Core CC Tool)kod 30 (rozmiar) → patrz powiązany staninny → zgłoś + telefon do RCCCCtool wysł.CCtool zwalid.Niepoprawny rozmiar + brak ACK do CET. KRYTYCZNE.Postępowanie (KRYTYCZNE):⛔ Krytyczne — minął CET, niepoprawny rozmiar i brak ACK.Zgłoś + telefon do RCC szczegóły w bazie ryzykCCtool wysł.CCtool zwalid.FIDx-928 dostarczony po CET — walidacja OK.Walidacja zakończona po terminie — OK.CCtool wysł.CCtool zwalid.Wysyłka zwrotna trwa (transport Connector 2.0).Postępowanie:Czekaj 5 min (transport zwrotny Connector 2.0)Jeżeli:zmieniło się na zielony → OK — koniecbrak &gt;10 min → zgłoś (R18)CCtool wysł.CCtool zwalid.Status ręczny przyznany (nietypowe dla pliku zwrotnego).Brak działań — status ręczny przyznany przez Dyspozytora (nietypowe dla pliku zwrotnego).CCtool wysł.CCtool zwalid.TET zbliża się, ACK błąd już teraz (błąd paczki ATC).Postępowanie:Core CC Tool (Message Viewer) → odczytaj błąd paczki ATCJeżeli:błąd składowej → uzupełnij składową w aplikacji CCMinny → odczytaj kod ACK (patrz powiązany stan)</w:t>
+      </w:r>
+    </w:p>
+    <w:p>
       <w:pPr>
         <w:pStyle w:val="Heading4"/>
       </w:pPr>
@@ -17311,6 +18783,16 @@
       </w:r>
     </w:p>
     <w:p>
+      <w:r>
+        <w:t>Warianty stanów (10)</w:t>
+      </w:r>
+    </w:p>
+    <w:p>
+      <w:r>
+        <w:t>Status kafelkaSytuacjaDziałania awaryjneMinIOsFTP/ZP wysł.Paczka dostarczona prawidłowo na MinIO i sFTP/ZP.Brak działań — proces poprawny.MinIOsFTP/ZP wysł.Status nadany ręcznie 'R' po weryfikacji.Brak działań — decyzja ręczna.MinIOsFTP/ZP wysł.Paczka dostarczona po CET — status pozytywny.Brak działań — po CET OK.MinIOsFTP/ZP wysł.Przedwczesne — paczka jeszcze niewymagana.Monitoring — czekaj do TET.MinIOsFTP/ZP wysł.Zbliża się TET — paczka niekompletna / brak.Sprawdź agregację składowych. Gdy brak → zagreguj/pobierz ręcznie i wrzuć (Manual Upload / wysyłka na sFTP).MinIOsFTP/ZP wysł.Na MinIO OK, brak / błąd na sFTP/ZP.Gdy brak na sFTP → wyślij plik ręcznie ze źródła na sFTP/ZP.MinIOsFTP/ZP wysł.Brak / błąd na MinIO, OK na sFTP/ZP.Gdy brak na MinIO → pobierz/wygeneruj ręcznie i wgraj przez Manual Upload (GUI Core CC Tool).MinIOsFTP/ZP wysł.Transfer w toku (MinIO i sFTP/ZP).Czekaj 5 min → sprawdź MinIO i sFTP. Gdy brak → ręcznie (Manual Upload / wysyłka na sFTP).MinIOsFTP/ZP wysł.Zbliża się CET — brak / błąd na MinIO i sFTP/ZP.Gdy brak na MinIO → Manual Upload; gdy brak na sFTP → wyślij ręcznie.MinIOsFTP/ZP wysł.Minął CET — paczka niedostarczona. Krytyczne.Zgłoś (CIZ/WPO/PSE-I). Postępowanie krytyczne.</w:t>
+      </w:r>
+    </w:p>
+    <w:p>
       <w:pPr>
         <w:pStyle w:val="Heading4"/>
       </w:pPr>
@@ -17387,6 +18869,16 @@
       </w:r>
     </w:p>
     <w:p>
+      <w:r>
+        <w:t>Warianty stanów (10)</w:t>
+      </w:r>
+    </w:p>
+    <w:p>
+      <w:r>
+        <w:t>Status kafelkaSytuacjaDziałania awaryjneMinIOsFTP/ZP wysł.Paczka dostarczona prawidłowo na MinIO i sFTP/ZP.Brak działań — proces poprawny.MinIOsFTP/ZP wysł.Status nadany ręcznie 'R' po weryfikacji.Brak działań — decyzja ręczna.MinIOsFTP/ZP wysł.Paczka dostarczona po CET — status pozytywny.Brak działań — po CET OK.MinIOsFTP/ZP wysł.Przedwczesne — paczka jeszcze niewymagana.Monitoring — czekaj do TET.MinIOsFTP/ZP wysł.Zbliża się TET — paczka niekompletna / brak.Sprawdź agregację składowych. Gdy brak → zagreguj/pobierz ręcznie i wrzuć (Manual Upload / wysyłka na sFTP).MinIOsFTP/ZP wysł.Na MinIO OK, brak / błąd na sFTP/ZP.Gdy brak na sFTP → wyślij plik ręcznie ze źródła na sFTP/ZP.MinIOsFTP/ZP wysł.Brak / błąd na MinIO, OK na sFTP/ZP.Gdy brak na MinIO → pobierz/wygeneruj ręcznie i wgraj przez Manual Upload (GUI Core CC Tool).MinIOsFTP/ZP wysł.Transfer w toku (MinIO i sFTP/ZP).Czekaj 5 min → sprawdź MinIO i sFTP. Gdy brak → ręcznie (Manual Upload / wysyłka na sFTP).MinIOsFTP/ZP wysł.Zbliża się CET — brak / błąd na MinIO i sFTP/ZP.Gdy brak na MinIO → Manual Upload; gdy brak na sFTP → wyślij ręcznie.MinIOsFTP/ZP wysł.Minął CET — paczka niedostarczona. Krytyczne.Zgłoś (CIZ/WPO/PSE-I). Postępowanie krytyczne.</w:t>
+      </w:r>
+    </w:p>
+    <w:p>
       <w:pPr>
         <w:pStyle w:val="Heading4"/>
       </w:pPr>
@@ -17458,6 +18950,16 @@
       </w:r>
     </w:p>
     <w:p>
+      <w:r>
+        <w:t>Warianty stanów (8)</w:t>
+      </w:r>
+    </w:p>
+    <w:p>
+      <w:r>
+        <w:t>Status kafelkaSytuacjaDziałania awaryjnesFTP/ZP wysł.Plik dostarczony prawidłowo na sFTP/ZP — status pozytywny.Brak działań — proces poprawny.sFTP/ZP wysł.Status nadany ręcznie literą 'R' przez Dyspozytora po weryfikacji.Brak działań — decyzja ręczna Dyspozytora.sFTP/ZP wysł.Plik dostarczony po CET — status pozytywny.Brak działań — dostarczone po CET, OK.sFTP/ZP wysł.Przedwczesne (&gt;30 min do TET) — plik jeszcze niewymagany.Monitoring — czekaj do TET.sFTP/ZP wysł.Oczekiwanie / transfer w toku (stan przejściowy).Czekaj 5 min → sprawdź sFTP/ZP. Gdy brak → wyślij plik ręcznie ze źródła na sFTP/ZP.sFTP/ZP wysł.Zbliża się TET — pliku jeszcze nie ma na sFTP/ZP.Sprawdź źródło (Kreator / Perun4V / Core CC Tool). Gdy brak → wyślij plik ręcznie ze źródła na sFTP/ZP.sFTP/ZP wysł.Zbliża się CET / błąd dostarczenia — brak pliku na sFTP/ZP.Gdy pliku NIE ma na sFTP/ZP → wyślij plik ręcznie ze źródła na sFTP/ZP.sFTP/ZP wysł.Minął CET — plik niedostarczony. Krytyczne.Zgłoś (CIZ/WPO/PSE-I). Po CET — postępowanie krytyczne (brak lokalnego fallbacku).</w:t>
+      </w:r>
+    </w:p>
+    <w:p>
       <w:pPr>
         <w:pStyle w:val="Heading4"/>
       </w:pPr>
@@ -17529,6 +19031,16 @@
       </w:r>
     </w:p>
     <w:p>
+      <w:r>
+        <w:t>Warianty stanów (8)</w:t>
+      </w:r>
+    </w:p>
+    <w:p>
+      <w:r>
+        <w:t>Status kafelkaSytuacjaDziałania awaryjnesFTP/ZP wysł.Plik dostarczony prawidłowo na sFTP/ZP — status pozytywny.Brak działań — proces poprawny.sFTP/ZP wysł.Status nadany ręcznie literą 'R' przez Dyspozytora po weryfikacji.Brak działań — decyzja ręczna Dyspozytora.sFTP/ZP wysł.Plik dostarczony po CET — status pozytywny.Brak działań — dostarczone po CET, OK.sFTP/ZP wysł.Przedwczesne (&gt;30 min do TET) — plik jeszcze niewymagany.Monitoring — czekaj do TET.sFTP/ZP wysł.Oczekiwanie / transfer w toku (stan przejściowy).Czekaj 5 min → sprawdź sFTP/ZP. Gdy brak → wyślij plik ręcznie ze źródła na sFTP/ZP.sFTP/ZP wysł.Zbliża się TET — pliku jeszcze nie ma na sFTP/ZP.Sprawdź źródło (Kreator / Perun4V / Core CC Tool). Gdy brak → wyślij plik ręcznie ze źródła na sFTP/ZP.sFTP/ZP wysł.Zbliża się CET / błąd dostarczenia — brak pliku na sFTP/ZP.Gdy pliku NIE ma na sFTP/ZP → wyślij plik ręcznie ze źródła na sFTP/ZP.sFTP/ZP wysł.Minął CET — plik niedostarczony. Krytyczne.Zgłoś (CIZ/WPO/PSE-I). Po CET — postępowanie krytyczne (brak lokalnego fallbacku).</w:t>
+      </w:r>
+    </w:p>
+    <w:p>
       <w:pPr>
         <w:pStyle w:val="Heading4"/>
       </w:pPr>
@@ -17590,6 +19102,16 @@
       </w:r>
     </w:p>
     <w:p>
+      <w:r>
+        <w:t>Warianty stanów (8)</w:t>
+      </w:r>
+    </w:p>
+    <w:p>
+      <w:r>
+        <w:t>Status kafelkaSytuacjaDziałania awaryjneMinIOPlik dostarczony prawidłowo na MinIO — status pozytywny.Brak działań — proces poprawny.MinIOStatus nadany ręcznie literą 'R' przez Dyspozytora po weryfikacji.Brak działań — decyzja ręczna Dyspozytora.MinIOPlik dostarczony po CET — status pozytywny.Brak działań — dostarczone po CET, OK.MinIOPrzedwczesne (&gt;30 min do TET) — plik jeszcze niewymagany.Monitoring — czekaj do TET.MinIOOczekiwanie / transfer w toku (stan przejściowy).Czekaj 5 min → sprawdź MinIO. Gdy brak → pobierz/wygeneruj plik ręcznie ze źródła i wgraj przez Manual Upload (GUI Core CC Tool) / wyślij z CCM.MinIOZbliża się TET — pliku jeszcze nie ma na MinIO.Sprawdź źródło (Kreator / Perun4V / Core CC Tool). Gdy brak → pobierz/wygeneruj plik ręcznie ze źródła i wgraj przez Manual Upload (GUI Core CC Tool) / wyślij z CCM.MinIOZbliża się CET / błąd dostarczenia — brak pliku na MinIO.Gdy pliku NIE ma na MinIO → pobierz/wygeneruj plik ręcznie ze źródła i wgraj przez Manual Upload (GUI Core CC Tool) / wyślij z CCM.MinIOMinął CET — plik niedostarczony. Krytyczne.Zgłoś (CIZ/WPO/PSE-I). Po CET — postępowanie krytyczne (brak lokalnego fallbacku).</w:t>
+      </w:r>
+    </w:p>
+    <w:p>
       <w:pPr>
         <w:pStyle w:val="Heading4"/>
       </w:pPr>
@@ -17651,6 +19173,16 @@
       </w:r>
     </w:p>
     <w:p>
+      <w:r>
+        <w:t>Warianty stanów (8)</w:t>
+      </w:r>
+    </w:p>
+    <w:p>
+      <w:r>
+        <w:t>Status kafelkaSytuacjaDziałania awaryjneMinIOPlik dostarczony prawidłowo na MinIO — status pozytywny.Brak działań — proces poprawny.MinIOStatus nadany ręcznie literą 'R' przez Dyspozytora po weryfikacji.Brak działań — decyzja ręczna Dyspozytora.MinIOPlik dostarczony po CET — status pozytywny.Brak działań — dostarczone po CET, OK.MinIOPrzedwczesne (&gt;30 min do TET) — plik jeszcze niewymagany.Monitoring — czekaj do TET.MinIOOczekiwanie / transfer w toku (stan przejściowy).Czekaj 5 min → sprawdź MinIO. Gdy brak → pobierz/wygeneruj plik ręcznie ze źródła i wgraj przez Manual Upload (GUI Core CC Tool) / wyślij z CCM.MinIOZbliża się TET — pliku jeszcze nie ma na MinIO.Sprawdź źródło (Kreator / Perun4V / Core CC Tool). Gdy brak → pobierz/wygeneruj plik ręcznie ze źródła i wgraj przez Manual Upload (GUI Core CC Tool) / wyślij z CCM.MinIOZbliża się CET / błąd dostarczenia — brak pliku na MinIO.Gdy pliku NIE ma na MinIO → pobierz/wygeneruj plik ręcznie ze źródła i wgraj przez Manual Upload (GUI Core CC Tool) / wyślij z CCM.MinIOMinął CET — plik niedostarczony. Krytyczne.Zgłoś (CIZ/WPO/PSE-I). Po CET — postępowanie krytyczne (brak lokalnego fallbacku).</w:t>
+      </w:r>
+    </w:p>
+    <w:p>
       <w:pPr>
         <w:pStyle w:val="Heading3"/>
       </w:pPr>
@@ -17755,6 +19287,16 @@
       </w:r>
     </w:p>
     <w:p>
+      <w:r>
+        <w:t>Warianty stanów (32)</w:t>
+      </w:r>
+    </w:p>
+    <w:p>
+      <w:r>
+        <w:t>Status kafelkaSytuacjaDziałania awaryjneCCtool wysł.CCtool zwalid.Dokument wysłany prawidłowo do CCTool, otrzymano potwierdzenie ACK z pozytywnym komunikatem.Brak działań — proces poprawny.CCtool wysł.CCtool zwalid.Dokument wysłany prawidłowo do CCTool. Dyspozytor ustawił status ręcznie 'R' po weryfikacji w CCTool.Brak działań.CCtool wysł.CCtool zwalid.Dokument wysłany prawidłowo do CCTool po CET, ACK napłynął po CET z pozytywnym komunikatem.Brak działań — dostarczone po CET, OK.CCtool wysł.CCtool zwalid.Dokument oznaczony ręcznie jako wysłany prawidłowo do CCTool oraz otrzymanie potwierdzenia ACK.Brak działań.CCtool wysł.CCtool zwalid.Dokument prawidłowo wysłany ręcznie z poziomu CCM. Otrzymano potwierdzenie ACK z pozytywnym komunikatem.Brak działań — wysyłka ręczna wykonana.CCtool wysł.CCtool zwalid.Dokument prawidłowo wysłany ręcznie z poziomu CCM. Trwa oczekiwanie na potwierdzenie ACK — około 2 min.Postępowanie:Czekaj 5 minOK → ustaw 'R' w CCMCCtool wysł.CCtool zwalid.Dokument wysłany ręcznie z poziomu CCM, ale ACK nie napłynął w żądanym czasie i zbliża się CET.Postępowanie:Core CC Tool → sprawdź czy plik dotarł (Message Viewer)Jeżeli:OK → oznacz 'R' w CCMbłąd → Plik został odrzucony — odczytaj kod błędu z potwierdzenia ACK i zareaguj zależnie od kodu:kod 20 (bramka dla pliku zamknięta) — zgłoś administratorowi Core CC Toolkod 21 (wersja nie jest wyższa niż już zapisana) — w źródle podnieś numer wersji i wyślij plik ponowniekod 30 (rozmiar pliku niezgodny) — pobierz poprawny plik i wyślij ponownie pełny opis w bazie ryzykbrak → Awaria transportu plików (Connector 2.0). Zgłoś awarię. W międzyczasie pobierz plik ze źródła (aplikacji ZP) i wyślij go ręcznie przez Core CC Tool (Manual Upload). pełny opis w bazie ryzykCCtool wysł.CCtool zwalid.Dokument wysłany ręcznie z poziomu CCM, a otrzymane ACK: (1) zawiera komunikat błędu (najedź kursorem); (2) proces zakończył się błędem — 'Błąd procesu'.Postępowanie:Najedź kursorem na status i odczytaj kod ACKJeżeli:kod 20 (bramka dla pliku zamknięta) → zgłoś administratorowi Core CC Toolkod 21 (wersja nie jest wyższa niż zapisana) → podnieś numer wersji w aplikacji ZP i wyślij plik ponownie przez Core CC Tool (Manual Upload)kod 30 (rozmiar pliku niezgodny) → pobierz poprawny plik z MinIO lub aplikacji ZP i wyślij ponownieCCtool wysł.CCtool zwalid.Dokument prawidłowo wysłany ręcznie z poziomu CCM. Otrzymano potwierdzenie ACK z pozytywnym komunikatem po CET.Brak działań — ręczna + ACK po CET, OK.CCtool wysł.CCtool zwalid.Dokument prawidłowo wysłany ręcznie z poziomu CCM. Nie otrzymano potwierdzenia ACK — upłynął czas CET.Postępowanie:Core CC Tool → sprawdź statusJeżeli:OK (Processed) → oznacz 'R' w CCM + zgłośbrak / awaria zwrotna → Awaria transportu plików (Connector 2.0). Zgłoś awarię. W międzyczasie pobierz plik ze źródła (aplikacji ZP) i wyślij go ręcznie przez Core CC Tool (Manual Upload). pełny opis w bazie ryzykCCtool wysł.CCtool zwalid.Dokument prawidłowo wysłany ręcznie z poziomu CCM. Nie otrzymano ACK, Dyspozytor ustawił status 'R' po weryfikacji w CCTool.Brak działań — decyzja ręczna Dyspozytora.CCtool wysł.CCtool zwalid.Dokument prawidłowo wysłany ręcznie z poziomu CCM po CET. Trwa oczekiwanie na potwierdzenie ACK — około 2 min.Postępowanie:Czekaj 2-5 minOK → ustaw 'R'CCtool wysł.CCtool zwalid.Dokument wysłany ręcznie z poziomu CCM po CET. Trwa oczekiwanie na potwierdzenie ACK — upłynęło więcej niż 2 minuty.Postępowanie:Core CC Tool → sprawdź czy plik dotarł (Message Viewer)Jeżeli:OK → oznacz 'R' w CCMbłąd → Plik został odrzucony — odczytaj kod błędu z potwierdzenia ACK i zareaguj zależnie od kodu:kod 20 (bramka dla pliku zamknięta) — zgłoś administratorowi Core CC Toolkod 21 (wersja nie jest wyższa niż już zapisana) — w źródle podnieś numer wersji i wyślij plik ponowniekod 30 (rozmiar pliku niezgodny) — pobierz poprawny plik i wyślij ponownie pełny opis w bazie ryzykbrak → Awaria transportu plików (Connector 2.0). Zgłoś awarię. W międzyczasie pobierz plik ze źródła (aplikacji ZP) i wyślij go ręcznie przez Core CC Tool (Manual Upload). pełny opis w bazie ryzykCCtool wysł.CCtool zwalid.Dokument wysłany ręcznie z poziomu CCM po CET, a otrzymane ACK: (1) komunikat błędu; (2) proces zakończył się błędem. Typowo kod 20 gateClosed.Postępowanie:Najedź kursorem na status i odczytaj kod ACK (typowo kod 20)Jeżeli:kod 20 (bramka dla pliku zamknięta) → po CET bramka jest zamknięta → zgłośinny kod → Plik został odrzucony — odczytaj kod błędu z potwierdzenia ACK i zareaguj zależnie od kodu:kod 20 (bramka dla pliku zamknięta) — zgłoś administratorowi Core CC Toolkod 21 (wersja nie jest wyższa niż już zapisana) — w źródle podnieś numer wersji i wyślij plik ponowniekod 30 (rozmiar pliku niezgodny) — pobierz poprawny plik i wyślij ponownie pełny opis w bazie ryzykCCtool wysł.CCtool zwalid.Dokument prawidłowo wysłany ręcznie z poziomu CCM po CET. Otrzymano potwierdzenie ACK z pozytywnym komunikatem (po CET).Brak działań — ręczna + ACK po CET, OK.CCtool wysł.CCtool zwalid.Dokument prawidłowo wysłany ręcznie z poziomu CCM po CET. Nie otrzymano potwierdzenia ACK — upłynął czas CET.Postępowanie:Core CC Tool → sprawdź statusJeżeli:OK (Processed) → oznacz 'R' w CCM + zgłośbrak / awaria zwrotna → Awaria transportu plików (Connector 2.0). Zgłoś awarię. W międzyczasie pobierz plik ze źródła (aplikacji ZP) i wyślij go ręcznie przez Core CC Tool (Manual Upload). pełny opis w bazie ryzykCCtool wysł.CCtool zwalid.Dokument oznaczony ręcznie jako wysłany prawidłowo do CCTool. Trwa oczekiwanie na ACK — około 2 min.Postępowanie:Czekaj 5 minOK → 'R' dla ACKCCtool wysł.CCtool zwalid.Dokument oznaczony ręcznie jako wysłany prawidłowo. Trwa oczekiwanie na ACK — upłynęło więcej niż 2 min.Postępowanie:Czekaj 5 minOK → 'R' dla ACKCCtool wysł.CCtool zwalid.Dokument oznaczony ręcznie jako wysłany prawidłowo. Nie otrzymano potwierdzenia ACK — upłynął czas CET.Postępowanie:Core CC Tool → sprawdź statusJeżeli:OK (Processed) → utrzymaj 'R'brak / awaria → Awaria transportu plików (Connector 2.0). Zgłoś awarię. W międzyczasie pobierz plik ze źródła (aplikacji ZP) i wyślij go ręcznie przez Core CC Tool (Manual Upload). pełny opis w bazie ryzykCCtool wysł.CCtool zwalid.Wysłany dokument nie spełnia kryterium rozmiaru. ACK nie otrzymano, Dyspozytor ustawił status 'R' po weryfikacji w CCTool.Brak działań — Dyspozytor zatwierdził zawartość.CCtool wysł.CCtool zwalid.Dokument jeszcze nie został wysłany do CCTool, ACK nie napłynął. Plik nie wymagany (&gt;30 min do TET).Brak działań — czekaj do TET.CCtool wysł.CCtool zwalid.Zbliża się CET — plik niedostarczony lub błąd wysyłki. Stan alarmowy.Postępowanie (alarm):Core CC Tool → sprawdź czy plik dotarł do Core CC ToolJeżeli:plik jest, brak ACK → Plik został odrzucony — odczytaj kod błędu z potwierdzenia ACK i zareaguj zależnie od kodu:kod 20 (bramka dla pliku zamknięta) — zgłoś administratorowi Core CC Toolkod 21 (wersja nie jest wyższa niż już zapisana) — w źródle podnieś numer wersji i wyślij plik ponowniekod 30 (rozmiar pliku niezgodny) — pobierz poprawny plik i wyślij ponownie pełny opis w bazie ryzykbrak pliku (awaria Connector 2.0) → Awaria transportu plików (Connector 2.0). Zgłoś awarię. W międzyczasie pobierz plik ze źródła (aplikacji ZP) i wyślij go ręcznie przez Core CC Tool (Manual Upload). pełny opis w bazie ryzykbrak pliku w źródle → Brak pliku lub wersji w aplikacji źródłowej. Otwórz aplikacji ZP, przejdź do bilansu i sprawdź wersję pliku: jeśli wersja jest dostępna — pobierz ją (Pobierz XML); jeśli brakuje — wygeneruj nową wersję; jeśli aplikacja nie działa — zgłoś. pełny opis w bazie ryzykCCtool wysł.CCtool zwalid.Wysłany dokument nie spełnia kryterium rozmiaru. Oczekiwanie na ACK — upłynęło więcej niż 2 min.Postępowanie:W aplikacji CCM kliknij plik lewym przyciskiem myszy → Informacje → sprawdź rozmiar; pobierz z MinIO i rozpakujJeżeli:zawartość OK mimo rozmiaru → oznacz 'R' (→ powiązany stan)zawartość niepoprawna → Plik został odrzucony — odczytaj kod błędu z potwierdzenia ACK i zareaguj zależnie od kodu:kod 20 (bramka dla pliku zamknięta) — zgłoś administratorowi Core CC Toolkod 21 (wersja nie jest wyższa niż już zapisana) — w źródle podnieś numer wersji i wyślij plik ponowniekod 30 (rozmiar pliku niezgodny) — pobierz poprawny plik i wyślij ponownie pełny opis w bazie ryzykCCtool wysł.CCtool zwalid.Wysłany dokument nie spełnia kryterium rozmiaru, a ACK ma status czerwony — typowo kod 30.Postępowanie:W aplikacji CCM kliknij plik lewym przyciskiem myszy → Informacje → potwierdź rozmiarPobierz poprawny plik z aplikacji ZP (Pobierz XML) i wyślij przez Core CC Tool (Manual Upload) z kolejnym numerem wersjiNadal za mały → zgłoś szczegóły w bazie ryzykCCtool wysł.CCtool zwalid.Wysłany dokument nie spełnia kryterium rozmiaru. ACK napłynął po CET z pozytywnym komunikatem. Sprzeczność.Postępowanie:Pobierz z MinIO → rozpakuj → sprawdź zawartośćJeżeli:zawartość OK → oznacz 'R' (→ powiązany stan); zgłośniepoprawna → zgłośCCtool wysł.CCtool zwalid.Dokument wysłany prawidłowo do CCTool, ale ACK negatywny (Rejected). Kody: 20/21/30.Postępowanie:Najedź kursorem na status i odczytaj kod ACKJeżeli:kod 20 (bramka dla pliku zamknięta) → zgłoś (administrator Core CC Tool otwiera bramkę); sprawdź proces IDx-AC-FORWARDINGkod 21 (wersja nie jest wyższa niż zapisana) → podnieś numer wersji w aplikacji ZP i wyślij plik ponownie przez Core CC Tool (Manual Upload)kod 30 (rozmiar pliku niezgodny) → pobierz poprawny plik z MinIO lub aplikacji ZP i wyślij ponownieCCtool wysł.CCtool zwalid.Dokument wysłany prawidłowo, trwa oczekiwanie na ACK, który nie napłynął w zadanym czasie (&gt;2-3 min).Postępowanie:Czekaj 5 min → Core CC Tool (⚠ nie wysyłaj ponownie!)Jeżeli:Processed → oznacz 'R' + zgłośRejected → patrz stan kod ACKbrak wpisu → Awaria transportu plików (Connector 2.0). Zgłoś awarię. W międzyczasie pobierz plik ze źródła (aplikacji ZP) i wyślij go ręcznie przez Core CC Tool (Manual Upload). pełny opis w bazie ryzykCCtool wysł.CCtool zwalid.Dokument wysłany prawidłowo, ACK nie napłynął do CET.Postępowanie:Core CC Tool → sprawdź statusJeżeli:Processed → oznacz 'R' + zgłoś (→ powiązany stan)Rejected → wyślij ponownie przez Core CC Tool (Manual Upload) "po CET"brak → Awaria transportu plików (Connector 2.0). Zgłoś awarię. W międzyczasie pobierz plik ze źródła (aplikacji ZP) i wyślij go ręcznie przez Core CC Tool (Manual Upload). pełny opis w bazie ryzyk + powiadom RCCCCtool wysł.CCtool zwalid.Wysłany dokument nie spełnia kryterium rozmiaru. ACK nie napłynął do CET. Krytyczne.Postępowanie (KRYTYCZNE w C):Pobierz poprawny plik z aplikacji ZP i wyślij przez Core CC Tool (Manual Upload) "po CET" (jeśli bramka otwarta)Natychmiast: zgłoś + powiadom RCC szczegóły w bazie ryzykCCtool wysł.CCtool zwalid.Dokument zarejestrowany w CCTool po CET (wysyłka pozytywna), ale walidacja zakończona negatywnie — ACK Rejected po CET.Postępowanie (po CET):Najedź kursorem na status i odczytaj kod ACK (kontekst: rejestracja po CET)Jeżeli:kod 20 (bramka dla pliku zamknięta) → po CET bramka zamknięta → zgłoś + powiadom RCCkod 21 (wersja nie jest wyższa niż zapisana) → podnieś numer wersji w aplikacji ZP i wyślij plik ponownie przez Core CC Tool (Manual Upload) (jeśli bramka otwarta)kod 30 (rozmiar pliku niezgodny) → pobierz poprawny plik z MinIO lub aplikacji ZP i wyślij ponownie (jeśli bramka otwarta)CCtool wysł.CCtool zwalid.Dokument zarejestrowany w CCTool po CET (wysyłka pozytywna), ale ACK walidacji nie napłynął — plik dostarczony, lecz niezwalidowany.Postępowanie (po CET):Core CC Tool → sprawdź status walidacji (plik dostarczony po CET)Jeżeli:Processed → oznacz 'R' w CCM + zgłośRejected → postępuj jak w Stanie 30 (odczytaj kod ACK)brak wpisu → Awaria transportu plików (Connector 2.0). Zgłoś awarię. W międzyczasie pobierz plik ze źródła (aplikacji ZP) i wyślij go ręcznie przez Core CC Tool (Manual Upload). pełny opis w bazie ryzyk + powiadom RCCCCtool wysł.CCtool zwalid.Dokument nie został dostarczony do CCTool, ACK nie napłynął. Minął czas CET. KRYTYCZNE — po CET dograć nie można.Postępowanie (KRYTYCZNE — brak naprawy):Telefon do RCC + zgłoś (priorytet P1)Po CET — brak naprawy. Diagnoza przyczyn: ZP · Connector 2.0 · Core CC Tool szczegóły w bazie ryzyk</w:t>
+      </w:r>
+    </w:p>
+    <w:p>
       <w:pPr>
         <w:pStyle w:val="Heading2"/>
       </w:pPr>
@@ -17797,6 +19339,11 @@
     </w:p>
     <w:p>
       <w:r>
+        <w:t>Główny pulpit IDCC — pełna lista plików FIDx procesu z czasami granicznymi i kolumnami statusów wysyłki/walidacji.</w:t>
+      </w:r>
+    </w:p>
+    <w:p>
+      <w:r>
         <w:rPr>
           <w:b/>
         </w:rPr>
@@ -17939,6 +19486,16 @@
       </w:r>
     </w:p>
     <w:p>
+      <w:r>
+        <w:t>Pulpit CCM — pełna galeria (89 ekranów + 42 ikon)</w:t>
+      </w:r>
+    </w:p>
+    <w:p>
+      <w:r>
+        <w:t>Elementy interfejsu (ikony i przyciski, rozmiar rzeczywisty):</w:t>
+      </w:r>
+    </w:p>
+    <w:p>
       <w:pPr>
         <w:pStyle w:val="Heading2"/>
       </w:pPr>
@@ -17970,6 +19527,11 @@
       </w:r>
     </w:p>
     <w:p>
+      <w:r>
+        <w:t>Walidacja NOR — pełna galeria (18 ekranów)</w:t>
+      </w:r>
+    </w:p>
+    <w:p>
       <w:pPr>
         <w:pStyle w:val="Heading2"/>
       </w:pPr>
@@ -18001,6 +19563,16 @@
       </w:r>
     </w:p>
     <w:p>
+      <w:r>
+        <w:t>Walidacja BUP — pełna galeria (90 ekranów + 4 ikon)</w:t>
+      </w:r>
+    </w:p>
+    <w:p>
+      <w:r>
+        <w:t>Elementy interfejsu (ikony i przyciski, rozmiar rzeczywisty):</w:t>
+      </w:r>
+    </w:p>
+    <w:p>
       <w:pPr>
         <w:pStyle w:val="Heading2"/>
       </w:pPr>
@@ -18032,6 +19604,11 @@
       </w:r>
     </w:p>
     <w:p>
+      <w:r>
+        <w:t>GLSK 607 — stany kafelka — pełna galeria (32 ekranów)</w:t>
+      </w:r>
+    </w:p>
+    <w:p>
       <w:pPr>
         <w:pStyle w:val="Heading2"/>
       </w:pPr>
@@ -18498,6 +20075,16 @@
     </w:p>
     <w:p>
       <w:r>
+        <w:t>Pełne opisy:</w:t>
+      </w:r>
+    </w:p>
+    <w:p>
+      <w:r>
+        <w:t>. Skrót poniżej.</w:t>
+      </w:r>
+    </w:p>
+    <w:p>
+      <w:r>
         <w:rPr>
           <w:b/>
         </w:rPr>
@@ -18884,6 +20471,11 @@
     </w:p>
     <w:p>
       <w:r>
+        <w:t>📖 BUP DA Ryzyko 2 (str. 17), Rys. 11–13</w:t>
+      </w:r>
+    </w:p>
+    <w:p>
+      <w:r>
         <w:t>Otwórz przeglądarkę → URL CCCt (wewn.)</w:t>
       </w:r>
     </w:p>
@@ -18997,6 +20589,11 @@
     </w:p>
     <w:p>
       <w:r>
+        <w:t>📖 BUP DA Ryzyko 3 (str. 22)</w:t>
+      </w:r>
+    </w:p>
+    <w:p>
+      <w:r>
         <w:t>Otwórz przeglądarkę → https://minio-gui.pse.pl</w:t>
       </w:r>
     </w:p>
@@ -19075,6 +20672,11 @@
     </w:p>
     <w:p>
       <w:r>
+        <w:t>📖 AC manuall ZP.docx</w:t>
+      </w:r>
+    </w:p>
+    <w:p>
+      <w:r>
         <w:t>Otwórz aplikację</w:t>
       </w:r>
     </w:p>
@@ -19138,6 +20740,11 @@
     </w:p>
     <w:p>
       <w:r>
+        <w:t>📖 BUP DA Ryzyko 1 (str. 9), NOR DA §2.3.2.2</w:t>
+      </w:r>
+    </w:p>
+    <w:p>
+      <w:r>
         <w:t>Otwórz przeglądarkę → https://lccv.tscnet.eu</w:t>
       </w:r>
     </w:p>
@@ -19515,6 +21122,21 @@
       </w:pPr>
       <w:r>
         <w:t>3. Ryzyka uniwersalne U01–U23</w:t>
+      </w:r>
+    </w:p>
+    <w:p>
+      <w:r>
+        <w:t>Pełne karty ryzyk z opisami, objawami, działaniami i zgłoszeniem: patrz</w:t>
+      </w:r>
+    </w:p>
+    <w:p>
+      <w:r>
+        <w:t>. Poniżej</w:t>
+      </w:r>
+    </w:p>
+    <w:p>
+      <w:r>
+        <w:t>.</w:t>
       </w:r>
     </w:p>
     <w:p>

</xml_diff>